<commit_message>
Added TemplatesScreen and Functionality. This page shows all Saved templates and allows users to upload templates on supabase bucket, or delete templates and view all thier templates.
</commit_message>
<xml_diff>
--- a/backend/temp_output.docx
+++ b/backend/temp_output.docx
@@ -72,7 +72,7 @@
                 <w:sz w:val="26"/>
                 <w:szCs w:val="26"/>
               </w:rPr>
-              <w:t xml:space="preserve">Game Development Progress Meeting</w:t>
+              <w:t xml:space="preserve">Q3 Marketing Plan Discussion</w:t>
             </w:r>
           </w:p>
         </w:tc>
@@ -271,7 +271,7 @@
           </w:tcPr>
           <w:p>
             <w:r>
-              <w:t xml:space="preserve">Discuss current progress in building the game and address deadline concerns</w:t>
+              <w:t xml:space="preserve">To discuss the Q3 marketing plan</w:t>
             </w:r>
           </w:p>
         </w:tc>
@@ -614,7 +614,7 @@
               <w:rPr>
                 <w:rFonts w:asciiTheme="majorHAnsi" w:hAnsiTheme="majorHAnsi" w:cstheme="majorHAnsi"/>
               </w:rPr>
-              <w:t xml:space="preserve">Adel AlHarbi</w:t>
+              <w:t xml:space="preserve">Sara</w:t>
             </w:r>
           </w:p>
         </w:tc>
@@ -641,7 +641,7 @@
               <w:rPr>
                 <w:rFonts w:asciiTheme="majorHAnsi" w:hAnsiTheme="majorHAnsi" w:cstheme="majorHAnsi"/>
               </w:rPr>
-              <w:t xml:space="preserve">adel@darah.gov.sa</w:t>
+              <w:t xml:space="preserve"/>
             </w:r>
           </w:p>
         </w:tc>
@@ -668,96 +668,7 @@
               <w:rPr>
                 <w:rFonts w:asciiTheme="majorBidi" w:hAnsiTheme="majorBidi" w:cstheme="majorBidi"/>
               </w:rPr>
-              <w:t xml:space="preserve">Chief Data Management Officer</w:t>
-            </w:r>
-          </w:p>
-        </w:tc>
-      </w:tr>
-      <w:tr>
-        <w:tblPrEx>
-          <w:tblCellMar>
-            <w:top w:w="0" w:type="dxa"/>
-            <w:bottom w:w="0" w:type="dxa"/>
-          </w:tblCellMar>
-        </w:tblPrEx>
-        <w:tc>
-          <w:tcPr>
-            <w:tcW w:w="3360" w:type="dxa"/>
-            <w:tcBorders>
-              <w:top w:val="single" w:sz="1" w:space="0" w:color="AABDD1"/>
-              <w:left w:val="single" w:sz="1" w:space="0" w:color="AABDD1"/>
-              <w:bottom w:val="single" w:sz="1" w:space="0" w:color="AABDD1"/>
-              <w:right w:val="single" w:sz="1" w:space="0" w:color="AABDD1"/>
-            </w:tcBorders>
-            <w:shd w:val="clear" w:color="auto" w:fill="F5F5F5"/>
-            <w:tcMar>
-              <w:top w:w="80" w:type="dxa"/>
-              <w:left w:w="150" w:type="dxa"/>
-              <w:bottom w:w="80" w:type="dxa"/>
-              <w:right w:w="150" w:type="dxa"/>
-            </w:tcMar>
-            <w:vAlign w:val="center"/>
-          </w:tcPr>
-          <w:p>
-            <w:r>
-              <w:rPr>
-                <w:rFonts w:asciiTheme="majorHAnsi" w:hAnsiTheme="majorHAnsi" w:cstheme="majorHAnsi"/>
-              </w:rPr>
-              <w:t xml:space="preserve">Faisal Rihani</w:t>
-            </w:r>
-          </w:p>
-        </w:tc>
-        <w:tc>
-          <w:tcPr>
-            <w:tcW w:w="3360" w:type="dxa"/>
-            <w:tcBorders>
-              <w:top w:val="single" w:sz="1" w:space="0" w:color="AABDD1"/>
-              <w:left w:val="single" w:sz="1" w:space="0" w:color="AABDD1"/>
-              <w:bottom w:val="single" w:sz="1" w:space="0" w:color="AABDD1"/>
-              <w:right w:val="single" w:sz="1" w:space="0" w:color="AABDD1"/>
-            </w:tcBorders>
-            <w:shd w:val="clear" w:color="auto" w:fill="F5F5F5"/>
-            <w:tcMar>
-              <w:top w:w="80" w:type="dxa"/>
-              <w:left w:w="150" w:type="dxa"/>
-              <w:bottom w:w="80" w:type="dxa"/>
-              <w:right w:w="150" w:type="dxa"/>
-            </w:tcMar>
-            <w:vAlign w:val="center"/>
-          </w:tcPr>
-          <w:p>
-            <w:r>
-              <w:rPr>
-                <w:rFonts w:asciiTheme="majorHAnsi" w:hAnsiTheme="majorHAnsi" w:cstheme="majorHAnsi"/>
-              </w:rPr>
-              <w:t xml:space="preserve">cyrus@gmail.com</w:t>
-            </w:r>
-          </w:p>
-        </w:tc>
-        <w:tc>
-          <w:tcPr>
-            <w:tcW w:w="3360" w:type="dxa"/>
-            <w:tcBorders>
-              <w:top w:val="single" w:sz="1" w:space="0" w:color="AABDD1"/>
-              <w:left w:val="single" w:sz="1" w:space="0" w:color="AABDD1"/>
-              <w:bottom w:val="single" w:sz="1" w:space="0" w:color="AABDD1"/>
-              <w:right w:val="single" w:sz="1" w:space="0" w:color="AABDD1"/>
-            </w:tcBorders>
-            <w:shd w:val="clear" w:color="auto" w:fill="F5F5F5"/>
-            <w:tcMar>
-              <w:top w:w="80" w:type="dxa"/>
-              <w:left w:w="150" w:type="dxa"/>
-              <w:bottom w:w="80" w:type="dxa"/>
-              <w:right w:w="150" w:type="dxa"/>
-            </w:tcMar>
-            <w:vAlign w:val="center"/>
-          </w:tcPr>
-          <w:p>
-            <w:r>
-              <w:rPr>
-                <w:rFonts w:asciiTheme="majorBidi" w:hAnsiTheme="majorBidi" w:cstheme="majorBidi"/>
-              </w:rPr>
-              <w:t xml:space="preserve">Consultant</w:t>
+              <w:t xml:space="preserve"/>
             </w:r>
           </w:p>
         </w:tc>
@@ -791,7 +702,7 @@
         <w:spacing w:before="320"/>
       </w:pPr>
       <w:r>
-        <w:t xml:space="preserve">Reviewed current progress in building the game,Good progress has been made overall,The team is still falling behind the deadline</w:t>
+        <w:t xml:space="preserve">Discussion of the Q3 marketing plan,Review of the marketing budget and proposal to increase it by 20%,Coordination with the external agency</w:t>
       </w:r>
     </w:p>
     <w:p>
@@ -817,7 +728,7 @@
         <w:spacing w:before="320"/>
       </w:pPr>
       <w:r>
-        <w:t xml:space="preserve">Faisal must complete all new character designs before the next meeting,Khalid must animate all characters created by Faisal directly into the game before the next meeting</w:t>
+        <w:t xml:space="preserve">Decided to increase the marketing budget by 20%</w:t>
       </w:r>
     </w:p>
     <w:p>
@@ -1000,7 +911,7 @@
               <w:rPr>
                 <w:rFonts w:asciiTheme="majorHAnsi" w:hAnsiTheme="majorHAnsi" w:cstheme="majorHAnsi"/>
               </w:rPr>
-              <w:t xml:space="preserve">Finish all new character designs</w:t>
+              <w:t xml:space="preserve">Prepare the new budget proposal</w:t>
             </w:r>
           </w:p>
         </w:tc>
@@ -1027,7 +938,7 @@
               <w:rPr>
                 <w:rFonts w:asciiTheme="majorHAnsi" w:hAnsiTheme="majorHAnsi" w:cstheme="majorHAnsi"/>
               </w:rPr>
-              <w:t xml:space="preserve">Faisal</w:t>
+              <w:t xml:space="preserve">Ahmed</w:t>
             </w:r>
           </w:p>
         </w:tc>
@@ -1054,7 +965,7 @@
               <w:rPr>
                 <w:rFonts w:asciiTheme="majorBidi" w:hAnsiTheme="majorBidi" w:cstheme="majorBidi"/>
               </w:rPr>
-              <w:t xml:space="preserve">2026-05-18</w:t>
+              <w:t xml:space="preserve">2026-05-14</w:t>
             </w:r>
           </w:p>
         </w:tc>
@@ -1089,7 +1000,7 @@
               <w:rPr>
                 <w:rFonts w:asciiTheme="majorHAnsi" w:hAnsiTheme="majorHAnsi" w:cstheme="majorHAnsi"/>
               </w:rPr>
-              <w:t xml:space="preserve">Animate all characters created by Faisal directly into the game</w:t>
+              <w:t xml:space="preserve">Reach out to the agency</w:t>
             </w:r>
           </w:p>
         </w:tc>
@@ -1116,7 +1027,7 @@
               <w:rPr>
                 <w:rFonts w:asciiTheme="majorHAnsi" w:hAnsiTheme="majorHAnsi" w:cstheme="majorHAnsi"/>
               </w:rPr>
-              <w:t xml:space="preserve">Khalid</w:t>
+              <w:t xml:space="preserve">Sara</w:t>
             </w:r>
           </w:p>
         </w:tc>
@@ -1143,7 +1054,7 @@
               <w:rPr>
                 <w:rFonts w:asciiTheme="majorBidi" w:hAnsiTheme="majorBidi" w:cstheme="majorBidi"/>
               </w:rPr>
-              <w:t xml:space="preserve">2026-05-18</w:t>
+              <w:t xml:space="preserve"/>
             </w:r>
           </w:p>
         </w:tc>

</xml_diff>

<commit_message>
Added a subscriptions icon, also changed mahdarscreen to show preview and to show mahdar result on column to right
</commit_message>
<xml_diff>
--- a/backend/temp_output.docx
+++ b/backend/temp_output.docx
@@ -17,8 +17,8 @@
       <w:tblPr>
         <w:tblStyle w:val="TableGrid"/>
         <w:bidiVisual/>
-        <w:tblW w:w="4934" w:type="pct"/>
-        <w:tblInd w:w="-5" w:type="dxa"/>
+        <w:tblW w:w="9912" w:type="dxa"/>
+        <w:tblInd w:w="371" w:type="dxa"/>
         <w:tblBorders>
           <w:top w:val="none" w:sz="0" w:space="0" w:color="auto"/>
           <w:left w:val="none" w:sz="0" w:space="0" w:color="auto"/>
@@ -30,8 +30,10 @@
         <w:tblLook w:val="04A0" w:firstRow="1" w:lastRow="0" w:firstColumn="1" w:lastColumn="0" w:noHBand="0" w:noVBand="1"/>
       </w:tblPr>
       <w:tblGrid>
-        <w:gridCol w:w="1584"/>
-        <w:gridCol w:w="8784"/>
+        <w:gridCol w:w="1899"/>
+        <w:gridCol w:w="3776"/>
+        <w:gridCol w:w="1001"/>
+        <w:gridCol w:w="3236"/>
       </w:tblGrid>
       <w:tr>
         <w:trPr>
@@ -39,51 +41,9 @@
         </w:trPr>
         <w:tc>
           <w:tcPr>
-            <w:tcW w:w="764" w:type="pct"/>
+            <w:tcW w:w="1899" w:type="dxa"/>
             <w:tcBorders>
               <w:top w:val="single" w:sz="2" w:space="0" w:color="BFBFBF" w:themeColor="background1" w:themeShade="BF"/>
-              <w:right w:val="single" w:sz="4" w:space="0" w:color="auto"/>
-            </w:tcBorders>
-            <w:shd w:val="clear" w:color="auto" w:fill="1F3864"/>
-            <w:vAlign w:val="center"/>
-          </w:tcPr>
-          <w:p>
-            <w:pPr>
-              <w:tabs>
-                <w:tab w:val="left" w:pos="1692"/>
-                <w:tab w:val="center" w:pos="5256"/>
-              </w:tabs>
-              <w:bidi/>
-              <w:ind w:right="162"/>
-              <w:rPr>
-                <w:rFonts w:asciiTheme="majorBidi" w:hAnsiTheme="majorBidi" w:cstheme="majorBidi"/>
-                <w:color w:val="FFFFFF" w:themeColor="background1"/>
-                <w:sz w:val="24"/>
-                <w:szCs w:val="24"/>
-              </w:rPr>
-            </w:pPr>
-            <w:bookmarkStart w:id="0" w:name="_Hlk487665564"/>
-            <w:bookmarkStart w:id="1" w:name="_Hlk487712651"/>
-            <w:r>
-              <w:rPr>
-                <w:rFonts w:asciiTheme="majorBidi" w:hAnsiTheme="majorBidi" w:cstheme="majorBidi"/>
-                <w:color w:val="FFFFFF" w:themeColor="background1"/>
-                <w:sz w:val="24"/>
-                <w:szCs w:val="24"/>
-                <w:rtl/>
-              </w:rPr>
-              <w:t>الموضوع</w:t>
-            </w:r>
-          </w:p>
-        </w:tc>
-        <w:tc>
-          <w:tcPr>
-            <w:tcW w:w="4236" w:type="pct"/>
-            <w:tcBorders>
-              <w:top w:val="single" w:sz="4" w:space="0" w:color="auto"/>
-              <w:left w:val="single" w:sz="4" w:space="0" w:color="auto"/>
-              <w:bottom w:val="single" w:sz="4" w:space="0" w:color="auto"/>
-              <w:right w:val="single" w:sz="4" w:space="0" w:color="auto"/>
             </w:tcBorders>
             <w:vAlign w:val="center"/>
           </w:tcPr>
@@ -97,18 +57,174 @@
               <w:ind w:right="162"/>
               <w:rPr>
                 <w:rFonts w:asciiTheme="majorBidi" w:hAnsiTheme="majorBidi" w:cstheme="majorBidi"/>
-                <w:sz w:val="20"/>
-                <w:szCs w:val="20"/>
-                <w:rtl/>
+                <w:b/>
+                <w:bCs/>
+                <w:color w:val="716254"/>
+                <w:sz w:val="20"/>
+                <w:szCs w:val="20"/>
               </w:rPr>
             </w:pPr>
-            <w:r>
-              <w:rPr>
-                <w:rFonts w:asciiTheme="majorBidi" w:hAnsiTheme="majorBidi" w:cstheme="majorBidi"/>
-                <w:sz w:val="20"/>
-                <w:szCs w:val="20"/>
-              </w:rPr>
-              <w:t xml:space="preserve">اجتماع مناقشة خطة التسويق للربع الثالث</w:t>
+            <w:bookmarkStart w:id="0" w:name="_Hlk487665564"/>
+            <w:bookmarkStart w:id="1" w:name="_Hlk487712651"/>
+            <w:r>
+              <w:rPr>
+                <w:rFonts w:asciiTheme="majorBidi" w:hAnsiTheme="majorBidi" w:cstheme="majorBidi"/>
+                <w:b/>
+                <w:bCs/>
+                <w:color w:val="716254"/>
+                <w:sz w:val="20"/>
+                <w:szCs w:val="20"/>
+                <w:rtl/>
+              </w:rPr>
+              <w:t>الموضوع/ المشروع</w:t>
+            </w:r>
+          </w:p>
+        </w:tc>
+        <w:tc>
+          <w:tcPr>
+            <w:tcW w:w="3776" w:type="dxa"/>
+            <w:tcBorders>
+              <w:top w:val="single" w:sz="4" w:space="0" w:color="BFBFBF" w:themeColor="background1" w:themeShade="BF"/>
+              <w:bottom w:val="single" w:sz="4" w:space="0" w:color="BFBFBF" w:themeColor="background1" w:themeShade="BF"/>
+            </w:tcBorders>
+            <w:vAlign w:val="center"/>
+          </w:tcPr>
+          <w:p>
+            <w:pPr>
+              <w:tabs>
+                <w:tab w:val="left" w:pos="1692"/>
+                <w:tab w:val="center" w:pos="5256"/>
+              </w:tabs>
+              <w:bidi/>
+              <w:ind w:right="162"/>
+              <w:rPr>
+                <w:rFonts w:asciiTheme="majorBidi" w:hAnsiTheme="majorBidi" w:cstheme="majorBidi"/>
+                <w:b/>
+                <w:bCs/>
+                <w:sz w:val="20"/>
+                <w:szCs w:val="20"/>
+                <w:rtl/>
+              </w:rPr>
+            </w:pPr>
+            <w:r>
+              <w:rPr>
+                <w:rFonts w:asciiTheme="majorBidi" w:hAnsiTheme="majorBidi" w:cstheme="majorBidi"/>
+                <w:b/>
+                <w:bCs/>
+                <w:sz w:val="20"/>
+                <w:szCs w:val="20"/>
+              </w:rPr>
+              <w:t xml:space="preserve">Q3 Marketing Plan Discussion</w:t>
+            </w:r>
+          </w:p>
+        </w:tc>
+        <w:tc>
+          <w:tcPr>
+            <w:tcW w:w="1001" w:type="dxa"/>
+            <w:tcBorders>
+              <w:top w:val="single" w:sz="4" w:space="0" w:color="BFBFBF" w:themeColor="background1" w:themeShade="BF"/>
+            </w:tcBorders>
+            <w:vAlign w:val="center"/>
+          </w:tcPr>
+          <w:p>
+            <w:pPr>
+              <w:tabs>
+                <w:tab w:val="left" w:pos="1692"/>
+                <w:tab w:val="center" w:pos="5256"/>
+              </w:tabs>
+              <w:bidi/>
+              <w:ind w:left="341" w:right="-113"/>
+              <w:rPr>
+                <w:rFonts w:asciiTheme="majorBidi" w:hAnsiTheme="majorBidi" w:cstheme="majorBidi"/>
+                <w:b/>
+                <w:bCs/>
+                <w:color w:val="716254"/>
+                <w:sz w:val="20"/>
+                <w:szCs w:val="20"/>
+              </w:rPr>
+            </w:pPr>
+            <w:r>
+              <w:rPr>
+                <w:rFonts w:asciiTheme="majorBidi" w:hAnsiTheme="majorBidi" w:cstheme="majorBidi"/>
+                <w:b/>
+                <w:bCs/>
+                <w:color w:val="716254"/>
+                <w:sz w:val="20"/>
+                <w:szCs w:val="20"/>
+                <w:rtl/>
+              </w:rPr>
+              <w:t>النوع</w:t>
+            </w:r>
+          </w:p>
+        </w:tc>
+        <w:tc>
+          <w:tcPr>
+            <w:tcW w:w="3236" w:type="dxa"/>
+            <w:tcBorders>
+              <w:top w:val="single" w:sz="4" w:space="0" w:color="BFBFBF" w:themeColor="background1" w:themeShade="BF"/>
+              <w:bottom w:val="single" w:sz="4" w:space="0" w:color="BFBFBF" w:themeColor="background1" w:themeShade="BF"/>
+            </w:tcBorders>
+            <w:vAlign w:val="center"/>
+          </w:tcPr>
+          <w:p>
+            <w:pPr>
+              <w:tabs>
+                <w:tab w:val="left" w:pos="1692"/>
+                <w:tab w:val="center" w:pos="5256"/>
+              </w:tabs>
+              <w:bidi/>
+              <w:ind w:right="162"/>
+              <w:rPr>
+                <w:rFonts w:asciiTheme="majorBidi" w:hAnsiTheme="majorBidi" w:cstheme="majorBidi"/>
+                <w:b/>
+                <w:bCs/>
+                <w:sz w:val="20"/>
+                <w:szCs w:val="20"/>
+              </w:rPr>
+            </w:pPr>
+            <w:r>
+              <w:rPr>
+                <w:rFonts w:asciiTheme="majorBidi" w:hAnsiTheme="majorBidi" w:cstheme="majorBidi" w:hint="cs"/>
+                <w:b/>
+                <w:bCs/>
+                <w:sz w:val="20"/>
+                <w:szCs w:val="20"/>
+                <w:rtl/>
+              </w:rPr>
+              <w:t xml:space="preserve">اجتماع </w:t>
+            </w:r>
+            <w:r>
+              <w:rPr>
+                <w:rFonts w:asciiTheme="majorBidi" w:hAnsiTheme="majorBidi" w:cstheme="majorBidi" w:hint="cs"/>
+                <w:b/>
+                <w:bCs/>
+                <w:sz w:val="20"/>
+                <w:szCs w:val="20"/>
+                <w:rtl/>
+              </w:rPr>
+              <w:t xml:space="preserve">متابعة </w:t>
+            </w:r>
+            <w:r>
+              <w:rPr>
+                <w:rFonts w:asciiTheme="majorBidi" w:hAnsiTheme="majorBidi" w:cstheme="majorBidi" w:hint="cs"/>
+                <w:b/>
+                <w:bCs/>
+                <w:sz w:val="20"/>
+                <w:szCs w:val="20"/>
+                <w:rtl/>
+              </w:rPr>
+              <w:t>أسبوعي</w:t>
+            </w:r>
+            <w:r>
+              <w:rPr>
+                <w:rFonts w:asciiTheme="majorBidi" w:hAnsiTheme="majorBidi" w:cstheme="majorBidi" w:hint="cs"/>
+                <w:b/>
+                <w:bCs/>
+                <w:sz w:val="20"/>
+                <w:szCs w:val="20"/>
+                <w:rtl/>
+              </w:rPr>
+              <w:t xml:space="preserve"> </w:t>
             </w:r>
           </w:p>
         </w:tc>
@@ -121,11 +237,7 @@
         </w:trPr>
         <w:tc>
           <w:tcPr>
-            <w:tcW w:w="764" w:type="pct"/>
-            <w:tcBorders>
-              <w:right w:val="single" w:sz="4" w:space="0" w:color="auto"/>
-            </w:tcBorders>
-            <w:shd w:val="clear" w:color="auto" w:fill="1F3864"/>
+            <w:tcW w:w="1899" w:type="dxa"/>
             <w:vAlign w:val="center"/>
           </w:tcPr>
           <w:p>
@@ -138,31 +250,33 @@
               <w:ind w:right="162"/>
               <w:rPr>
                 <w:rFonts w:asciiTheme="majorBidi" w:hAnsiTheme="majorBidi" w:cstheme="majorBidi"/>
-                <w:color w:val="FFFFFF" w:themeColor="background1"/>
-                <w:sz w:val="24"/>
-                <w:szCs w:val="24"/>
+                <w:b/>
+                <w:bCs/>
+                <w:color w:val="716254"/>
+                <w:sz w:val="20"/>
+                <w:szCs w:val="20"/>
               </w:rPr>
             </w:pPr>
             <w:r>
               <w:rPr>
                 <w:rFonts w:asciiTheme="majorBidi" w:hAnsiTheme="majorBidi" w:cstheme="majorBidi"/>
-                <w:color w:val="FFFFFF" w:themeColor="background1"/>
-                <w:sz w:val="24"/>
-                <w:szCs w:val="24"/>
-                <w:rtl/>
-              </w:rPr>
-              <w:t xml:space="preserve">التاريخ</w:t>
+                <w:b/>
+                <w:bCs/>
+                <w:color w:val="716254"/>
+                <w:sz w:val="20"/>
+                <w:szCs w:val="20"/>
+                <w:rtl/>
+              </w:rPr>
+              <w:t>الإدارة المعنية</w:t>
             </w:r>
           </w:p>
         </w:tc>
         <w:tc>
           <w:tcPr>
-            <w:tcW w:w="4236" w:type="pct"/>
+            <w:tcW w:w="3776" w:type="dxa"/>
             <w:tcBorders>
-              <w:top w:val="single" w:sz="4" w:space="0" w:color="auto"/>
-              <w:left w:val="single" w:sz="4" w:space="0" w:color="auto"/>
-              <w:bottom w:val="single" w:sz="4" w:space="0" w:color="auto"/>
-              <w:right w:val="single" w:sz="4" w:space="0" w:color="auto"/>
+              <w:top w:val="single" w:sz="4" w:space="0" w:color="BFBFBF" w:themeColor="background1" w:themeShade="BF"/>
+              <w:bottom w:val="single" w:sz="4" w:space="0" w:color="BFBFBF" w:themeColor="background1" w:themeShade="BF"/>
             </w:tcBorders>
             <w:vAlign w:val="center"/>
           </w:tcPr>
@@ -178,42 +292,15 @@
                 <w:rFonts w:asciiTheme="majorBidi" w:hAnsiTheme="majorBidi" w:cstheme="majorBidi"/>
                 <w:sz w:val="20"/>
                 <w:szCs w:val="20"/>
+                <w:rtl/>
                 <w:lang w:bidi="ar-JO"/>
               </w:rPr>
             </w:pPr>
-            <w:r>
-              <w:rPr>
-                <w:rFonts w:asciiTheme="majorBidi" w:hAnsiTheme="majorBidi" w:cstheme="majorBidi"/>
-                <w:sz w:val="20"/>
-                <w:szCs w:val="20"/>
-                <w:lang w:bidi="ar-JO"/>
-              </w:rPr>
-              <w:t xml:space="preserve"> </w:t>
-            </w:r>
-            <w:r>
-              <w:rPr>
-                <w:rFonts w:asciiTheme="majorBidi" w:hAnsiTheme="majorBidi" w:cstheme="majorBidi"/>
-                <w:sz w:val="20"/>
-                <w:szCs w:val="20"/>
-                <w:rtl/>
-                <w:lang w:bidi="ar-JO"/>
-              </w:rPr>
-              <w:t xml:space="preserve">الموافق 2026-05-12م</w:t>
-            </w:r>
           </w:p>
         </w:tc>
-      </w:tr>
-      <w:tr>
-        <w:trPr>
-          <w:trHeight w:val="432"/>
-        </w:trPr>
         <w:tc>
           <w:tcPr>
-            <w:tcW w:w="764" w:type="pct"/>
-            <w:tcBorders>
-              <w:right w:val="single" w:sz="4" w:space="0" w:color="auto"/>
-            </w:tcBorders>
-            <w:shd w:val="clear" w:color="auto" w:fill="1F3864"/>
+            <w:tcW w:w="1001" w:type="dxa"/>
             <w:vAlign w:val="center"/>
           </w:tcPr>
           <w:p>
@@ -223,34 +310,36 @@
                 <w:tab w:val="center" w:pos="5256"/>
               </w:tabs>
               <w:bidi/>
-              <w:ind w:right="162"/>
-              <w:rPr>
-                <w:rFonts w:asciiTheme="majorBidi" w:hAnsiTheme="majorBidi" w:cstheme="majorBidi"/>
-                <w:color w:val="FFFFFF" w:themeColor="background1"/>
-                <w:sz w:val="24"/>
-                <w:szCs w:val="24"/>
+              <w:ind w:left="341" w:right="-113"/>
+              <w:rPr>
+                <w:rFonts w:asciiTheme="majorBidi" w:hAnsiTheme="majorBidi" w:cstheme="majorBidi"/>
+                <w:b/>
+                <w:bCs/>
+                <w:color w:val="716254"/>
+                <w:sz w:val="20"/>
+                <w:szCs w:val="20"/>
               </w:rPr>
             </w:pPr>
             <w:r>
               <w:rPr>
                 <w:rFonts w:asciiTheme="majorBidi" w:hAnsiTheme="majorBidi" w:cstheme="majorBidi"/>
-                <w:color w:val="FFFFFF" w:themeColor="background1"/>
-                <w:sz w:val="24"/>
-                <w:szCs w:val="24"/>
-                <w:rtl/>
-              </w:rPr>
-              <w:t>المكان</w:t>
+                <w:b/>
+                <w:bCs/>
+                <w:color w:val="716254"/>
+                <w:sz w:val="20"/>
+                <w:szCs w:val="20"/>
+                <w:rtl/>
+              </w:rPr>
+              <w:t>التاريخ</w:t>
             </w:r>
           </w:p>
         </w:tc>
         <w:tc>
           <w:tcPr>
-            <w:tcW w:w="4236" w:type="pct"/>
+            <w:tcW w:w="3236" w:type="dxa"/>
             <w:tcBorders>
-              <w:top w:val="single" w:sz="4" w:space="0" w:color="auto"/>
-              <w:left w:val="single" w:sz="4" w:space="0" w:color="auto"/>
-              <w:bottom w:val="single" w:sz="4" w:space="0" w:color="auto"/>
-              <w:right w:val="single" w:sz="4" w:space="0" w:color="auto"/>
+              <w:top w:val="single" w:sz="4" w:space="0" w:color="BFBFBF" w:themeColor="background1" w:themeShade="BF"/>
+              <w:bottom w:val="single" w:sz="4" w:space="0" w:color="BFBFBF" w:themeColor="background1" w:themeShade="BF"/>
             </w:tcBorders>
             <w:vAlign w:val="center"/>
           </w:tcPr>
@@ -264,17 +353,33 @@
               <w:ind w:right="162"/>
               <w:rPr>
                 <w:rFonts w:asciiTheme="majorBidi" w:hAnsiTheme="majorBidi" w:cstheme="majorBidi"/>
-                <w:sz w:val="20"/>
-                <w:szCs w:val="20"/>
+                <w:b/>
+                <w:bCs/>
+                <w:sz w:val="20"/>
+                <w:szCs w:val="20"/>
+                <w:rtl/>
               </w:rPr>
             </w:pPr>
             <w:r>
               <w:rPr>
                 <w:rFonts w:asciiTheme="majorBidi" w:hAnsiTheme="majorBidi" w:cstheme="majorBidi"/>
-                <w:sz w:val="20"/>
-                <w:szCs w:val="20"/>
-              </w:rPr>
-              <w:t xml:space="preserve">حضوري</w:t>
+                <w:b/>
+                <w:bCs/>
+                <w:sz w:val="20"/>
+                <w:szCs w:val="20"/>
+                <w:rtl/>
+              </w:rPr>
+              <w:t xml:space="preserve">١٣/١١/١٤٤٧هـ الموافق </w:t>
+            </w:r>
+            <w:r>
+              <w:rPr>
+                <w:rFonts w:asciiTheme="majorBidi" w:hAnsiTheme="majorBidi" w:cstheme="majorBidi"/>
+                <w:b/>
+                <w:bCs/>
+                <w:sz w:val="20"/>
+                <w:szCs w:val="20"/>
+              </w:rPr>
+              <w:t xml:space="preserve">2026-05-25</w:t>
             </w:r>
           </w:p>
         </w:tc>
@@ -285,11 +390,7 @@
         </w:trPr>
         <w:tc>
           <w:tcPr>
-            <w:tcW w:w="764" w:type="pct"/>
-            <w:tcBorders>
-              <w:right w:val="single" w:sz="4" w:space="0" w:color="auto"/>
-            </w:tcBorders>
-            <w:shd w:val="clear" w:color="auto" w:fill="1F3864"/>
+            <w:tcW w:w="1899" w:type="dxa"/>
             <w:vAlign w:val="center"/>
           </w:tcPr>
           <w:p>
@@ -302,34 +403,33 @@
               <w:ind w:right="162"/>
               <w:rPr>
                 <w:rFonts w:asciiTheme="majorBidi" w:hAnsiTheme="majorBidi" w:cstheme="majorBidi"/>
-                <w:color w:val="FFFFFF" w:themeColor="background1"/>
-                <w:sz w:val="24"/>
-                <w:szCs w:val="24"/>
-                <w:rtl/>
-                <w:lang w:bidi="ar-JO"/>
+                <w:b/>
+                <w:bCs/>
+                <w:color w:val="716254"/>
+                <w:sz w:val="20"/>
+                <w:szCs w:val="20"/>
               </w:rPr>
             </w:pPr>
             <w:r>
               <w:rPr>
                 <w:rFonts w:asciiTheme="majorBidi" w:hAnsiTheme="majorBidi" w:cstheme="majorBidi"/>
-                <w:color w:val="FFFFFF" w:themeColor="background1"/>
-                <w:sz w:val="24"/>
-                <w:szCs w:val="24"/>
-                <w:rtl/>
-                <w:lang w:bidi="ar-JO"/>
-              </w:rPr>
-              <w:t>الاجتماع القادم</w:t>
+                <w:b/>
+                <w:bCs/>
+                <w:color w:val="716254"/>
+                <w:sz w:val="20"/>
+                <w:szCs w:val="20"/>
+                <w:rtl/>
+              </w:rPr>
+              <w:t>الجهة الطالبة للاجتماع</w:t>
             </w:r>
           </w:p>
         </w:tc>
         <w:tc>
           <w:tcPr>
-            <w:tcW w:w="4236" w:type="pct"/>
+            <w:tcW w:w="3776" w:type="dxa"/>
             <w:tcBorders>
-              <w:top w:val="single" w:sz="4" w:space="0" w:color="auto"/>
-              <w:left w:val="single" w:sz="4" w:space="0" w:color="auto"/>
-              <w:bottom w:val="single" w:sz="4" w:space="0" w:color="auto"/>
-              <w:right w:val="single" w:sz="4" w:space="0" w:color="auto"/>
+              <w:top w:val="single" w:sz="4" w:space="0" w:color="BFBFBF" w:themeColor="background1" w:themeShade="BF"/>
+              <w:bottom w:val="single" w:sz="4" w:space="0" w:color="BFBFBF" w:themeColor="background1" w:themeShade="BF"/>
             </w:tcBorders>
             <w:vAlign w:val="center"/>
           </w:tcPr>
@@ -343,28 +443,449 @@
               <w:ind w:right="162"/>
               <w:rPr>
                 <w:rFonts w:asciiTheme="majorBidi" w:hAnsiTheme="majorBidi" w:cstheme="majorBidi"/>
+                <w:b/>
+                <w:bCs/>
                 <w:sz w:val="20"/>
                 <w:szCs w:val="20"/>
               </w:rPr>
             </w:pPr>
             <w:r>
               <w:rPr>
-                <w:rFonts w:asciiTheme="majorBidi" w:hAnsiTheme="majorBidi" w:cstheme="majorBidi"/>
-                <w:sz w:val="20"/>
-                <w:szCs w:val="20"/>
-                <w:lang w:bidi="ar-JO"/>
-              </w:rPr>
-              <w:t xml:space="preserve"/>
-            </w:r>
-            <w:r>
-              <w:rPr>
-                <w:rFonts w:asciiTheme="majorBidi" w:hAnsiTheme="majorBidi" w:cstheme="majorBidi"/>
-                <w:sz w:val="20"/>
-                <w:szCs w:val="20"/>
-                <w:rtl/>
-                <w:lang w:bidi="ar-JO"/>
-              </w:rPr>
-              <w:t xml:space="preserve">الموافق 2026-05-18م</w:t>
+                <w:rFonts w:asciiTheme="majorBidi" w:hAnsiTheme="majorBidi" w:cstheme="majorBidi" w:hint="cs"/>
+                <w:b/>
+                <w:bCs/>
+                <w:sz w:val="20"/>
+                <w:szCs w:val="20"/>
+                <w:rtl/>
+              </w:rPr>
+              <w:t xml:space="preserve">مكتب إدارة البيانات </w:t>
+            </w:r>
+          </w:p>
+        </w:tc>
+        <w:tc>
+          <w:tcPr>
+            <w:tcW w:w="1001" w:type="dxa"/>
+            <w:vAlign w:val="center"/>
+          </w:tcPr>
+          <w:p>
+            <w:pPr>
+              <w:tabs>
+                <w:tab w:val="left" w:pos="1692"/>
+                <w:tab w:val="center" w:pos="5256"/>
+              </w:tabs>
+              <w:bidi/>
+              <w:ind w:left="341" w:right="-113"/>
+              <w:rPr>
+                <w:rFonts w:asciiTheme="majorBidi" w:hAnsiTheme="majorBidi" w:cstheme="majorBidi"/>
+                <w:b/>
+                <w:bCs/>
+                <w:color w:val="716254"/>
+                <w:sz w:val="20"/>
+                <w:szCs w:val="20"/>
+              </w:rPr>
+            </w:pPr>
+            <w:r>
+              <w:rPr>
+                <w:rFonts w:asciiTheme="majorBidi" w:hAnsiTheme="majorBidi" w:cstheme="majorBidi"/>
+                <w:b/>
+                <w:bCs/>
+                <w:color w:val="716254"/>
+                <w:sz w:val="20"/>
+                <w:szCs w:val="20"/>
+                <w:rtl/>
+              </w:rPr>
+              <w:t>الوقت</w:t>
+            </w:r>
+          </w:p>
+        </w:tc>
+        <w:tc>
+          <w:tcPr>
+            <w:tcW w:w="3236" w:type="dxa"/>
+            <w:tcBorders>
+              <w:top w:val="single" w:sz="4" w:space="0" w:color="BFBFBF" w:themeColor="background1" w:themeShade="BF"/>
+              <w:bottom w:val="single" w:sz="4" w:space="0" w:color="BFBFBF" w:themeColor="background1" w:themeShade="BF"/>
+            </w:tcBorders>
+            <w:vAlign w:val="center"/>
+          </w:tcPr>
+          <w:p>
+            <w:pPr>
+              <w:tabs>
+                <w:tab w:val="left" w:pos="1692"/>
+                <w:tab w:val="center" w:pos="5256"/>
+              </w:tabs>
+              <w:bidi/>
+              <w:ind w:right="162"/>
+              <w:rPr>
+                <w:rFonts w:asciiTheme="majorBidi" w:hAnsiTheme="majorBidi" w:cstheme="majorBidi"/>
+                <w:b/>
+                <w:bCs/>
+                <w:sz w:val="20"/>
+                <w:szCs w:val="20"/>
+              </w:rPr>
+            </w:pPr>
+            <w:r>
+              <w:rPr>
+                <w:rFonts w:asciiTheme="majorBidi" w:hAnsiTheme="majorBidi" w:cstheme="majorBidi" w:hint="cs"/>
+                <w:b/>
+                <w:bCs/>
+                <w:sz w:val="20"/>
+                <w:szCs w:val="20"/>
+                <w:rtl/>
+              </w:rPr>
+              <w:t>2</w:t>
+            </w:r>
+            <w:r>
+              <w:rPr>
+                <w:rFonts w:asciiTheme="majorBidi" w:hAnsiTheme="majorBidi" w:cstheme="majorBidi" w:hint="cs"/>
+                <w:b/>
+                <w:bCs/>
+                <w:sz w:val="20"/>
+                <w:szCs w:val="20"/>
+                <w:rtl/>
+              </w:rPr>
+              <w:t>:00 مساء</w:t>
+            </w:r>
+            <w:r>
+              <w:rPr>
+                <w:rFonts w:asciiTheme="majorBidi" w:hAnsiTheme="majorBidi" w:cstheme="majorBidi" w:hint="cs"/>
+                <w:b/>
+                <w:bCs/>
+                <w:sz w:val="20"/>
+                <w:szCs w:val="20"/>
+                <w:rtl/>
+              </w:rPr>
+              <w:t xml:space="preserve">ً </w:t>
+            </w:r>
+            <w:r>
+              <w:rPr>
+                <w:rFonts w:asciiTheme="majorBidi" w:hAnsiTheme="majorBidi" w:cstheme="majorBidi"/>
+                <w:b/>
+                <w:bCs/>
+                <w:sz w:val="20"/>
+                <w:szCs w:val="20"/>
+                <w:rtl/>
+              </w:rPr>
+              <w:t>–</w:t>
+            </w:r>
+            <w:r>
+              <w:rPr>
+                <w:rFonts w:asciiTheme="majorBidi" w:hAnsiTheme="majorBidi" w:cstheme="majorBidi" w:hint="cs"/>
+                <w:b/>
+                <w:bCs/>
+                <w:sz w:val="20"/>
+                <w:szCs w:val="20"/>
+                <w:rtl/>
+              </w:rPr>
+              <w:t xml:space="preserve"> 3:00 مساءً</w:t>
+            </w:r>
+          </w:p>
+        </w:tc>
+      </w:tr>
+      <w:tr>
+        <w:trPr>
+          <w:trHeight w:val="432"/>
+        </w:trPr>
+        <w:tc>
+          <w:tcPr>
+            <w:tcW w:w="1899" w:type="dxa"/>
+            <w:vAlign w:val="center"/>
+          </w:tcPr>
+          <w:p>
+            <w:pPr>
+              <w:tabs>
+                <w:tab w:val="left" w:pos="1692"/>
+                <w:tab w:val="center" w:pos="5256"/>
+              </w:tabs>
+              <w:bidi/>
+              <w:ind w:right="162"/>
+              <w:rPr>
+                <w:rFonts w:asciiTheme="majorBidi" w:hAnsiTheme="majorBidi" w:cstheme="majorBidi"/>
+                <w:b/>
+                <w:bCs/>
+                <w:color w:val="716254"/>
+                <w:sz w:val="20"/>
+                <w:szCs w:val="20"/>
+              </w:rPr>
+            </w:pPr>
+            <w:r>
+              <w:rPr>
+                <w:rFonts w:asciiTheme="majorBidi" w:hAnsiTheme="majorBidi" w:cstheme="majorBidi"/>
+                <w:b/>
+                <w:bCs/>
+                <w:color w:val="716254"/>
+                <w:sz w:val="20"/>
+                <w:szCs w:val="20"/>
+                <w:rtl/>
+              </w:rPr>
+              <w:t>ميسّر الاجتماع</w:t>
+            </w:r>
+            <w:r>
+              <w:rPr>
+                <w:rFonts w:asciiTheme="majorBidi" w:hAnsiTheme="majorBidi" w:cstheme="majorBidi"/>
+                <w:b/>
+                <w:bCs/>
+                <w:color w:val="716254"/>
+                <w:sz w:val="20"/>
+                <w:szCs w:val="20"/>
+              </w:rPr>
+              <w:t xml:space="preserve"> </w:t>
+            </w:r>
+          </w:p>
+        </w:tc>
+        <w:tc>
+          <w:tcPr>
+            <w:tcW w:w="3776" w:type="dxa"/>
+            <w:tcBorders>
+              <w:top w:val="single" w:sz="4" w:space="0" w:color="BFBFBF" w:themeColor="background1" w:themeShade="BF"/>
+              <w:bottom w:val="single" w:sz="4" w:space="0" w:color="BFBFBF" w:themeColor="background1" w:themeShade="BF"/>
+            </w:tcBorders>
+            <w:vAlign w:val="center"/>
+          </w:tcPr>
+          <w:p>
+            <w:pPr>
+              <w:tabs>
+                <w:tab w:val="left" w:pos="1692"/>
+                <w:tab w:val="center" w:pos="5256"/>
+              </w:tabs>
+              <w:bidi/>
+              <w:ind w:right="162"/>
+              <w:rPr>
+                <w:rFonts w:asciiTheme="majorBidi" w:hAnsiTheme="majorBidi" w:cstheme="majorBidi"/>
+                <w:sz w:val="20"/>
+                <w:szCs w:val="20"/>
+              </w:rPr>
+            </w:pPr>
+          </w:p>
+        </w:tc>
+        <w:tc>
+          <w:tcPr>
+            <w:tcW w:w="1001" w:type="dxa"/>
+            <w:vAlign w:val="center"/>
+          </w:tcPr>
+          <w:p>
+            <w:pPr>
+              <w:tabs>
+                <w:tab w:val="left" w:pos="1692"/>
+                <w:tab w:val="center" w:pos="5256"/>
+              </w:tabs>
+              <w:bidi/>
+              <w:ind w:left="341" w:right="-113"/>
+              <w:rPr>
+                <w:rFonts w:asciiTheme="majorBidi" w:hAnsiTheme="majorBidi" w:cstheme="majorBidi"/>
+                <w:b/>
+                <w:bCs/>
+                <w:color w:val="716254"/>
+                <w:sz w:val="20"/>
+                <w:szCs w:val="20"/>
+              </w:rPr>
+            </w:pPr>
+            <w:r>
+              <w:rPr>
+                <w:rFonts w:asciiTheme="majorBidi" w:hAnsiTheme="majorBidi" w:cstheme="majorBidi"/>
+                <w:b/>
+                <w:bCs/>
+                <w:color w:val="716254"/>
+                <w:sz w:val="20"/>
+                <w:szCs w:val="20"/>
+                <w:rtl/>
+              </w:rPr>
+              <w:t>المدّة</w:t>
+            </w:r>
+          </w:p>
+        </w:tc>
+        <w:tc>
+          <w:tcPr>
+            <w:tcW w:w="3236" w:type="dxa"/>
+            <w:tcBorders>
+              <w:top w:val="single" w:sz="4" w:space="0" w:color="BFBFBF" w:themeColor="background1" w:themeShade="BF"/>
+              <w:bottom w:val="single" w:sz="2" w:space="0" w:color="BFBFBF" w:themeColor="background1" w:themeShade="BF"/>
+            </w:tcBorders>
+            <w:vAlign w:val="center"/>
+          </w:tcPr>
+          <w:p>
+            <w:pPr>
+              <w:tabs>
+                <w:tab w:val="left" w:pos="1692"/>
+                <w:tab w:val="center" w:pos="5256"/>
+              </w:tabs>
+              <w:bidi/>
+              <w:ind w:right="162"/>
+              <w:rPr>
+                <w:rFonts w:asciiTheme="majorBidi" w:hAnsiTheme="majorBidi" w:cstheme="majorBidi"/>
+                <w:b/>
+                <w:bCs/>
+                <w:sz w:val="20"/>
+                <w:szCs w:val="20"/>
+              </w:rPr>
+            </w:pPr>
+            <w:r>
+              <w:rPr>
+                <w:rFonts w:asciiTheme="majorBidi" w:hAnsiTheme="majorBidi" w:cstheme="majorBidi" w:hint="cs"/>
+                <w:b/>
+                <w:bCs/>
+                <w:sz w:val="20"/>
+                <w:szCs w:val="20"/>
+                <w:rtl/>
+              </w:rPr>
+              <w:t xml:space="preserve">ساعة </w:t>
+            </w:r>
+          </w:p>
+        </w:tc>
+      </w:tr>
+      <w:tr>
+        <w:trPr>
+          <w:trHeight w:val="432"/>
+        </w:trPr>
+        <w:tc>
+          <w:tcPr>
+            <w:tcW w:w="1899" w:type="dxa"/>
+            <w:tcBorders>
+              <w:bottom w:val="single" w:sz="2" w:space="0" w:color="BFBFBF" w:themeColor="background1" w:themeShade="BF"/>
+            </w:tcBorders>
+            <w:vAlign w:val="center"/>
+          </w:tcPr>
+          <w:p>
+            <w:pPr>
+              <w:tabs>
+                <w:tab w:val="left" w:pos="1692"/>
+                <w:tab w:val="center" w:pos="5256"/>
+              </w:tabs>
+              <w:bidi/>
+              <w:ind w:right="162"/>
+              <w:rPr>
+                <w:rFonts w:asciiTheme="majorBidi" w:hAnsiTheme="majorBidi" w:cstheme="majorBidi"/>
+                <w:b/>
+                <w:bCs/>
+                <w:color w:val="716254"/>
+                <w:sz w:val="20"/>
+                <w:szCs w:val="20"/>
+              </w:rPr>
+            </w:pPr>
+            <w:r>
+              <w:rPr>
+                <w:rFonts w:asciiTheme="majorBidi" w:hAnsiTheme="majorBidi" w:cstheme="majorBidi"/>
+                <w:b/>
+                <w:bCs/>
+                <w:color w:val="716254"/>
+                <w:sz w:val="20"/>
+                <w:szCs w:val="20"/>
+                <w:rtl/>
+              </w:rPr>
+              <w:t>معد من قبل</w:t>
+            </w:r>
+          </w:p>
+        </w:tc>
+        <w:tc>
+          <w:tcPr>
+            <w:tcW w:w="3776" w:type="dxa"/>
+            <w:tcBorders>
+              <w:top w:val="single" w:sz="4" w:space="0" w:color="BFBFBF" w:themeColor="background1" w:themeShade="BF"/>
+              <w:bottom w:val="single" w:sz="2" w:space="0" w:color="BFBFBF" w:themeColor="background1" w:themeShade="BF"/>
+            </w:tcBorders>
+            <w:vAlign w:val="center"/>
+          </w:tcPr>
+          <w:p>
+            <w:pPr>
+              <w:tabs>
+                <w:tab w:val="left" w:pos="1692"/>
+                <w:tab w:val="center" w:pos="5256"/>
+              </w:tabs>
+              <w:bidi/>
+              <w:ind w:right="162"/>
+              <w:rPr>
+                <w:rFonts w:asciiTheme="majorBidi" w:hAnsiTheme="majorBidi" w:cstheme="majorBidi"/>
+                <w:b/>
+                <w:bCs/>
+                <w:sz w:val="20"/>
+                <w:szCs w:val="20"/>
+              </w:rPr>
+            </w:pPr>
+            <w:r>
+              <w:rPr>
+                <w:rFonts w:asciiTheme="majorBidi" w:hAnsiTheme="majorBidi" w:cstheme="majorBidi" w:hint="cs"/>
+                <w:b/>
+                <w:bCs/>
+                <w:sz w:val="20"/>
+                <w:szCs w:val="20"/>
+                <w:rtl/>
+              </w:rPr>
+              <w:t xml:space="preserve">عهد القحطاني </w:t>
+            </w:r>
+          </w:p>
+        </w:tc>
+        <w:tc>
+          <w:tcPr>
+            <w:tcW w:w="1001" w:type="dxa"/>
+            <w:tcBorders>
+              <w:bottom w:val="single" w:sz="2" w:space="0" w:color="BFBFBF" w:themeColor="background1" w:themeShade="BF"/>
+            </w:tcBorders>
+            <w:vAlign w:val="center"/>
+          </w:tcPr>
+          <w:p>
+            <w:pPr>
+              <w:tabs>
+                <w:tab w:val="left" w:pos="1692"/>
+                <w:tab w:val="center" w:pos="5256"/>
+              </w:tabs>
+              <w:bidi/>
+              <w:ind w:left="341" w:right="-113"/>
+              <w:rPr>
+                <w:rFonts w:asciiTheme="majorBidi" w:hAnsiTheme="majorBidi" w:cstheme="majorBidi"/>
+                <w:b/>
+                <w:bCs/>
+                <w:color w:val="716254"/>
+                <w:sz w:val="20"/>
+                <w:szCs w:val="20"/>
+              </w:rPr>
+            </w:pPr>
+            <w:r>
+              <w:rPr>
+                <w:rFonts w:asciiTheme="majorBidi" w:hAnsiTheme="majorBidi" w:cstheme="majorBidi"/>
+                <w:b/>
+                <w:bCs/>
+                <w:color w:val="716254"/>
+                <w:sz w:val="20"/>
+                <w:szCs w:val="20"/>
+                <w:rtl/>
+              </w:rPr>
+              <w:t>المكان</w:t>
+            </w:r>
+          </w:p>
+        </w:tc>
+        <w:tc>
+          <w:tcPr>
+            <w:tcW w:w="3236" w:type="dxa"/>
+            <w:tcBorders>
+              <w:top w:val="single" w:sz="2" w:space="0" w:color="BFBFBF" w:themeColor="background1" w:themeShade="BF"/>
+              <w:bottom w:val="single" w:sz="2" w:space="0" w:color="BFBFBF" w:themeColor="background1" w:themeShade="BF"/>
+            </w:tcBorders>
+            <w:vAlign w:val="center"/>
+          </w:tcPr>
+          <w:p>
+            <w:pPr>
+              <w:tabs>
+                <w:tab w:val="left" w:pos="1692"/>
+                <w:tab w:val="center" w:pos="5256"/>
+              </w:tabs>
+              <w:bidi/>
+              <w:ind w:right="162"/>
+              <w:rPr>
+                <w:rFonts w:asciiTheme="majorBidi" w:hAnsiTheme="majorBidi" w:cstheme="majorBidi"/>
+                <w:b/>
+                <w:bCs/>
+                <w:sz w:val="20"/>
+                <w:szCs w:val="20"/>
+              </w:rPr>
+            </w:pPr>
+            <w:r>
+              <w:rPr>
+                <w:rFonts w:asciiTheme="majorBidi" w:hAnsiTheme="majorBidi" w:cstheme="majorBidi"/>
+                <w:b/>
+                <w:bCs/>
+                <w:sz w:val="20"/>
+                <w:szCs w:val="20"/>
+              </w:rPr>
+              <w:t xml:space="preserve">in-person</w:t>
             </w:r>
           </w:p>
         </w:tc>
@@ -372,35 +893,20 @@
     </w:tbl>
     <w:p>
       <w:pPr>
-        <w:pBdr>
-          <w:bottom w:val="single" w:sz="6" w:space="1" w:color="2E75B6"/>
-        </w:pBdr>
         <w:bidi/>
-        <w:spacing w:before="320"/>
+        <w:jc w:val="right"/>
         <w:rPr>
           <w:rFonts w:asciiTheme="majorBidi" w:hAnsiTheme="majorBidi" w:cstheme="majorBidi"/>
-          <w:sz w:val="32"/>
+          <w:sz w:val="28"/>
           <w:szCs w:val="32"/>
           <w:rtl/>
         </w:rPr>
       </w:pPr>
-      <w:r>
-        <w:rPr>
-          <w:rFonts w:asciiTheme="majorBidi" w:hAnsiTheme="majorBidi" w:cstheme="majorBidi"/>
-          <w:b/>
-          <w:bCs/>
-          <w:color w:val="1F3864"/>
-          <w:sz w:val="36"/>
-          <w:szCs w:val="36"/>
-          <w:rtl/>
-        </w:rPr>
-        <w:t>الحضور</w:t>
-      </w:r>
     </w:p>
     <w:tbl>
       <w:tblPr>
-        <w:tblW w:w="4935" w:type="pct"/>
-        <w:tblInd w:w="137" w:type="dxa"/>
+        <w:tblW w:w="0" w:type="auto"/>
+        <w:tblInd w:w="175" w:type="dxa"/>
         <w:tblBorders>
           <w:top w:val="single" w:sz="4" w:space="0" w:color="866A3F" w:themeColor="accent4" w:themeShade="80"/>
           <w:left w:val="single" w:sz="4" w:space="0" w:color="866A3F" w:themeColor="accent4" w:themeShade="80"/>
@@ -409,6 +915,7 @@
           <w:insideH w:val="single" w:sz="4" w:space="0" w:color="866A3F" w:themeColor="accent4" w:themeShade="80"/>
           <w:insideV w:val="single" w:sz="4" w:space="0" w:color="866A3F" w:themeColor="accent4" w:themeShade="80"/>
         </w:tblBorders>
+        <w:tblLayout w:type="fixed"/>
         <w:tblCellMar>
           <w:left w:w="0" w:type="dxa"/>
           <w:right w:w="0" w:type="dxa"/>
@@ -416,9 +923,8 @@
         <w:tblLook w:val="0420" w:firstRow="1" w:lastRow="0" w:firstColumn="0" w:lastColumn="0" w:noHBand="0" w:noVBand="1"/>
       </w:tblPr>
       <w:tblGrid>
-        <w:gridCol w:w="3686"/>
-        <w:gridCol w:w="3261"/>
-        <w:gridCol w:w="3418"/>
+        <w:gridCol w:w="5017"/>
+        <w:gridCol w:w="4973"/>
       </w:tblGrid>
       <w:tr>
         <w:trPr>
@@ -426,8 +932,59 @@
         </w:trPr>
         <w:tc>
           <w:tcPr>
-            <w:tcW w:w="1778" w:type="pct"/>
-            <w:shd w:val="clear" w:color="auto" w:fill="1F3864"/>
+            <w:tcW w:w="9990" w:type="dxa"/>
+            <w:gridSpan w:val="2"/>
+            <w:shd w:val="clear" w:color="auto" w:fill="A79F88"/>
+            <w:tcMar>
+              <w:top w:w="72" w:type="dxa"/>
+              <w:left w:w="144" w:type="dxa"/>
+              <w:bottom w:w="72" w:type="dxa"/>
+              <w:right w:w="144" w:type="dxa"/>
+            </w:tcMar>
+            <w:hideMark/>
+          </w:tcPr>
+          <w:p>
+            <w:pPr>
+              <w:tabs>
+                <w:tab w:val="left" w:pos="1692"/>
+                <w:tab w:val="center" w:pos="5256"/>
+              </w:tabs>
+              <w:bidi/>
+              <w:spacing w:after="0" w:line="240" w:lineRule="auto"/>
+              <w:ind w:right="162"/>
+              <w:jc w:val="center"/>
+              <w:rPr>
+                <w:rFonts w:asciiTheme="majorBidi" w:hAnsiTheme="majorBidi" w:cstheme="majorBidi"/>
+                <w:b/>
+                <w:bCs/>
+                <w:color w:val="FFFFFF" w:themeColor="background1"/>
+                <w:sz w:val="28"/>
+                <w:szCs w:val="28"/>
+              </w:rPr>
+            </w:pPr>
+            <w:r>
+              <w:rPr>
+                <w:rFonts w:asciiTheme="majorBidi" w:hAnsiTheme="majorBidi" w:cstheme="majorBidi"/>
+                <w:b/>
+                <w:bCs/>
+                <w:color w:val="FFFFFF" w:themeColor="background1"/>
+                <w:sz w:val="28"/>
+                <w:szCs w:val="28"/>
+                <w:rtl/>
+              </w:rPr>
+              <w:t>الحضور</w:t>
+            </w:r>
+          </w:p>
+        </w:tc>
+      </w:tr>
+      <w:tr>
+        <w:trPr>
+          <w:trHeight w:val="195"/>
+        </w:trPr>
+        <w:tc>
+          <w:tcPr>
+            <w:tcW w:w="5017" w:type="dxa"/>
+            <w:shd w:val="clear" w:color="auto" w:fill="F0EAE0"/>
             <w:tcMar>
               <w:top w:w="72" w:type="dxa"/>
               <w:left w:w="144" w:type="dxa"/>
@@ -449,7 +1006,7 @@
                 <w:rFonts w:asciiTheme="majorBidi" w:hAnsiTheme="majorBidi" w:cstheme="majorBidi"/>
                 <w:b/>
                 <w:bCs/>
-                <w:color w:val="FFFFFF" w:themeColor="background1"/>
+                <w:color w:val="564812" w:themeColor="accent5" w:themeShade="80"/>
                 <w:sz w:val="24"/>
                 <w:szCs w:val="24"/>
               </w:rPr>
@@ -459,7 +1016,7 @@
                 <w:rFonts w:asciiTheme="majorBidi" w:hAnsiTheme="majorBidi" w:cstheme="majorBidi"/>
                 <w:b/>
                 <w:bCs/>
-                <w:color w:val="FFFFFF" w:themeColor="background1"/>
+                <w:color w:val="564812" w:themeColor="accent5" w:themeShade="80"/>
                 <w:sz w:val="24"/>
                 <w:szCs w:val="24"/>
                 <w:rtl/>
@@ -470,8 +1027,8 @@
         </w:tc>
         <w:tc>
           <w:tcPr>
-            <w:tcW w:w="1573" w:type="pct"/>
-            <w:shd w:val="clear" w:color="auto" w:fill="1F3864"/>
+            <w:tcW w:w="4973" w:type="dxa"/>
+            <w:shd w:val="clear" w:color="auto" w:fill="F0EAE0"/>
           </w:tcPr>
           <w:p>
             <w:pPr>
@@ -487,11 +1044,9 @@
                 <w:rFonts w:asciiTheme="majorBidi" w:hAnsiTheme="majorBidi" w:cstheme="majorBidi"/>
                 <w:b/>
                 <w:bCs/>
-                <w:color w:val="FFFFFF" w:themeColor="background1"/>
+                <w:color w:val="564812" w:themeColor="accent5" w:themeShade="80"/>
                 <w:sz w:val="24"/>
                 <w:szCs w:val="24"/>
-                <w:rtl/>
-                <w:lang w:bidi="ar-JO"/>
               </w:rPr>
             </w:pPr>
             <w:r>
@@ -499,20 +1054,53 @@
                 <w:rFonts w:asciiTheme="majorBidi" w:hAnsiTheme="majorBidi" w:cstheme="majorBidi"/>
                 <w:b/>
                 <w:bCs/>
-                <w:color w:val="FFFFFF" w:themeColor="background1"/>
+                <w:color w:val="564812" w:themeColor="accent5" w:themeShade="80"/>
                 <w:sz w:val="24"/>
                 <w:szCs w:val="24"/>
                 <w:rtl/>
-                <w:lang w:bidi="ar-JO"/>
-              </w:rPr>
-              <w:t>البريد الالكتروني</w:t>
+              </w:rPr>
+              <w:t>ال</w:t>
+            </w:r>
+            <w:r>
+              <w:rPr>
+                <w:rFonts w:asciiTheme="majorBidi" w:hAnsiTheme="majorBidi" w:cstheme="majorBidi"/>
+                <w:b/>
+                <w:bCs/>
+                <w:color w:val="564812" w:themeColor="accent5" w:themeShade="80"/>
+                <w:sz w:val="24"/>
+                <w:szCs w:val="24"/>
+                <w:rtl/>
+              </w:rPr>
+              <w:t>ا</w:t>
+            </w:r>
+            <w:r>
+              <w:rPr>
+                <w:rFonts w:asciiTheme="majorBidi" w:hAnsiTheme="majorBidi" w:cstheme="majorBidi"/>
+                <w:b/>
+                <w:bCs/>
+                <w:color w:val="564812" w:themeColor="accent5" w:themeShade="80"/>
+                <w:sz w:val="24"/>
+                <w:szCs w:val="24"/>
+                <w:rtl/>
+              </w:rPr>
+              <w:t xml:space="preserve">سم</w:t>
             </w:r>
           </w:p>
         </w:tc>
+      </w:tr>
+      <w:tr>
+        <w:trPr>
+          <w:trHeight w:val="265"/>
+        </w:trPr>
         <w:tc>
           <w:tcPr>
-            <w:tcW w:w="1649" w:type="pct"/>
-            <w:shd w:val="clear" w:color="auto" w:fill="1F3864"/>
+            <w:tcW w:w="5017" w:type="dxa"/>
+            <w:tcMar>
+              <w:top w:w="72" w:type="dxa"/>
+              <w:left w:w="144" w:type="dxa"/>
+              <w:bottom w:w="72" w:type="dxa"/>
+              <w:right w:w="144" w:type="dxa"/>
+            </w:tcMar>
           </w:tcPr>
           <w:p>
             <w:pPr>
@@ -523,27 +1111,46 @@
               <w:bidi/>
               <w:spacing w:after="0" w:line="240" w:lineRule="auto"/>
               <w:ind w:right="162"/>
-              <w:jc w:val="center"/>
-              <w:rPr>
-                <w:rFonts w:asciiTheme="majorBidi" w:hAnsiTheme="majorBidi" w:cstheme="majorBidi"/>
-                <w:b/>
-                <w:bCs/>
-                <w:color w:val="FFFFFF" w:themeColor="background1"/>
-                <w:sz w:val="24"/>
-                <w:szCs w:val="24"/>
+              <w:rPr>
+                <w:rFonts w:asciiTheme="majorBidi" w:hAnsiTheme="majorBidi" w:cstheme="majorBidi"/>
+                <w:sz w:val="20"/>
+                <w:szCs w:val="20"/>
               </w:rPr>
             </w:pPr>
-            <w:r>
-              <w:rPr>
-                <w:rFonts w:asciiTheme="majorBidi" w:hAnsiTheme="majorBidi" w:cstheme="majorBidi"/>
-                <w:b/>
-                <w:bCs/>
-                <w:color w:val="FFFFFF" w:themeColor="background1"/>
-                <w:sz w:val="24"/>
-                <w:szCs w:val="24"/>
-                <w:rtl/>
-              </w:rPr>
-              <w:t>الاسم</w:t>
+          </w:p>
+        </w:tc>
+        <w:tc>
+          <w:tcPr>
+            <w:tcW w:w="4973" w:type="dxa"/>
+          </w:tcPr>
+          <w:p>
+            <w:pPr>
+              <w:pStyle w:val="ListParagraph"/>
+              <w:tabs>
+                <w:tab w:val="left" w:pos="1692"/>
+              </w:tabs>
+              <w:bidi/>
+              <w:spacing w:after="0" w:line="240" w:lineRule="auto"/>
+              <w:ind w:left="2052" w:right="162"/>
+              <w:rPr>
+                <w:rFonts w:asciiTheme="majorBidi" w:hAnsiTheme="majorBidi" w:cstheme="majorBidi"/>
+                <w:b/>
+                <w:bCs/>
+                <w:sz w:val="20"/>
+                <w:szCs w:val="20"/>
+                <w:rtl/>
+              </w:rPr>
+            </w:pPr>
+            <w:r>
+              <w:rPr>
+                <w:rFonts w:asciiTheme="majorBidi" w:hAnsiTheme="majorBidi" w:cs="Times New Roman"/>
+                <w:b/>
+                <w:bCs/>
+                <w:sz w:val="20"/>
+                <w:szCs w:val="20"/>
+                <w:rtl/>
+              </w:rPr>
+              <w:t xml:space="preserve"/>
             </w:r>
           </w:p>
         </w:tc>
@@ -554,14 +1161,13 @@
         </w:trPr>
         <w:tc>
           <w:tcPr>
-            <w:tcW w:w="1778" w:type="pct"/>
+            <w:tcW w:w="5017" w:type="dxa"/>
             <w:tcMar>
               <w:top w:w="72" w:type="dxa"/>
               <w:left w:w="144" w:type="dxa"/>
               <w:bottom w:w="72" w:type="dxa"/>
               <w:right w:w="144" w:type="dxa"/>
             </w:tcMar>
-            <w:vAlign w:val="center"/>
           </w:tcPr>
           <w:p>
             <w:pPr>
@@ -581,16 +1187,18 @@
             </w:pPr>
             <w:r>
               <w:rPr>
-                <w:rFonts w:asciiTheme="majorBidi" w:hAnsiTheme="majorBidi" w:cstheme="majorBidi"/>
-              </w:rPr>
-              <w:t xml:space="preserve"/>
+                <w:rFonts w:asciiTheme="majorBidi" w:hAnsiTheme="majorBidi" w:cs="Times New Roman"/>
+                <w:sz w:val="20"/>
+                <w:szCs w:val="20"/>
+                <w:rtl/>
+              </w:rPr>
+              <w:t xml:space="preserve">Chief Data Management Officer</w:t>
             </w:r>
           </w:p>
         </w:tc>
         <w:tc>
           <w:tcPr>
-            <w:tcW w:w="1573" w:type="pct"/>
-            <w:vAlign w:val="center"/>
+            <w:tcW w:w="4973" w:type="dxa"/>
           </w:tcPr>
           <w:p>
             <w:pPr>
@@ -603,6 +1211,8 @@
               <w:ind w:right="162"/>
               <w:rPr>
                 <w:rFonts w:asciiTheme="majorBidi" w:hAnsiTheme="majorBidi" w:cstheme="majorBidi"/>
+                <w:b/>
+                <w:bCs/>
                 <w:sz w:val="20"/>
                 <w:szCs w:val="20"/>
                 <w:rtl/>
@@ -610,16 +1220,31 @@
             </w:pPr>
             <w:r>
               <w:rPr>
-                <w:rFonts w:asciiTheme="majorBidi" w:hAnsiTheme="majorBidi" w:cstheme="majorBidi"/>
-              </w:rPr>
-              <w:t xml:space="preserve"/>
+                <w:rFonts w:asciiTheme="majorBidi" w:hAnsiTheme="majorBidi" w:cs="Times New Roman"/>
+                <w:b/>
+                <w:bCs/>
+                <w:sz w:val="20"/>
+                <w:szCs w:val="20"/>
+                <w:rtl/>
+              </w:rPr>
+              <w:t xml:space="preserve">Adel AlHarbi</w:t>
             </w:r>
           </w:p>
         </w:tc>
+      </w:tr>
+      <w:tr>
+        <w:trPr>
+          <w:trHeight w:val="265"/>
+        </w:trPr>
         <w:tc>
           <w:tcPr>
-            <w:tcW w:w="1649" w:type="pct"/>
-            <w:vAlign w:val="center"/>
+            <w:tcW w:w="5017" w:type="dxa"/>
+            <w:tcMar>
+              <w:top w:w="72" w:type="dxa"/>
+              <w:left w:w="144" w:type="dxa"/>
+              <w:bottom w:w="72" w:type="dxa"/>
+              <w:right w:w="144" w:type="dxa"/>
+            </w:tcMar>
           </w:tcPr>
           <w:p>
             <w:pPr>
@@ -637,29 +1262,11 @@
                 <w:rtl/>
               </w:rPr>
             </w:pPr>
-            <w:r>
-              <w:rPr>
-                <w:rFonts w:asciiTheme="majorBidi" w:hAnsiTheme="majorBidi" w:cstheme="majorBidi"/>
-              </w:rPr>
-              <w:t xml:space="preserve">أحمد</w:t>
-            </w:r>
           </w:p>
         </w:tc>
-      </w:tr>
-      <w:tr>
-        <w:trPr>
-          <w:trHeight w:val="265"/>
-        </w:trPr>
         <w:tc>
           <w:tcPr>
-            <w:tcW w:w="1778" w:type="pct"/>
-            <w:tcMar>
-              <w:top w:w="72" w:type="dxa"/>
-              <w:left w:w="144" w:type="dxa"/>
-              <w:bottom w:w="72" w:type="dxa"/>
-              <w:right w:w="144" w:type="dxa"/>
-            </w:tcMar>
-            <w:vAlign w:val="center"/>
+            <w:tcW w:w="4973" w:type="dxa"/>
           </w:tcPr>
           <w:p>
             <w:pPr>
@@ -672,6 +1279,8 @@
               <w:ind w:right="162"/>
               <w:rPr>
                 <w:rFonts w:asciiTheme="majorBidi" w:hAnsiTheme="majorBidi" w:cstheme="majorBidi"/>
+                <w:b/>
+                <w:bCs/>
                 <w:sz w:val="20"/>
                 <w:szCs w:val="20"/>
                 <w:rtl/>
@@ -679,16 +1288,31 @@
             </w:pPr>
             <w:r>
               <w:rPr>
-                <w:rFonts w:asciiTheme="majorBidi" w:hAnsiTheme="majorBidi" w:cstheme="majorBidi"/>
+                <w:rFonts w:asciiTheme="majorBidi" w:hAnsiTheme="majorBidi" w:cs="Times New Roman"/>
+                <w:b/>
+                <w:bCs/>
+                <w:sz w:val="20"/>
+                <w:szCs w:val="20"/>
+                <w:rtl/>
               </w:rPr>
               <w:t xml:space="preserve"/>
             </w:r>
           </w:p>
         </w:tc>
+      </w:tr>
+      <w:tr>
+        <w:trPr>
+          <w:trHeight w:val="265"/>
+        </w:trPr>
         <w:tc>
           <w:tcPr>
-            <w:tcW w:w="1573" w:type="pct"/>
-            <w:vAlign w:val="center"/>
+            <w:tcW w:w="5017" w:type="dxa"/>
+            <w:tcMar>
+              <w:top w:w="72" w:type="dxa"/>
+              <w:left w:w="144" w:type="dxa"/>
+              <w:bottom w:w="72" w:type="dxa"/>
+              <w:right w:w="144" w:type="dxa"/>
+            </w:tcMar>
           </w:tcPr>
           <w:p>
             <w:pPr>
@@ -708,16 +1332,18 @@
             </w:pPr>
             <w:r>
               <w:rPr>
-                <w:rFonts w:asciiTheme="majorBidi" w:hAnsiTheme="majorBidi" w:cstheme="majorBidi"/>
-              </w:rPr>
-              <w:t xml:space="preserve"/>
+                <w:rFonts w:asciiTheme="majorBidi" w:hAnsiTheme="majorBidi" w:cs="Times New Roman"/>
+                <w:sz w:val="20"/>
+                <w:szCs w:val="20"/>
+                <w:rtl/>
+              </w:rPr>
+              <w:t xml:space="preserve">Consultant</w:t>
             </w:r>
           </w:p>
         </w:tc>
         <w:tc>
           <w:tcPr>
-            <w:tcW w:w="1649" w:type="pct"/>
-            <w:vAlign w:val="center"/>
+            <w:tcW w:w="4973" w:type="dxa"/>
           </w:tcPr>
           <w:p>
             <w:pPr>
@@ -730,6 +1356,8 @@
               <w:ind w:right="162"/>
               <w:rPr>
                 <w:rFonts w:asciiTheme="majorBidi" w:hAnsiTheme="majorBidi" w:cstheme="majorBidi"/>
+                <w:b/>
+                <w:bCs/>
                 <w:sz w:val="20"/>
                 <w:szCs w:val="20"/>
                 <w:rtl/>
@@ -737,302 +1365,31 @@
             </w:pPr>
             <w:r>
               <w:rPr>
-                <w:rFonts w:asciiTheme="majorBidi" w:hAnsiTheme="majorBidi" w:cstheme="majorBidi"/>
-              </w:rPr>
-              <w:t xml:space="preserve">سارة</w:t>
+                <w:rFonts w:asciiTheme="majorBidi" w:hAnsiTheme="majorBidi" w:cs="Times New Roman"/>
+                <w:b/>
+                <w:bCs/>
+                <w:sz w:val="20"/>
+                <w:szCs w:val="20"/>
+                <w:rtl/>
+              </w:rPr>
+              <w:t xml:space="preserve">Faisal Rihani</w:t>
             </w:r>
           </w:p>
         </w:tc>
       </w:tr>
-    </w:tbl>
-    <w:p>
-      <w:pPr>
-        <w:bidi/>
-        <w:jc w:val="center"/>
-        <w:rPr>
-          <w:rFonts w:asciiTheme="majorBidi" w:hAnsiTheme="majorBidi" w:cstheme="majorBidi"/>
-          <w:sz w:val="2"/>
-          <w:szCs w:val="2"/>
-          <w:rtl/>
-        </w:rPr>
-      </w:pPr>
-    </w:p>
-    <w:p>
-      <w:pPr>
-        <w:bidi/>
-        <w:jc w:val="center"/>
-        <w:rPr>
-          <w:rFonts w:asciiTheme="majorBidi" w:hAnsiTheme="majorBidi" w:cstheme="majorBidi"/>
-          <w:sz w:val="2"/>
-          <w:szCs w:val="2"/>
-          <w:rtl/>
-        </w:rPr>
-      </w:pPr>
-    </w:p>
-    <w:p>
-      <w:pPr>
-        <w:pBdr>
-          <w:bottom w:val="single" w:sz="6" w:space="1" w:color="2E75B6"/>
-        </w:pBdr>
-        <w:bidi/>
-        <w:spacing w:before="320"/>
-        <w:rPr>
-          <w:rFonts w:asciiTheme="majorBidi" w:hAnsiTheme="majorBidi" w:cstheme="majorBidi"/>
-          <w:sz w:val="32"/>
-          <w:szCs w:val="32"/>
-          <w:rtl/>
-          <w:lang w:bidi="ar-JO"/>
-        </w:rPr>
-      </w:pPr>
-      <w:r>
-        <w:rPr>
-          <w:rFonts w:asciiTheme="majorBidi" w:hAnsiTheme="majorBidi" w:cstheme="majorBidi"/>
-          <w:b/>
-          <w:bCs/>
-          <w:color w:val="1F3864"/>
-          <w:sz w:val="36"/>
-          <w:szCs w:val="36"/>
-          <w:rtl/>
-          <w:lang w:bidi="ar-JO"/>
-        </w:rPr>
-        <w:t>الهدف من الإجتماع</w:t>
-      </w:r>
-    </w:p>
-    <w:p>
-      <w:pPr>
-        <w:bidi/>
-        <w:jc w:val="center"/>
-        <w:rPr>
-          <w:rFonts w:asciiTheme="majorBidi" w:hAnsiTheme="majorBidi" w:cstheme="majorBidi"/>
-          <w:sz w:val="2"/>
-          <w:szCs w:val="2"/>
-          <w:rtl/>
-        </w:rPr>
-      </w:pPr>
-    </w:p>
-    <w:p>
-      <w:pPr>
-        <w:bidi/>
-        <w:spacing w:after="0" w:line="360" w:lineRule="auto"/>
-        <w:rPr>
-          <w:rFonts w:asciiTheme="majorBidi" w:hAnsiTheme="majorBidi" w:cstheme="majorBidi"/>
-          <w:sz w:val="20"/>
-          <w:szCs w:val="20"/>
-          <w:rtl/>
-        </w:rPr>
-      </w:pPr>
-      <w:r>
-        <w:rPr>
-          <w:rFonts w:asciiTheme="majorBidi" w:hAnsiTheme="majorBidi" w:cstheme="majorBidi"/>
-          <w:sz w:val="20"/>
-          <w:szCs w:val="20"/>
-        </w:rPr>
-        <w:t xml:space="preserve">مناقشة خطة التسويق للربع الثالث</w:t>
-      </w:r>
-    </w:p>
-    <w:p>
-      <w:pPr>
-        <w:pBdr>
-          <w:bottom w:val="single" w:sz="6" w:space="1" w:color="2E75B6"/>
-        </w:pBdr>
-        <w:bidi/>
-        <w:spacing w:before="320"/>
-        <w:rPr>
-          <w:rFonts w:asciiTheme="majorBidi" w:hAnsiTheme="majorBidi" w:cstheme="majorBidi"/>
-          <w:sz w:val="32"/>
-          <w:szCs w:val="32"/>
-          <w:rtl/>
-          <w:lang w:bidi="ar-JO"/>
-        </w:rPr>
-      </w:pPr>
-      <w:r>
-        <w:rPr>
-          <w:rFonts w:asciiTheme="majorBidi" w:hAnsiTheme="majorBidi" w:cstheme="majorBidi"/>
-          <w:b/>
-          <w:bCs/>
-          <w:color w:val="1F3864"/>
-          <w:sz w:val="36"/>
-          <w:szCs w:val="36"/>
-          <w:rtl/>
-          <w:lang w:bidi="ar-JO"/>
-        </w:rPr>
-        <w:t>نقاط النقاش الرئيسية</w:t>
-      </w:r>
-    </w:p>
-    <w:p>
-      <w:pPr>
-        <w:bidi/>
-        <w:jc w:val="center"/>
-        <w:rPr>
-          <w:rFonts w:asciiTheme="majorBidi" w:hAnsiTheme="majorBidi" w:cstheme="majorBidi"/>
-          <w:sz w:val="2"/>
-          <w:szCs w:val="2"/>
-          <w:rtl/>
-        </w:rPr>
-      </w:pPr>
-    </w:p>
-    <w:p>
-      <w:pPr>
-        <w:bidi/>
-        <w:spacing w:after="0" w:line="360" w:lineRule="auto"/>
-        <w:rPr>
-          <w:rFonts w:asciiTheme="majorBidi" w:hAnsiTheme="majorBidi" w:cstheme="majorBidi"/>
-          <w:sz w:val="2"/>
-          <w:szCs w:val="2"/>
-          <w:rtl/>
-        </w:rPr>
-      </w:pPr>
-      <w:r>
-        <w:rPr>
-          <w:rFonts w:asciiTheme="majorBidi" w:hAnsiTheme="majorBidi" w:cstheme="majorBidi"/>
-          <w:sz w:val="20"/>
-          <w:szCs w:val="20"/>
-        </w:rPr>
-        <w:t xml:space="preserve">مناقشة خطة التسويق للربع الثالث,مراجعة الميزانية المخصصة للتسويق واقتراح زيادتها بنسبة 20%,التواصل مع وكالة التسويق</w:t>
-      </w:r>
-    </w:p>
-    <w:p>
-      <w:pPr>
-        <w:bidi/>
-        <w:spacing w:after="0" w:line="360" w:lineRule="auto"/>
-        <w:rPr>
-          <w:rFonts w:asciiTheme="majorBidi" w:hAnsiTheme="majorBidi" w:cstheme="majorBidi"/>
-          <w:sz w:val="2"/>
-          <w:szCs w:val="2"/>
-          <w:rtl/>
-        </w:rPr>
-      </w:pPr>
-    </w:p>
-    <w:p>
-      <w:pPr>
-        <w:bidi/>
-        <w:jc w:val="center"/>
-        <w:rPr>
-          <w:rFonts w:asciiTheme="majorBidi" w:hAnsiTheme="majorBidi" w:cstheme="majorBidi"/>
-          <w:sz w:val="2"/>
-          <w:szCs w:val="2"/>
-          <w:rtl/>
-        </w:rPr>
-      </w:pPr>
-    </w:p>
-    <w:p>
-      <w:pPr>
-        <w:pBdr>
-          <w:bottom w:val="single" w:sz="6" w:space="1" w:color="2E75B6"/>
-        </w:pBdr>
-        <w:bidi/>
-        <w:spacing w:before="320"/>
-        <w:rPr>
-          <w:rFonts w:asciiTheme="majorBidi" w:hAnsiTheme="majorBidi" w:cstheme="majorBidi"/>
-          <w:sz w:val="32"/>
-          <w:szCs w:val="32"/>
-          <w:rtl/>
-          <w:lang w:bidi="ar-JO"/>
-        </w:rPr>
-      </w:pPr>
-      <w:r>
-        <w:rPr>
-          <w:rFonts w:asciiTheme="majorBidi" w:hAnsiTheme="majorBidi" w:cstheme="majorBidi"/>
-          <w:b/>
-          <w:bCs/>
-          <w:color w:val="1F3864"/>
-          <w:sz w:val="36"/>
-          <w:szCs w:val="36"/>
-          <w:rtl/>
-          <w:lang w:bidi="ar-JO"/>
-        </w:rPr>
-        <w:t>القرارات</w:t>
-      </w:r>
-    </w:p>
-    <w:p>
-      <w:pPr>
-        <w:bidi/>
-        <w:spacing w:after="0" w:line="360" w:lineRule="auto"/>
-        <w:rPr>
-          <w:rFonts w:asciiTheme="majorBidi" w:hAnsiTheme="majorBidi" w:cstheme="majorBidi"/>
-          <w:sz w:val="20"/>
-          <w:szCs w:val="20"/>
-        </w:rPr>
-      </w:pPr>
-      <w:r>
-        <w:rPr>
-          <w:rFonts w:asciiTheme="majorBidi" w:hAnsiTheme="majorBidi" w:cstheme="majorBidi"/>
-          <w:sz w:val="20"/>
-          <w:szCs w:val="20"/>
-        </w:rPr>
-        <w:t xml:space="preserve">زيادة ميزانية التسويق بنسبة 20%</w:t>
-      </w:r>
-    </w:p>
-    <w:p>
-      <w:pPr>
-        <w:bidi/>
-        <w:jc w:val="right"/>
-        <w:rPr>
-          <w:rFonts w:asciiTheme="majorBidi" w:hAnsiTheme="majorBidi" w:cstheme="majorBidi"/>
-          <w:sz w:val="20"/>
-          <w:szCs w:val="20"/>
-          <w:lang w:bidi="ar-JO"/>
-        </w:rPr>
-      </w:pPr>
-    </w:p>
-    <w:p>
-      <w:pPr>
-        <w:bidi/>
-        <w:jc w:val="right"/>
-        <w:rPr>
-          <w:rFonts w:asciiTheme="majorBidi" w:hAnsiTheme="majorBidi" w:cstheme="majorBidi"/>
-          <w:sz w:val="20"/>
-          <w:szCs w:val="20"/>
-        </w:rPr>
-      </w:pPr>
-    </w:p>
-    <w:p>
-      <w:pPr>
-        <w:bidi/>
-        <w:jc w:val="right"/>
-        <w:rPr>
-          <w:rFonts w:asciiTheme="majorBidi" w:hAnsiTheme="majorBidi" w:cstheme="majorBidi"/>
-          <w:sz w:val="20"/>
-          <w:szCs w:val="20"/>
-          <w:rtl/>
-        </w:rPr>
-      </w:pPr>
-    </w:p>
-    <w:tbl>
-      <w:tblPr>
-        <w:tblpPr w:leftFromText="180" w:rightFromText="180" w:vertAnchor="text" w:tblpX="175" w:tblpY="1"/>
-        <w:tblOverlap w:val="never"/>
-        <w:tblW w:w="5000" w:type="pct"/>
-        <w:tblBorders>
-          <w:top w:val="single" w:sz="4" w:space="0" w:color="866A3F" w:themeColor="accent4" w:themeShade="80"/>
-          <w:left w:val="single" w:sz="4" w:space="0" w:color="866A3F" w:themeColor="accent4" w:themeShade="80"/>
-          <w:bottom w:val="single" w:sz="4" w:space="0" w:color="866A3F" w:themeColor="accent4" w:themeShade="80"/>
-          <w:right w:val="single" w:sz="4" w:space="0" w:color="866A3F" w:themeColor="accent4" w:themeShade="80"/>
-          <w:insideH w:val="single" w:sz="4" w:space="0" w:color="866A3F" w:themeColor="accent4" w:themeShade="80"/>
-          <w:insideV w:val="single" w:sz="4" w:space="0" w:color="866A3F" w:themeColor="accent4" w:themeShade="80"/>
-        </w:tblBorders>
-        <w:tblCellMar>
-          <w:left w:w="0" w:type="dxa"/>
-          <w:right w:w="0" w:type="dxa"/>
-        </w:tblCellMar>
-        <w:tblLook w:val="0420" w:firstRow="1" w:lastRow="0" w:firstColumn="0" w:lastColumn="0" w:noHBand="0" w:noVBand="1"/>
-      </w:tblPr>
-      <w:tblGrid>
-        <w:gridCol w:w="1695"/>
-        <w:gridCol w:w="2836"/>
-        <w:gridCol w:w="1985"/>
-        <w:gridCol w:w="3625"/>
-        <w:gridCol w:w="361"/>
-      </w:tblGrid>
       <w:tr>
         <w:trPr>
-          <w:trHeight w:val="204"/>
+          <w:trHeight w:val="265"/>
         </w:trPr>
         <w:tc>
           <w:tcPr>
-            <w:tcW w:w="807" w:type="pct"/>
-            <w:shd w:val="clear" w:color="auto" w:fill="1F3864"/>
-            <w:vAlign w:val="center"/>
+            <w:tcW w:w="5017" w:type="dxa"/>
+            <w:tcMar>
+              <w:top w:w="72" w:type="dxa"/>
+              <w:left w:w="144" w:type="dxa"/>
+              <w:bottom w:w="72" w:type="dxa"/>
+              <w:right w:w="144" w:type="dxa"/>
+            </w:tcMar>
           </w:tcPr>
           <w:p>
             <w:pPr>
@@ -1043,31 +1400,272 @@
               <w:bidi/>
               <w:spacing w:after="0" w:line="240" w:lineRule="auto"/>
               <w:ind w:right="162"/>
-              <w:jc w:val="center"/>
-              <w:rPr>
-                <w:rFonts w:asciiTheme="majorBidi" w:hAnsiTheme="majorBidi" w:cstheme="majorBidi"/>
-                <w:color w:val="FFFFFF" w:themeColor="background1"/>
-                <w:sz w:val="28"/>
-                <w:szCs w:val="28"/>
+              <w:rPr>
+                <w:rFonts w:asciiTheme="majorBidi" w:hAnsiTheme="majorBidi" w:cstheme="majorBidi"/>
+                <w:sz w:val="20"/>
+                <w:szCs w:val="20"/>
                 <w:rtl/>
               </w:rPr>
             </w:pPr>
-            <w:r>
-              <w:rPr>
-                <w:rFonts w:asciiTheme="majorBidi" w:hAnsiTheme="majorBidi" w:cstheme="majorBidi"/>
-                <w:color w:val="FFFFFF" w:themeColor="background1"/>
-                <w:sz w:val="28"/>
-                <w:szCs w:val="28"/>
-                <w:rtl/>
-              </w:rPr>
-              <w:t>الحالة</w:t>
-            </w:r>
           </w:p>
         </w:tc>
         <w:tc>
           <w:tcPr>
-            <w:tcW w:w="1350" w:type="pct"/>
-            <w:shd w:val="clear" w:color="auto" w:fill="1F3864"/>
+            <w:tcW w:w="4973" w:type="dxa"/>
+          </w:tcPr>
+          <w:p>
+            <w:pPr>
+              <w:tabs>
+                <w:tab w:val="left" w:pos="1692"/>
+                <w:tab w:val="center" w:pos="5256"/>
+              </w:tabs>
+              <w:bidi/>
+              <w:spacing w:after="0" w:line="240" w:lineRule="auto"/>
+              <w:ind w:right="162"/>
+              <w:rPr>
+                <w:rFonts w:asciiTheme="majorBidi" w:hAnsiTheme="majorBidi" w:cstheme="majorBidi"/>
+                <w:b/>
+                <w:bCs/>
+                <w:sz w:val="20"/>
+                <w:szCs w:val="20"/>
+                <w:rtl/>
+              </w:rPr>
+            </w:pPr>
+            <w:r>
+              <w:rPr>
+                <w:rFonts w:asciiTheme="majorBidi" w:hAnsiTheme="majorBidi" w:cs="Times New Roman"/>
+                <w:b/>
+                <w:bCs/>
+                <w:sz w:val="20"/>
+                <w:szCs w:val="20"/>
+                <w:rtl/>
+              </w:rPr>
+              <w:t xml:space="preserve"/>
+            </w:r>
+          </w:p>
+        </w:tc>
+      </w:tr>
+      <w:tr>
+        <w:trPr>
+          <w:trHeight w:val="265"/>
+        </w:trPr>
+        <w:tc>
+          <w:tcPr>
+            <w:tcW w:w="5017" w:type="dxa"/>
+            <w:tcMar>
+              <w:top w:w="72" w:type="dxa"/>
+              <w:left w:w="144" w:type="dxa"/>
+              <w:bottom w:w="72" w:type="dxa"/>
+              <w:right w:w="144" w:type="dxa"/>
+            </w:tcMar>
+          </w:tcPr>
+          <w:p>
+            <w:pPr>
+              <w:tabs>
+                <w:tab w:val="left" w:pos="1692"/>
+                <w:tab w:val="center" w:pos="5256"/>
+              </w:tabs>
+              <w:bidi/>
+              <w:spacing w:after="0" w:line="240" w:lineRule="auto"/>
+              <w:ind w:right="162"/>
+              <w:rPr>
+                <w:rFonts w:asciiTheme="majorBidi" w:hAnsiTheme="majorBidi" w:cstheme="majorBidi"/>
+                <w:sz w:val="20"/>
+                <w:szCs w:val="20"/>
+                <w:rtl/>
+              </w:rPr>
+            </w:pPr>
+          </w:p>
+        </w:tc>
+        <w:tc>
+          <w:tcPr>
+            <w:tcW w:w="4973" w:type="dxa"/>
+          </w:tcPr>
+          <w:p>
+            <w:pPr>
+              <w:tabs>
+                <w:tab w:val="left" w:pos="1692"/>
+                <w:tab w:val="center" w:pos="5256"/>
+              </w:tabs>
+              <w:bidi/>
+              <w:spacing w:after="0" w:line="240" w:lineRule="auto"/>
+              <w:ind w:right="162"/>
+              <w:rPr>
+                <w:rFonts w:asciiTheme="majorBidi" w:hAnsiTheme="majorBidi" w:cstheme="majorBidi"/>
+                <w:b/>
+                <w:bCs/>
+                <w:sz w:val="20"/>
+                <w:szCs w:val="20"/>
+                <w:rtl/>
+              </w:rPr>
+            </w:pPr>
+          </w:p>
+        </w:tc>
+      </w:tr>
+      <w:tr>
+        <w:trPr>
+          <w:trHeight w:val="265"/>
+        </w:trPr>
+        <w:tc>
+          <w:tcPr>
+            <w:tcW w:w="5017" w:type="dxa"/>
+            <w:tcMar>
+              <w:top w:w="72" w:type="dxa"/>
+              <w:left w:w="144" w:type="dxa"/>
+              <w:bottom w:w="72" w:type="dxa"/>
+              <w:right w:w="144" w:type="dxa"/>
+            </w:tcMar>
+          </w:tcPr>
+          <w:p>
+            <w:pPr>
+              <w:tabs>
+                <w:tab w:val="left" w:pos="1692"/>
+                <w:tab w:val="center" w:pos="5256"/>
+              </w:tabs>
+              <w:bidi/>
+              <w:spacing w:after="0" w:line="240" w:lineRule="auto"/>
+              <w:ind w:right="162"/>
+              <w:rPr>
+                <w:rFonts w:asciiTheme="majorBidi" w:hAnsiTheme="majorBidi" w:cstheme="majorBidi"/>
+                <w:sz w:val="20"/>
+                <w:szCs w:val="20"/>
+                <w:rtl/>
+              </w:rPr>
+            </w:pPr>
+          </w:p>
+        </w:tc>
+        <w:tc>
+          <w:tcPr>
+            <w:tcW w:w="4973" w:type="dxa"/>
+          </w:tcPr>
+          <w:p>
+            <w:pPr>
+              <w:tabs>
+                <w:tab w:val="left" w:pos="1692"/>
+                <w:tab w:val="center" w:pos="5256"/>
+              </w:tabs>
+              <w:bidi/>
+              <w:spacing w:after="0" w:line="240" w:lineRule="auto"/>
+              <w:ind w:right="162"/>
+              <w:rPr>
+                <w:rFonts w:asciiTheme="majorBidi" w:hAnsiTheme="majorBidi" w:cstheme="majorBidi"/>
+                <w:sz w:val="20"/>
+                <w:szCs w:val="20"/>
+                <w:rtl/>
+              </w:rPr>
+            </w:pPr>
+          </w:p>
+        </w:tc>
+      </w:tr>
+      <w:tr>
+        <w:trPr>
+          <w:trHeight w:val="265"/>
+        </w:trPr>
+        <w:tc>
+          <w:tcPr>
+            <w:tcW w:w="5017" w:type="dxa"/>
+            <w:tcMar>
+              <w:top w:w="72" w:type="dxa"/>
+              <w:left w:w="144" w:type="dxa"/>
+              <w:bottom w:w="72" w:type="dxa"/>
+              <w:right w:w="144" w:type="dxa"/>
+            </w:tcMar>
+          </w:tcPr>
+          <w:p>
+            <w:pPr>
+              <w:tabs>
+                <w:tab w:val="left" w:pos="1692"/>
+                <w:tab w:val="center" w:pos="5256"/>
+              </w:tabs>
+              <w:bidi/>
+              <w:spacing w:after="0" w:line="240" w:lineRule="auto"/>
+              <w:ind w:right="162"/>
+              <w:rPr>
+                <w:rFonts w:asciiTheme="majorBidi" w:hAnsiTheme="majorBidi" w:cstheme="majorBidi"/>
+                <w:sz w:val="20"/>
+                <w:szCs w:val="20"/>
+                <w:rtl/>
+              </w:rPr>
+            </w:pPr>
+          </w:p>
+        </w:tc>
+        <w:tc>
+          <w:tcPr>
+            <w:tcW w:w="4973" w:type="dxa"/>
+          </w:tcPr>
+          <w:p>
+            <w:pPr>
+              <w:tabs>
+                <w:tab w:val="left" w:pos="1692"/>
+              </w:tabs>
+              <w:bidi/>
+              <w:spacing w:after="0" w:line="240" w:lineRule="auto"/>
+              <w:ind w:right="162"/>
+              <w:rPr>
+                <w:rFonts w:asciiTheme="majorBidi" w:hAnsiTheme="majorBidi" w:cstheme="majorBidi"/>
+                <w:sz w:val="20"/>
+                <w:szCs w:val="20"/>
+                <w:rtl/>
+              </w:rPr>
+            </w:pPr>
+          </w:p>
+        </w:tc>
+      </w:tr>
+    </w:tbl>
+    <w:p>
+      <w:pPr>
+        <w:bidi/>
+        <w:jc w:val="center"/>
+        <w:rPr>
+          <w:rFonts w:asciiTheme="majorBidi" w:hAnsiTheme="majorBidi" w:cstheme="majorBidi"/>
+          <w:sz w:val="2"/>
+          <w:szCs w:val="2"/>
+          <w:rtl/>
+        </w:rPr>
+      </w:pPr>
+    </w:p>
+    <w:p>
+      <w:pPr>
+        <w:bidi/>
+        <w:jc w:val="center"/>
+        <w:rPr>
+          <w:rFonts w:asciiTheme="majorBidi" w:hAnsiTheme="majorBidi" w:cstheme="majorBidi"/>
+          <w:sz w:val="2"/>
+          <w:szCs w:val="2"/>
+          <w:rtl/>
+        </w:rPr>
+      </w:pPr>
+    </w:p>
+    <w:tbl>
+      <w:tblPr>
+        <w:tblW w:w="0" w:type="auto"/>
+        <w:tblInd w:w="170" w:type="dxa"/>
+        <w:tblBorders>
+          <w:top w:val="single" w:sz="4" w:space="0" w:color="866A3F" w:themeColor="accent4" w:themeShade="80"/>
+          <w:left w:val="single" w:sz="4" w:space="0" w:color="866A3F" w:themeColor="accent4" w:themeShade="80"/>
+          <w:bottom w:val="single" w:sz="4" w:space="0" w:color="866A3F" w:themeColor="accent4" w:themeShade="80"/>
+          <w:right w:val="single" w:sz="4" w:space="0" w:color="866A3F" w:themeColor="accent4" w:themeShade="80"/>
+          <w:insideH w:val="single" w:sz="4" w:space="0" w:color="866A3F" w:themeColor="accent4" w:themeShade="80"/>
+          <w:insideV w:val="single" w:sz="4" w:space="0" w:color="866A3F" w:themeColor="accent4" w:themeShade="80"/>
+        </w:tblBorders>
+        <w:tblLayout w:type="fixed"/>
+        <w:tblCellMar>
+          <w:left w:w="0" w:type="dxa"/>
+          <w:right w:w="0" w:type="dxa"/>
+        </w:tblCellMar>
+        <w:tblLook w:val="0420" w:firstRow="1" w:lastRow="0" w:firstColumn="0" w:lastColumn="0" w:noHBand="0" w:noVBand="1"/>
+      </w:tblPr>
+      <w:tblGrid>
+        <w:gridCol w:w="10038"/>
+      </w:tblGrid>
+      <w:tr>
+        <w:trPr>
+          <w:trHeight w:val="287"/>
+        </w:trPr>
+        <w:tc>
+          <w:tcPr>
+            <w:tcW w:w="10038" w:type="dxa"/>
+            <w:shd w:val="clear" w:color="auto" w:fill="A79F88"/>
             <w:tcMar>
               <w:top w:w="72" w:type="dxa"/>
               <w:left w:w="144" w:type="dxa"/>
@@ -1089,6 +1687,8 @@
               <w:jc w:val="center"/>
               <w:rPr>
                 <w:rFonts w:asciiTheme="majorBidi" w:hAnsiTheme="majorBidi" w:cstheme="majorBidi"/>
+                <w:b/>
+                <w:bCs/>
                 <w:color w:val="FFFFFF" w:themeColor="background1"/>
                 <w:sz w:val="28"/>
                 <w:szCs w:val="28"/>
@@ -1097,19 +1697,279 @@
             <w:r>
               <w:rPr>
                 <w:rFonts w:asciiTheme="majorBidi" w:hAnsiTheme="majorBidi" w:cstheme="majorBidi"/>
+                <w:b/>
+                <w:bCs/>
                 <w:color w:val="FFFFFF" w:themeColor="background1"/>
                 <w:sz w:val="28"/>
                 <w:szCs w:val="28"/>
                 <w:rtl/>
               </w:rPr>
-              <w:t>تاريخ الاستحقاق</w:t>
+              <w:t>ال</w:t>
+            </w:r>
+            <w:r>
+              <w:rPr>
+                <w:rFonts w:asciiTheme="majorBidi" w:hAnsiTheme="majorBidi" w:cstheme="majorBidi"/>
+                <w:b/>
+                <w:bCs/>
+                <w:color w:val="FFFFFF" w:themeColor="background1"/>
+                <w:sz w:val="28"/>
+                <w:szCs w:val="28"/>
+                <w:rtl/>
+              </w:rPr>
+              <w:t xml:space="preserve">هدف </w:t>
+            </w:r>
+            <w:r>
+              <w:rPr>
+                <w:rFonts w:asciiTheme="majorBidi" w:hAnsiTheme="majorBidi" w:cstheme="majorBidi"/>
+                <w:b/>
+                <w:bCs/>
+                <w:color w:val="FFFFFF" w:themeColor="background1"/>
+                <w:sz w:val="28"/>
+                <w:szCs w:val="28"/>
+                <w:rtl/>
+              </w:rPr>
+              <w:t xml:space="preserve">من </w:t>
+            </w:r>
+            <w:r>
+              <w:rPr>
+                <w:rFonts w:asciiTheme="majorBidi" w:hAnsiTheme="majorBidi" w:cstheme="majorBidi"/>
+                <w:b/>
+                <w:bCs/>
+                <w:color w:val="FFFFFF" w:themeColor="background1"/>
+                <w:sz w:val="28"/>
+                <w:szCs w:val="28"/>
+                <w:rtl/>
+              </w:rPr>
+              <w:t>الاجتماع</w:t>
             </w:r>
           </w:p>
         </w:tc>
+      </w:tr>
+      <w:tr>
+        <w:trPr>
+          <w:trHeight w:val="239"/>
+        </w:trPr>
         <w:tc>
           <w:tcPr>
-            <w:tcW w:w="945" w:type="pct"/>
-            <w:shd w:val="clear" w:color="auto" w:fill="1F3864"/>
+            <w:tcW w:w="10038" w:type="dxa"/>
+            <w:tcMar>
+              <w:top w:w="72" w:type="dxa"/>
+              <w:left w:w="144" w:type="dxa"/>
+              <w:bottom w:w="72" w:type="dxa"/>
+              <w:right w:w="144" w:type="dxa"/>
+            </w:tcMar>
+            <w:vAlign w:val="center"/>
+          </w:tcPr>
+          <w:p>
+            <w:pPr>
+              <w:bidi/>
+              <w:spacing w:after="0" w:line="360" w:lineRule="auto"/>
+              <w:rPr>
+                <w:rFonts w:asciiTheme="majorBidi" w:hAnsiTheme="majorBidi" w:cstheme="majorBidi"/>
+                <w:b/>
+                <w:bCs/>
+                <w:sz w:val="20"/>
+                <w:szCs w:val="20"/>
+              </w:rPr>
+            </w:pPr>
+            <w:r>
+              <w:rPr>
+                <w:rFonts w:asciiTheme="majorBidi" w:hAnsiTheme="majorBidi" w:cstheme="majorBidi"/>
+                <w:b/>
+                <w:bCs/>
+                <w:sz w:val="20"/>
+                <w:szCs w:val="20"/>
+              </w:rPr>
+              <w:t xml:space="preserve">To discuss the Q3 marketing plan</w:t>
+            </w:r>
+          </w:p>
+        </w:tc>
+      </w:tr>
+    </w:tbl>
+    <w:p>
+      <w:pPr>
+        <w:bidi/>
+        <w:jc w:val="center"/>
+        <w:rPr>
+          <w:rFonts w:asciiTheme="majorBidi" w:hAnsiTheme="majorBidi" w:cstheme="majorBidi"/>
+          <w:sz w:val="2"/>
+          <w:szCs w:val="2"/>
+          <w:rtl/>
+        </w:rPr>
+      </w:pPr>
+    </w:p>
+    <w:p>
+      <w:pPr>
+        <w:bidi/>
+        <w:jc w:val="center"/>
+        <w:rPr>
+          <w:rFonts w:asciiTheme="majorBidi" w:hAnsiTheme="majorBidi" w:cstheme="majorBidi"/>
+          <w:sz w:val="2"/>
+          <w:szCs w:val="2"/>
+          <w:rtl/>
+        </w:rPr>
+      </w:pPr>
+    </w:p>
+    <w:tbl>
+      <w:tblPr>
+        <w:tblW w:w="0" w:type="auto"/>
+        <w:tblInd w:w="170" w:type="dxa"/>
+        <w:tblBorders>
+          <w:top w:val="single" w:sz="4" w:space="0" w:color="866A3F" w:themeColor="accent4" w:themeShade="80"/>
+          <w:left w:val="single" w:sz="4" w:space="0" w:color="866A3F" w:themeColor="accent4" w:themeShade="80"/>
+          <w:bottom w:val="single" w:sz="4" w:space="0" w:color="866A3F" w:themeColor="accent4" w:themeShade="80"/>
+          <w:right w:val="single" w:sz="4" w:space="0" w:color="866A3F" w:themeColor="accent4" w:themeShade="80"/>
+          <w:insideH w:val="single" w:sz="4" w:space="0" w:color="866A3F" w:themeColor="accent4" w:themeShade="80"/>
+          <w:insideV w:val="single" w:sz="4" w:space="0" w:color="866A3F" w:themeColor="accent4" w:themeShade="80"/>
+        </w:tblBorders>
+        <w:tblLayout w:type="fixed"/>
+        <w:tblCellMar>
+          <w:left w:w="0" w:type="dxa"/>
+          <w:right w:w="0" w:type="dxa"/>
+        </w:tblCellMar>
+        <w:tblLook w:val="0420" w:firstRow="1" w:lastRow="0" w:firstColumn="0" w:lastColumn="0" w:noHBand="0" w:noVBand="1"/>
+      </w:tblPr>
+      <w:tblGrid>
+        <w:gridCol w:w="10038"/>
+      </w:tblGrid>
+      <w:tr>
+        <w:trPr>
+          <w:trHeight w:val="176"/>
+        </w:trPr>
+        <w:tc>
+          <w:tcPr>
+            <w:tcW w:w="10038" w:type="dxa"/>
+            <w:shd w:val="clear" w:color="auto" w:fill="A79F88"/>
+            <w:tcMar>
+              <w:top w:w="72" w:type="dxa"/>
+              <w:left w:w="144" w:type="dxa"/>
+              <w:bottom w:w="72" w:type="dxa"/>
+              <w:right w:w="144" w:type="dxa"/>
+            </w:tcMar>
+            <w:hideMark/>
+          </w:tcPr>
+          <w:p>
+            <w:pPr>
+              <w:tabs>
+                <w:tab w:val="left" w:pos="1692"/>
+                <w:tab w:val="center" w:pos="5256"/>
+              </w:tabs>
+              <w:bidi/>
+              <w:spacing w:after="0" w:line="240" w:lineRule="auto"/>
+              <w:ind w:right="162"/>
+              <w:jc w:val="center"/>
+              <w:rPr>
+                <w:rFonts w:asciiTheme="majorBidi" w:hAnsiTheme="majorBidi" w:cstheme="majorBidi"/>
+                <w:b/>
+                <w:bCs/>
+                <w:color w:val="FFFFFF" w:themeColor="background1"/>
+                <w:sz w:val="28"/>
+                <w:szCs w:val="28"/>
+              </w:rPr>
+            </w:pPr>
+            <w:r>
+              <w:rPr>
+                <w:rFonts w:asciiTheme="majorBidi" w:hAnsiTheme="majorBidi" w:cstheme="majorBidi"/>
+                <w:b/>
+                <w:bCs/>
+                <w:color w:val="FFFFFF" w:themeColor="background1"/>
+                <w:sz w:val="28"/>
+                <w:szCs w:val="28"/>
+                <w:rtl/>
+              </w:rPr>
+              <w:t xml:space="preserve">نقاط النقاش الرئيسية</w:t>
+            </w:r>
+          </w:p>
+        </w:tc>
+      </w:tr>
+      <w:tr>
+        <w:trPr>
+          <w:trHeight w:val="548"/>
+        </w:trPr>
+        <w:tc>
+          <w:tcPr>
+            <w:tcW w:w="10038" w:type="dxa"/>
+            <w:tcMar>
+              <w:top w:w="72" w:type="dxa"/>
+              <w:left w:w="144" w:type="dxa"/>
+              <w:bottom w:w="72" w:type="dxa"/>
+              <w:right w:w="144" w:type="dxa"/>
+            </w:tcMar>
+          </w:tcPr>
+          <w:p>
+            <w:pPr>
+              <w:bidi/>
+              <w:spacing w:after="0" w:line="360" w:lineRule="auto"/>
+              <w:rPr>
+                <w:rFonts w:asciiTheme="majorBidi" w:hAnsiTheme="majorBidi" w:cstheme="majorBidi"/>
+                <w:b/>
+                <w:bCs/>
+                <w:sz w:val="20"/>
+                <w:szCs w:val="20"/>
+              </w:rPr>
+            </w:pPr>
+            <w:r>
+              <w:rPr>
+                <w:rFonts w:asciiTheme="majorBidi" w:hAnsiTheme="majorBidi" w:cs="Times New Roman"/>
+                <w:b/>
+                <w:bCs/>
+                <w:sz w:val="20"/>
+                <w:szCs w:val="20"/>
+                <w:rtl/>
+              </w:rPr>
+              <w:t xml:space="preserve">Discussion of the Q3 marketing plan,Review of the marketing budget and consideration of a budget increase,Coordination with an external agency for marketing efforts</w:t>
+            </w:r>
+          </w:p>
+        </w:tc>
+      </w:tr>
+    </w:tbl>
+    <w:p>
+      <w:pPr>
+        <w:bidi/>
+        <w:jc w:val="right"/>
+        <w:rPr>
+          <w:rFonts w:asciiTheme="majorBidi" w:hAnsiTheme="majorBidi" w:cstheme="majorBidi"/>
+          <w:sz w:val="20"/>
+          <w:szCs w:val="20"/>
+          <w:rtl/>
+        </w:rPr>
+      </w:pPr>
+    </w:p>
+    <w:tbl>
+      <w:tblPr>
+        <w:tblpPr w:leftFromText="180" w:rightFromText="180" w:vertAnchor="text" w:tblpX="175" w:tblpY="1"/>
+        <w:tblOverlap w:val="never"/>
+        <w:tblW w:w="10165" w:type="dxa"/>
+        <w:tblBorders>
+          <w:top w:val="single" w:sz="4" w:space="0" w:color="866A3F" w:themeColor="accent4" w:themeShade="80"/>
+          <w:left w:val="single" w:sz="4" w:space="0" w:color="866A3F" w:themeColor="accent4" w:themeShade="80"/>
+          <w:bottom w:val="single" w:sz="4" w:space="0" w:color="866A3F" w:themeColor="accent4" w:themeShade="80"/>
+          <w:right w:val="single" w:sz="4" w:space="0" w:color="866A3F" w:themeColor="accent4" w:themeShade="80"/>
+          <w:insideH w:val="single" w:sz="4" w:space="0" w:color="866A3F" w:themeColor="accent4" w:themeShade="80"/>
+          <w:insideV w:val="single" w:sz="4" w:space="0" w:color="866A3F" w:themeColor="accent4" w:themeShade="80"/>
+        </w:tblBorders>
+        <w:tblLayout w:type="fixed"/>
+        <w:tblCellMar>
+          <w:left w:w="0" w:type="dxa"/>
+          <w:right w:w="0" w:type="dxa"/>
+        </w:tblCellMar>
+        <w:tblLook w:val="0420" w:firstRow="1" w:lastRow="0" w:firstColumn="0" w:lastColumn="0" w:noHBand="0" w:noVBand="1"/>
+      </w:tblPr>
+      <w:tblGrid>
+        <w:gridCol w:w="3539"/>
+        <w:gridCol w:w="2977"/>
+        <w:gridCol w:w="1417"/>
+        <w:gridCol w:w="1882"/>
+        <w:gridCol w:w="350"/>
+      </w:tblGrid>
+      <w:tr>
+        <w:trPr>
+          <w:trHeight w:val="204"/>
+        </w:trPr>
+        <w:tc>
+          <w:tcPr>
+            <w:tcW w:w="3539" w:type="dxa"/>
+            <w:shd w:val="clear" w:color="auto" w:fill="A79F88"/>
             <w:vAlign w:val="center"/>
           </w:tcPr>
           <w:p>
@@ -1124,27 +1984,78 @@
               <w:jc w:val="center"/>
               <w:rPr>
                 <w:rFonts w:asciiTheme="majorBidi" w:hAnsiTheme="majorBidi" w:cstheme="majorBidi"/>
+                <w:b/>
+                <w:bCs/>
                 <w:color w:val="FFFFFF" w:themeColor="background1"/>
                 <w:sz w:val="28"/>
                 <w:szCs w:val="28"/>
+                <w:rtl/>
               </w:rPr>
             </w:pPr>
             <w:r>
               <w:rPr>
-                <w:rFonts w:asciiTheme="majorBidi" w:hAnsiTheme="majorBidi" w:cstheme="majorBidi"/>
+                <w:rFonts w:asciiTheme="majorBidi" w:hAnsiTheme="majorBidi" w:cstheme="majorBidi" w:hint="cs"/>
+                <w:b/>
+                <w:bCs/>
                 <w:color w:val="FFFFFF" w:themeColor="background1"/>
                 <w:sz w:val="28"/>
                 <w:szCs w:val="28"/>
                 <w:rtl/>
               </w:rPr>
-              <w:t>المسؤول</w:t>
+              <w:t>الحالة</w:t>
             </w:r>
           </w:p>
         </w:tc>
         <w:tc>
           <w:tcPr>
-            <w:tcW w:w="1726" w:type="pct"/>
-            <w:shd w:val="clear" w:color="auto" w:fill="1F3864"/>
+            <w:tcW w:w="2977" w:type="dxa"/>
+            <w:shd w:val="clear" w:color="auto" w:fill="A79F88"/>
+            <w:tcMar>
+              <w:top w:w="72" w:type="dxa"/>
+              <w:left w:w="144" w:type="dxa"/>
+              <w:bottom w:w="72" w:type="dxa"/>
+              <w:right w:w="144" w:type="dxa"/>
+            </w:tcMar>
+            <w:vAlign w:val="center"/>
+            <w:hideMark/>
+          </w:tcPr>
+          <w:p>
+            <w:pPr>
+              <w:tabs>
+                <w:tab w:val="left" w:pos="1692"/>
+                <w:tab w:val="center" w:pos="5256"/>
+              </w:tabs>
+              <w:bidi/>
+              <w:spacing w:after="0" w:line="240" w:lineRule="auto"/>
+              <w:ind w:right="162"/>
+              <w:jc w:val="center"/>
+              <w:rPr>
+                <w:rFonts w:asciiTheme="majorBidi" w:hAnsiTheme="majorBidi" w:cstheme="majorBidi"/>
+                <w:b/>
+                <w:bCs/>
+                <w:color w:val="FFFFFF" w:themeColor="background1"/>
+                <w:sz w:val="28"/>
+                <w:szCs w:val="28"/>
+              </w:rPr>
+            </w:pPr>
+            <w:r>
+              <w:rPr>
+                <w:rFonts w:asciiTheme="majorBidi" w:hAnsiTheme="majorBidi" w:cstheme="majorBidi"/>
+                <w:b/>
+                <w:bCs/>
+                <w:color w:val="FFFFFF" w:themeColor="background1"/>
+                <w:sz w:val="28"/>
+                <w:szCs w:val="28"/>
+                <w:rtl/>
+              </w:rPr>
+              <w:t>تاريخ الاستحقاق</w:t>
+            </w:r>
+          </w:p>
+        </w:tc>
+        <w:tc>
+          <w:tcPr>
+            <w:tcW w:w="1417" w:type="dxa"/>
+            <w:shd w:val="clear" w:color="auto" w:fill="A79F88"/>
             <w:vAlign w:val="center"/>
           </w:tcPr>
           <w:p>
@@ -1159,28 +2070,31 @@
               <w:jc w:val="center"/>
               <w:rPr>
                 <w:rFonts w:asciiTheme="majorBidi" w:hAnsiTheme="majorBidi" w:cstheme="majorBidi"/>
+                <w:b/>
+                <w:bCs/>
                 <w:color w:val="FFFFFF" w:themeColor="background1"/>
                 <w:sz w:val="28"/>
                 <w:szCs w:val="28"/>
-                <w:rtl/>
               </w:rPr>
             </w:pPr>
             <w:r>
               <w:rPr>
                 <w:rFonts w:asciiTheme="majorBidi" w:hAnsiTheme="majorBidi" w:cstheme="majorBidi"/>
+                <w:b/>
+                <w:bCs/>
                 <w:color w:val="FFFFFF" w:themeColor="background1"/>
                 <w:sz w:val="28"/>
                 <w:szCs w:val="28"/>
                 <w:rtl/>
               </w:rPr>
-              <w:t>المهام والأعمال المتفق عليها</w:t>
+              <w:t>المسؤول</w:t>
             </w:r>
           </w:p>
         </w:tc>
         <w:tc>
           <w:tcPr>
-            <w:tcW w:w="172" w:type="pct"/>
-            <w:shd w:val="clear" w:color="auto" w:fill="1F3864"/>
+            <w:tcW w:w="1882" w:type="dxa"/>
+            <w:shd w:val="clear" w:color="auto" w:fill="A79F88"/>
             <w:vAlign w:val="center"/>
           </w:tcPr>
           <w:p>
@@ -1195,6 +2109,8 @@
               <w:jc w:val="center"/>
               <w:rPr>
                 <w:rFonts w:asciiTheme="majorBidi" w:hAnsiTheme="majorBidi" w:cstheme="majorBidi"/>
+                <w:b/>
+                <w:bCs/>
                 <w:color w:val="FFFFFF" w:themeColor="background1"/>
                 <w:sz w:val="28"/>
                 <w:szCs w:val="28"/>
@@ -1204,23 +2120,21 @@
             <w:r>
               <w:rPr>
                 <w:rFonts w:asciiTheme="majorBidi" w:hAnsiTheme="majorBidi" w:cstheme="majorBidi"/>
+                <w:b/>
+                <w:bCs/>
                 <w:color w:val="FFFFFF" w:themeColor="background1"/>
                 <w:sz w:val="28"/>
                 <w:szCs w:val="28"/>
                 <w:rtl/>
               </w:rPr>
-              <w:t xml:space="preserve">#</w:t>
+              <w:t>المهام والأعمال المتفق عليها</w:t>
             </w:r>
           </w:p>
         </w:tc>
-      </w:tr>
-      <w:tr>
-        <w:trPr>
-          <w:trHeight w:val="278"/>
-        </w:trPr>
         <w:tc>
           <w:tcPr>
-            <w:tcW w:w="807" w:type="pct"/>
+            <w:tcW w:w="350" w:type="dxa"/>
+            <w:shd w:val="clear" w:color="auto" w:fill="A79F88"/>
             <w:vAlign w:val="center"/>
           </w:tcPr>
           <w:p>
@@ -1235,6 +2149,50 @@
               <w:jc w:val="center"/>
               <w:rPr>
                 <w:rFonts w:asciiTheme="majorBidi" w:hAnsiTheme="majorBidi" w:cstheme="majorBidi"/>
+                <w:b/>
+                <w:bCs/>
+                <w:color w:val="FFFFFF" w:themeColor="background1"/>
+                <w:sz w:val="28"/>
+                <w:szCs w:val="28"/>
+                <w:rtl/>
+              </w:rPr>
+            </w:pPr>
+            <w:r>
+              <w:rPr>
+                <w:rFonts w:asciiTheme="majorBidi" w:hAnsiTheme="majorBidi" w:cstheme="majorBidi" w:hint="cs"/>
+                <w:b/>
+                <w:bCs/>
+                <w:color w:val="FFFFFF" w:themeColor="background1"/>
+                <w:sz w:val="28"/>
+                <w:szCs w:val="28"/>
+                <w:rtl/>
+              </w:rPr>
+              <w:t xml:space="preserve">#</w:t>
+            </w:r>
+          </w:p>
+        </w:tc>
+      </w:tr>
+      <w:tr>
+        <w:trPr>
+          <w:trHeight w:val="278"/>
+        </w:trPr>
+        <w:tc>
+          <w:tcPr>
+            <w:tcW w:w="3539" w:type="dxa"/>
+            <w:vAlign w:val="center"/>
+          </w:tcPr>
+          <w:p>
+            <w:pPr>
+              <w:tabs>
+                <w:tab w:val="left" w:pos="1692"/>
+                <w:tab w:val="center" w:pos="5256"/>
+              </w:tabs>
+              <w:bidi/>
+              <w:spacing w:after="0" w:line="240" w:lineRule="auto"/>
+              <w:ind w:right="162"/>
+              <w:jc w:val="center"/>
+              <w:rPr>
+                <w:rFonts w:asciiTheme="majorBidi" w:hAnsiTheme="majorBidi" w:cstheme="majorBidi"/>
                 <w:sz w:val="20"/>
                 <w:szCs w:val="20"/>
                 <w:rtl/>
@@ -1244,7 +2202,7 @@
         </w:tc>
         <w:tc>
           <w:tcPr>
-            <w:tcW w:w="1350" w:type="pct"/>
+            <w:tcW w:w="2977" w:type="dxa"/>
             <w:tcMar>
               <w:top w:w="72" w:type="dxa"/>
               <w:left w:w="144" w:type="dxa"/>
@@ -1263,7 +2221,7 @@
               <w:spacing w:after="0" w:line="240" w:lineRule="auto"/>
               <w:ind w:right="162"/>
               <w:rPr>
-                <w:rFonts w:asciiTheme="majorBidi" w:hAnsiTheme="majorBidi" w:cstheme="majorBidi"/>
+                <w:rFonts w:asciiTheme="majorHAnsi" w:hAnsiTheme="majorHAnsi" w:cstheme="majorHAnsi"/>
                 <w:sz w:val="20"/>
                 <w:szCs w:val="20"/>
                 <w:rtl/>
@@ -1275,13 +2233,13 @@
                 <w:sz w:val="20"/>
                 <w:szCs w:val="20"/>
               </w:rPr>
-              <w:t xml:space="preserve">2026-05-21</w:t>
+              <w:t xml:space="preserve">2026-05-28</w:t>
             </w:r>
           </w:p>
         </w:tc>
         <w:tc>
           <w:tcPr>
-            <w:tcW w:w="945" w:type="pct"/>
+            <w:tcW w:w="1417" w:type="dxa"/>
             <w:vAlign w:val="center"/>
           </w:tcPr>
           <w:p>
@@ -1294,7 +2252,7 @@
               <w:spacing w:after="0" w:line="240" w:lineRule="auto"/>
               <w:ind w:right="162"/>
               <w:rPr>
-                <w:rFonts w:asciiTheme="majorBidi" w:hAnsiTheme="majorBidi" w:cstheme="majorBidi"/>
+                <w:rFonts w:asciiTheme="majorHAnsi" w:hAnsiTheme="majorHAnsi" w:cstheme="majorHAnsi"/>
                 <w:sz w:val="20"/>
                 <w:szCs w:val="20"/>
                 <w:rtl/>
@@ -1302,17 +2260,17 @@
             </w:pPr>
             <w:r>
               <w:rPr>
-                <w:rFonts w:asciiTheme="majorBidi" w:hAnsiTheme="majorBidi" w:cstheme="majorBidi"/>
-                <w:sz w:val="20"/>
-                <w:szCs w:val="20"/>
-              </w:rPr>
-              <w:t xml:space="preserve">أحمد</w:t>
+                <w:rFonts w:asciiTheme="majorHAnsi" w:hAnsiTheme="majorHAnsi" w:cstheme="majorHAnsi"/>
+                <w:sz w:val="20"/>
+                <w:szCs w:val="20"/>
+              </w:rPr>
+              <w:t xml:space="preserve">Ahmed</w:t>
             </w:r>
           </w:p>
         </w:tc>
         <w:tc>
           <w:tcPr>
-            <w:tcW w:w="1726" w:type="pct"/>
+            <w:tcW w:w="1882" w:type="dxa"/>
             <w:vAlign w:val="center"/>
           </w:tcPr>
           <w:p>
@@ -1325,7 +2283,7 @@
               <w:spacing w:after="0" w:line="240" w:lineRule="auto"/>
               <w:ind w:left="136" w:right="162"/>
               <w:rPr>
-                <w:rFonts w:asciiTheme="majorBidi" w:hAnsiTheme="majorBidi" w:cstheme="majorBidi"/>
+                <w:rFonts w:asciiTheme="majorHAnsi" w:hAnsiTheme="majorHAnsi" w:cstheme="majorHAnsi"/>
                 <w:sz w:val="20"/>
                 <w:szCs w:val="20"/>
                 <w:rtl/>
@@ -1333,17 +2291,17 @@
             </w:pPr>
             <w:r>
               <w:rPr>
-                <w:rFonts w:asciiTheme="majorBidi" w:hAnsiTheme="majorBidi" w:cstheme="majorBidi"/>
-                <w:sz w:val="20"/>
-                <w:szCs w:val="20"/>
-              </w:rPr>
-              <w:t xml:space="preserve">إعداد مقترح الميزانية الجديدة</w:t>
+                <w:rFonts w:asciiTheme="majorHAnsi" w:hAnsiTheme="majorHAnsi" w:cstheme="majorHAnsi"/>
+                <w:sz w:val="20"/>
+                <w:szCs w:val="20"/>
+              </w:rPr>
+              <w:t xml:space="preserve">Prepare the new budget proposal</w:t>
             </w:r>
           </w:p>
         </w:tc>
         <w:tc>
           <w:tcPr>
-            <w:tcW w:w="172" w:type="pct"/>
+            <w:tcW w:w="350" w:type="dxa"/>
             <w:vAlign w:val="center"/>
           </w:tcPr>
           <w:p>
@@ -1377,7 +2335,7 @@
         </w:trPr>
         <w:tc>
           <w:tcPr>
-            <w:tcW w:w="807" w:type="pct"/>
+            <w:tcW w:w="3539" w:type="dxa"/>
             <w:vAlign w:val="center"/>
           </w:tcPr>
           <w:p>
@@ -1401,7 +2359,7 @@
         </w:tc>
         <w:tc>
           <w:tcPr>
-            <w:tcW w:w="1350" w:type="pct"/>
+            <w:tcW w:w="2977" w:type="dxa"/>
             <w:tcMar>
               <w:top w:w="72" w:type="dxa"/>
               <w:left w:w="144" w:type="dxa"/>
@@ -1420,7 +2378,7 @@
               <w:spacing w:after="0" w:line="240" w:lineRule="auto"/>
               <w:ind w:right="162"/>
               <w:rPr>
-                <w:rFonts w:asciiTheme="majorBidi" w:hAnsiTheme="majorBidi" w:cstheme="majorBidi"/>
+                <w:rFonts w:asciiTheme="majorHAnsi" w:hAnsiTheme="majorHAnsi" w:cstheme="majorHAnsi"/>
                 <w:sz w:val="20"/>
                 <w:szCs w:val="20"/>
                 <w:rtl/>
@@ -1438,7 +2396,7 @@
         </w:tc>
         <w:tc>
           <w:tcPr>
-            <w:tcW w:w="945" w:type="pct"/>
+            <w:tcW w:w="1417" w:type="dxa"/>
             <w:vAlign w:val="center"/>
           </w:tcPr>
           <w:p>
@@ -1451,7 +2409,7 @@
               <w:spacing w:after="0" w:line="240" w:lineRule="auto"/>
               <w:ind w:right="162"/>
               <w:rPr>
-                <w:rFonts w:asciiTheme="majorBidi" w:hAnsiTheme="majorBidi" w:cstheme="majorBidi"/>
+                <w:rFonts w:asciiTheme="majorHAnsi" w:hAnsiTheme="majorHAnsi" w:cstheme="majorHAnsi"/>
                 <w:sz w:val="20"/>
                 <w:szCs w:val="20"/>
                 <w:rtl/>
@@ -1459,17 +2417,17 @@
             </w:pPr>
             <w:r>
               <w:rPr>
-                <w:rFonts w:asciiTheme="majorBidi" w:hAnsiTheme="majorBidi" w:cstheme="majorBidi"/>
-                <w:sz w:val="20"/>
-                <w:szCs w:val="20"/>
-              </w:rPr>
-              <w:t xml:space="preserve">سارة</w:t>
+                <w:rFonts w:asciiTheme="majorHAnsi" w:hAnsiTheme="majorHAnsi" w:cstheme="majorHAnsi"/>
+                <w:sz w:val="20"/>
+                <w:szCs w:val="20"/>
+              </w:rPr>
+              <w:t xml:space="preserve">Sara</w:t>
             </w:r>
           </w:p>
         </w:tc>
         <w:tc>
           <w:tcPr>
-            <w:tcW w:w="1726" w:type="pct"/>
+            <w:tcW w:w="1882" w:type="dxa"/>
             <w:vAlign w:val="center"/>
           </w:tcPr>
           <w:p>
@@ -1482,7 +2440,7 @@
               <w:spacing w:after="0" w:line="240" w:lineRule="auto"/>
               <w:ind w:left="136" w:right="162"/>
               <w:rPr>
-                <w:rFonts w:asciiTheme="majorBidi" w:hAnsiTheme="majorBidi" w:cstheme="majorBidi"/>
+                <w:rFonts w:asciiTheme="majorHAnsi" w:hAnsiTheme="majorHAnsi" w:cstheme="majorHAnsi"/>
                 <w:sz w:val="20"/>
                 <w:szCs w:val="20"/>
                 <w:rtl/>
@@ -1490,17 +2448,17 @@
             </w:pPr>
             <w:r>
               <w:rPr>
-                <w:rFonts w:asciiTheme="majorBidi" w:hAnsiTheme="majorBidi" w:cstheme="majorBidi"/>
-                <w:sz w:val="20"/>
-                <w:szCs w:val="20"/>
-              </w:rPr>
-              <w:t xml:space="preserve">التواصل مع وكالة التسويق</w:t>
+                <w:rFonts w:asciiTheme="majorHAnsi" w:hAnsiTheme="majorHAnsi" w:cstheme="majorHAnsi"/>
+                <w:sz w:val="20"/>
+                <w:szCs w:val="20"/>
+              </w:rPr>
+              <w:t xml:space="preserve">Reach out to the agency</w:t>
             </w:r>
           </w:p>
         </w:tc>
         <w:tc>
           <w:tcPr>
-            <w:tcW w:w="172" w:type="pct"/>
+            <w:tcW w:w="350" w:type="dxa"/>
             <w:vAlign w:val="center"/>
           </w:tcPr>
           <w:p>
@@ -1538,9 +2496,20 @@
       </w:pPr>
     </w:p>
     <w:sectPr>
-      <w:headerReference w:type="default" r:id="rId11"/>
+      <w:headerReference w:type="even" r:id="rId11"/>
+      <w:headerReference w:type="default" r:id="rId12"/>
+      <w:footerReference w:type="even" r:id="rId13"/>
+      <w:footerReference w:type="default" r:id="rId14"/>
+      <w:headerReference w:type="first" r:id="rId15"/>
+      <w:footerReference w:type="first" r:id="rId16"/>
       <w:pgSz w:w="12240" w:h="15840"/>
       <w:pgMar w:top="1620" w:right="864" w:bottom="720" w:left="864" w:header="720" w:footer="309" w:gutter="0"/>
+      <w:pgBorders w:offsetFrom="page">
+        <w:top w:val="double" w:sz="4" w:space="24" w:color="auto"/>
+        <w:left w:val="double" w:sz="4" w:space="24" w:color="auto"/>
+        <w:bottom w:val="double" w:sz="4" w:space="24" w:color="auto"/>
+        <w:right w:val="double" w:sz="4" w:space="24" w:color="auto"/>
+      </w:pgBorders>
       <w:cols w:space="720"/>
       <w:docGrid w:linePitch="360"/>
     </w:sectPr>
@@ -1573,6 +2542,295 @@
 </w:endnotes>
 </file>
 
+<file path=word/footer1.xml><?xml version="1.0" encoding="utf-8"?>
+<w:ftr xmlns:wpc="http://schemas.microsoft.com/office/word/2010/wordprocessingCanvas" xmlns:cx="http://schemas.microsoft.com/office/drawing/2014/chartex" xmlns:cx1="http://schemas.microsoft.com/office/drawing/2015/9/8/chartex" xmlns:cx2="http://schemas.microsoft.com/office/drawing/2015/10/21/chartex" xmlns:cx3="http://schemas.microsoft.com/office/drawing/2016/5/9/chartex" xmlns:cx4="http://schemas.microsoft.com/office/drawing/2016/5/10/chartex" xmlns:cx5="http://schemas.microsoft.com/office/drawing/2016/5/11/chartex" xmlns:cx6="http://schemas.microsoft.com/office/drawing/2016/5/12/chartex" xmlns:cx7="http://schemas.microsoft.com/office/drawing/2016/5/13/chartex" xmlns:cx8="http://schemas.microsoft.com/office/drawing/2016/5/14/chartex" xmlns:mc="http://schemas.openxmlformats.org/markup-compatibility/2006" xmlns:aink="http://schemas.microsoft.com/office/drawing/2016/ink" xmlns:am3d="http://schemas.microsoft.com/office/drawing/2017/model3d" xmlns:o="urn:schemas-microsoft-com:office:office" xmlns:oel="http://schemas.microsoft.com/office/2019/extlst" xmlns:r="http://schemas.openxmlformats.org/officeDocument/2006/relationships" xmlns:m="http://schemas.openxmlformats.org/officeDocument/2006/math" xmlns:v="urn:schemas-microsoft-com:vml" xmlns:wp14="http://schemas.microsoft.com/office/word/2010/wordprocessingDrawing" xmlns:wp="http://schemas.openxmlformats.org/drawingml/2006/wordprocessingDrawing" xmlns:w10="urn:schemas-microsoft-com:office:word" xmlns:w="http://schemas.openxmlformats.org/wordprocessingml/2006/main" xmlns:w14="http://schemas.microsoft.com/office/word/2010/wordml" xmlns:w15="http://schemas.microsoft.com/office/word/2012/wordml" xmlns:w16cex="http://schemas.microsoft.com/office/word/2018/wordml/cex" xmlns:w16cid="http://schemas.microsoft.com/office/word/2016/wordml/cid" xmlns:w16="http://schemas.microsoft.com/office/word/2018/wordml" xmlns:w16du="http://schemas.microsoft.com/office/word/2023/wordml/word16du" xmlns:w16sdtdh="http://schemas.microsoft.com/office/word/2020/wordml/sdtdatahash" xmlns:w16sdtfl="http://schemas.microsoft.com/office/word/2024/wordml/sdtformatlock" xmlns:w16se="http://schemas.microsoft.com/office/word/2015/wordml/symex" xmlns:wpg="http://schemas.microsoft.com/office/word/2010/wordprocessingGroup" xmlns:wpi="http://schemas.microsoft.com/office/word/2010/wordprocessingInk" xmlns:wne="http://schemas.microsoft.com/office/word/2006/wordml" xmlns:wps="http://schemas.microsoft.com/office/word/2010/wordprocessingShape" mc:Ignorable="w14 w15 w16se w16cid w16 w16cex w16sdtdh w16sdtfl w16du wp14">
+  <w:p>
+    <w:pPr>
+      <w:pStyle w:val="Footer"/>
+    </w:pPr>
+  </w:p>
+</w:ftr>
+</file>
+
+<file path=word/footer2.xml><?xml version="1.0" encoding="utf-8"?>
+<w:ftr xmlns:wpc="http://schemas.microsoft.com/office/word/2010/wordprocessingCanvas" xmlns:cx="http://schemas.microsoft.com/office/drawing/2014/chartex" xmlns:cx1="http://schemas.microsoft.com/office/drawing/2015/9/8/chartex" xmlns:cx2="http://schemas.microsoft.com/office/drawing/2015/10/21/chartex" xmlns:cx3="http://schemas.microsoft.com/office/drawing/2016/5/9/chartex" xmlns:cx4="http://schemas.microsoft.com/office/drawing/2016/5/10/chartex" xmlns:cx5="http://schemas.microsoft.com/office/drawing/2016/5/11/chartex" xmlns:cx6="http://schemas.microsoft.com/office/drawing/2016/5/12/chartex" xmlns:cx7="http://schemas.microsoft.com/office/drawing/2016/5/13/chartex" xmlns:cx8="http://schemas.microsoft.com/office/drawing/2016/5/14/chartex" xmlns:mc="http://schemas.openxmlformats.org/markup-compatibility/2006" xmlns:aink="http://schemas.microsoft.com/office/drawing/2016/ink" xmlns:am3d="http://schemas.microsoft.com/office/drawing/2017/model3d" xmlns:o="urn:schemas-microsoft-com:office:office" xmlns:oel="http://schemas.microsoft.com/office/2019/extlst" xmlns:r="http://schemas.openxmlformats.org/officeDocument/2006/relationships" xmlns:m="http://schemas.openxmlformats.org/officeDocument/2006/math" xmlns:v="urn:schemas-microsoft-com:vml" xmlns:wp14="http://schemas.microsoft.com/office/word/2010/wordprocessingDrawing" xmlns:wp="http://schemas.openxmlformats.org/drawingml/2006/wordprocessingDrawing" xmlns:w10="urn:schemas-microsoft-com:office:word" xmlns:w="http://schemas.openxmlformats.org/wordprocessingml/2006/main" xmlns:w14="http://schemas.microsoft.com/office/word/2010/wordml" xmlns:w15="http://schemas.microsoft.com/office/word/2012/wordml" xmlns:w16cex="http://schemas.microsoft.com/office/word/2018/wordml/cex" xmlns:w16cid="http://schemas.microsoft.com/office/word/2016/wordml/cid" xmlns:w16="http://schemas.microsoft.com/office/word/2018/wordml" xmlns:w16du="http://schemas.microsoft.com/office/word/2023/wordml/word16du" xmlns:w16sdtdh="http://schemas.microsoft.com/office/word/2020/wordml/sdtdatahash" xmlns:w16sdtfl="http://schemas.microsoft.com/office/word/2024/wordml/sdtformatlock" xmlns:w16se="http://schemas.microsoft.com/office/word/2015/wordml/symex" xmlns:wpg="http://schemas.microsoft.com/office/word/2010/wordprocessingGroup" xmlns:wpi="http://schemas.microsoft.com/office/word/2010/wordprocessingInk" xmlns:wne="http://schemas.microsoft.com/office/word/2006/wordml" xmlns:wps="http://schemas.microsoft.com/office/word/2010/wordprocessingShape" mc:Ignorable="w14 w15 w16se w16cid w16 w16cex w16sdtdh w16sdtfl w16du wp14">
+  <w:p>
+    <w:pPr>
+      <w:pStyle w:val="Footer"/>
+      <w:tabs>
+        <w:tab w:val="clear" w:pos="4680"/>
+        <w:tab w:val="center" w:pos="3240"/>
+      </w:tabs>
+      <w:bidi/>
+      <w:jc w:val="right"/>
+      <w:rPr>
+        <w:rFonts w:asciiTheme="majorBidi" w:hAnsiTheme="majorBidi" w:cstheme="majorBidi"/>
+        <w:color w:val="A79F88"/>
+        <w:sz w:val="20"/>
+        <w:szCs w:val="20"/>
+      </w:rPr>
+    </w:pPr>
+    <w:r>
+      <w:rPr>
+        <w:rFonts w:asciiTheme="majorBidi" w:hAnsiTheme="majorBidi" w:cstheme="majorBidi"/>
+        <w:color w:val="A79F88"/>
+        <w:sz w:val="20"/>
+        <w:szCs w:val="20"/>
+        <w:rtl/>
+      </w:rPr>
+      <w:tab/>
+    </w:r>
+    <w:r>
+      <w:rPr>
+        <w:rFonts w:asciiTheme="majorBidi" w:hAnsiTheme="majorBidi" w:cstheme="majorBidi"/>
+        <w:color w:val="A79F88"/>
+        <w:sz w:val="20"/>
+        <w:szCs w:val="20"/>
+        <w:rtl/>
+      </w:rPr>
+      <w:tab/>
+    </w:r>
+    <w:r>
+      <w:rPr>
+        <w:rFonts w:asciiTheme="majorBidi" w:hAnsiTheme="majorBidi" w:cstheme="majorBidi"/>
+        <w:color w:val="A79F88"/>
+        <w:sz w:val="20"/>
+        <w:szCs w:val="20"/>
+        <w:rtl/>
+      </w:rPr>
+      <w:tab/>
+    </w:r>
+    <w:sdt>
+      <w:sdtPr>
+        <w:rPr>
+          <w:rFonts w:asciiTheme="majorBidi" w:hAnsiTheme="majorBidi" w:cstheme="majorBidi"/>
+          <w:color w:val="A79F88"/>
+          <w:sz w:val="20"/>
+          <w:szCs w:val="20"/>
+          <w:rtl/>
+        </w:rPr>
+        <w:id w:val="1129204054"/>
+        <w:docPartObj>
+          <w:docPartGallery w:val="Page Numbers (Bottom of Page)"/>
+          <w:docPartUnique/>
+        </w:docPartObj>
+      </w:sdtPr>
+      <w:sdtContent>
+        <w:sdt>
+          <w:sdtPr>
+            <w:rPr>
+              <w:rFonts w:asciiTheme="majorBidi" w:hAnsiTheme="majorBidi" w:cstheme="majorBidi"/>
+              <w:color w:val="A79F88"/>
+              <w:sz w:val="20"/>
+              <w:szCs w:val="20"/>
+              <w:rtl/>
+            </w:rPr>
+            <w:id w:val="-856891464"/>
+            <w:docPartObj>
+              <w:docPartGallery w:val="Page Numbers (Top of Page)"/>
+              <w:docPartUnique/>
+            </w:docPartObj>
+          </w:sdtPr>
+          <w:sdtContent>
+            <w:r>
+              <w:rPr>
+                <w:rFonts w:asciiTheme="majorBidi" w:hAnsiTheme="majorBidi" w:cstheme="majorBidi"/>
+                <w:color w:val="A79F88"/>
+                <w:sz w:val="20"/>
+                <w:szCs w:val="20"/>
+                <w:rtl/>
+              </w:rPr>
+              <w:t xml:space="preserve">  </w:t>
+            </w:r>
+            <w:r>
+              <w:rPr>
+                <w:rFonts w:asciiTheme="majorBidi" w:hAnsiTheme="majorBidi" w:cstheme="majorBidi"/>
+                <w:color w:val="A79F88"/>
+                <w:sz w:val="20"/>
+                <w:szCs w:val="20"/>
+                <w:rtl/>
+              </w:rPr>
+              <w:t>صفحة</w:t>
+            </w:r>
+            <w:r>
+              <w:rPr>
+                <w:rFonts w:asciiTheme="majorBidi" w:hAnsiTheme="majorBidi" w:cstheme="majorBidi"/>
+                <w:color w:val="A79F88"/>
+                <w:sz w:val="20"/>
+                <w:szCs w:val="20"/>
+              </w:rPr>
+              <w:t xml:space="preserve"> </w:t>
+            </w:r>
+            <w:r>
+              <w:rPr>
+                <w:rFonts w:asciiTheme="majorBidi" w:hAnsiTheme="majorBidi" w:cstheme="majorBidi"/>
+                <w:b/>
+                <w:bCs/>
+                <w:color w:val="A79F88"/>
+                <w:sz w:val="20"/>
+                <w:szCs w:val="20"/>
+              </w:rPr>
+              <w:fldChar w:fldCharType="begin"/>
+            </w:r>
+            <w:r>
+              <w:rPr>
+                <w:rFonts w:asciiTheme="majorBidi" w:hAnsiTheme="majorBidi" w:cstheme="majorBidi"/>
+                <w:b/>
+                <w:bCs/>
+                <w:color w:val="A79F88"/>
+                <w:sz w:val="20"/>
+                <w:szCs w:val="20"/>
+              </w:rPr>
+              <w:instrText xml:space="preserve"> PAGE </w:instrText>
+            </w:r>
+            <w:r>
+              <w:rPr>
+                <w:rFonts w:asciiTheme="majorBidi" w:hAnsiTheme="majorBidi" w:cstheme="majorBidi"/>
+                <w:b/>
+                <w:bCs/>
+                <w:color w:val="A79F88"/>
+                <w:sz w:val="20"/>
+                <w:szCs w:val="20"/>
+              </w:rPr>
+              <w:fldChar w:fldCharType="separate"/>
+            </w:r>
+            <w:r>
+              <w:rPr>
+                <w:rFonts w:asciiTheme="majorBidi" w:hAnsiTheme="majorBidi" w:cstheme="majorBidi"/>
+                <w:b/>
+                <w:bCs/>
+                <w:noProof/>
+                <w:color w:val="A79F88"/>
+                <w:sz w:val="20"/>
+                <w:szCs w:val="20"/>
+                <w:rtl/>
+              </w:rPr>
+              <w:t>1</w:t>
+            </w:r>
+            <w:r>
+              <w:rPr>
+                <w:rFonts w:asciiTheme="majorBidi" w:hAnsiTheme="majorBidi" w:cstheme="majorBidi"/>
+                <w:b/>
+                <w:bCs/>
+                <w:color w:val="A79F88"/>
+                <w:sz w:val="20"/>
+                <w:szCs w:val="20"/>
+              </w:rPr>
+              <w:fldChar w:fldCharType="end"/>
+            </w:r>
+            <w:r>
+              <w:rPr>
+                <w:rFonts w:asciiTheme="majorBidi" w:hAnsiTheme="majorBidi" w:cstheme="majorBidi"/>
+                <w:color w:val="A79F88"/>
+                <w:sz w:val="20"/>
+                <w:szCs w:val="20"/>
+              </w:rPr>
+              <w:t xml:space="preserve"> </w:t>
+            </w:r>
+            <w:r>
+              <w:rPr>
+                <w:rFonts w:asciiTheme="majorBidi" w:hAnsiTheme="majorBidi" w:cstheme="majorBidi"/>
+                <w:color w:val="A79F88"/>
+                <w:sz w:val="20"/>
+                <w:szCs w:val="20"/>
+                <w:rtl/>
+              </w:rPr>
+              <w:t>من</w:t>
+            </w:r>
+            <w:r>
+              <w:rPr>
+                <w:rFonts w:asciiTheme="majorBidi" w:hAnsiTheme="majorBidi" w:cstheme="majorBidi"/>
+                <w:color w:val="A79F88"/>
+                <w:sz w:val="20"/>
+                <w:szCs w:val="20"/>
+              </w:rPr>
+              <w:t xml:space="preserve"> </w:t>
+            </w:r>
+            <w:r>
+              <w:rPr>
+                <w:rFonts w:asciiTheme="majorBidi" w:hAnsiTheme="majorBidi" w:cstheme="majorBidi"/>
+                <w:b/>
+                <w:bCs/>
+                <w:color w:val="A79F88"/>
+                <w:sz w:val="20"/>
+                <w:szCs w:val="20"/>
+              </w:rPr>
+              <w:fldChar w:fldCharType="begin"/>
+            </w:r>
+            <w:r>
+              <w:rPr>
+                <w:rFonts w:asciiTheme="majorBidi" w:hAnsiTheme="majorBidi" w:cstheme="majorBidi"/>
+                <w:b/>
+                <w:bCs/>
+                <w:color w:val="A79F88"/>
+                <w:sz w:val="20"/>
+                <w:szCs w:val="20"/>
+              </w:rPr>
+              <w:instrText xml:space="preserve"> NUMPAGES  </w:instrText>
+            </w:r>
+            <w:r>
+              <w:rPr>
+                <w:rFonts w:asciiTheme="majorBidi" w:hAnsiTheme="majorBidi" w:cstheme="majorBidi"/>
+                <w:b/>
+                <w:bCs/>
+                <w:color w:val="A79F88"/>
+                <w:sz w:val="20"/>
+                <w:szCs w:val="20"/>
+              </w:rPr>
+              <w:fldChar w:fldCharType="separate"/>
+            </w:r>
+            <w:r>
+              <w:rPr>
+                <w:rFonts w:asciiTheme="majorBidi" w:hAnsiTheme="majorBidi" w:cstheme="majorBidi"/>
+                <w:b/>
+                <w:bCs/>
+                <w:noProof/>
+                <w:color w:val="A79F88"/>
+                <w:sz w:val="20"/>
+                <w:szCs w:val="20"/>
+                <w:rtl/>
+              </w:rPr>
+              <w:t>1</w:t>
+            </w:r>
+            <w:r>
+              <w:rPr>
+                <w:rFonts w:asciiTheme="majorBidi" w:hAnsiTheme="majorBidi" w:cstheme="majorBidi"/>
+                <w:b/>
+                <w:bCs/>
+                <w:color w:val="A79F88"/>
+                <w:sz w:val="20"/>
+                <w:szCs w:val="20"/>
+              </w:rPr>
+              <w:fldChar w:fldCharType="end"/>
+            </w:r>
+          </w:sdtContent>
+        </w:sdt>
+      </w:sdtContent>
+    </w:sdt>
+  </w:p>
+  <w:p>
+    <w:pPr>
+      <w:pStyle w:val="Footer"/>
+      <w:rPr>
+        <w:rFonts w:ascii="Sakkal Majalla" w:hAnsi="Sakkal Majalla" w:cs="Sakkal Majalla"/>
+        <w:sz w:val="28"/>
+        <w:szCs w:val="28"/>
+      </w:rPr>
+    </w:pPr>
+  </w:p>
+</w:ftr>
+</file>
+
+<file path=word/footer3.xml><?xml version="1.0" encoding="utf-8"?>
+<w:ftr xmlns:wpc="http://schemas.microsoft.com/office/word/2010/wordprocessingCanvas" xmlns:cx="http://schemas.microsoft.com/office/drawing/2014/chartex" xmlns:cx1="http://schemas.microsoft.com/office/drawing/2015/9/8/chartex" xmlns:cx2="http://schemas.microsoft.com/office/drawing/2015/10/21/chartex" xmlns:cx3="http://schemas.microsoft.com/office/drawing/2016/5/9/chartex" xmlns:cx4="http://schemas.microsoft.com/office/drawing/2016/5/10/chartex" xmlns:cx5="http://schemas.microsoft.com/office/drawing/2016/5/11/chartex" xmlns:cx6="http://schemas.microsoft.com/office/drawing/2016/5/12/chartex" xmlns:cx7="http://schemas.microsoft.com/office/drawing/2016/5/13/chartex" xmlns:cx8="http://schemas.microsoft.com/office/drawing/2016/5/14/chartex" xmlns:mc="http://schemas.openxmlformats.org/markup-compatibility/2006" xmlns:aink="http://schemas.microsoft.com/office/drawing/2016/ink" xmlns:am3d="http://schemas.microsoft.com/office/drawing/2017/model3d" xmlns:o="urn:schemas-microsoft-com:office:office" xmlns:oel="http://schemas.microsoft.com/office/2019/extlst" xmlns:r="http://schemas.openxmlformats.org/officeDocument/2006/relationships" xmlns:m="http://schemas.openxmlformats.org/officeDocument/2006/math" xmlns:v="urn:schemas-microsoft-com:vml" xmlns:wp14="http://schemas.microsoft.com/office/word/2010/wordprocessingDrawing" xmlns:wp="http://schemas.openxmlformats.org/drawingml/2006/wordprocessingDrawing" xmlns:w10="urn:schemas-microsoft-com:office:word" xmlns:w="http://schemas.openxmlformats.org/wordprocessingml/2006/main" xmlns:w14="http://schemas.microsoft.com/office/word/2010/wordml" xmlns:w15="http://schemas.microsoft.com/office/word/2012/wordml" xmlns:w16cex="http://schemas.microsoft.com/office/word/2018/wordml/cex" xmlns:w16cid="http://schemas.microsoft.com/office/word/2016/wordml/cid" xmlns:w16="http://schemas.microsoft.com/office/word/2018/wordml" xmlns:w16du="http://schemas.microsoft.com/office/word/2023/wordml/word16du" xmlns:w16sdtdh="http://schemas.microsoft.com/office/word/2020/wordml/sdtdatahash" xmlns:w16sdtfl="http://schemas.microsoft.com/office/word/2024/wordml/sdtformatlock" xmlns:w16se="http://schemas.microsoft.com/office/word/2015/wordml/symex" xmlns:wpg="http://schemas.microsoft.com/office/word/2010/wordprocessingGroup" xmlns:wpi="http://schemas.microsoft.com/office/word/2010/wordprocessingInk" xmlns:wne="http://schemas.microsoft.com/office/word/2006/wordml" xmlns:wps="http://schemas.microsoft.com/office/word/2010/wordprocessingShape" mc:Ignorable="w14 w15 w16se w16cid w16 w16cex w16sdtdh w16sdtfl w16du wp14">
+  <w:p>
+    <w:pPr>
+      <w:pStyle w:val="Footer"/>
+    </w:pPr>
+  </w:p>
+</w:ftr>
+</file>
+
 <file path=word/footnotes.xml><?xml version="1.0" encoding="utf-8"?>
 <w:footnotes xmlns:wpc="http://schemas.microsoft.com/office/word/2010/wordprocessingCanvas" xmlns:cx="http://schemas.microsoft.com/office/drawing/2014/chartex" xmlns:cx1="http://schemas.microsoft.com/office/drawing/2015/9/8/chartex" xmlns:cx2="http://schemas.microsoft.com/office/drawing/2015/10/21/chartex" xmlns:cx3="http://schemas.microsoft.com/office/drawing/2016/5/9/chartex" xmlns:cx4="http://schemas.microsoft.com/office/drawing/2016/5/10/chartex" xmlns:cx5="http://schemas.microsoft.com/office/drawing/2016/5/11/chartex" xmlns:cx6="http://schemas.microsoft.com/office/drawing/2016/5/12/chartex" xmlns:cx7="http://schemas.microsoft.com/office/drawing/2016/5/13/chartex" xmlns:cx8="http://schemas.microsoft.com/office/drawing/2016/5/14/chartex" xmlns:mc="http://schemas.openxmlformats.org/markup-compatibility/2006" xmlns:aink="http://schemas.microsoft.com/office/drawing/2016/ink" xmlns:am3d="http://schemas.microsoft.com/office/drawing/2017/model3d" xmlns:o="urn:schemas-microsoft-com:office:office" xmlns:oel="http://schemas.microsoft.com/office/2019/extlst" xmlns:r="http://schemas.openxmlformats.org/officeDocument/2006/relationships" xmlns:m="http://schemas.openxmlformats.org/officeDocument/2006/math" xmlns:v="urn:schemas-microsoft-com:vml" xmlns:wp14="http://schemas.microsoft.com/office/word/2010/wordprocessingDrawing" xmlns:wp="http://schemas.openxmlformats.org/drawingml/2006/wordprocessingDrawing" xmlns:w10="urn:schemas-microsoft-com:office:word" xmlns:w="http://schemas.openxmlformats.org/wordprocessingml/2006/main" xmlns:w14="http://schemas.microsoft.com/office/word/2010/wordml" xmlns:w15="http://schemas.microsoft.com/office/word/2012/wordml" xmlns:w16cex="http://schemas.microsoft.com/office/word/2018/wordml/cex" xmlns:w16cid="http://schemas.microsoft.com/office/word/2016/wordml/cid" xmlns:w16="http://schemas.microsoft.com/office/word/2018/wordml" xmlns:w16du="http://schemas.microsoft.com/office/word/2023/wordml/word16du" xmlns:w16sdtdh="http://schemas.microsoft.com/office/word/2020/wordml/sdtdatahash" xmlns:w16sdtfl="http://schemas.microsoft.com/office/word/2024/wordml/sdtformatlock" xmlns:w16se="http://schemas.microsoft.com/office/word/2015/wordml/symex" xmlns:wpg="http://schemas.microsoft.com/office/word/2010/wordprocessingGroup" xmlns:wpi="http://schemas.microsoft.com/office/word/2010/wordprocessingInk" xmlns:wne="http://schemas.microsoft.com/office/word/2006/wordml" xmlns:wps="http://schemas.microsoft.com/office/word/2010/wordprocessingShape" mc:Ignorable="w14 w15 w16se w16cid w16 w16cex w16sdtdh w16sdtfl w16du wp14">
   <w:footnote w:type="separator" w:id="-1">
@@ -1600,11 +2858,21 @@
 
 <file path=word/header1.xml><?xml version="1.0" encoding="utf-8"?>
 <w:hdr xmlns:wpc="http://schemas.microsoft.com/office/word/2010/wordprocessingCanvas" xmlns:cx="http://schemas.microsoft.com/office/drawing/2014/chartex" xmlns:cx1="http://schemas.microsoft.com/office/drawing/2015/9/8/chartex" xmlns:cx2="http://schemas.microsoft.com/office/drawing/2015/10/21/chartex" xmlns:cx3="http://schemas.microsoft.com/office/drawing/2016/5/9/chartex" xmlns:cx4="http://schemas.microsoft.com/office/drawing/2016/5/10/chartex" xmlns:cx5="http://schemas.microsoft.com/office/drawing/2016/5/11/chartex" xmlns:cx6="http://schemas.microsoft.com/office/drawing/2016/5/12/chartex" xmlns:cx7="http://schemas.microsoft.com/office/drawing/2016/5/13/chartex" xmlns:cx8="http://schemas.microsoft.com/office/drawing/2016/5/14/chartex" xmlns:mc="http://schemas.openxmlformats.org/markup-compatibility/2006" xmlns:aink="http://schemas.microsoft.com/office/drawing/2016/ink" xmlns:am3d="http://schemas.microsoft.com/office/drawing/2017/model3d" xmlns:o="urn:schemas-microsoft-com:office:office" xmlns:oel="http://schemas.microsoft.com/office/2019/extlst" xmlns:r="http://schemas.openxmlformats.org/officeDocument/2006/relationships" xmlns:m="http://schemas.openxmlformats.org/officeDocument/2006/math" xmlns:v="urn:schemas-microsoft-com:vml" xmlns:wp14="http://schemas.microsoft.com/office/word/2010/wordprocessingDrawing" xmlns:wp="http://schemas.openxmlformats.org/drawingml/2006/wordprocessingDrawing" xmlns:w10="urn:schemas-microsoft-com:office:word" xmlns:w="http://schemas.openxmlformats.org/wordprocessingml/2006/main" xmlns:w14="http://schemas.microsoft.com/office/word/2010/wordml" xmlns:w15="http://schemas.microsoft.com/office/word/2012/wordml" xmlns:w16cex="http://schemas.microsoft.com/office/word/2018/wordml/cex" xmlns:w16cid="http://schemas.microsoft.com/office/word/2016/wordml/cid" xmlns:w16="http://schemas.microsoft.com/office/word/2018/wordml" xmlns:w16du="http://schemas.microsoft.com/office/word/2023/wordml/word16du" xmlns:w16sdtdh="http://schemas.microsoft.com/office/word/2020/wordml/sdtdatahash" xmlns:w16sdtfl="http://schemas.microsoft.com/office/word/2024/wordml/sdtformatlock" xmlns:w16se="http://schemas.microsoft.com/office/word/2015/wordml/symex" xmlns:wpg="http://schemas.microsoft.com/office/word/2010/wordprocessingGroup" xmlns:wpi="http://schemas.microsoft.com/office/word/2010/wordprocessingInk" xmlns:wne="http://schemas.microsoft.com/office/word/2006/wordml" xmlns:wps="http://schemas.microsoft.com/office/word/2010/wordprocessingShape" mc:Ignorable="w14 w15 w16se w16cid w16 w16cex w16sdtdh w16sdtfl w16du wp14">
+  <w:p>
+    <w:pPr>
+      <w:pStyle w:val="Header"/>
+    </w:pPr>
+  </w:p>
+</w:hdr>
+</file>
+
+<file path=word/header2.xml><?xml version="1.0" encoding="utf-8"?>
+<w:hdr xmlns:wpc="http://schemas.microsoft.com/office/word/2010/wordprocessingCanvas" xmlns:cx="http://schemas.microsoft.com/office/drawing/2014/chartex" xmlns:cx1="http://schemas.microsoft.com/office/drawing/2015/9/8/chartex" xmlns:cx2="http://schemas.microsoft.com/office/drawing/2015/10/21/chartex" xmlns:cx3="http://schemas.microsoft.com/office/drawing/2016/5/9/chartex" xmlns:cx4="http://schemas.microsoft.com/office/drawing/2016/5/10/chartex" xmlns:cx5="http://schemas.microsoft.com/office/drawing/2016/5/11/chartex" xmlns:cx6="http://schemas.microsoft.com/office/drawing/2016/5/12/chartex" xmlns:cx7="http://schemas.microsoft.com/office/drawing/2016/5/13/chartex" xmlns:cx8="http://schemas.microsoft.com/office/drawing/2016/5/14/chartex" xmlns:mc="http://schemas.openxmlformats.org/markup-compatibility/2006" xmlns:aink="http://schemas.microsoft.com/office/drawing/2016/ink" xmlns:am3d="http://schemas.microsoft.com/office/drawing/2017/model3d" xmlns:o="urn:schemas-microsoft-com:office:office" xmlns:oel="http://schemas.microsoft.com/office/2019/extlst" xmlns:r="http://schemas.openxmlformats.org/officeDocument/2006/relationships" xmlns:m="http://schemas.openxmlformats.org/officeDocument/2006/math" xmlns:v="urn:schemas-microsoft-com:vml" xmlns:wp14="http://schemas.microsoft.com/office/word/2010/wordprocessingDrawing" xmlns:wp="http://schemas.openxmlformats.org/drawingml/2006/wordprocessingDrawing" xmlns:w10="urn:schemas-microsoft-com:office:word" xmlns:w="http://schemas.openxmlformats.org/wordprocessingml/2006/main" xmlns:w14="http://schemas.microsoft.com/office/word/2010/wordml" xmlns:w15="http://schemas.microsoft.com/office/word/2012/wordml" xmlns:w16cex="http://schemas.microsoft.com/office/word/2018/wordml/cex" xmlns:w16cid="http://schemas.microsoft.com/office/word/2016/wordml/cid" xmlns:w16="http://schemas.microsoft.com/office/word/2018/wordml" xmlns:w16du="http://schemas.microsoft.com/office/word/2023/wordml/word16du" xmlns:w16sdtdh="http://schemas.microsoft.com/office/word/2020/wordml/sdtdatahash" xmlns:w16sdtfl="http://schemas.microsoft.com/office/word/2024/wordml/sdtformatlock" xmlns:w16se="http://schemas.microsoft.com/office/word/2015/wordml/symex" xmlns:wpg="http://schemas.microsoft.com/office/word/2010/wordprocessingGroup" xmlns:wpi="http://schemas.microsoft.com/office/word/2010/wordprocessingInk" xmlns:wne="http://schemas.microsoft.com/office/word/2006/wordml" xmlns:wps="http://schemas.microsoft.com/office/word/2010/wordprocessingShape" mc:Ignorable="w14 w15 w16se w16cid w16 w16cex w16sdtdh w16sdtfl w16du wp14">
   <w:tbl>
     <w:tblPr>
       <w:tblStyle w:val="TableGrid"/>
       <w:bidiVisual/>
-      <w:tblW w:w="5000" w:type="pct"/>
+      <w:tblW w:w="0" w:type="auto"/>
       <w:tblBorders>
         <w:top w:val="single" w:sz="2" w:space="0" w:color="BFBFBF" w:themeColor="background1" w:themeShade="BF"/>
         <w:left w:val="single" w:sz="2" w:space="0" w:color="BFBFBF" w:themeColor="background1" w:themeShade="BF"/>
@@ -1616,15 +2884,102 @@
       <w:tblLook w:val="04A0" w:firstRow="1" w:lastRow="0" w:firstColumn="1" w:lastColumn="0" w:noHBand="0" w:noVBand="1"/>
     </w:tblPr>
     <w:tblGrid>
-      <w:gridCol w:w="10506"/>
+      <w:gridCol w:w="3500"/>
+      <w:gridCol w:w="3501"/>
+      <w:gridCol w:w="3501"/>
     </w:tblGrid>
     <w:tr>
       <w:trPr>
-        <w:trHeight w:val="569"/>
+        <w:trHeight w:val="620"/>
       </w:trPr>
       <w:tc>
         <w:tcPr>
-          <w:tcW w:w="5000" w:type="pct"/>
+          <w:tcW w:w="3500" w:type="dxa"/>
+          <w:vAlign w:val="center"/>
+        </w:tcPr>
+        <w:p>
+          <w:pPr>
+            <w:tabs>
+              <w:tab w:val="left" w:pos="1692"/>
+              <w:tab w:val="center" w:pos="5256"/>
+            </w:tabs>
+            <w:bidi/>
+            <w:rPr>
+              <w:rFonts w:asciiTheme="majorBidi" w:hAnsiTheme="majorBidi" w:cstheme="majorBidi"/>
+              <w:color w:val="716254"/>
+              <w:sz w:val="20"/>
+              <w:szCs w:val="20"/>
+              <w:rtl/>
+            </w:rPr>
+          </w:pPr>
+          <w:r>
+            <w:rPr>
+              <w:rFonts w:ascii="Sakkal Majalla" w:hAnsi="Sakkal Majalla" w:cs="Sakkal Majalla"/>
+              <w:noProof/>
+              <w:sz w:val="24"/>
+              <w:szCs w:val="24"/>
+            </w:rPr>
+            <w:drawing>
+              <wp:inline distT="0" distB="0" distL="0" distR="0" wp14:anchorId="3AF2B768" wp14:editId="37D707B4">
+                <wp:extent cx="982980" cy="289603"/>
+                <wp:effectExtent l="0" t="0" r="7620" b="0"/>
+                <wp:docPr id="3" name="Graphic 10">
+                  <a:extLst xmlns:a="http://schemas.openxmlformats.org/drawingml/2006/main">
+                    <a:ext uri="{FF2B5EF4-FFF2-40B4-BE49-F238E27FC236}">
+                      <a16:creationId xmlns:a16="http://schemas.microsoft.com/office/drawing/2014/main" id="{0BBF6EC9-D6F2-B4FE-2F22-6FCEEB899FED}"/>
+                    </a:ext>
+                  </a:extLst>
+                </wp:docPr>
+                <wp:cNvGraphicFramePr>
+                  <a:graphicFrameLocks xmlns:a="http://schemas.openxmlformats.org/drawingml/2006/main" noChangeAspect="1"/>
+                </wp:cNvGraphicFramePr>
+                <a:graphic xmlns:a="http://schemas.openxmlformats.org/drawingml/2006/main">
+                  <a:graphicData uri="http://schemas.openxmlformats.org/drawingml/2006/picture">
+                    <pic:pic xmlns:pic="http://schemas.openxmlformats.org/drawingml/2006/picture">
+                      <pic:nvPicPr>
+                        <pic:cNvPr id="3" name="Graphic 10">
+                          <a:extLst>
+                            <a:ext uri="{FF2B5EF4-FFF2-40B4-BE49-F238E27FC236}">
+                              <a16:creationId xmlns:a16="http://schemas.microsoft.com/office/drawing/2014/main" id="{0BBF6EC9-D6F2-B4FE-2F22-6FCEEB899FED}"/>
+                            </a:ext>
+                          </a:extLst>
+                        </pic:cNvPr>
+                        <pic:cNvPicPr>
+                          <a:picLocks noChangeAspect="1"/>
+                        </pic:cNvPicPr>
+                      </pic:nvPicPr>
+                      <pic:blipFill>
+                        <a:blip r:embed="rId1">
+                          <a:extLst>
+                            <a:ext uri="{96DAC541-7B7A-43D3-8B79-37D633B846F1}">
+                              <asvg:svgBlip xmlns:asvg="http://schemas.microsoft.com/office/drawing/2016/SVG/main" r:embed="rId2"/>
+                            </a:ext>
+                          </a:extLst>
+                        </a:blip>
+                        <a:stretch>
+                          <a:fillRect/>
+                        </a:stretch>
+                      </pic:blipFill>
+                      <pic:spPr>
+                        <a:xfrm>
+                          <a:off x="0" y="0"/>
+                          <a:ext cx="998107" cy="294060"/>
+                        </a:xfrm>
+                        <a:prstGeom prst="rect">
+                          <a:avLst/>
+                        </a:prstGeom>
+                      </pic:spPr>
+                    </pic:pic>
+                  </a:graphicData>
+                </a:graphic>
+              </wp:inline>
+            </w:drawing>
+          </w:r>
+        </w:p>
+      </w:tc>
+      <w:tc>
+        <w:tcPr>
+          <w:tcW w:w="3501" w:type="dxa"/>
           <w:vAlign w:val="center"/>
         </w:tcPr>
         <w:p>
@@ -1636,42 +2991,116 @@
             <w:bidi/>
             <w:jc w:val="center"/>
             <w:rPr>
-              <w:rFonts w:ascii="Arial" w:hAnsi="Arial" w:cs="Arial"/>
-              <w:color w:val="1F3864"/>
-              <w:sz w:val="32"/>
-              <w:szCs w:val="32"/>
+              <w:rFonts w:asciiTheme="majorBidi" w:hAnsiTheme="majorBidi" w:cstheme="majorBidi"/>
+              <w:color w:val="716254"/>
+              <w:sz w:val="20"/>
+              <w:szCs w:val="20"/>
               <w:rtl/>
             </w:rPr>
           </w:pPr>
           <w:r>
             <w:rPr>
-              <w:rFonts w:ascii="Sakkal Majalla" w:hAnsi="Sakkal Majalla" w:cs="Sakkal Majalla" w:hint="cs"/>
-              <w:color w:val="1F3864"/>
-              <w:sz w:val="32"/>
-              <w:szCs w:val="32"/>
+              <w:rFonts w:asciiTheme="majorBidi" w:hAnsiTheme="majorBidi" w:cstheme="majorBidi"/>
+              <w:color w:val="716254"/>
+              <w:sz w:val="20"/>
+              <w:szCs w:val="20"/>
               <w:rtl/>
             </w:rPr>
-            <w:t>محضر</w:t>
+            <w:t>م</w:t>
           </w:r>
           <w:r>
             <w:rPr>
-              <w:rFonts w:ascii="Arial" w:hAnsi="Arial" w:cs="Arial"/>
-              <w:color w:val="1F3864"/>
-              <w:sz w:val="32"/>
-              <w:szCs w:val="32"/>
+              <w:rFonts w:asciiTheme="majorBidi" w:hAnsiTheme="majorBidi" w:cstheme="majorBidi" w:hint="cs"/>
+              <w:color w:val="716254"/>
+              <w:sz w:val="20"/>
+              <w:szCs w:val="20"/>
               <w:rtl/>
             </w:rPr>
-            <w:t xml:space="preserve"> </w:t>
+            <w:t>ح</w:t>
           </w:r>
           <w:r>
             <w:rPr>
-              <w:rFonts w:ascii="Sakkal Majalla" w:hAnsi="Sakkal Majalla" w:cs="Sakkal Majalla" w:hint="cs"/>
-              <w:color w:val="1F3864"/>
-              <w:sz w:val="32"/>
-              <w:szCs w:val="32"/>
+              <w:rFonts w:asciiTheme="majorBidi" w:hAnsiTheme="majorBidi" w:cstheme="majorBidi"/>
+              <w:color w:val="716254"/>
+              <w:sz w:val="20"/>
+              <w:szCs w:val="20"/>
               <w:rtl/>
             </w:rPr>
-            <w:t>اجتماع</w:t>
+            <w:t xml:space="preserve">ضر </w:t>
+          </w:r>
+          <w:r>
+            <w:rPr>
+              <w:rFonts w:asciiTheme="majorBidi" w:hAnsiTheme="majorBidi" w:cstheme="majorBidi" w:hint="cs"/>
+              <w:color w:val="716254"/>
+              <w:sz w:val="20"/>
+              <w:szCs w:val="20"/>
+              <w:rtl/>
+            </w:rPr>
+            <w:t>ا</w:t>
+          </w:r>
+          <w:r>
+            <w:rPr>
+              <w:rFonts w:asciiTheme="majorBidi" w:hAnsiTheme="majorBidi" w:cstheme="majorBidi" w:hint="cs"/>
+              <w:color w:val="716254"/>
+              <w:sz w:val="20"/>
+              <w:szCs w:val="20"/>
+              <w:rtl/>
+            </w:rPr>
+            <w:t>جتماع</w:t>
+          </w:r>
+        </w:p>
+      </w:tc>
+      <w:tc>
+        <w:tcPr>
+          <w:tcW w:w="3501" w:type="dxa"/>
+          <w:vAlign w:val="center"/>
+        </w:tcPr>
+        <w:p>
+          <w:pPr>
+            <w:tabs>
+              <w:tab w:val="left" w:pos="1692"/>
+              <w:tab w:val="center" w:pos="5256"/>
+            </w:tabs>
+            <w:bidi/>
+            <w:ind w:right="251"/>
+            <w:jc w:val="right"/>
+            <w:rPr>
+              <w:rFonts w:asciiTheme="majorBidi" w:hAnsiTheme="majorBidi" w:cstheme="majorBidi"/>
+              <w:color w:val="716254"/>
+              <w:sz w:val="20"/>
+              <w:szCs w:val="20"/>
+              <w:rtl/>
+            </w:rPr>
+          </w:pPr>
+          <w:r>
+            <w:rPr>
+              <w:rFonts w:asciiTheme="majorBidi" w:hAnsiTheme="majorBidi" w:cstheme="majorBidi"/>
+              <w:color w:val="716254"/>
+              <w:sz w:val="20"/>
+              <w:szCs w:val="20"/>
+              <w:rtl/>
+            </w:rPr>
+            <w:t xml:space="preserve">النسخة: </w:t>
+          </w:r>
+          <w:r>
+            <w:rPr>
+              <w:rFonts w:asciiTheme="majorBidi" w:hAnsiTheme="majorBidi" w:cstheme="majorBidi"/>
+              <w:color w:val="716254"/>
+              <w:sz w:val="20"/>
+              <w:szCs w:val="20"/>
+              <w:highlight w:val="yellow"/>
+            </w:rPr>
+            <w:t>v</w:t>
+          </w:r>
+          <w:r>
+            <w:rPr>
+              <w:rFonts w:asciiTheme="majorBidi" w:hAnsiTheme="majorBidi" w:cstheme="majorBidi"/>
+              <w:color w:val="716254"/>
+              <w:sz w:val="18"/>
+              <w:szCs w:val="18"/>
+              <w:highlight w:val="yellow"/>
+            </w:rPr>
+            <w:t>0.1</w:t>
           </w:r>
         </w:p>
       </w:tc>
@@ -1696,6 +3125,308 @@
         <w:szCs w:val="12"/>
         <w:rtl/>
       </w:rPr>
+    </w:pPr>
+    <w:r>
+      <w:rPr>
+        <w:rFonts w:ascii="Sakkal Majalla" w:hAnsi="Sakkal Majalla" w:cs="Sakkal Majalla"/>
+        <w:b/>
+        <w:bCs/>
+        <w:i/>
+        <w:iCs/>
+        <w:noProof/>
+        <w:color w:val="FF0000"/>
+        <w:sz w:val="12"/>
+        <w:szCs w:val="12"/>
+        <w:rtl/>
+      </w:rPr>
+      <mc:AlternateContent>
+        <mc:Choice Requires="wps">
+          <w:drawing>
+            <wp:anchor distT="0" distB="0" distL="114300" distR="114300" simplePos="0" relativeHeight="251660288" behindDoc="0" locked="0" layoutInCell="1" allowOverlap="1" wp14:anchorId="06D21D32" wp14:editId="6E7AFB52">
+              <wp:simplePos x="0" y="0"/>
+              <wp:positionH relativeFrom="page">
+                <wp:align>left</wp:align>
+              </wp:positionH>
+              <wp:positionV relativeFrom="page">
+                <wp:align>bottom</wp:align>
+              </wp:positionV>
+              <wp:extent cx="5080000" cy="317500"/>
+              <wp:effectExtent l="0" t="0" r="0" b="0"/>
+              <wp:wrapNone/>
+              <wp:docPr id="4" name="GVFooter_Section1_1319220295"/>
+              <wp:cNvGraphicFramePr/>
+              <a:graphic xmlns:a="http://schemas.openxmlformats.org/drawingml/2006/main">
+                <a:graphicData uri="http://schemas.microsoft.com/office/word/2010/wordprocessingShape">
+                  <wps:wsp>
+                    <wps:cNvSpPr txBox="1"/>
+                    <wps:spPr>
+                      <a:xfrm>
+                        <a:off x="0" y="0"/>
+                        <a:ext cx="5080000" cy="317500"/>
+                      </a:xfrm>
+                      <a:prstGeom prst="rect">
+                        <a:avLst/>
+                      </a:prstGeom>
+                      <a:noFill/>
+                      <a:ln w="6350">
+                        <a:noFill/>
+                      </a:ln>
+                      <a:extLst>
+                        <a:ext uri="{91240B29-F687-4F45-9708-019B960494DF}">
+                          <a14:hiddenLine xmlns:a14="http://schemas.microsoft.com/office/drawing/2010/main" w="6350">
+                            <a:solidFill>
+                              <a:prstClr val="black"/>
+                            </a:solidFill>
+                          </a14:hiddenLine>
+                        </a:ext>
+                      </a:extLst>
+                    </wps:spPr>
+                    <wps:txbx>
+                      <w:txbxContent>
+                        <w:p>
+                          <w:r>
+                            <w:rPr>
+                              <w:rFonts w:ascii="Calibri" w:hAnsi="Calibri" w:cs="Calibri"/>
+                              <w:color w:val="008004"/>
+                              <w:sz w:val="20"/>
+                              <w:szCs w:val="20"/>
+                            </w:rPr>
+                            <w:t>Classified as Public-</w:t>
+                          </w:r>
+                          <w:r>
+                            <w:rPr>
+                              <w:rFonts w:ascii="Calibri" w:hAnsi="Calibri" w:cs="Calibri" w:hint="cs"/>
+                              <w:color w:val="008004"/>
+                              <w:sz w:val="20"/>
+                              <w:szCs w:val="20"/>
+                              <w:rtl/>
+                            </w:rPr>
+                            <w:t>عام</w:t>
+                          </w:r>
+                          <w:r>
+                            <w:rPr>
+                              <w:rFonts w:ascii="Calibri" w:hAnsi="Calibri" w:cs="Calibri"/>
+                              <w:color w:val="008004"/>
+                              <w:sz w:val="20"/>
+                              <w:szCs w:val="20"/>
+                            </w:rPr>
+                            <w:t xml:space="preserve"> - Internal</w:t>
+                          </w:r>
+                        </w:p>
+                      </w:txbxContent>
+                    </wps:txbx>
+                    <wps:bodyPr rot="0" spcFirstLastPara="0" vertOverflow="overflow" horzOverflow="overflow" vert="horz" wrap="square" lIns="91440" tIns="45720" rIns="91440" bIns="45720" numCol="1" spcCol="0" rtlCol="0" fromWordArt="0" anchor="t" anchorCtr="0" forceAA="0" compatLnSpc="1">
+                      <a:prstTxWarp prst="textNoShape">
+                        <a:avLst/>
+                      </a:prstTxWarp>
+                      <a:spAutoFit/>
+                    </wps:bodyPr>
+                  </wps:wsp>
+                </a:graphicData>
+              </a:graphic>
+            </wp:anchor>
+          </w:drawing>
+        </mc:Choice>
+        <mc:Fallback>
+          <w:pict>
+            <v:shapetype w14:anchorId="06D21D32" id="_x0000_t202" coordsize="21600,21600" o:spt="202" path="m,l,21600r21600,l21600,xe">
+              <v:stroke joinstyle="miter"/>
+              <v:path gradientshapeok="t" o:connecttype="rect"/>
+            </v:shapetype>
+            <v:shape id="GVFooter_Section1_1319220295" o:spid="_x0000_s1026" type="#_x0000_t202" style="position:absolute;left:0;text-align:left;margin-left:0;margin-top:0;width:400pt;height:25pt;z-index:251660288;visibility:visible;mso-wrap-style:square;mso-wrap-distance-left:9pt;mso-wrap-distance-top:0;mso-wrap-distance-right:9pt;mso-wrap-distance-bottom:0;mso-position-horizontal:left;mso-position-horizontal-relative:page;mso-position-vertical:bottom;mso-position-vertical-relative:page;v-text-anchor:top" o:gfxdata="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" filled="f" stroked="f" strokeweight=".5pt">
+              <v:textbox style="mso-fit-shape-to-text:t">
+                <w:txbxContent>
+                  <w:p>
+                    <w:r>
+                      <w:rPr>
+                        <w:rFonts w:ascii="Calibri" w:hAnsi="Calibri" w:cs="Calibri"/>
+                        <w:color w:val="008004"/>
+                        <w:sz w:val="20"/>
+                        <w:szCs w:val="20"/>
+                      </w:rPr>
+                      <w:t>Classified as Public-</w:t>
+                    </w:r>
+                    <w:r>
+                      <w:rPr>
+                        <w:rFonts w:ascii="Calibri" w:hAnsi="Calibri" w:cs="Calibri" w:hint="cs"/>
+                        <w:color w:val="008004"/>
+                        <w:sz w:val="20"/>
+                        <w:szCs w:val="20"/>
+                        <w:rtl/>
+                      </w:rPr>
+                      <w:t>عام</w:t>
+                    </w:r>
+                    <w:r>
+                      <w:rPr>
+                        <w:rFonts w:ascii="Calibri" w:hAnsi="Calibri" w:cs="Calibri"/>
+                        <w:color w:val="008004"/>
+                        <w:sz w:val="20"/>
+                        <w:szCs w:val="20"/>
+                      </w:rPr>
+                      <w:t xml:space="preserve"> - Internal</w:t>
+                    </w:r>
+                  </w:p>
+                </w:txbxContent>
+              </v:textbox>
+              <w10:wrap anchorx="page" anchory="page"/>
+            </v:shape>
+          </w:pict>
+        </mc:Fallback>
+      </mc:AlternateContent>
+    </w:r>
+    <w:r>
+      <w:rPr>
+        <w:rFonts w:ascii="Sakkal Majalla" w:hAnsi="Sakkal Majalla" w:cs="Sakkal Majalla"/>
+        <w:b/>
+        <w:bCs/>
+        <w:i/>
+        <w:iCs/>
+        <w:noProof/>
+        <w:color w:val="FF0000"/>
+        <w:sz w:val="12"/>
+        <w:szCs w:val="12"/>
+        <w:rtl/>
+      </w:rPr>
+      <mc:AlternateContent>
+        <mc:Choice Requires="wps">
+          <w:drawing>
+            <wp:anchor distT="0" distB="0" distL="114300" distR="114300" simplePos="0" relativeHeight="251659264" behindDoc="0" locked="0" layoutInCell="1" allowOverlap="1" wp14:anchorId="22FFACA2" wp14:editId="4ABBE3DF">
+              <wp:simplePos x="0" y="0"/>
+              <wp:positionH relativeFrom="page">
+                <wp:align>left</wp:align>
+              </wp:positionH>
+              <wp:positionV relativeFrom="page">
+                <wp:align>top</wp:align>
+              </wp:positionV>
+              <wp:extent cx="5080000" cy="317500"/>
+              <wp:effectExtent l="0" t="0" r="0" b="0"/>
+              <wp:wrapNone/>
+              <wp:docPr id="1" name="GVHeader_Section1_1473658229"/>
+              <wp:cNvGraphicFramePr/>
+              <a:graphic xmlns:a="http://schemas.openxmlformats.org/drawingml/2006/main">
+                <a:graphicData uri="http://schemas.microsoft.com/office/word/2010/wordprocessingShape">
+                  <wps:wsp>
+                    <wps:cNvSpPr txBox="1"/>
+                    <wps:spPr>
+                      <a:xfrm>
+                        <a:off x="0" y="0"/>
+                        <a:ext cx="5080000" cy="317500"/>
+                      </a:xfrm>
+                      <a:prstGeom prst="rect">
+                        <a:avLst/>
+                      </a:prstGeom>
+                      <a:noFill/>
+                      <a:ln w="6350">
+                        <a:noFill/>
+                      </a:ln>
+                      <a:extLst>
+                        <a:ext uri="{91240B29-F687-4F45-9708-019B960494DF}">
+                          <a14:hiddenLine xmlns:a14="http://schemas.microsoft.com/office/drawing/2010/main" w="6350">
+                            <a:solidFill>
+                              <a:prstClr val="black"/>
+                            </a:solidFill>
+                          </a14:hiddenLine>
+                        </a:ext>
+                      </a:extLst>
+                    </wps:spPr>
+                    <wps:txbx>
+                      <w:txbxContent>
+                        <w:p>
+                          <w:r>
+                            <w:rPr>
+                              <w:rFonts w:ascii="Calibri" w:hAnsi="Calibri" w:cs="Calibri"/>
+                              <w:color w:val="008004"/>
+                              <w:sz w:val="20"/>
+                              <w:szCs w:val="20"/>
+                            </w:rPr>
+                            <w:t>Classified as Public-</w:t>
+                          </w:r>
+                          <w:r>
+                            <w:rPr>
+                              <w:rFonts w:ascii="Calibri" w:hAnsi="Calibri" w:cs="Calibri" w:hint="cs"/>
+                              <w:color w:val="008004"/>
+                              <w:sz w:val="20"/>
+                              <w:szCs w:val="20"/>
+                              <w:rtl/>
+                            </w:rPr>
+                            <w:t>عام</w:t>
+                          </w:r>
+                          <w:r>
+                            <w:rPr>
+                              <w:rFonts w:ascii="Calibri" w:hAnsi="Calibri" w:cs="Calibri"/>
+                              <w:color w:val="008004"/>
+                              <w:sz w:val="20"/>
+                              <w:szCs w:val="20"/>
+                            </w:rPr>
+                            <w:t xml:space="preserve"> - Internal</w:t>
+                          </w:r>
+                        </w:p>
+                      </w:txbxContent>
+                    </wps:txbx>
+                    <wps:bodyPr rot="0" spcFirstLastPara="0" vertOverflow="overflow" horzOverflow="overflow" vert="horz" wrap="square" lIns="91440" tIns="45720" rIns="91440" bIns="45720" numCol="1" spcCol="0" rtlCol="0" fromWordArt="0" anchor="t" anchorCtr="0" forceAA="0" compatLnSpc="1">
+                      <a:prstTxWarp prst="textNoShape">
+                        <a:avLst/>
+                      </a:prstTxWarp>
+                      <a:spAutoFit/>
+                    </wps:bodyPr>
+                  </wps:wsp>
+                </a:graphicData>
+              </a:graphic>
+            </wp:anchor>
+          </w:drawing>
+        </mc:Choice>
+        <mc:Fallback>
+          <w:pict>
+            <v:shape w14:anchorId="22FFACA2" id="GVHeader_Section1_1473658229" o:spid="_x0000_s1027" type="#_x0000_t202" style="position:absolute;left:0;text-align:left;margin-left:0;margin-top:0;width:400pt;height:25pt;z-index:251659264;visibility:visible;mso-wrap-style:square;mso-wrap-distance-left:9pt;mso-wrap-distance-top:0;mso-wrap-distance-right:9pt;mso-wrap-distance-bottom:0;mso-position-horizontal:left;mso-position-horizontal-relative:page;mso-position-vertical:top;mso-position-vertical-relative:page;v-text-anchor:top" o:gfxdata="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" filled="f" stroked="f" strokeweight=".5pt">
+              <v:textbox style="mso-fit-shape-to-text:t">
+                <w:txbxContent>
+                  <w:p>
+                    <w:r>
+                      <w:rPr>
+                        <w:rFonts w:ascii="Calibri" w:hAnsi="Calibri" w:cs="Calibri"/>
+                        <w:color w:val="008004"/>
+                        <w:sz w:val="20"/>
+                        <w:szCs w:val="20"/>
+                      </w:rPr>
+                      <w:t>Classified as Public-</w:t>
+                    </w:r>
+                    <w:r>
+                      <w:rPr>
+                        <w:rFonts w:ascii="Calibri" w:hAnsi="Calibri" w:cs="Calibri" w:hint="cs"/>
+                        <w:color w:val="008004"/>
+                        <w:sz w:val="20"/>
+                        <w:szCs w:val="20"/>
+                        <w:rtl/>
+                      </w:rPr>
+                      <w:t>عام</w:t>
+                    </w:r>
+                    <w:r>
+                      <w:rPr>
+                        <w:rFonts w:ascii="Calibri" w:hAnsi="Calibri" w:cs="Calibri"/>
+                        <w:color w:val="008004"/>
+                        <w:sz w:val="20"/>
+                        <w:szCs w:val="20"/>
+                      </w:rPr>
+                      <w:t xml:space="preserve"> - Internal</w:t>
+                    </w:r>
+                  </w:p>
+                </w:txbxContent>
+              </v:textbox>
+              <w10:wrap anchorx="page" anchory="page"/>
+            </v:shape>
+          </w:pict>
+        </mc:Fallback>
+      </mc:AlternateContent>
+    </w:r>
+  </w:p>
+</w:hdr>
+</file>
+
+<file path=word/header3.xml><?xml version="1.0" encoding="utf-8"?>
+<w:hdr xmlns:wpc="http://schemas.microsoft.com/office/word/2010/wordprocessingCanvas" xmlns:cx="http://schemas.microsoft.com/office/drawing/2014/chartex" xmlns:cx1="http://schemas.microsoft.com/office/drawing/2015/9/8/chartex" xmlns:cx2="http://schemas.microsoft.com/office/drawing/2015/10/21/chartex" xmlns:cx3="http://schemas.microsoft.com/office/drawing/2016/5/9/chartex" xmlns:cx4="http://schemas.microsoft.com/office/drawing/2016/5/10/chartex" xmlns:cx5="http://schemas.microsoft.com/office/drawing/2016/5/11/chartex" xmlns:cx6="http://schemas.microsoft.com/office/drawing/2016/5/12/chartex" xmlns:cx7="http://schemas.microsoft.com/office/drawing/2016/5/13/chartex" xmlns:cx8="http://schemas.microsoft.com/office/drawing/2016/5/14/chartex" xmlns:mc="http://schemas.openxmlformats.org/markup-compatibility/2006" xmlns:aink="http://schemas.microsoft.com/office/drawing/2016/ink" xmlns:am3d="http://schemas.microsoft.com/office/drawing/2017/model3d" xmlns:o="urn:schemas-microsoft-com:office:office" xmlns:oel="http://schemas.microsoft.com/office/2019/extlst" xmlns:r="http://schemas.openxmlformats.org/officeDocument/2006/relationships" xmlns:m="http://schemas.openxmlformats.org/officeDocument/2006/math" xmlns:v="urn:schemas-microsoft-com:vml" xmlns:wp14="http://schemas.microsoft.com/office/word/2010/wordprocessingDrawing" xmlns:wp="http://schemas.openxmlformats.org/drawingml/2006/wordprocessingDrawing" xmlns:w10="urn:schemas-microsoft-com:office:word" xmlns:w="http://schemas.openxmlformats.org/wordprocessingml/2006/main" xmlns:w14="http://schemas.microsoft.com/office/word/2010/wordml" xmlns:w15="http://schemas.microsoft.com/office/word/2012/wordml" xmlns:w16cex="http://schemas.microsoft.com/office/word/2018/wordml/cex" xmlns:w16cid="http://schemas.microsoft.com/office/word/2016/wordml/cid" xmlns:w16="http://schemas.microsoft.com/office/word/2018/wordml" xmlns:w16du="http://schemas.microsoft.com/office/word/2023/wordml/word16du" xmlns:w16sdtdh="http://schemas.microsoft.com/office/word/2020/wordml/sdtdatahash" xmlns:w16sdtfl="http://schemas.microsoft.com/office/word/2024/wordml/sdtformatlock" xmlns:w16se="http://schemas.microsoft.com/office/word/2015/wordml/symex" xmlns:wpg="http://schemas.microsoft.com/office/word/2010/wordprocessingGroup" xmlns:wpi="http://schemas.microsoft.com/office/word/2010/wordprocessingInk" xmlns:wne="http://schemas.microsoft.com/office/word/2006/wordml" xmlns:wps="http://schemas.microsoft.com/office/word/2010/wordprocessingShape" mc:Ignorable="w14 w15 w16se w16cid w16 w16cex w16sdtdh w16sdtfl w16du wp14">
+  <w:p>
+    <w:pPr>
+      <w:pStyle w:val="Header"/>
     </w:pPr>
   </w:p>
 </w:hdr>
@@ -3561,7 +5292,7 @@
   <w:style w:type="paragraph" w:default="1" w:styleId="Normal">
     <w:name w:val="Normal"/>
     <w:qFormat/>
-    <w:rsid w:val="009345FF"/>
+    <w:rsid w:val="009D0F8F"/>
   </w:style>
   <w:style w:type="character" w:default="1" w:styleId="DefaultParagraphFont">
     <w:name w:val="Default Paragraph Font"/>
@@ -4124,7 +5855,12 @@
 </file>
 
 <file path=customXml/item1.xml><?xml version="1.0" encoding="utf-8"?>
-<b:Sources xmlns:b="http://schemas.openxmlformats.org/officeDocument/2006/bibliography" xmlns="http://schemas.openxmlformats.org/officeDocument/2006/bibliography" SelectedStyle="\APASixthEditionOfficeOnline.xsl" StyleName="APA" Version="6"/>
+<?mso-contentType ?>
+<FormTemplates xmlns="http://schemas.microsoft.com/sharepoint/v3/contenttype/forms">
+  <Display>DocumentLibraryForm</Display>
+  <Edit>DocumentLibraryForm</Edit>
+  <New>DocumentLibraryForm</New>
+</FormTemplates>
 </file>
 
 <file path=customXml/item2.xml><?xml version="1.0" encoding="utf-8"?>
@@ -4139,12 +5875,7 @@
 </file>
 
 <file path=customXml/item3.xml><?xml version="1.0" encoding="utf-8"?>
-<?mso-contentType ?>
-<FormTemplates xmlns="http://schemas.microsoft.com/sharepoint/v3/contenttype/forms">
-  <Display>DocumentLibraryForm</Display>
-  <Edit>DocumentLibraryForm</Edit>
-  <New>DocumentLibraryForm</New>
-</FormTemplates>
+<b:Sources xmlns:b="http://schemas.openxmlformats.org/officeDocument/2006/bibliography" xmlns="http://schemas.openxmlformats.org/officeDocument/2006/bibliography" SelectedStyle="\APASixthEditionOfficeOnline.xsl" StyleName="APA" Version="6"/>
 </file>
 
 <file path=customXml/item4.xml><?xml version="1.0" encoding="utf-8"?>
@@ -4355,9 +6086,9 @@
 </file>
 
 <file path=customXml/itemProps1.xml><?xml version="1.0" encoding="utf-8"?>
-<ds:datastoreItem xmlns:ds="http://schemas.openxmlformats.org/officeDocument/2006/customXml" ds:itemID="{8AA13928-7109-4E06-9E2E-C03F885D1F3A}">
+<ds:datastoreItem xmlns:ds="http://schemas.openxmlformats.org/officeDocument/2006/customXml" ds:itemID="{FEA58E5F-2EB4-4879-AC15-A30D67E1E9FF}">
   <ds:schemaRefs>
-    <ds:schemaRef ds:uri="http://schemas.openxmlformats.org/officeDocument/2006/bibliography"/>
+    <ds:schemaRef ds:uri="http://schemas.microsoft.com/sharepoint/v3/contenttype/forms"/>
   </ds:schemaRefs>
 </ds:datastoreItem>
 </file>
@@ -4374,9 +6105,9 @@
 </file>
 
 <file path=customXml/itemProps3.xml><?xml version="1.0" encoding="utf-8"?>
-<ds:datastoreItem xmlns:ds="http://schemas.openxmlformats.org/officeDocument/2006/customXml" ds:itemID="{FEA58E5F-2EB4-4879-AC15-A30D67E1E9FF}">
+<ds:datastoreItem xmlns:ds="http://schemas.openxmlformats.org/officeDocument/2006/customXml" ds:itemID="{8AA13928-7109-4E06-9E2E-C03F885D1F3A}">
   <ds:schemaRefs>
-    <ds:schemaRef ds:uri="http://schemas.microsoft.com/sharepoint/v3/contenttype/forms"/>
+    <ds:schemaRef ds:uri="http://schemas.openxmlformats.org/officeDocument/2006/bibliography"/>
   </ds:schemaRefs>
 </ds:datastoreItem>
 </file>

</xml_diff>

<commit_message>
Bug: Fixed Export, it was not working
</commit_message>
<xml_diff>
--- a/backend/temp_output.docx
+++ b/backend/temp_output.docx
@@ -114,7 +114,18 @@
                 <w:sz w:val="20"/>
                 <w:szCs w:val="20"/>
               </w:rPr>
-              <w:t xml:space="preserve">Q3 Marketing Plan Discussion</w:t>
+              <w:t xml:space="preserve">Marketing Kickoff – Ramadan Campaign</w:t>
+            </w:r>
+            <w:r>
+              <w:rPr>
+                <w:rFonts w:asciiTheme="majorBidi" w:hAnsiTheme="majorBidi" w:cstheme="majorBidi" w:hint="cs"/>
+                <w:b/>
+                <w:bCs/>
+                <w:sz w:val="20"/>
+                <w:szCs w:val="20"/>
+                <w:rtl/>
+              </w:rPr>
+              <w:t xml:space="preserve"> </w:t>
             </w:r>
           </w:p>
         </w:tc>
@@ -330,7 +341,7 @@
                 <w:szCs w:val="20"/>
                 <w:rtl/>
               </w:rPr>
-              <w:t>التاريخ</w:t>
+              <w:t xml:space="preserve">التاريخ</w:t>
             </w:r>
           </w:p>
         </w:tc>
@@ -362,24 +373,57 @@
             </w:pPr>
             <w:r>
               <w:rPr>
-                <w:rFonts w:asciiTheme="majorBidi" w:hAnsiTheme="majorBidi" w:cstheme="majorBidi"/>
-                <w:b/>
-                <w:bCs/>
-                <w:sz w:val="20"/>
-                <w:szCs w:val="20"/>
-                <w:rtl/>
-              </w:rPr>
-              <w:t xml:space="preserve">١٣/١١/١٤٤٧هـ الموافق </w:t>
-            </w:r>
-            <w:r>
-              <w:rPr>
-                <w:rFonts w:asciiTheme="majorBidi" w:hAnsiTheme="majorBidi" w:cstheme="majorBidi"/>
-                <w:b/>
-                <w:bCs/>
-                <w:sz w:val="20"/>
-                <w:szCs w:val="20"/>
-              </w:rPr>
-              <w:t xml:space="preserve">2026-05-25</w:t>
+                <w:rFonts w:asciiTheme="majorBidi" w:hAnsiTheme="majorBidi" w:cs="Times New Roman"/>
+                <w:b/>
+                <w:bCs/>
+                <w:sz w:val="20"/>
+                <w:szCs w:val="20"/>
+                <w:rtl/>
+              </w:rPr>
+              <w:t xml:space="preserve">6/1/1448 هـ</w:t>
+            </w:r>
+            <w:r>
+              <w:rPr>
+                <w:rFonts w:asciiTheme="majorBidi" w:hAnsiTheme="majorBidi" w:cstheme="majorBidi" w:hint="cs"/>
+                <w:b/>
+                <w:bCs/>
+                <w:sz w:val="20"/>
+                <w:szCs w:val="20"/>
+                <w:rtl/>
+              </w:rPr>
+              <w:t xml:space="preserve"> </w:t>
+            </w:r>
+            <w:r>
+              <w:rPr>
+                <w:rFonts w:asciiTheme="majorBidi" w:hAnsiTheme="majorBidi" w:cstheme="majorBidi"/>
+                <w:b/>
+                <w:bCs/>
+                <w:sz w:val="20"/>
+                <w:szCs w:val="20"/>
+                <w:rtl/>
+              </w:rPr>
+              <w:t xml:space="preserve">الموافق </w:t>
+            </w:r>
+            <w:r>
+              <w:rPr>
+                <w:rFonts w:asciiTheme="majorBidi" w:hAnsiTheme="majorBidi" w:cstheme="majorBidi"/>
+                <w:b/>
+                <w:bCs/>
+                <w:sz w:val="20"/>
+                <w:szCs w:val="20"/>
+              </w:rPr>
+              <w:t xml:space="preserve">2026-06-21</w:t>
+            </w:r>
+            <w:r>
+              <w:rPr>
+                <w:rFonts w:asciiTheme="majorBidi" w:hAnsiTheme="majorBidi" w:cstheme="majorBidi"/>
+                <w:b/>
+                <w:bCs/>
+                <w:sz w:val="20"/>
+                <w:szCs w:val="20"/>
+                <w:rtl/>
+              </w:rPr>
+              <w:t>م</w:t>
             </w:r>
           </w:p>
         </w:tc>
@@ -532,6 +576,61 @@
                 <w:szCs w:val="20"/>
                 <w:rtl/>
               </w:rPr>
+              <w:t>1</w:t>
+            </w:r>
+            <w:r>
+              <w:rPr>
+                <w:rFonts w:asciiTheme="majorBidi" w:hAnsiTheme="majorBidi" w:cstheme="majorBidi" w:hint="cs"/>
+                <w:b/>
+                <w:bCs/>
+                <w:sz w:val="20"/>
+                <w:szCs w:val="20"/>
+                <w:rtl/>
+              </w:rPr>
+              <w:t>:00 مساء</w:t>
+            </w:r>
+            <w:r>
+              <w:rPr>
+                <w:rFonts w:asciiTheme="majorBidi" w:hAnsiTheme="majorBidi" w:cstheme="majorBidi" w:hint="cs"/>
+                <w:b/>
+                <w:bCs/>
+                <w:sz w:val="20"/>
+                <w:szCs w:val="20"/>
+                <w:rtl/>
+              </w:rPr>
+              <w:t xml:space="preserve">ً </w:t>
+            </w:r>
+            <w:r>
+              <w:rPr>
+                <w:rFonts w:asciiTheme="majorBidi" w:hAnsiTheme="majorBidi" w:cstheme="majorBidi"/>
+                <w:b/>
+                <w:bCs/>
+                <w:sz w:val="20"/>
+                <w:szCs w:val="20"/>
+                <w:rtl/>
+              </w:rPr>
+              <w:t>–</w:t>
+            </w:r>
+            <w:r>
+              <w:rPr>
+                <w:rFonts w:asciiTheme="majorBidi" w:hAnsiTheme="majorBidi" w:cstheme="majorBidi" w:hint="cs"/>
+                <w:b/>
+                <w:bCs/>
+                <w:sz w:val="20"/>
+                <w:szCs w:val="20"/>
+                <w:rtl/>
+              </w:rPr>
+              <w:t xml:space="preserve"> </w:t>
+            </w:r>
+            <w:r>
+              <w:rPr>
+                <w:rFonts w:asciiTheme="majorBidi" w:hAnsiTheme="majorBidi" w:cstheme="majorBidi" w:hint="cs"/>
+                <w:b/>
+                <w:bCs/>
+                <w:sz w:val="20"/>
+                <w:szCs w:val="20"/>
+                <w:rtl/>
+              </w:rPr>
               <w:t>2</w:t>
             </w:r>
             <w:r>
@@ -543,40 +642,7 @@
                 <w:szCs w:val="20"/>
                 <w:rtl/>
               </w:rPr>
-              <w:t>:00 مساء</w:t>
-            </w:r>
-            <w:r>
-              <w:rPr>
-                <w:rFonts w:asciiTheme="majorBidi" w:hAnsiTheme="majorBidi" w:cstheme="majorBidi" w:hint="cs"/>
-                <w:b/>
-                <w:bCs/>
-                <w:sz w:val="20"/>
-                <w:szCs w:val="20"/>
-                <w:rtl/>
-              </w:rPr>
-              <w:t xml:space="preserve">ً </w:t>
-            </w:r>
-            <w:r>
-              <w:rPr>
-                <w:rFonts w:asciiTheme="majorBidi" w:hAnsiTheme="majorBidi" w:cstheme="majorBidi"/>
-                <w:b/>
-                <w:bCs/>
-                <w:sz w:val="20"/>
-                <w:szCs w:val="20"/>
-                <w:rtl/>
-              </w:rPr>
-              <w:t>–</w:t>
-            </w:r>
-            <w:r>
-              <w:rPr>
-                <w:rFonts w:asciiTheme="majorBidi" w:hAnsiTheme="majorBidi" w:cstheme="majorBidi" w:hint="cs"/>
-                <w:b/>
-                <w:bCs/>
-                <w:sz w:val="20"/>
-                <w:szCs w:val="20"/>
-                <w:rtl/>
-              </w:rPr>
-              <w:t xml:space="preserve"> 3:00 مساءً</w:t>
+              <w:t>:00 مساءً</w:t>
             </w:r>
           </w:p>
         </w:tc>
@@ -727,7 +793,39 @@
                 <w:szCs w:val="20"/>
                 <w:rtl/>
               </w:rPr>
-              <w:t xml:space="preserve">ساعة </w:t>
+              <w:t>ساعة</w:t>
+            </w:r>
+            <w:r>
+              <w:rPr>
+                <w:rFonts w:asciiTheme="majorBidi" w:hAnsiTheme="majorBidi" w:cstheme="majorBidi" w:hint="cs"/>
+                <w:b/>
+                <w:bCs/>
+                <w:sz w:val="20"/>
+                <w:szCs w:val="20"/>
+                <w:rtl/>
+              </w:rPr>
+              <w:t xml:space="preserve"> من</w:t>
+            </w:r>
+            <w:r>
+              <w:rPr>
+                <w:rFonts w:asciiTheme="majorBidi" w:hAnsiTheme="majorBidi" w:cstheme="majorBidi" w:hint="cs"/>
+                <w:b/>
+                <w:bCs/>
+                <w:sz w:val="20"/>
+                <w:szCs w:val="20"/>
+                <w:rtl/>
+              </w:rPr>
+              <w:t xml:space="preserve"> </w:t>
+            </w:r>
+            <w:r>
+              <w:rPr>
+                <w:rFonts w:asciiTheme="majorBidi" w:hAnsiTheme="majorBidi" w:cstheme="majorBidi"/>
+                <w:b/>
+                <w:bCs/>
+                <w:sz w:val="20"/>
+                <w:szCs w:val="20"/>
+              </w:rPr>
+              <w:t>14:00 – 13:00</w:t>
             </w:r>
           </w:p>
         </w:tc>
@@ -875,6 +973,7 @@
                 <w:bCs/>
                 <w:sz w:val="20"/>
                 <w:szCs w:val="20"/>
+                <w:rtl/>
               </w:rPr>
             </w:pPr>
             <w:r>
@@ -1101,16 +1200,18 @@
               <w:bottom w:w="72" w:type="dxa"/>
               <w:right w:w="144" w:type="dxa"/>
             </w:tcMar>
-          </w:tcPr>
-          <w:p>
-            <w:pPr>
-              <w:tabs>
-                <w:tab w:val="left" w:pos="1692"/>
-                <w:tab w:val="center" w:pos="5256"/>
-              </w:tabs>
-              <w:bidi/>
-              <w:spacing w:after="0" w:line="240" w:lineRule="auto"/>
-              <w:ind w:right="162"/>
+            <w:vAlign w:val="center"/>
+          </w:tcPr>
+          <w:p>
+            <w:pPr>
+              <w:tabs>
+                <w:tab w:val="left" w:pos="1692"/>
+                <w:tab w:val="center" w:pos="5256"/>
+              </w:tabs>
+              <w:bidi/>
+              <w:spacing w:after="0" w:line="240" w:lineRule="auto"/>
+              <w:ind w:right="162"/>
+              <w:jc w:val="both"/>
               <w:rPr>
                 <w:rFonts w:asciiTheme="majorBidi" w:hAnsiTheme="majorBidi" w:cstheme="majorBidi"/>
                 <w:sz w:val="20"/>
@@ -1122,20 +1223,19 @@
         <w:tc>
           <w:tcPr>
             <w:tcW w:w="4973" w:type="dxa"/>
-          </w:tcPr>
-          <w:p>
-            <w:pPr>
-              <w:pStyle w:val="ListParagraph"/>
-              <w:tabs>
-                <w:tab w:val="left" w:pos="1692"/>
-              </w:tabs>
-              <w:bidi/>
-              <w:spacing w:after="0" w:line="240" w:lineRule="auto"/>
-              <w:ind w:left="2052" w:right="162"/>
-              <w:rPr>
-                <w:rFonts w:asciiTheme="majorBidi" w:hAnsiTheme="majorBidi" w:cstheme="majorBidi"/>
-                <w:b/>
-                <w:bCs/>
+            <w:vAlign w:val="center"/>
+          </w:tcPr>
+          <w:p>
+            <w:pPr>
+              <w:tabs>
+                <w:tab w:val="left" w:pos="1692"/>
+              </w:tabs>
+              <w:bidi/>
+              <w:spacing w:after="0" w:line="240" w:lineRule="auto"/>
+              <w:ind w:right="162"/>
+              <w:jc w:val="both"/>
+              <w:rPr>
+                <w:rFonts w:asciiTheme="majorBidi" w:hAnsiTheme="majorBidi" w:cstheme="majorBidi"/>
                 <w:sz w:val="20"/>
                 <w:szCs w:val="20"/>
                 <w:rtl/>
@@ -1144,8 +1244,6 @@
             <w:r>
               <w:rPr>
                 <w:rFonts w:asciiTheme="majorBidi" w:hAnsiTheme="majorBidi" w:cs="Times New Roman"/>
-                <w:b/>
-                <w:bCs/>
                 <w:sz w:val="20"/>
                 <w:szCs w:val="20"/>
                 <w:rtl/>
@@ -1168,16 +1266,18 @@
               <w:bottom w:w="72" w:type="dxa"/>
               <w:right w:w="144" w:type="dxa"/>
             </w:tcMar>
-          </w:tcPr>
-          <w:p>
-            <w:pPr>
-              <w:tabs>
-                <w:tab w:val="left" w:pos="1692"/>
-                <w:tab w:val="center" w:pos="5256"/>
-              </w:tabs>
-              <w:bidi/>
-              <w:spacing w:after="0" w:line="240" w:lineRule="auto"/>
-              <w:ind w:right="162"/>
+            <w:vAlign w:val="center"/>
+          </w:tcPr>
+          <w:p>
+            <w:pPr>
+              <w:tabs>
+                <w:tab w:val="left" w:pos="1692"/>
+                <w:tab w:val="center" w:pos="5256"/>
+              </w:tabs>
+              <w:bidi/>
+              <w:spacing w:after="0" w:line="240" w:lineRule="auto"/>
+              <w:ind w:right="162"/>
+              <w:jc w:val="both"/>
               <w:rPr>
                 <w:rFonts w:asciiTheme="majorBidi" w:hAnsiTheme="majorBidi" w:cstheme="majorBidi"/>
                 <w:sz w:val="20"/>
@@ -1192,27 +1292,27 @@
                 <w:szCs w:val="20"/>
                 <w:rtl/>
               </w:rPr>
-              <w:t xml:space="preserve">Chief Data Management Officer</w:t>
+              <w:t xml:space="preserve">Meeting Chair</w:t>
             </w:r>
           </w:p>
         </w:tc>
         <w:tc>
           <w:tcPr>
             <w:tcW w:w="4973" w:type="dxa"/>
-          </w:tcPr>
-          <w:p>
-            <w:pPr>
-              <w:tabs>
-                <w:tab w:val="left" w:pos="1692"/>
-                <w:tab w:val="center" w:pos="5256"/>
-              </w:tabs>
-              <w:bidi/>
-              <w:spacing w:after="0" w:line="240" w:lineRule="auto"/>
-              <w:ind w:right="162"/>
-              <w:rPr>
-                <w:rFonts w:asciiTheme="majorBidi" w:hAnsiTheme="majorBidi" w:cstheme="majorBidi"/>
-                <w:b/>
-                <w:bCs/>
+            <w:vAlign w:val="center"/>
+          </w:tcPr>
+          <w:p>
+            <w:pPr>
+              <w:tabs>
+                <w:tab w:val="left" w:pos="1692"/>
+                <w:tab w:val="center" w:pos="5256"/>
+              </w:tabs>
+              <w:bidi/>
+              <w:spacing w:after="0" w:line="240" w:lineRule="auto"/>
+              <w:ind w:right="162"/>
+              <w:jc w:val="both"/>
+              <w:rPr>
+                <w:rFonts w:asciiTheme="majorBidi" w:hAnsiTheme="majorBidi" w:cstheme="majorBidi"/>
                 <w:sz w:val="20"/>
                 <w:szCs w:val="20"/>
                 <w:rtl/>
@@ -1221,13 +1321,11 @@
             <w:r>
               <w:rPr>
                 <w:rFonts w:asciiTheme="majorBidi" w:hAnsiTheme="majorBidi" w:cs="Times New Roman"/>
-                <w:b/>
-                <w:bCs/>
-                <w:sz w:val="20"/>
-                <w:szCs w:val="20"/>
-                <w:rtl/>
-              </w:rPr>
-              <w:t xml:space="preserve">Adel AlHarbi</w:t>
+                <w:sz w:val="20"/>
+                <w:szCs w:val="20"/>
+                <w:rtl/>
+              </w:rPr>
+              <w:t xml:space="preserve">Layla</w:t>
             </w:r>
           </w:p>
         </w:tc>
@@ -1245,16 +1343,18 @@
               <w:bottom w:w="72" w:type="dxa"/>
               <w:right w:w="144" w:type="dxa"/>
             </w:tcMar>
-          </w:tcPr>
-          <w:p>
-            <w:pPr>
-              <w:tabs>
-                <w:tab w:val="left" w:pos="1692"/>
-                <w:tab w:val="center" w:pos="5256"/>
-              </w:tabs>
-              <w:bidi/>
-              <w:spacing w:after="0" w:line="240" w:lineRule="auto"/>
-              <w:ind w:right="162"/>
+            <w:vAlign w:val="center"/>
+          </w:tcPr>
+          <w:p>
+            <w:pPr>
+              <w:tabs>
+                <w:tab w:val="left" w:pos="1692"/>
+                <w:tab w:val="center" w:pos="5256"/>
+              </w:tabs>
+              <w:bidi/>
+              <w:spacing w:after="0" w:line="240" w:lineRule="auto"/>
+              <w:ind w:right="162"/>
+              <w:jc w:val="both"/>
               <w:rPr>
                 <w:rFonts w:asciiTheme="majorBidi" w:hAnsiTheme="majorBidi" w:cstheme="majorBidi"/>
                 <w:sz w:val="20"/>
@@ -1267,20 +1367,20 @@
         <w:tc>
           <w:tcPr>
             <w:tcW w:w="4973" w:type="dxa"/>
-          </w:tcPr>
-          <w:p>
-            <w:pPr>
-              <w:tabs>
-                <w:tab w:val="left" w:pos="1692"/>
-                <w:tab w:val="center" w:pos="5256"/>
-              </w:tabs>
-              <w:bidi/>
-              <w:spacing w:after="0" w:line="240" w:lineRule="auto"/>
-              <w:ind w:right="162"/>
-              <w:rPr>
-                <w:rFonts w:asciiTheme="majorBidi" w:hAnsiTheme="majorBidi" w:cstheme="majorBidi"/>
-                <w:b/>
-                <w:bCs/>
+            <w:vAlign w:val="center"/>
+          </w:tcPr>
+          <w:p>
+            <w:pPr>
+              <w:tabs>
+                <w:tab w:val="left" w:pos="1692"/>
+                <w:tab w:val="center" w:pos="5256"/>
+              </w:tabs>
+              <w:bidi/>
+              <w:spacing w:after="0" w:line="240" w:lineRule="auto"/>
+              <w:ind w:right="162"/>
+              <w:jc w:val="both"/>
+              <w:rPr>
+                <w:rFonts w:asciiTheme="majorBidi" w:hAnsiTheme="majorBidi" w:cstheme="majorBidi"/>
                 <w:sz w:val="20"/>
                 <w:szCs w:val="20"/>
                 <w:rtl/>
@@ -1289,8 +1389,6 @@
             <w:r>
               <w:rPr>
                 <w:rFonts w:asciiTheme="majorBidi" w:hAnsiTheme="majorBidi" w:cs="Times New Roman"/>
-                <w:b/>
-                <w:bCs/>
                 <w:sz w:val="20"/>
                 <w:szCs w:val="20"/>
                 <w:rtl/>
@@ -1313,16 +1411,18 @@
               <w:bottom w:w="72" w:type="dxa"/>
               <w:right w:w="144" w:type="dxa"/>
             </w:tcMar>
-          </w:tcPr>
-          <w:p>
-            <w:pPr>
-              <w:tabs>
-                <w:tab w:val="left" w:pos="1692"/>
-                <w:tab w:val="center" w:pos="5256"/>
-              </w:tabs>
-              <w:bidi/>
-              <w:spacing w:after="0" w:line="240" w:lineRule="auto"/>
-              <w:ind w:right="162"/>
+            <w:vAlign w:val="center"/>
+          </w:tcPr>
+          <w:p>
+            <w:pPr>
+              <w:tabs>
+                <w:tab w:val="left" w:pos="1692"/>
+                <w:tab w:val="center" w:pos="5256"/>
+              </w:tabs>
+              <w:bidi/>
+              <w:spacing w:after="0" w:line="240" w:lineRule="auto"/>
+              <w:ind w:right="162"/>
+              <w:jc w:val="both"/>
               <w:rPr>
                 <w:rFonts w:asciiTheme="majorBidi" w:hAnsiTheme="majorBidi" w:cstheme="majorBidi"/>
                 <w:sz w:val="20"/>
@@ -1337,27 +1437,27 @@
                 <w:szCs w:val="20"/>
                 <w:rtl/>
               </w:rPr>
-              <w:t xml:space="preserve">Consultant</w:t>
+              <w:t xml:space="preserve"/>
             </w:r>
           </w:p>
         </w:tc>
         <w:tc>
           <w:tcPr>
             <w:tcW w:w="4973" w:type="dxa"/>
-          </w:tcPr>
-          <w:p>
-            <w:pPr>
-              <w:tabs>
-                <w:tab w:val="left" w:pos="1692"/>
-                <w:tab w:val="center" w:pos="5256"/>
-              </w:tabs>
-              <w:bidi/>
-              <w:spacing w:after="0" w:line="240" w:lineRule="auto"/>
-              <w:ind w:right="162"/>
-              <w:rPr>
-                <w:rFonts w:asciiTheme="majorBidi" w:hAnsiTheme="majorBidi" w:cstheme="majorBidi"/>
-                <w:b/>
-                <w:bCs/>
+            <w:vAlign w:val="center"/>
+          </w:tcPr>
+          <w:p>
+            <w:pPr>
+              <w:tabs>
+                <w:tab w:val="left" w:pos="1692"/>
+                <w:tab w:val="center" w:pos="5256"/>
+              </w:tabs>
+              <w:bidi/>
+              <w:spacing w:after="0" w:line="240" w:lineRule="auto"/>
+              <w:ind w:right="162"/>
+              <w:jc w:val="both"/>
+              <w:rPr>
+                <w:rFonts w:asciiTheme="majorBidi" w:hAnsiTheme="majorBidi" w:cstheme="majorBidi"/>
                 <w:sz w:val="20"/>
                 <w:szCs w:val="20"/>
                 <w:rtl/>
@@ -1366,13 +1466,11 @@
             <w:r>
               <w:rPr>
                 <w:rFonts w:asciiTheme="majorBidi" w:hAnsiTheme="majorBidi" w:cs="Times New Roman"/>
-                <w:b/>
-                <w:bCs/>
-                <w:sz w:val="20"/>
-                <w:szCs w:val="20"/>
-                <w:rtl/>
-              </w:rPr>
-              <w:t xml:space="preserve">Faisal Rihani</w:t>
+                <w:sz w:val="20"/>
+                <w:szCs w:val="20"/>
+                <w:rtl/>
+              </w:rPr>
+              <w:t xml:space="preserve">Hajji Omar</w:t>
             </w:r>
           </w:p>
         </w:tc>
@@ -1390,16 +1488,18 @@
               <w:bottom w:w="72" w:type="dxa"/>
               <w:right w:w="144" w:type="dxa"/>
             </w:tcMar>
-          </w:tcPr>
-          <w:p>
-            <w:pPr>
-              <w:tabs>
-                <w:tab w:val="left" w:pos="1692"/>
-                <w:tab w:val="center" w:pos="5256"/>
-              </w:tabs>
-              <w:bidi/>
-              <w:spacing w:after="0" w:line="240" w:lineRule="auto"/>
-              <w:ind w:right="162"/>
+            <w:vAlign w:val="center"/>
+          </w:tcPr>
+          <w:p>
+            <w:pPr>
+              <w:tabs>
+                <w:tab w:val="left" w:pos="1692"/>
+                <w:tab w:val="center" w:pos="5256"/>
+              </w:tabs>
+              <w:bidi/>
+              <w:spacing w:after="0" w:line="240" w:lineRule="auto"/>
+              <w:ind w:right="162"/>
+              <w:jc w:val="both"/>
               <w:rPr>
                 <w:rFonts w:asciiTheme="majorBidi" w:hAnsiTheme="majorBidi" w:cstheme="majorBidi"/>
                 <w:sz w:val="20"/>
@@ -1412,20 +1512,20 @@
         <w:tc>
           <w:tcPr>
             <w:tcW w:w="4973" w:type="dxa"/>
-          </w:tcPr>
-          <w:p>
-            <w:pPr>
-              <w:tabs>
-                <w:tab w:val="left" w:pos="1692"/>
-                <w:tab w:val="center" w:pos="5256"/>
-              </w:tabs>
-              <w:bidi/>
-              <w:spacing w:after="0" w:line="240" w:lineRule="auto"/>
-              <w:ind w:right="162"/>
-              <w:rPr>
-                <w:rFonts w:asciiTheme="majorBidi" w:hAnsiTheme="majorBidi" w:cstheme="majorBidi"/>
-                <w:b/>
-                <w:bCs/>
+            <w:vAlign w:val="center"/>
+          </w:tcPr>
+          <w:p>
+            <w:pPr>
+              <w:tabs>
+                <w:tab w:val="left" w:pos="1692"/>
+                <w:tab w:val="center" w:pos="5256"/>
+              </w:tabs>
+              <w:bidi/>
+              <w:spacing w:after="0" w:line="240" w:lineRule="auto"/>
+              <w:ind w:right="162"/>
+              <w:jc w:val="both"/>
+              <w:rPr>
+                <w:rFonts w:asciiTheme="majorBidi" w:hAnsiTheme="majorBidi" w:cstheme="majorBidi"/>
                 <w:sz w:val="20"/>
                 <w:szCs w:val="20"/>
                 <w:rtl/>
@@ -1434,8 +1534,6 @@
             <w:r>
               <w:rPr>
                 <w:rFonts w:asciiTheme="majorBidi" w:hAnsiTheme="majorBidi" w:cs="Times New Roman"/>
-                <w:b/>
-                <w:bCs/>
                 <w:sz w:val="20"/>
                 <w:szCs w:val="20"/>
                 <w:rtl/>
@@ -1458,47 +1556,67 @@
               <w:bottom w:w="72" w:type="dxa"/>
               <w:right w:w="144" w:type="dxa"/>
             </w:tcMar>
-          </w:tcPr>
-          <w:p>
-            <w:pPr>
-              <w:tabs>
-                <w:tab w:val="left" w:pos="1692"/>
-                <w:tab w:val="center" w:pos="5256"/>
-              </w:tabs>
-              <w:bidi/>
-              <w:spacing w:after="0" w:line="240" w:lineRule="auto"/>
-              <w:ind w:right="162"/>
-              <w:rPr>
-                <w:rFonts w:asciiTheme="majorBidi" w:hAnsiTheme="majorBidi" w:cstheme="majorBidi"/>
-                <w:sz w:val="20"/>
-                <w:szCs w:val="20"/>
-                <w:rtl/>
-              </w:rPr>
-            </w:pPr>
+            <w:vAlign w:val="center"/>
+          </w:tcPr>
+          <w:p>
+            <w:pPr>
+              <w:tabs>
+                <w:tab w:val="left" w:pos="1692"/>
+                <w:tab w:val="center" w:pos="5256"/>
+              </w:tabs>
+              <w:bidi/>
+              <w:spacing w:after="0" w:line="240" w:lineRule="auto"/>
+              <w:ind w:right="162"/>
+              <w:jc w:val="both"/>
+              <w:rPr>
+                <w:rFonts w:asciiTheme="majorBidi" w:hAnsiTheme="majorBidi" w:cstheme="majorBidi"/>
+                <w:sz w:val="20"/>
+                <w:szCs w:val="20"/>
+                <w:rtl/>
+              </w:rPr>
+            </w:pPr>
+            <w:r>
+              <w:rPr>
+                <w:rFonts w:asciiTheme="majorBidi" w:hAnsiTheme="majorBidi" w:cs="Times New Roman"/>
+                <w:sz w:val="20"/>
+                <w:szCs w:val="20"/>
+                <w:rtl/>
+              </w:rPr>
+              <w:t xml:space="preserve">Chief Data Management Officer</w:t>
+            </w:r>
           </w:p>
         </w:tc>
         <w:tc>
           <w:tcPr>
             <w:tcW w:w="4973" w:type="dxa"/>
-          </w:tcPr>
-          <w:p>
-            <w:pPr>
-              <w:tabs>
-                <w:tab w:val="left" w:pos="1692"/>
-                <w:tab w:val="center" w:pos="5256"/>
-              </w:tabs>
-              <w:bidi/>
-              <w:spacing w:after="0" w:line="240" w:lineRule="auto"/>
-              <w:ind w:right="162"/>
-              <w:rPr>
-                <w:rFonts w:asciiTheme="majorBidi" w:hAnsiTheme="majorBidi" w:cstheme="majorBidi"/>
-                <w:b/>
-                <w:bCs/>
-                <w:sz w:val="20"/>
-                <w:szCs w:val="20"/>
-                <w:rtl/>
-              </w:rPr>
-            </w:pPr>
+            <w:vAlign w:val="center"/>
+          </w:tcPr>
+          <w:p>
+            <w:pPr>
+              <w:tabs>
+                <w:tab w:val="left" w:pos="1692"/>
+                <w:tab w:val="center" w:pos="5256"/>
+              </w:tabs>
+              <w:bidi/>
+              <w:spacing w:after="0" w:line="240" w:lineRule="auto"/>
+              <w:ind w:right="162"/>
+              <w:jc w:val="both"/>
+              <w:rPr>
+                <w:rFonts w:asciiTheme="majorBidi" w:hAnsiTheme="majorBidi" w:cstheme="majorBidi"/>
+                <w:sz w:val="20"/>
+                <w:szCs w:val="20"/>
+                <w:rtl/>
+              </w:rPr>
+            </w:pPr>
+            <w:r>
+              <w:rPr>
+                <w:rFonts w:asciiTheme="majorBidi" w:hAnsiTheme="majorBidi" w:cs="Times New Roman"/>
+                <w:sz w:val="20"/>
+                <w:szCs w:val="20"/>
+                <w:rtl/>
+              </w:rPr>
+              <w:t xml:space="preserve">Adel AlHarbi</w:t>
+            </w:r>
           </w:p>
         </w:tc>
       </w:tr>
@@ -1515,16 +1633,18 @@
               <w:bottom w:w="72" w:type="dxa"/>
               <w:right w:w="144" w:type="dxa"/>
             </w:tcMar>
-          </w:tcPr>
-          <w:p>
-            <w:pPr>
-              <w:tabs>
-                <w:tab w:val="left" w:pos="1692"/>
-                <w:tab w:val="center" w:pos="5256"/>
-              </w:tabs>
-              <w:bidi/>
-              <w:spacing w:after="0" w:line="240" w:lineRule="auto"/>
-              <w:ind w:right="162"/>
+            <w:vAlign w:val="center"/>
+          </w:tcPr>
+          <w:p>
+            <w:pPr>
+              <w:tabs>
+                <w:tab w:val="left" w:pos="1692"/>
+                <w:tab w:val="center" w:pos="5256"/>
+              </w:tabs>
+              <w:bidi/>
+              <w:spacing w:after="0" w:line="240" w:lineRule="auto"/>
+              <w:ind w:right="162"/>
+              <w:jc w:val="both"/>
               <w:rPr>
                 <w:rFonts w:asciiTheme="majorBidi" w:hAnsiTheme="majorBidi" w:cstheme="majorBidi"/>
                 <w:sz w:val="20"/>
@@ -1537,23 +1657,34 @@
         <w:tc>
           <w:tcPr>
             <w:tcW w:w="4973" w:type="dxa"/>
-          </w:tcPr>
-          <w:p>
-            <w:pPr>
-              <w:tabs>
-                <w:tab w:val="left" w:pos="1692"/>
-                <w:tab w:val="center" w:pos="5256"/>
-              </w:tabs>
-              <w:bidi/>
-              <w:spacing w:after="0" w:line="240" w:lineRule="auto"/>
-              <w:ind w:right="162"/>
-              <w:rPr>
-                <w:rFonts w:asciiTheme="majorBidi" w:hAnsiTheme="majorBidi" w:cstheme="majorBidi"/>
-                <w:sz w:val="20"/>
-                <w:szCs w:val="20"/>
-                <w:rtl/>
-              </w:rPr>
-            </w:pPr>
+            <w:vAlign w:val="center"/>
+          </w:tcPr>
+          <w:p>
+            <w:pPr>
+              <w:tabs>
+                <w:tab w:val="left" w:pos="1692"/>
+                <w:tab w:val="center" w:pos="5256"/>
+              </w:tabs>
+              <w:bidi/>
+              <w:spacing w:after="0" w:line="240" w:lineRule="auto"/>
+              <w:ind w:right="162"/>
+              <w:jc w:val="both"/>
+              <w:rPr>
+                <w:rFonts w:asciiTheme="majorBidi" w:hAnsiTheme="majorBidi" w:cstheme="majorBidi"/>
+                <w:sz w:val="20"/>
+                <w:szCs w:val="20"/>
+                <w:rtl/>
+              </w:rPr>
+            </w:pPr>
+            <w:r>
+              <w:rPr>
+                <w:rFonts w:asciiTheme="majorBidi" w:hAnsiTheme="majorBidi" w:cs="Times New Roman"/>
+                <w:sz w:val="20"/>
+                <w:szCs w:val="20"/>
+                <w:rtl/>
+              </w:rPr>
+              <w:t xml:space="preserve"/>
+            </w:r>
           </w:p>
         </w:tc>
       </w:tr>
@@ -1570,37 +1701,304 @@
               <w:bottom w:w="72" w:type="dxa"/>
               <w:right w:w="144" w:type="dxa"/>
             </w:tcMar>
-          </w:tcPr>
-          <w:p>
-            <w:pPr>
-              <w:tabs>
-                <w:tab w:val="left" w:pos="1692"/>
-                <w:tab w:val="center" w:pos="5256"/>
-              </w:tabs>
-              <w:bidi/>
-              <w:spacing w:after="0" w:line="240" w:lineRule="auto"/>
-              <w:ind w:right="162"/>
-              <w:rPr>
-                <w:rFonts w:asciiTheme="majorBidi" w:hAnsiTheme="majorBidi" w:cstheme="majorBidi"/>
-                <w:sz w:val="20"/>
-                <w:szCs w:val="20"/>
-                <w:rtl/>
-              </w:rPr>
-            </w:pPr>
+            <w:vAlign w:val="center"/>
+          </w:tcPr>
+          <w:p>
+            <w:pPr>
+              <w:tabs>
+                <w:tab w:val="left" w:pos="1692"/>
+                <w:tab w:val="center" w:pos="5256"/>
+              </w:tabs>
+              <w:bidi/>
+              <w:spacing w:after="0" w:line="240" w:lineRule="auto"/>
+              <w:ind w:right="162"/>
+              <w:jc w:val="both"/>
+              <w:rPr>
+                <w:rFonts w:asciiTheme="majorBidi" w:hAnsiTheme="majorBidi" w:cstheme="majorBidi"/>
+                <w:sz w:val="20"/>
+                <w:szCs w:val="20"/>
+                <w:rtl/>
+              </w:rPr>
+            </w:pPr>
+            <w:r>
+              <w:rPr>
+                <w:rFonts w:asciiTheme="majorBidi" w:hAnsiTheme="majorBidi" w:cs="Times New Roman"/>
+                <w:sz w:val="20"/>
+                <w:szCs w:val="20"/>
+                <w:rtl/>
+              </w:rPr>
+              <w:t xml:space="preserve"/>
+            </w:r>
           </w:p>
         </w:tc>
         <w:tc>
           <w:tcPr>
             <w:tcW w:w="4973" w:type="dxa"/>
-          </w:tcPr>
-          <w:p>
-            <w:pPr>
-              <w:tabs>
-                <w:tab w:val="left" w:pos="1692"/>
-              </w:tabs>
-              <w:bidi/>
-              <w:spacing w:after="0" w:line="240" w:lineRule="auto"/>
-              <w:ind w:right="162"/>
+            <w:vAlign w:val="center"/>
+          </w:tcPr>
+          <w:p>
+            <w:pPr>
+              <w:tabs>
+                <w:tab w:val="left" w:pos="1692"/>
+                <w:tab w:val="center" w:pos="5256"/>
+              </w:tabs>
+              <w:bidi/>
+              <w:spacing w:after="0" w:line="240" w:lineRule="auto"/>
+              <w:ind w:right="162"/>
+              <w:jc w:val="both"/>
+              <w:rPr>
+                <w:rFonts w:asciiTheme="majorBidi" w:hAnsiTheme="majorBidi" w:cstheme="majorBidi"/>
+                <w:sz w:val="20"/>
+                <w:szCs w:val="20"/>
+                <w:rtl/>
+              </w:rPr>
+            </w:pPr>
+            <w:r>
+              <w:rPr>
+                <w:rFonts w:asciiTheme="majorBidi" w:hAnsiTheme="majorBidi" w:cs="Times New Roman"/>
+                <w:sz w:val="20"/>
+                <w:szCs w:val="20"/>
+                <w:rtl/>
+              </w:rPr>
+              <w:t xml:space="preserve">Mira</w:t>
+            </w:r>
+          </w:p>
+        </w:tc>
+      </w:tr>
+      <w:tr>
+        <w:trPr>
+          <w:trHeight w:val="265"/>
+        </w:trPr>
+        <w:tc>
+          <w:tcPr>
+            <w:tcW w:w="5017" w:type="dxa"/>
+            <w:tcMar>
+              <w:top w:w="72" w:type="dxa"/>
+              <w:left w:w="144" w:type="dxa"/>
+              <w:bottom w:w="72" w:type="dxa"/>
+              <w:right w:w="144" w:type="dxa"/>
+            </w:tcMar>
+            <w:vAlign w:val="center"/>
+          </w:tcPr>
+          <w:p>
+            <w:pPr>
+              <w:tabs>
+                <w:tab w:val="left" w:pos="1692"/>
+                <w:tab w:val="center" w:pos="5256"/>
+              </w:tabs>
+              <w:bidi/>
+              <w:spacing w:after="0" w:line="240" w:lineRule="auto"/>
+              <w:ind w:right="162"/>
+              <w:jc w:val="both"/>
+              <w:rPr>
+                <w:rFonts w:asciiTheme="majorBidi" w:hAnsiTheme="majorBidi" w:cstheme="majorBidi"/>
+                <w:sz w:val="20"/>
+                <w:szCs w:val="20"/>
+                <w:rtl/>
+              </w:rPr>
+            </w:pPr>
+          </w:p>
+        </w:tc>
+        <w:tc>
+          <w:tcPr>
+            <w:tcW w:w="4973" w:type="dxa"/>
+            <w:vAlign w:val="center"/>
+          </w:tcPr>
+          <w:p>
+            <w:pPr>
+              <w:tabs>
+                <w:tab w:val="left" w:pos="1692"/>
+                <w:tab w:val="center" w:pos="5256"/>
+              </w:tabs>
+              <w:bidi/>
+              <w:spacing w:after="0" w:line="240" w:lineRule="auto"/>
+              <w:ind w:right="162"/>
+              <w:jc w:val="both"/>
+              <w:rPr>
+                <w:rFonts w:asciiTheme="majorBidi" w:hAnsiTheme="majorBidi" w:cstheme="majorBidi"/>
+                <w:sz w:val="20"/>
+                <w:szCs w:val="20"/>
+                <w:rtl/>
+              </w:rPr>
+            </w:pPr>
+            <w:r>
+              <w:rPr>
+                <w:rFonts w:asciiTheme="majorBidi" w:hAnsiTheme="majorBidi" w:cs="Times New Roman"/>
+                <w:sz w:val="20"/>
+                <w:szCs w:val="20"/>
+                <w:rtl/>
+              </w:rPr>
+              <w:t xml:space="preserve"/>
+            </w:r>
+          </w:p>
+        </w:tc>
+      </w:tr>
+      <w:tr>
+        <w:trPr>
+          <w:trHeight w:val="265"/>
+        </w:trPr>
+        <w:tc>
+          <w:tcPr>
+            <w:tcW w:w="5017" w:type="dxa"/>
+            <w:tcMar>
+              <w:top w:w="72" w:type="dxa"/>
+              <w:left w:w="144" w:type="dxa"/>
+              <w:bottom w:w="72" w:type="dxa"/>
+              <w:right w:w="144" w:type="dxa"/>
+            </w:tcMar>
+            <w:vAlign w:val="center"/>
+          </w:tcPr>
+          <w:p>
+            <w:pPr>
+              <w:tabs>
+                <w:tab w:val="left" w:pos="1692"/>
+                <w:tab w:val="center" w:pos="5256"/>
+              </w:tabs>
+              <w:bidi/>
+              <w:spacing w:after="0" w:line="240" w:lineRule="auto"/>
+              <w:ind w:right="162"/>
+              <w:jc w:val="both"/>
+              <w:rPr>
+                <w:rFonts w:asciiTheme="majorBidi" w:hAnsiTheme="majorBidi" w:cstheme="majorBidi"/>
+                <w:sz w:val="20"/>
+                <w:szCs w:val="20"/>
+                <w:rtl/>
+              </w:rPr>
+            </w:pPr>
+          </w:p>
+        </w:tc>
+        <w:tc>
+          <w:tcPr>
+            <w:tcW w:w="4973" w:type="dxa"/>
+            <w:vAlign w:val="center"/>
+          </w:tcPr>
+          <w:p>
+            <w:pPr>
+              <w:tabs>
+                <w:tab w:val="left" w:pos="1692"/>
+                <w:tab w:val="center" w:pos="5256"/>
+              </w:tabs>
+              <w:bidi/>
+              <w:spacing w:after="0" w:line="240" w:lineRule="auto"/>
+              <w:ind w:right="162"/>
+              <w:jc w:val="both"/>
+              <w:rPr>
+                <w:rFonts w:asciiTheme="majorBidi" w:hAnsiTheme="majorBidi" w:cstheme="majorBidi"/>
+                <w:sz w:val="20"/>
+                <w:szCs w:val="20"/>
+                <w:rtl/>
+              </w:rPr>
+            </w:pPr>
+          </w:p>
+        </w:tc>
+      </w:tr>
+      <w:tr>
+        <w:trPr>
+          <w:trHeight w:val="265"/>
+        </w:trPr>
+        <w:tc>
+          <w:tcPr>
+            <w:tcW w:w="5017" w:type="dxa"/>
+            <w:tcMar>
+              <w:top w:w="72" w:type="dxa"/>
+              <w:left w:w="144" w:type="dxa"/>
+              <w:bottom w:w="72" w:type="dxa"/>
+              <w:right w:w="144" w:type="dxa"/>
+            </w:tcMar>
+            <w:vAlign w:val="center"/>
+          </w:tcPr>
+          <w:p>
+            <w:pPr>
+              <w:tabs>
+                <w:tab w:val="left" w:pos="1692"/>
+                <w:tab w:val="center" w:pos="5256"/>
+              </w:tabs>
+              <w:bidi/>
+              <w:spacing w:after="0" w:line="240" w:lineRule="auto"/>
+              <w:ind w:right="162"/>
+              <w:jc w:val="both"/>
+              <w:rPr>
+                <w:rFonts w:asciiTheme="majorBidi" w:hAnsiTheme="majorBidi" w:cstheme="majorBidi"/>
+                <w:sz w:val="20"/>
+                <w:szCs w:val="20"/>
+                <w:rtl/>
+              </w:rPr>
+            </w:pPr>
+          </w:p>
+        </w:tc>
+        <w:tc>
+          <w:tcPr>
+            <w:tcW w:w="4973" w:type="dxa"/>
+            <w:vAlign w:val="center"/>
+          </w:tcPr>
+          <w:p>
+            <w:pPr>
+              <w:tabs>
+                <w:tab w:val="left" w:pos="1692"/>
+                <w:tab w:val="center" w:pos="5256"/>
+              </w:tabs>
+              <w:bidi/>
+              <w:spacing w:after="0" w:line="240" w:lineRule="auto"/>
+              <w:ind w:right="162"/>
+              <w:jc w:val="both"/>
+              <w:rPr>
+                <w:rFonts w:asciiTheme="majorBidi" w:hAnsiTheme="majorBidi" w:cstheme="majorBidi"/>
+                <w:sz w:val="20"/>
+                <w:szCs w:val="20"/>
+              </w:rPr>
+            </w:pPr>
+          </w:p>
+        </w:tc>
+      </w:tr>
+      <w:tr>
+        <w:trPr>
+          <w:trHeight w:val="265"/>
+        </w:trPr>
+        <w:tc>
+          <w:tcPr>
+            <w:tcW w:w="5017" w:type="dxa"/>
+            <w:tcMar>
+              <w:top w:w="72" w:type="dxa"/>
+              <w:left w:w="144" w:type="dxa"/>
+              <w:bottom w:w="72" w:type="dxa"/>
+              <w:right w:w="144" w:type="dxa"/>
+            </w:tcMar>
+            <w:vAlign w:val="center"/>
+          </w:tcPr>
+          <w:p>
+            <w:pPr>
+              <w:tabs>
+                <w:tab w:val="left" w:pos="1692"/>
+                <w:tab w:val="center" w:pos="5256"/>
+              </w:tabs>
+              <w:bidi/>
+              <w:spacing w:after="0" w:line="240" w:lineRule="auto"/>
+              <w:ind w:right="162"/>
+              <w:jc w:val="both"/>
+              <w:rPr>
+                <w:rFonts w:asciiTheme="majorBidi" w:hAnsiTheme="majorBidi" w:cstheme="majorBidi"/>
+                <w:sz w:val="20"/>
+                <w:szCs w:val="20"/>
+                <w:rtl/>
+              </w:rPr>
+            </w:pPr>
+          </w:p>
+        </w:tc>
+        <w:tc>
+          <w:tcPr>
+            <w:tcW w:w="4973" w:type="dxa"/>
+            <w:vAlign w:val="center"/>
+          </w:tcPr>
+          <w:p>
+            <w:pPr>
+              <w:tabs>
+                <w:tab w:val="left" w:pos="1692"/>
+                <w:tab w:val="center" w:pos="5256"/>
+              </w:tabs>
+              <w:bidi/>
+              <w:spacing w:after="0" w:line="240" w:lineRule="auto"/>
+              <w:ind w:right="162"/>
+              <w:jc w:val="both"/>
               <w:rPr>
                 <w:rFonts w:asciiTheme="majorBidi" w:hAnsiTheme="majorBidi" w:cstheme="majorBidi"/>
                 <w:sz w:val="20"/>
@@ -1740,7 +2138,7 @@
                 <w:szCs w:val="28"/>
                 <w:rtl/>
               </w:rPr>
-              <w:t>الاجتماع</w:t>
+              <w:t xml:space="preserve">الاجتماع</w:t>
             </w:r>
           </w:p>
         </w:tc>
@@ -1774,13 +2172,14 @@
             </w:pPr>
             <w:r>
               <w:rPr>
-                <w:rFonts w:asciiTheme="majorBidi" w:hAnsiTheme="majorBidi" w:cstheme="majorBidi"/>
-                <w:b/>
-                <w:bCs/>
-                <w:sz w:val="20"/>
-                <w:szCs w:val="20"/>
-              </w:rPr>
-              <w:t xml:space="preserve">To discuss the Q3 marketing plan</w:t>
+                <w:rFonts w:asciiTheme="majorBidi" w:hAnsiTheme="majorBidi" w:cs="Times New Roman"/>
+                <w:b/>
+                <w:bCs/>
+                <w:sz w:val="20"/>
+                <w:szCs w:val="20"/>
+                <w:rtl/>
+              </w:rPr>
+              <w:t xml:space="preserve">Kick off the marketing planning for the Ramadan campaign, review creative concepts, and align on budget and influencer strategy</w:t>
             </w:r>
           </w:p>
         </w:tc>
@@ -1917,7 +2316,60 @@
                 <w:szCs w:val="20"/>
                 <w:rtl/>
               </w:rPr>
-              <w:t xml:space="preserve">Discussion of the Q3 marketing plan,Review of the marketing budget and consideration of a budget increase,Coordination with an external agency for marketing efforts</w:t>
+              <w:t xml:space="preserve">
+                <w:r>
+                  <w:t xml:space="preserve">1. Khalid presented three creative concepts for the Ramadan campaign; the team evaluated and discussed the merits of each.
+</w:t>
+                </w:r>
+                <w:r>
+                  <w:br/>
+                </w:r>
+                <w:r>
+                  <w:t xml:space="preserve">2. The second creative concept — the storytelling angle — was selected as the preferred direction.
+</w:t>
+                </w:r>
+                <w:r>
+                  <w:br/>
+                </w:r>
+                <w:r>
+                  <w:t xml:space="preserve">3. Layla raised the concern that budget approval from upper management has not yet been obtained, which could impact timelines.
+</w:t>
+                </w:r>
+                <w:r>
+                  <w:br/>
+                </w:r>
+                <w:r>
+                  <w:t xml:space="preserve">4. Hajji Omar committed to escalating the budget request to the board for approval this week.
+</w:t>
+                </w:r>
+                <w:r>
+                  <w:br/>
+                </w:r>
+                <w:r>
+                  <w:t xml:space="preserve">5. The team discussed the influencer strategy and the need to finalize a shortlist of influencers for the campaign.
+</w:t>
+                </w:r>
+                <w:r>
+                  <w:br/>
+                </w:r>
+                <w:r>
+                  <w:t xml:space="preserve">6. Mira was tasked with shortlisting five influencer names to share before the next meeting.
+</w:t>
+                </w:r>
+                <w:r>
+                  <w:br/>
+                </w:r>
+                <w:r>
+                  <w:t xml:space="preserve">7. The tentative campaign launch is planned for the first week of Ramadan, though the timeline is tight and contingent on budget clearance.
+</w:t>
+                </w:r>
+                <w:r>
+                  <w:br/>
+                </w:r>
+                <w:r>
+                  <w:t xml:space="preserve">8. The team acknowledged the need to confirm the launch date once the budget is approved.</w:t>
+                </w:r>
+              </w:t>
             </w:r>
           </w:p>
         </w:tc>
@@ -1956,10 +2408,10 @@
         <w:tblLook w:val="0420" w:firstRow="1" w:lastRow="0" w:firstColumn="0" w:lastColumn="0" w:noHBand="0" w:noVBand="1"/>
       </w:tblPr>
       <w:tblGrid>
-        <w:gridCol w:w="3539"/>
-        <w:gridCol w:w="2977"/>
-        <w:gridCol w:w="1417"/>
-        <w:gridCol w:w="1882"/>
+        <w:gridCol w:w="1890"/>
+        <w:gridCol w:w="2431"/>
+        <w:gridCol w:w="1709"/>
+        <w:gridCol w:w="3785"/>
         <w:gridCol w:w="350"/>
       </w:tblGrid>
       <w:tr>
@@ -1968,7 +2420,7 @@
         </w:trPr>
         <w:tc>
           <w:tcPr>
-            <w:tcW w:w="3539" w:type="dxa"/>
+            <w:tcW w:w="1890" w:type="dxa"/>
             <w:shd w:val="clear" w:color="auto" w:fill="A79F88"/>
             <w:vAlign w:val="center"/>
           </w:tcPr>
@@ -2008,7 +2460,7 @@
         </w:tc>
         <w:tc>
           <w:tcPr>
-            <w:tcW w:w="2977" w:type="dxa"/>
+            <w:tcW w:w="2431" w:type="dxa"/>
             <w:shd w:val="clear" w:color="auto" w:fill="A79F88"/>
             <w:tcMar>
               <w:top w:w="72" w:type="dxa"/>
@@ -2054,7 +2506,7 @@
         </w:tc>
         <w:tc>
           <w:tcPr>
-            <w:tcW w:w="1417" w:type="dxa"/>
+            <w:tcW w:w="1709" w:type="dxa"/>
             <w:shd w:val="clear" w:color="auto" w:fill="A79F88"/>
             <w:vAlign w:val="center"/>
           </w:tcPr>
@@ -2093,7 +2545,7 @@
         </w:tc>
         <w:tc>
           <w:tcPr>
-            <w:tcW w:w="1882" w:type="dxa"/>
+            <w:tcW w:w="3785" w:type="dxa"/>
             <w:shd w:val="clear" w:color="auto" w:fill="A79F88"/>
             <w:vAlign w:val="center"/>
           </w:tcPr>
@@ -2178,7 +2630,7 @@
         </w:trPr>
         <w:tc>
           <w:tcPr>
-            <w:tcW w:w="3539" w:type="dxa"/>
+            <w:tcW w:w="1890" w:type="dxa"/>
             <w:vAlign w:val="center"/>
           </w:tcPr>
           <w:p>
@@ -2202,7 +2654,7 @@
         </w:tc>
         <w:tc>
           <w:tcPr>
-            <w:tcW w:w="2977" w:type="dxa"/>
+            <w:tcW w:w="2431" w:type="dxa"/>
             <w:tcMar>
               <w:top w:w="72" w:type="dxa"/>
               <w:left w:w="144" w:type="dxa"/>
@@ -2221,56 +2673,40 @@
               <w:spacing w:after="0" w:line="240" w:lineRule="auto"/>
               <w:ind w:right="162"/>
               <w:rPr>
-                <w:rFonts w:asciiTheme="majorHAnsi" w:hAnsiTheme="majorHAnsi" w:cstheme="majorHAnsi"/>
-                <w:sz w:val="20"/>
-                <w:szCs w:val="20"/>
-                <w:rtl/>
-              </w:rPr>
-            </w:pPr>
-            <w:r>
-              <w:rPr>
-                <w:rFonts w:asciiTheme="majorBidi" w:hAnsiTheme="majorBidi" w:cstheme="majorBidi"/>
-                <w:sz w:val="20"/>
-                <w:szCs w:val="20"/>
-              </w:rPr>
-              <w:t xml:space="preserve">2026-05-28</w:t>
-            </w:r>
-          </w:p>
-        </w:tc>
-        <w:tc>
-          <w:tcPr>
-            <w:tcW w:w="1417" w:type="dxa"/>
-            <w:vAlign w:val="center"/>
-          </w:tcPr>
-          <w:p>
-            <w:pPr>
-              <w:tabs>
-                <w:tab w:val="left" w:pos="1692"/>
-                <w:tab w:val="center" w:pos="5256"/>
-              </w:tabs>
-              <w:bidi/>
-              <w:spacing w:after="0" w:line="240" w:lineRule="auto"/>
-              <w:ind w:right="162"/>
-              <w:rPr>
-                <w:rFonts w:asciiTheme="majorHAnsi" w:hAnsiTheme="majorHAnsi" w:cstheme="majorHAnsi"/>
-                <w:sz w:val="20"/>
-                <w:szCs w:val="20"/>
-                <w:rtl/>
-              </w:rPr>
-            </w:pPr>
-            <w:r>
-              <w:rPr>
-                <w:rFonts w:asciiTheme="majorHAnsi" w:hAnsiTheme="majorHAnsi" w:cstheme="majorHAnsi"/>
-                <w:sz w:val="20"/>
-                <w:szCs w:val="20"/>
-              </w:rPr>
-              <w:t xml:space="preserve">Ahmed</w:t>
-            </w:r>
-          </w:p>
-        </w:tc>
-        <w:tc>
-          <w:tcPr>
-            <w:tcW w:w="1882" w:type="dxa"/>
+                <w:rFonts w:asciiTheme="majorBidi" w:hAnsiTheme="majorBidi" w:cstheme="majorBidi"/>
+                <w:sz w:val="20"/>
+                <w:szCs w:val="20"/>
+                <w:rtl/>
+              </w:rPr>
+            </w:pPr>
+          </w:p>
+        </w:tc>
+        <w:tc>
+          <w:tcPr>
+            <w:tcW w:w="1709" w:type="dxa"/>
+            <w:vAlign w:val="center"/>
+          </w:tcPr>
+          <w:p>
+            <w:pPr>
+              <w:tabs>
+                <w:tab w:val="left" w:pos="1692"/>
+                <w:tab w:val="center" w:pos="5256"/>
+              </w:tabs>
+              <w:bidi/>
+              <w:spacing w:after="0" w:line="240" w:lineRule="auto"/>
+              <w:ind w:right="162"/>
+              <w:rPr>
+                <w:rFonts w:asciiTheme="majorBidi" w:hAnsiTheme="majorBidi" w:cstheme="majorBidi"/>
+                <w:sz w:val="20"/>
+                <w:szCs w:val="20"/>
+                <w:rtl/>
+              </w:rPr>
+            </w:pPr>
+          </w:p>
+        </w:tc>
+        <w:tc>
+          <w:tcPr>
+            <w:tcW w:w="3785" w:type="dxa"/>
             <w:vAlign w:val="center"/>
           </w:tcPr>
           <w:p>
@@ -2283,19 +2719,19 @@
               <w:spacing w:after="0" w:line="240" w:lineRule="auto"/>
               <w:ind w:left="136" w:right="162"/>
               <w:rPr>
-                <w:rFonts w:asciiTheme="majorHAnsi" w:hAnsiTheme="majorHAnsi" w:cstheme="majorHAnsi"/>
-                <w:sz w:val="20"/>
-                <w:szCs w:val="20"/>
-                <w:rtl/>
-              </w:rPr>
-            </w:pPr>
-            <w:r>
-              <w:rPr>
-                <w:rFonts w:asciiTheme="majorHAnsi" w:hAnsiTheme="majorHAnsi" w:cstheme="majorHAnsi"/>
-                <w:sz w:val="20"/>
-                <w:szCs w:val="20"/>
-              </w:rPr>
-              <w:t xml:space="preserve">Prepare the new budget proposal</w:t>
+                <w:rFonts w:asciiTheme="majorBidi" w:hAnsiTheme="majorBidi" w:cstheme="majorBidi"/>
+                <w:sz w:val="20"/>
+                <w:szCs w:val="20"/>
+              </w:rPr>
+            </w:pPr>
+            <w:r>
+              <w:rPr>
+                <w:rFonts w:asciiTheme="majorBidi" w:hAnsiTheme="majorBidi" w:cs="Times New Roman"/>
+                <w:sz w:val="20"/>
+                <w:szCs w:val="20"/>
+                <w:rtl/>
+              </w:rPr>
+              <w:t xml:space="preserve"/>
             </w:r>
           </w:p>
         </w:tc>
@@ -2335,31 +2771,28 @@
         </w:trPr>
         <w:tc>
           <w:tcPr>
-            <w:tcW w:w="3539" w:type="dxa"/>
-            <w:vAlign w:val="center"/>
-          </w:tcPr>
-          <w:p>
-            <w:pPr>
-              <w:tabs>
-                <w:tab w:val="left" w:pos="1692"/>
-                <w:tab w:val="center" w:pos="5256"/>
-              </w:tabs>
-              <w:bidi/>
-              <w:spacing w:after="0" w:line="240" w:lineRule="auto"/>
-              <w:ind w:right="162"/>
-              <w:jc w:val="center"/>
-              <w:rPr>
-                <w:rFonts w:asciiTheme="majorBidi" w:hAnsiTheme="majorBidi" w:cstheme="majorBidi"/>
-                <w:sz w:val="20"/>
-                <w:szCs w:val="20"/>
-                <w:rtl/>
-              </w:rPr>
-            </w:pPr>
-          </w:p>
-        </w:tc>
-        <w:tc>
-          <w:tcPr>
-            <w:tcW w:w="2977" w:type="dxa"/>
+            <w:tcW w:w="1890" w:type="dxa"/>
+            <w:vAlign w:val="center"/>
+          </w:tcPr>
+          <w:p>
+            <w:pPr>
+              <w:tabs>
+                <w:tab w:val="center" w:pos="5256"/>
+              </w:tabs>
+              <w:bidi/>
+              <w:spacing w:after="0" w:line="240" w:lineRule="auto"/>
+              <w:rPr>
+                <w:rFonts w:asciiTheme="majorBidi" w:hAnsiTheme="majorBidi" w:cstheme="majorBidi"/>
+                <w:sz w:val="20"/>
+                <w:szCs w:val="20"/>
+                <w:rtl/>
+              </w:rPr>
+            </w:pPr>
+          </w:p>
+        </w:tc>
+        <w:tc>
+          <w:tcPr>
+            <w:tcW w:w="2431" w:type="dxa"/>
             <w:tcMar>
               <w:top w:w="72" w:type="dxa"/>
               <w:left w:w="144" w:type="dxa"/>
@@ -2371,24 +2804,227 @@
           <w:p>
             <w:pPr>
               <w:tabs>
-                <w:tab w:val="left" w:pos="1692"/>
-                <w:tab w:val="center" w:pos="5256"/>
-              </w:tabs>
-              <w:bidi/>
-              <w:spacing w:after="0" w:line="240" w:lineRule="auto"/>
-              <w:ind w:right="162"/>
-              <w:rPr>
-                <w:rFonts w:asciiTheme="majorHAnsi" w:hAnsiTheme="majorHAnsi" w:cstheme="majorHAnsi"/>
-                <w:sz w:val="20"/>
-                <w:szCs w:val="20"/>
-                <w:rtl/>
-              </w:rPr>
-            </w:pPr>
-            <w:r>
-              <w:rPr>
-                <w:rFonts w:asciiTheme="majorBidi" w:hAnsiTheme="majorBidi" w:cstheme="majorBidi"/>
-                <w:sz w:val="20"/>
-                <w:szCs w:val="20"/>
+                <w:tab w:val="center" w:pos="5256"/>
+              </w:tabs>
+              <w:bidi/>
+              <w:spacing w:after="0" w:line="240" w:lineRule="auto"/>
+              <w:rPr>
+                <w:rFonts w:asciiTheme="majorBidi" w:hAnsiTheme="majorBidi" w:cstheme="majorBidi"/>
+                <w:sz w:val="20"/>
+                <w:szCs w:val="20"/>
+                <w:rtl/>
+                <w:lang w:bidi="ar-JO"/>
+              </w:rPr>
+            </w:pPr>
+            <w:r>
+              <w:rPr>
+                <w:rFonts w:asciiTheme="majorBidi" w:hAnsiTheme="majorBidi" w:cs="Times New Roman"/>
+                <w:sz w:val="20"/>
+                <w:szCs w:val="20"/>
+                <w:rtl/>
+                <w:lang w:bidi="ar-JO"/>
+              </w:rPr>
+              <w:t xml:space="preserve">2026-06-24</w:t>
+            </w:r>
+          </w:p>
+        </w:tc>
+        <w:tc>
+          <w:tcPr>
+            <w:tcW w:w="1709" w:type="dxa"/>
+            <w:vAlign w:val="center"/>
+          </w:tcPr>
+          <w:p>
+            <w:pPr>
+              <w:tabs>
+                <w:tab w:val="left" w:pos="1692"/>
+                <w:tab w:val="center" w:pos="5256"/>
+              </w:tabs>
+              <w:bidi/>
+              <w:spacing w:after="0" w:line="240" w:lineRule="auto"/>
+              <w:ind w:right="162"/>
+              <w:rPr>
+                <w:rFonts w:asciiTheme="majorBidi" w:hAnsiTheme="majorBidi" w:cstheme="majorBidi"/>
+                <w:sz w:val="20"/>
+                <w:szCs w:val="20"/>
+                <w:rtl/>
+              </w:rPr>
+            </w:pPr>
+            <w:r>
+              <w:rPr>
+                <w:rFonts w:asciiTheme="majorBidi" w:hAnsiTheme="majorBidi" w:cs="Times New Roman"/>
+                <w:sz w:val="20"/>
+                <w:szCs w:val="20"/>
+                <w:rtl/>
+              </w:rPr>
+              <w:t xml:space="preserve">Eng. Khalid Al-Dosari</w:t>
+            </w:r>
+          </w:p>
+        </w:tc>
+        <w:tc>
+          <w:tcPr>
+            <w:tcW w:w="3785" w:type="dxa"/>
+            <w:vAlign w:val="center"/>
+          </w:tcPr>
+          <w:p>
+            <w:pPr>
+              <w:tabs>
+                <w:tab w:val="left" w:pos="1692"/>
+                <w:tab w:val="center" w:pos="5256"/>
+              </w:tabs>
+              <w:bidi/>
+              <w:spacing w:after="0" w:line="240" w:lineRule="auto"/>
+              <w:ind w:right="162"/>
+              <w:rPr>
+                <w:rFonts w:asciiTheme="majorBidi" w:hAnsiTheme="majorBidi" w:cstheme="majorBidi" w:hint="cs"/>
+                <w:sz w:val="20"/>
+                <w:szCs w:val="20"/>
+                <w:rtl/>
+              </w:rPr>
+            </w:pPr>
+            <w:r>
+              <w:rPr>
+                <w:rFonts w:asciiTheme="majorBidi" w:hAnsiTheme="majorBidi" w:cs="Times New Roman"/>
+                <w:sz w:val="20"/>
+                <w:szCs w:val="20"/>
+                <w:rtl/>
+              </w:rPr>
+              <w:t xml:space="preserve">Send over final mockups for the selected storytelling creative concept</w:t>
+            </w:r>
+          </w:p>
+        </w:tc>
+        <w:tc>
+          <w:tcPr>
+            <w:tcW w:w="350" w:type="dxa"/>
+            <w:vAlign w:val="center"/>
+          </w:tcPr>
+          <w:p>
+            <w:pPr>
+              <w:pStyle w:val="ListParagraph"/>
+              <w:numPr>
+                <w:ilvl w:val="0"/>
+                <w:numId w:val="18"/>
+              </w:numPr>
+              <w:tabs>
+                <w:tab w:val="left" w:pos="1692"/>
+                <w:tab w:val="center" w:pos="5256"/>
+              </w:tabs>
+              <w:bidi/>
+              <w:spacing w:after="0" w:line="240" w:lineRule="auto"/>
+              <w:ind w:right="162"/>
+              <w:jc w:val="center"/>
+              <w:rPr>
+                <w:rFonts w:asciiTheme="majorBidi" w:hAnsiTheme="majorBidi" w:cstheme="majorBidi"/>
+                <w:sz w:val="20"/>
+                <w:szCs w:val="20"/>
+                <w:rtl/>
+              </w:rPr>
+            </w:pPr>
+          </w:p>
+        </w:tc>
+      </w:tr>
+      <w:tr>
+        <w:trPr>
+          <w:trHeight w:val="278"/>
+        </w:trPr>
+        <w:tc>
+          <w:tcPr>
+            <w:tcW w:w="1890" w:type="dxa"/>
+            <w:vAlign w:val="center"/>
+          </w:tcPr>
+          <w:p>
+            <w:pPr>
+              <w:tabs>
+                <w:tab w:val="center" w:pos="5256"/>
+              </w:tabs>
+              <w:bidi/>
+              <w:spacing w:after="0" w:line="240" w:lineRule="auto"/>
+              <w:rPr>
+                <w:rFonts w:asciiTheme="majorBidi" w:hAnsiTheme="majorBidi" w:cstheme="majorBidi"/>
+                <w:sz w:val="20"/>
+                <w:szCs w:val="20"/>
+                <w:rtl/>
+              </w:rPr>
+            </w:pPr>
+          </w:p>
+        </w:tc>
+        <w:tc>
+          <w:tcPr>
+            <w:tcW w:w="2431" w:type="dxa"/>
+            <w:tcMar>
+              <w:top w:w="72" w:type="dxa"/>
+              <w:left w:w="144" w:type="dxa"/>
+              <w:bottom w:w="72" w:type="dxa"/>
+              <w:right w:w="144" w:type="dxa"/>
+            </w:tcMar>
+            <w:vAlign w:val="center"/>
+          </w:tcPr>
+          <w:p>
+            <w:pPr>
+              <w:tabs>
+                <w:tab w:val="center" w:pos="5256"/>
+              </w:tabs>
+              <w:bidi/>
+              <w:spacing w:after="0" w:line="240" w:lineRule="auto"/>
+              <w:rPr>
+                <w:rFonts w:asciiTheme="majorBidi" w:hAnsiTheme="majorBidi" w:cstheme="majorBidi"/>
+                <w:sz w:val="20"/>
+                <w:szCs w:val="20"/>
+                <w:rtl/>
+                <w:lang w:bidi="ar-JO"/>
+              </w:rPr>
+            </w:pPr>
+          </w:p>
+        </w:tc>
+        <w:tc>
+          <w:tcPr>
+            <w:tcW w:w="1709" w:type="dxa"/>
+            <w:vAlign w:val="center"/>
+          </w:tcPr>
+          <w:p>
+            <w:pPr>
+              <w:tabs>
+                <w:tab w:val="left" w:pos="1692"/>
+                <w:tab w:val="center" w:pos="5256"/>
+              </w:tabs>
+              <w:bidi/>
+              <w:spacing w:after="0" w:line="240" w:lineRule="auto"/>
+              <w:ind w:right="162"/>
+              <w:rPr>
+                <w:rFonts w:asciiTheme="majorBidi" w:hAnsiTheme="majorBidi" w:cstheme="majorBidi"/>
+                <w:sz w:val="20"/>
+                <w:szCs w:val="20"/>
+                <w:rtl/>
+              </w:rPr>
+            </w:pPr>
+          </w:p>
+        </w:tc>
+        <w:tc>
+          <w:tcPr>
+            <w:tcW w:w="3785" w:type="dxa"/>
+            <w:vAlign w:val="center"/>
+          </w:tcPr>
+          <w:p>
+            <w:pPr>
+              <w:tabs>
+                <w:tab w:val="left" w:pos="1692"/>
+                <w:tab w:val="center" w:pos="5256"/>
+              </w:tabs>
+              <w:bidi/>
+              <w:spacing w:after="0" w:line="240" w:lineRule="auto"/>
+              <w:ind w:right="162"/>
+              <w:rPr>
+                <w:rFonts w:asciiTheme="majorBidi" w:hAnsiTheme="majorBidi" w:cstheme="majorBidi"/>
+                <w:sz w:val="20"/>
+                <w:szCs w:val="20"/>
+                <w:rtl/>
+              </w:rPr>
+            </w:pPr>
+            <w:r>
+              <w:rPr>
+                <w:rFonts w:asciiTheme="majorBidi" w:hAnsiTheme="majorBidi" w:cs="Times New Roman"/>
+                <w:sz w:val="20"/>
+                <w:szCs w:val="20"/>
+                <w:rtl/>
               </w:rPr>
               <w:t xml:space="preserve"/>
             </w:r>
@@ -2396,64 +3032,1145 @@
         </w:tc>
         <w:tc>
           <w:tcPr>
-            <w:tcW w:w="1417" w:type="dxa"/>
-            <w:vAlign w:val="center"/>
-          </w:tcPr>
-          <w:p>
-            <w:pPr>
-              <w:tabs>
-                <w:tab w:val="left" w:pos="1692"/>
-                <w:tab w:val="center" w:pos="5256"/>
-              </w:tabs>
-              <w:bidi/>
-              <w:spacing w:after="0" w:line="240" w:lineRule="auto"/>
-              <w:ind w:right="162"/>
-              <w:rPr>
-                <w:rFonts w:asciiTheme="majorHAnsi" w:hAnsiTheme="majorHAnsi" w:cstheme="majorHAnsi"/>
-                <w:sz w:val="20"/>
-                <w:szCs w:val="20"/>
-                <w:rtl/>
-              </w:rPr>
-            </w:pPr>
-            <w:r>
-              <w:rPr>
-                <w:rFonts w:asciiTheme="majorHAnsi" w:hAnsiTheme="majorHAnsi" w:cstheme="majorHAnsi"/>
-                <w:sz w:val="20"/>
-                <w:szCs w:val="20"/>
-              </w:rPr>
-              <w:t xml:space="preserve">Sara</w:t>
-            </w:r>
-          </w:p>
-        </w:tc>
-        <w:tc>
-          <w:tcPr>
-            <w:tcW w:w="1882" w:type="dxa"/>
-            <w:vAlign w:val="center"/>
-          </w:tcPr>
-          <w:p>
-            <w:pPr>
-              <w:tabs>
-                <w:tab w:val="left" w:pos="1692"/>
-                <w:tab w:val="center" w:pos="5256"/>
-              </w:tabs>
-              <w:bidi/>
-              <w:spacing w:after="0" w:line="240" w:lineRule="auto"/>
-              <w:ind w:left="136" w:right="162"/>
-              <w:rPr>
-                <w:rFonts w:asciiTheme="majorHAnsi" w:hAnsiTheme="majorHAnsi" w:cstheme="majorHAnsi"/>
-                <w:sz w:val="20"/>
-                <w:szCs w:val="20"/>
-                <w:rtl/>
-              </w:rPr>
-            </w:pPr>
-            <w:r>
-              <w:rPr>
-                <w:rFonts w:asciiTheme="majorHAnsi" w:hAnsiTheme="majorHAnsi" w:cstheme="majorHAnsi"/>
-                <w:sz w:val="20"/>
-                <w:szCs w:val="20"/>
-              </w:rPr>
-              <w:t xml:space="preserve">Reach out to the agency</w:t>
-            </w:r>
+            <w:tcW w:w="350" w:type="dxa"/>
+            <w:vAlign w:val="center"/>
+          </w:tcPr>
+          <w:p>
+            <w:pPr>
+              <w:pStyle w:val="ListParagraph"/>
+              <w:numPr>
+                <w:ilvl w:val="0"/>
+                <w:numId w:val="18"/>
+              </w:numPr>
+              <w:tabs>
+                <w:tab w:val="left" w:pos="1692"/>
+                <w:tab w:val="center" w:pos="5256"/>
+              </w:tabs>
+              <w:bidi/>
+              <w:spacing w:after="0" w:line="240" w:lineRule="auto"/>
+              <w:ind w:right="162"/>
+              <w:jc w:val="center"/>
+              <w:rPr>
+                <w:rFonts w:asciiTheme="majorBidi" w:hAnsiTheme="majorBidi" w:cstheme="majorBidi"/>
+                <w:sz w:val="20"/>
+                <w:szCs w:val="20"/>
+                <w:rtl/>
+              </w:rPr>
+            </w:pPr>
+          </w:p>
+        </w:tc>
+      </w:tr>
+      <w:tr>
+        <w:trPr>
+          <w:trHeight w:val="278"/>
+        </w:trPr>
+        <w:tc>
+          <w:tcPr>
+            <w:tcW w:w="1890" w:type="dxa"/>
+            <w:vAlign w:val="center"/>
+          </w:tcPr>
+          <w:p>
+            <w:pPr>
+              <w:tabs>
+                <w:tab w:val="center" w:pos="5256"/>
+              </w:tabs>
+              <w:bidi/>
+              <w:spacing w:after="0" w:line="240" w:lineRule="auto"/>
+              <w:rPr>
+                <w:rFonts w:asciiTheme="majorBidi" w:hAnsiTheme="majorBidi" w:cstheme="majorBidi"/>
+                <w:sz w:val="20"/>
+                <w:szCs w:val="20"/>
+                <w:rtl/>
+              </w:rPr>
+            </w:pPr>
+          </w:p>
+        </w:tc>
+        <w:tc>
+          <w:tcPr>
+            <w:tcW w:w="2431" w:type="dxa"/>
+            <w:tcMar>
+              <w:top w:w="72" w:type="dxa"/>
+              <w:left w:w="144" w:type="dxa"/>
+              <w:bottom w:w="72" w:type="dxa"/>
+              <w:right w:w="144" w:type="dxa"/>
+            </w:tcMar>
+            <w:vAlign w:val="center"/>
+          </w:tcPr>
+          <w:p>
+            <w:pPr>
+              <w:tabs>
+                <w:tab w:val="center" w:pos="5256"/>
+              </w:tabs>
+              <w:bidi/>
+              <w:spacing w:after="0" w:line="240" w:lineRule="auto"/>
+              <w:rPr>
+                <w:rFonts w:asciiTheme="majorBidi" w:hAnsiTheme="majorBidi" w:cstheme="majorBidi"/>
+                <w:sz w:val="20"/>
+                <w:szCs w:val="20"/>
+                <w:rtl/>
+                <w:lang w:bidi="ar-JO"/>
+              </w:rPr>
+            </w:pPr>
+            <w:r>
+              <w:rPr>
+                <w:rFonts w:asciiTheme="majorBidi" w:hAnsiTheme="majorBidi" w:cs="Times New Roman"/>
+                <w:sz w:val="20"/>
+                <w:szCs w:val="20"/>
+                <w:rtl/>
+                <w:lang w:bidi="ar-JO"/>
+              </w:rPr>
+              <w:t xml:space="preserve">2026-06-27</w:t>
+            </w:r>
+          </w:p>
+        </w:tc>
+        <w:tc>
+          <w:tcPr>
+            <w:tcW w:w="1709" w:type="dxa"/>
+            <w:vAlign w:val="center"/>
+          </w:tcPr>
+          <w:p>
+            <w:pPr>
+              <w:tabs>
+                <w:tab w:val="left" w:pos="1692"/>
+                <w:tab w:val="center" w:pos="5256"/>
+              </w:tabs>
+              <w:bidi/>
+              <w:spacing w:after="0" w:line="240" w:lineRule="auto"/>
+              <w:ind w:right="162"/>
+              <w:rPr>
+                <w:rFonts w:asciiTheme="majorBidi" w:hAnsiTheme="majorBidi" w:cstheme="majorBidi"/>
+                <w:sz w:val="20"/>
+                <w:szCs w:val="20"/>
+                <w:rtl/>
+              </w:rPr>
+            </w:pPr>
+            <w:r>
+              <w:rPr>
+                <w:rFonts w:asciiTheme="majorBidi" w:hAnsiTheme="majorBidi" w:cs="Times New Roman"/>
+                <w:sz w:val="20"/>
+                <w:szCs w:val="20"/>
+                <w:rtl/>
+              </w:rPr>
+              <w:t xml:space="preserve">Hajji Omar</w:t>
+            </w:r>
+          </w:p>
+        </w:tc>
+        <w:tc>
+          <w:tcPr>
+            <w:tcW w:w="3785" w:type="dxa"/>
+            <w:vAlign w:val="center"/>
+          </w:tcPr>
+          <w:p>
+            <w:pPr>
+              <w:tabs>
+                <w:tab w:val="left" w:pos="1692"/>
+                <w:tab w:val="center" w:pos="5256"/>
+              </w:tabs>
+              <w:bidi/>
+              <w:spacing w:after="0" w:line="240" w:lineRule="auto"/>
+              <w:ind w:right="162"/>
+              <w:rPr>
+                <w:rFonts w:asciiTheme="majorBidi" w:hAnsiTheme="majorBidi" w:cstheme="majorBidi" w:hint="cs"/>
+                <w:sz w:val="20"/>
+                <w:szCs w:val="20"/>
+                <w:rtl/>
+              </w:rPr>
+            </w:pPr>
+            <w:r>
+              <w:rPr>
+                <w:rFonts w:asciiTheme="majorBidi" w:hAnsiTheme="majorBidi" w:cs="Times New Roman"/>
+                <w:sz w:val="20"/>
+                <w:szCs w:val="20"/>
+                <w:rtl/>
+              </w:rPr>
+              <w:t xml:space="preserve">Escalate budget request to the board and obtain approval or rejection</w:t>
+            </w:r>
+          </w:p>
+        </w:tc>
+        <w:tc>
+          <w:tcPr>
+            <w:tcW w:w="350" w:type="dxa"/>
+            <w:vAlign w:val="center"/>
+          </w:tcPr>
+          <w:p>
+            <w:pPr>
+              <w:pStyle w:val="ListParagraph"/>
+              <w:numPr>
+                <w:ilvl w:val="0"/>
+                <w:numId w:val="18"/>
+              </w:numPr>
+              <w:tabs>
+                <w:tab w:val="left" w:pos="1692"/>
+                <w:tab w:val="center" w:pos="5256"/>
+              </w:tabs>
+              <w:bidi/>
+              <w:spacing w:after="0" w:line="240" w:lineRule="auto"/>
+              <w:ind w:right="162"/>
+              <w:jc w:val="center"/>
+              <w:rPr>
+                <w:rFonts w:asciiTheme="majorBidi" w:hAnsiTheme="majorBidi" w:cstheme="majorBidi"/>
+                <w:sz w:val="20"/>
+                <w:szCs w:val="20"/>
+                <w:rtl/>
+              </w:rPr>
+            </w:pPr>
+          </w:p>
+        </w:tc>
+      </w:tr>
+      <w:tr>
+        <w:trPr>
+          <w:trHeight w:val="278"/>
+        </w:trPr>
+        <w:tc>
+          <w:tcPr>
+            <w:tcW w:w="1890" w:type="dxa"/>
+            <w:vAlign w:val="center"/>
+          </w:tcPr>
+          <w:p>
+            <w:pPr>
+              <w:tabs>
+                <w:tab w:val="center" w:pos="5256"/>
+              </w:tabs>
+              <w:bidi/>
+              <w:spacing w:after="0" w:line="240" w:lineRule="auto"/>
+              <w:rPr>
+                <w:rFonts w:asciiTheme="majorBidi" w:hAnsiTheme="majorBidi" w:cstheme="majorBidi"/>
+                <w:sz w:val="20"/>
+                <w:szCs w:val="20"/>
+                <w:rtl/>
+              </w:rPr>
+            </w:pPr>
+          </w:p>
+        </w:tc>
+        <w:tc>
+          <w:tcPr>
+            <w:tcW w:w="2431" w:type="dxa"/>
+            <w:tcMar>
+              <w:top w:w="72" w:type="dxa"/>
+              <w:left w:w="144" w:type="dxa"/>
+              <w:bottom w:w="72" w:type="dxa"/>
+              <w:right w:w="144" w:type="dxa"/>
+            </w:tcMar>
+            <w:vAlign w:val="center"/>
+          </w:tcPr>
+          <w:p>
+            <w:pPr>
+              <w:tabs>
+                <w:tab w:val="center" w:pos="5256"/>
+              </w:tabs>
+              <w:bidi/>
+              <w:spacing w:after="0" w:line="240" w:lineRule="auto"/>
+              <w:rPr>
+                <w:rFonts w:asciiTheme="majorBidi" w:hAnsiTheme="majorBidi" w:cstheme="majorBidi"/>
+                <w:sz w:val="20"/>
+                <w:szCs w:val="20"/>
+                <w:rtl/>
+                <w:lang w:bidi="ar-JO"/>
+              </w:rPr>
+            </w:pPr>
+          </w:p>
+        </w:tc>
+        <w:tc>
+          <w:tcPr>
+            <w:tcW w:w="1709" w:type="dxa"/>
+            <w:vAlign w:val="center"/>
+          </w:tcPr>
+          <w:p>
+            <w:pPr>
+              <w:tabs>
+                <w:tab w:val="left" w:pos="1692"/>
+                <w:tab w:val="center" w:pos="5256"/>
+              </w:tabs>
+              <w:bidi/>
+              <w:spacing w:after="0" w:line="240" w:lineRule="auto"/>
+              <w:ind w:right="162"/>
+              <w:rPr>
+                <w:rFonts w:asciiTheme="majorBidi" w:hAnsiTheme="majorBidi" w:cstheme="majorBidi"/>
+                <w:sz w:val="20"/>
+                <w:szCs w:val="20"/>
+                <w:rtl/>
+              </w:rPr>
+            </w:pPr>
+          </w:p>
+        </w:tc>
+        <w:tc>
+          <w:tcPr>
+            <w:tcW w:w="3785" w:type="dxa"/>
+            <w:vAlign w:val="center"/>
+          </w:tcPr>
+          <w:p>
+            <w:pPr>
+              <w:tabs>
+                <w:tab w:val="left" w:pos="1692"/>
+                <w:tab w:val="center" w:pos="5256"/>
+              </w:tabs>
+              <w:bidi/>
+              <w:spacing w:after="0" w:line="240" w:lineRule="auto"/>
+              <w:ind w:right="162"/>
+              <w:rPr>
+                <w:rFonts w:asciiTheme="majorBidi" w:hAnsiTheme="majorBidi" w:cstheme="majorBidi"/>
+                <w:sz w:val="20"/>
+                <w:szCs w:val="20"/>
+                <w:rtl/>
+              </w:rPr>
+            </w:pPr>
+            <w:r>
+              <w:rPr>
+                <w:rFonts w:asciiTheme="majorBidi" w:hAnsiTheme="majorBidi" w:cs="Times New Roman"/>
+                <w:sz w:val="20"/>
+                <w:szCs w:val="20"/>
+                <w:rtl/>
+              </w:rPr>
+              <w:t xml:space="preserve"/>
+            </w:r>
+          </w:p>
+        </w:tc>
+        <w:tc>
+          <w:tcPr>
+            <w:tcW w:w="350" w:type="dxa"/>
+            <w:vAlign w:val="center"/>
+          </w:tcPr>
+          <w:p>
+            <w:pPr>
+              <w:pStyle w:val="ListParagraph"/>
+              <w:numPr>
+                <w:ilvl w:val="0"/>
+                <w:numId w:val="18"/>
+              </w:numPr>
+              <w:tabs>
+                <w:tab w:val="left" w:pos="1692"/>
+                <w:tab w:val="center" w:pos="5256"/>
+              </w:tabs>
+              <w:bidi/>
+              <w:spacing w:after="0" w:line="240" w:lineRule="auto"/>
+              <w:ind w:right="162"/>
+              <w:jc w:val="center"/>
+              <w:rPr>
+                <w:rFonts w:asciiTheme="majorBidi" w:hAnsiTheme="majorBidi" w:cstheme="majorBidi"/>
+                <w:sz w:val="20"/>
+                <w:szCs w:val="20"/>
+                <w:rtl/>
+              </w:rPr>
+            </w:pPr>
+          </w:p>
+        </w:tc>
+      </w:tr>
+      <w:tr>
+        <w:trPr>
+          <w:trHeight w:val="278"/>
+        </w:trPr>
+        <w:tc>
+          <w:tcPr>
+            <w:tcW w:w="1890" w:type="dxa"/>
+            <w:vAlign w:val="center"/>
+          </w:tcPr>
+          <w:p>
+            <w:pPr>
+              <w:tabs>
+                <w:tab w:val="center" w:pos="5256"/>
+              </w:tabs>
+              <w:bidi/>
+              <w:spacing w:after="0" w:line="240" w:lineRule="auto"/>
+              <w:rPr>
+                <w:rFonts w:asciiTheme="majorBidi" w:hAnsiTheme="majorBidi" w:cstheme="majorBidi"/>
+                <w:sz w:val="20"/>
+                <w:szCs w:val="20"/>
+                <w:rtl/>
+              </w:rPr>
+            </w:pPr>
+          </w:p>
+        </w:tc>
+        <w:tc>
+          <w:tcPr>
+            <w:tcW w:w="2431" w:type="dxa"/>
+            <w:tcMar>
+              <w:top w:w="72" w:type="dxa"/>
+              <w:left w:w="144" w:type="dxa"/>
+              <w:bottom w:w="72" w:type="dxa"/>
+              <w:right w:w="144" w:type="dxa"/>
+            </w:tcMar>
+            <w:vAlign w:val="center"/>
+          </w:tcPr>
+          <w:p>
+            <w:pPr>
+              <w:tabs>
+                <w:tab w:val="center" w:pos="5256"/>
+              </w:tabs>
+              <w:bidi/>
+              <w:spacing w:after="0" w:line="240" w:lineRule="auto"/>
+              <w:rPr>
+                <w:rFonts w:asciiTheme="majorBidi" w:hAnsiTheme="majorBidi" w:cstheme="majorBidi"/>
+                <w:sz w:val="20"/>
+                <w:szCs w:val="20"/>
+                <w:rtl/>
+                <w:lang w:bidi="ar-JO"/>
+              </w:rPr>
+            </w:pPr>
+            <w:r>
+              <w:rPr>
+                <w:rFonts w:asciiTheme="majorBidi" w:hAnsiTheme="majorBidi" w:cs="Times New Roman"/>
+                <w:sz w:val="20"/>
+                <w:szCs w:val="20"/>
+                <w:rtl/>
+                <w:lang w:bidi="ar-JO"/>
+              </w:rPr>
+              <w:t xml:space="preserve">2026-06-25</w:t>
+            </w:r>
+          </w:p>
+        </w:tc>
+        <w:tc>
+          <w:tcPr>
+            <w:tcW w:w="1709" w:type="dxa"/>
+            <w:vAlign w:val="center"/>
+          </w:tcPr>
+          <w:p>
+            <w:pPr>
+              <w:tabs>
+                <w:tab w:val="left" w:pos="1692"/>
+                <w:tab w:val="center" w:pos="5256"/>
+              </w:tabs>
+              <w:bidi/>
+              <w:spacing w:after="0" w:line="240" w:lineRule="auto"/>
+              <w:ind w:right="162"/>
+              <w:rPr>
+                <w:rFonts w:asciiTheme="majorBidi" w:hAnsiTheme="majorBidi" w:cstheme="majorBidi"/>
+                <w:sz w:val="20"/>
+                <w:szCs w:val="20"/>
+                <w:rtl/>
+              </w:rPr>
+            </w:pPr>
+            <w:r>
+              <w:rPr>
+                <w:rFonts w:asciiTheme="majorBidi" w:hAnsiTheme="majorBidi" w:cs="Times New Roman"/>
+                <w:sz w:val="20"/>
+                <w:szCs w:val="20"/>
+                <w:rtl/>
+              </w:rPr>
+              <w:t xml:space="preserve">Mira</w:t>
+            </w:r>
+          </w:p>
+        </w:tc>
+        <w:tc>
+          <w:tcPr>
+            <w:tcW w:w="3785" w:type="dxa"/>
+            <w:vAlign w:val="center"/>
+          </w:tcPr>
+          <w:p>
+            <w:pPr>
+              <w:tabs>
+                <w:tab w:val="left" w:pos="1692"/>
+                <w:tab w:val="center" w:pos="5256"/>
+              </w:tabs>
+              <w:bidi/>
+              <w:spacing w:after="0" w:line="240" w:lineRule="auto"/>
+              <w:ind w:right="162"/>
+              <w:rPr>
+                <w:rFonts w:asciiTheme="majorBidi" w:hAnsiTheme="majorBidi" w:cstheme="majorBidi" w:hint="cs"/>
+                <w:sz w:val="20"/>
+                <w:szCs w:val="20"/>
+                <w:rtl/>
+              </w:rPr>
+            </w:pPr>
+            <w:r>
+              <w:rPr>
+                <w:rFonts w:asciiTheme="majorBidi" w:hAnsiTheme="majorBidi" w:cs="Times New Roman"/>
+                <w:sz w:val="20"/>
+                <w:szCs w:val="20"/>
+                <w:rtl/>
+              </w:rPr>
+              <w:t xml:space="preserve">Shortlist five influencer names and share with the team before the next meeting</w:t>
+            </w:r>
+          </w:p>
+        </w:tc>
+        <w:tc>
+          <w:tcPr>
+            <w:tcW w:w="350" w:type="dxa"/>
+            <w:vAlign w:val="center"/>
+          </w:tcPr>
+          <w:p>
+            <w:pPr>
+              <w:pStyle w:val="ListParagraph"/>
+              <w:numPr>
+                <w:ilvl w:val="0"/>
+                <w:numId w:val="18"/>
+              </w:numPr>
+              <w:tabs>
+                <w:tab w:val="left" w:pos="1692"/>
+                <w:tab w:val="center" w:pos="5256"/>
+              </w:tabs>
+              <w:bidi/>
+              <w:spacing w:after="0" w:line="240" w:lineRule="auto"/>
+              <w:ind w:right="162"/>
+              <w:jc w:val="center"/>
+              <w:rPr>
+                <w:rFonts w:asciiTheme="majorBidi" w:hAnsiTheme="majorBidi" w:cstheme="majorBidi"/>
+                <w:sz w:val="20"/>
+                <w:szCs w:val="20"/>
+                <w:rtl/>
+              </w:rPr>
+            </w:pPr>
+          </w:p>
+        </w:tc>
+      </w:tr>
+      <w:tr>
+        <w:trPr>
+          <w:trHeight w:val="278"/>
+        </w:trPr>
+        <w:tc>
+          <w:tcPr>
+            <w:tcW w:w="1890" w:type="dxa"/>
+            <w:vAlign w:val="center"/>
+          </w:tcPr>
+          <w:p>
+            <w:pPr>
+              <w:tabs>
+                <w:tab w:val="center" w:pos="5256"/>
+              </w:tabs>
+              <w:bidi/>
+              <w:spacing w:after="0" w:line="240" w:lineRule="auto"/>
+              <w:rPr>
+                <w:rFonts w:asciiTheme="majorBidi" w:hAnsiTheme="majorBidi" w:cstheme="majorBidi"/>
+                <w:sz w:val="20"/>
+                <w:szCs w:val="20"/>
+                <w:rtl/>
+              </w:rPr>
+            </w:pPr>
+          </w:p>
+        </w:tc>
+        <w:tc>
+          <w:tcPr>
+            <w:tcW w:w="2431" w:type="dxa"/>
+            <w:tcMar>
+              <w:top w:w="72" w:type="dxa"/>
+              <w:left w:w="144" w:type="dxa"/>
+              <w:bottom w:w="72" w:type="dxa"/>
+              <w:right w:w="144" w:type="dxa"/>
+            </w:tcMar>
+            <w:vAlign w:val="center"/>
+          </w:tcPr>
+          <w:p>
+            <w:pPr>
+              <w:tabs>
+                <w:tab w:val="center" w:pos="5256"/>
+              </w:tabs>
+              <w:bidi/>
+              <w:spacing w:after="0" w:line="240" w:lineRule="auto"/>
+              <w:rPr>
+                <w:rFonts w:asciiTheme="majorBidi" w:hAnsiTheme="majorBidi" w:cstheme="majorBidi"/>
+                <w:sz w:val="20"/>
+                <w:szCs w:val="20"/>
+                <w:rtl/>
+                <w:lang w:bidi="ar-JO"/>
+              </w:rPr>
+            </w:pPr>
+          </w:p>
+        </w:tc>
+        <w:tc>
+          <w:tcPr>
+            <w:tcW w:w="1709" w:type="dxa"/>
+            <w:vAlign w:val="center"/>
+          </w:tcPr>
+          <w:p>
+            <w:pPr>
+              <w:tabs>
+                <w:tab w:val="left" w:pos="1692"/>
+                <w:tab w:val="center" w:pos="5256"/>
+              </w:tabs>
+              <w:bidi/>
+              <w:spacing w:after="0" w:line="240" w:lineRule="auto"/>
+              <w:ind w:right="162"/>
+              <w:rPr>
+                <w:rFonts w:asciiTheme="majorBidi" w:hAnsiTheme="majorBidi" w:cstheme="majorBidi"/>
+                <w:sz w:val="20"/>
+                <w:szCs w:val="20"/>
+                <w:rtl/>
+              </w:rPr>
+            </w:pPr>
+          </w:p>
+        </w:tc>
+        <w:tc>
+          <w:tcPr>
+            <w:tcW w:w="3785" w:type="dxa"/>
+            <w:vAlign w:val="center"/>
+          </w:tcPr>
+          <w:p>
+            <w:pPr>
+              <w:tabs>
+                <w:tab w:val="left" w:pos="1692"/>
+                <w:tab w:val="center" w:pos="5256"/>
+              </w:tabs>
+              <w:bidi/>
+              <w:spacing w:after="0" w:line="240" w:lineRule="auto"/>
+              <w:ind w:right="162"/>
+              <w:rPr>
+                <w:rFonts w:asciiTheme="majorBidi" w:hAnsiTheme="majorBidi" w:cstheme="majorBidi"/>
+                <w:sz w:val="20"/>
+                <w:szCs w:val="20"/>
+                <w:rtl/>
+              </w:rPr>
+            </w:pPr>
+            <w:r>
+              <w:rPr>
+                <w:rFonts w:asciiTheme="majorBidi" w:hAnsiTheme="majorBidi" w:cs="Times New Roman"/>
+                <w:sz w:val="20"/>
+                <w:szCs w:val="20"/>
+                <w:rtl/>
+              </w:rPr>
+              <w:t xml:space="preserve"/>
+            </w:r>
+          </w:p>
+        </w:tc>
+        <w:tc>
+          <w:tcPr>
+            <w:tcW w:w="350" w:type="dxa"/>
+            <w:vAlign w:val="center"/>
+          </w:tcPr>
+          <w:p>
+            <w:pPr>
+              <w:pStyle w:val="ListParagraph"/>
+              <w:numPr>
+                <w:ilvl w:val="0"/>
+                <w:numId w:val="18"/>
+              </w:numPr>
+              <w:tabs>
+                <w:tab w:val="left" w:pos="1692"/>
+                <w:tab w:val="center" w:pos="5256"/>
+              </w:tabs>
+              <w:bidi/>
+              <w:spacing w:after="0" w:line="240" w:lineRule="auto"/>
+              <w:ind w:right="162"/>
+              <w:jc w:val="center"/>
+              <w:rPr>
+                <w:rFonts w:asciiTheme="majorBidi" w:hAnsiTheme="majorBidi" w:cstheme="majorBidi"/>
+                <w:sz w:val="20"/>
+                <w:szCs w:val="20"/>
+                <w:rtl/>
+              </w:rPr>
+            </w:pPr>
+          </w:p>
+        </w:tc>
+      </w:tr>
+      <w:tr>
+        <w:trPr>
+          <w:trHeight w:val="278"/>
+        </w:trPr>
+        <w:tc>
+          <w:tcPr>
+            <w:tcW w:w="1890" w:type="dxa"/>
+            <w:vAlign w:val="center"/>
+          </w:tcPr>
+          <w:p>
+            <w:pPr>
+              <w:tabs>
+                <w:tab w:val="center" w:pos="5256"/>
+              </w:tabs>
+              <w:bidi/>
+              <w:spacing w:after="0" w:line="240" w:lineRule="auto"/>
+              <w:rPr>
+                <w:rFonts w:asciiTheme="majorBidi" w:hAnsiTheme="majorBidi" w:cstheme="majorBidi"/>
+                <w:sz w:val="20"/>
+                <w:szCs w:val="20"/>
+                <w:rtl/>
+              </w:rPr>
+            </w:pPr>
+          </w:p>
+        </w:tc>
+        <w:tc>
+          <w:tcPr>
+            <w:tcW w:w="2431" w:type="dxa"/>
+            <w:tcMar>
+              <w:top w:w="72" w:type="dxa"/>
+              <w:left w:w="144" w:type="dxa"/>
+              <w:bottom w:w="72" w:type="dxa"/>
+              <w:right w:w="144" w:type="dxa"/>
+            </w:tcMar>
+            <w:vAlign w:val="center"/>
+          </w:tcPr>
+          <w:p>
+            <w:pPr>
+              <w:tabs>
+                <w:tab w:val="center" w:pos="5256"/>
+              </w:tabs>
+              <w:bidi/>
+              <w:spacing w:after="0" w:line="240" w:lineRule="auto"/>
+              <w:rPr>
+                <w:rFonts w:asciiTheme="majorBidi" w:hAnsiTheme="majorBidi" w:cstheme="majorBidi"/>
+                <w:sz w:val="20"/>
+                <w:szCs w:val="20"/>
+                <w:rtl/>
+                <w:lang w:bidi="ar-JO"/>
+              </w:rPr>
+            </w:pPr>
+            <w:r>
+              <w:rPr>
+                <w:rFonts w:asciiTheme="majorBidi" w:hAnsiTheme="majorBidi" w:cs="Times New Roman"/>
+                <w:sz w:val="20"/>
+                <w:szCs w:val="20"/>
+                <w:rtl/>
+                <w:lang w:bidi="ar-JO"/>
+              </w:rPr>
+              <w:t xml:space="preserve"/>
+            </w:r>
+          </w:p>
+        </w:tc>
+        <w:tc>
+          <w:tcPr>
+            <w:tcW w:w="1709" w:type="dxa"/>
+            <w:vAlign w:val="center"/>
+          </w:tcPr>
+          <w:p>
+            <w:pPr>
+              <w:tabs>
+                <w:tab w:val="left" w:pos="1692"/>
+                <w:tab w:val="center" w:pos="5256"/>
+              </w:tabs>
+              <w:bidi/>
+              <w:spacing w:after="0" w:line="240" w:lineRule="auto"/>
+              <w:ind w:right="162"/>
+              <w:rPr>
+                <w:rFonts w:asciiTheme="majorBidi" w:hAnsiTheme="majorBidi" w:cstheme="majorBidi"/>
+                <w:sz w:val="20"/>
+                <w:szCs w:val="20"/>
+                <w:rtl/>
+              </w:rPr>
+            </w:pPr>
+            <w:r>
+              <w:rPr>
+                <w:rFonts w:asciiTheme="majorBidi" w:hAnsiTheme="majorBidi" w:cs="Times New Roman"/>
+                <w:sz w:val="20"/>
+                <w:szCs w:val="20"/>
+                <w:rtl/>
+              </w:rPr>
+              <w:t xml:space="preserve"/>
+            </w:r>
+          </w:p>
+        </w:tc>
+        <w:tc>
+          <w:tcPr>
+            <w:tcW w:w="3785" w:type="dxa"/>
+            <w:vAlign w:val="center"/>
+          </w:tcPr>
+          <w:p>
+            <w:pPr>
+              <w:tabs>
+                <w:tab w:val="left" w:pos="1692"/>
+                <w:tab w:val="center" w:pos="5256"/>
+              </w:tabs>
+              <w:bidi/>
+              <w:spacing w:after="0" w:line="240" w:lineRule="auto"/>
+              <w:ind w:right="162"/>
+              <w:rPr>
+                <w:rFonts w:asciiTheme="majorBidi" w:hAnsiTheme="majorBidi" w:cstheme="majorBidi" w:hint="cs"/>
+                <w:sz w:val="20"/>
+                <w:szCs w:val="20"/>
+                <w:rtl/>
+              </w:rPr>
+            </w:pPr>
+            <w:r>
+              <w:rPr>
+                <w:rFonts w:asciiTheme="majorBidi" w:hAnsiTheme="majorBidi" w:cs="Times New Roman"/>
+                <w:sz w:val="20"/>
+                <w:szCs w:val="20"/>
+                <w:rtl/>
+              </w:rPr>
+              <w:t xml:space="preserve">Confirm campaign launch date once budget is cleared</w:t>
+            </w:r>
+          </w:p>
+        </w:tc>
+        <w:tc>
+          <w:tcPr>
+            <w:tcW w:w="350" w:type="dxa"/>
+            <w:vAlign w:val="center"/>
+          </w:tcPr>
+          <w:p>
+            <w:pPr>
+              <w:pStyle w:val="ListParagraph"/>
+              <w:numPr>
+                <w:ilvl w:val="0"/>
+                <w:numId w:val="18"/>
+              </w:numPr>
+              <w:tabs>
+                <w:tab w:val="left" w:pos="1692"/>
+                <w:tab w:val="center" w:pos="5256"/>
+              </w:tabs>
+              <w:bidi/>
+              <w:spacing w:after="0" w:line="240" w:lineRule="auto"/>
+              <w:ind w:right="162"/>
+              <w:jc w:val="center"/>
+              <w:rPr>
+                <w:rFonts w:asciiTheme="majorBidi" w:hAnsiTheme="majorBidi" w:cstheme="majorBidi"/>
+                <w:sz w:val="20"/>
+                <w:szCs w:val="20"/>
+                <w:rtl/>
+              </w:rPr>
+            </w:pPr>
+          </w:p>
+        </w:tc>
+      </w:tr>
+      <w:tr>
+        <w:trPr>
+          <w:trHeight w:val="278"/>
+        </w:trPr>
+        <w:tc>
+          <w:tcPr>
+            <w:tcW w:w="1890" w:type="dxa"/>
+            <w:vAlign w:val="center"/>
+          </w:tcPr>
+          <w:p>
+            <w:pPr>
+              <w:tabs>
+                <w:tab w:val="center" w:pos="5256"/>
+              </w:tabs>
+              <w:bidi/>
+              <w:spacing w:after="0" w:line="240" w:lineRule="auto"/>
+              <w:rPr>
+                <w:rFonts w:asciiTheme="majorBidi" w:hAnsiTheme="majorBidi" w:cstheme="majorBidi"/>
+                <w:sz w:val="20"/>
+                <w:szCs w:val="20"/>
+                <w:rtl/>
+              </w:rPr>
+            </w:pPr>
+          </w:p>
+        </w:tc>
+        <w:tc>
+          <w:tcPr>
+            <w:tcW w:w="2431" w:type="dxa"/>
+            <w:tcMar>
+              <w:top w:w="72" w:type="dxa"/>
+              <w:left w:w="144" w:type="dxa"/>
+              <w:bottom w:w="72" w:type="dxa"/>
+              <w:right w:w="144" w:type="dxa"/>
+            </w:tcMar>
+            <w:vAlign w:val="center"/>
+          </w:tcPr>
+          <w:p>
+            <w:pPr>
+              <w:tabs>
+                <w:tab w:val="center" w:pos="5256"/>
+              </w:tabs>
+              <w:bidi/>
+              <w:spacing w:after="0" w:line="240" w:lineRule="auto"/>
+              <w:rPr>
+                <w:rFonts w:asciiTheme="majorBidi" w:hAnsiTheme="majorBidi" w:cstheme="majorBidi"/>
+                <w:sz w:val="20"/>
+                <w:szCs w:val="20"/>
+                <w:rtl/>
+                <w:lang w:bidi="ar-JO"/>
+              </w:rPr>
+            </w:pPr>
+          </w:p>
+        </w:tc>
+        <w:tc>
+          <w:tcPr>
+            <w:tcW w:w="1709" w:type="dxa"/>
+            <w:vAlign w:val="center"/>
+          </w:tcPr>
+          <w:p>
+            <w:pPr>
+              <w:tabs>
+                <w:tab w:val="left" w:pos="1692"/>
+                <w:tab w:val="center" w:pos="5256"/>
+              </w:tabs>
+              <w:bidi/>
+              <w:spacing w:after="0" w:line="240" w:lineRule="auto"/>
+              <w:ind w:right="162"/>
+              <w:rPr>
+                <w:rFonts w:asciiTheme="majorBidi" w:hAnsiTheme="majorBidi" w:cstheme="majorBidi"/>
+                <w:sz w:val="20"/>
+                <w:szCs w:val="20"/>
+                <w:rtl/>
+              </w:rPr>
+            </w:pPr>
+          </w:p>
+        </w:tc>
+        <w:tc>
+          <w:tcPr>
+            <w:tcW w:w="3785" w:type="dxa"/>
+            <w:vAlign w:val="center"/>
+          </w:tcPr>
+          <w:p>
+            <w:pPr>
+              <w:tabs>
+                <w:tab w:val="left" w:pos="1692"/>
+                <w:tab w:val="center" w:pos="5256"/>
+              </w:tabs>
+              <w:bidi/>
+              <w:spacing w:after="0" w:line="240" w:lineRule="auto"/>
+              <w:ind w:right="162"/>
+              <w:rPr>
+                <w:rFonts w:asciiTheme="majorBidi" w:hAnsiTheme="majorBidi" w:cstheme="majorBidi"/>
+                <w:sz w:val="20"/>
+                <w:szCs w:val="20"/>
+                <w:rtl/>
+              </w:rPr>
+            </w:pPr>
+            <w:r>
+              <w:rPr>
+                <w:rFonts w:asciiTheme="majorBidi" w:hAnsiTheme="majorBidi" w:cs="Times New Roman"/>
+                <w:sz w:val="20"/>
+                <w:szCs w:val="20"/>
+                <w:rtl/>
+              </w:rPr>
+              <w:t xml:space="preserve"/>
+            </w:r>
+          </w:p>
+        </w:tc>
+        <w:tc>
+          <w:tcPr>
+            <w:tcW w:w="350" w:type="dxa"/>
+            <w:vAlign w:val="center"/>
+          </w:tcPr>
+          <w:p>
+            <w:pPr>
+              <w:pStyle w:val="ListParagraph"/>
+              <w:numPr>
+                <w:ilvl w:val="0"/>
+                <w:numId w:val="18"/>
+              </w:numPr>
+              <w:tabs>
+                <w:tab w:val="left" w:pos="1692"/>
+                <w:tab w:val="center" w:pos="5256"/>
+              </w:tabs>
+              <w:bidi/>
+              <w:spacing w:after="0" w:line="240" w:lineRule="auto"/>
+              <w:ind w:right="162"/>
+              <w:jc w:val="center"/>
+              <w:rPr>
+                <w:rFonts w:asciiTheme="majorBidi" w:hAnsiTheme="majorBidi" w:cstheme="majorBidi"/>
+                <w:sz w:val="20"/>
+                <w:szCs w:val="20"/>
+                <w:rtl/>
+              </w:rPr>
+            </w:pPr>
+          </w:p>
+        </w:tc>
+      </w:tr>
+      <w:tr>
+        <w:trPr>
+          <w:trHeight w:val="278"/>
+        </w:trPr>
+        <w:tc>
+          <w:tcPr>
+            <w:tcW w:w="1890" w:type="dxa"/>
+            <w:vAlign w:val="center"/>
+          </w:tcPr>
+          <w:p>
+            <w:pPr>
+              <w:tabs>
+                <w:tab w:val="center" w:pos="5256"/>
+              </w:tabs>
+              <w:bidi/>
+              <w:spacing w:after="0" w:line="240" w:lineRule="auto"/>
+              <w:rPr>
+                <w:rFonts w:asciiTheme="majorBidi" w:hAnsiTheme="majorBidi" w:cstheme="majorBidi"/>
+                <w:sz w:val="20"/>
+                <w:szCs w:val="20"/>
+                <w:rtl/>
+              </w:rPr>
+            </w:pPr>
+          </w:p>
+        </w:tc>
+        <w:tc>
+          <w:tcPr>
+            <w:tcW w:w="2431" w:type="dxa"/>
+            <w:tcMar>
+              <w:top w:w="72" w:type="dxa"/>
+              <w:left w:w="144" w:type="dxa"/>
+              <w:bottom w:w="72" w:type="dxa"/>
+              <w:right w:w="144" w:type="dxa"/>
+            </w:tcMar>
+            <w:vAlign w:val="center"/>
+          </w:tcPr>
+          <w:p>
+            <w:pPr>
+              <w:tabs>
+                <w:tab w:val="center" w:pos="5256"/>
+              </w:tabs>
+              <w:bidi/>
+              <w:spacing w:after="0" w:line="240" w:lineRule="auto"/>
+              <w:rPr>
+                <w:rFonts w:asciiTheme="majorBidi" w:hAnsiTheme="majorBidi" w:cstheme="majorBidi"/>
+                <w:sz w:val="20"/>
+                <w:szCs w:val="20"/>
+                <w:rtl/>
+                <w:lang w:bidi="ar-JO"/>
+              </w:rPr>
+            </w:pPr>
+          </w:p>
+        </w:tc>
+        <w:tc>
+          <w:tcPr>
+            <w:tcW w:w="1709" w:type="dxa"/>
+            <w:vAlign w:val="center"/>
+          </w:tcPr>
+          <w:p>
+            <w:pPr>
+              <w:tabs>
+                <w:tab w:val="left" w:pos="1692"/>
+                <w:tab w:val="center" w:pos="5256"/>
+              </w:tabs>
+              <w:bidi/>
+              <w:spacing w:after="0" w:line="240" w:lineRule="auto"/>
+              <w:ind w:right="162"/>
+              <w:rPr>
+                <w:rFonts w:asciiTheme="majorBidi" w:hAnsiTheme="majorBidi" w:cstheme="majorBidi"/>
+                <w:sz w:val="20"/>
+                <w:szCs w:val="20"/>
+                <w:rtl/>
+              </w:rPr>
+            </w:pPr>
+          </w:p>
+        </w:tc>
+        <w:tc>
+          <w:tcPr>
+            <w:tcW w:w="3785" w:type="dxa"/>
+            <w:vAlign w:val="center"/>
+          </w:tcPr>
+          <w:p>
+            <w:pPr>
+              <w:tabs>
+                <w:tab w:val="left" w:pos="1692"/>
+                <w:tab w:val="center" w:pos="5256"/>
+              </w:tabs>
+              <w:bidi/>
+              <w:spacing w:after="0" w:line="240" w:lineRule="auto"/>
+              <w:ind w:right="162"/>
+              <w:rPr>
+                <w:rFonts w:asciiTheme="majorBidi" w:hAnsiTheme="majorBidi" w:cstheme="majorBidi"/>
+                <w:sz w:val="20"/>
+                <w:szCs w:val="20"/>
+                <w:rtl/>
+              </w:rPr>
+            </w:pPr>
+          </w:p>
+        </w:tc>
+        <w:tc>
+          <w:tcPr>
+            <w:tcW w:w="350" w:type="dxa"/>
+            <w:vAlign w:val="center"/>
+          </w:tcPr>
+          <w:p>
+            <w:pPr>
+              <w:pStyle w:val="ListParagraph"/>
+              <w:numPr>
+                <w:ilvl w:val="0"/>
+                <w:numId w:val="18"/>
+              </w:numPr>
+              <w:tabs>
+                <w:tab w:val="left" w:pos="1692"/>
+                <w:tab w:val="center" w:pos="5256"/>
+              </w:tabs>
+              <w:bidi/>
+              <w:spacing w:after="0" w:line="240" w:lineRule="auto"/>
+              <w:ind w:right="162"/>
+              <w:jc w:val="center"/>
+              <w:rPr>
+                <w:rFonts w:asciiTheme="majorBidi" w:hAnsiTheme="majorBidi" w:cstheme="majorBidi"/>
+                <w:sz w:val="20"/>
+                <w:szCs w:val="20"/>
+                <w:rtl/>
+              </w:rPr>
+            </w:pPr>
+          </w:p>
+        </w:tc>
+      </w:tr>
+      <w:tr>
+        <w:trPr>
+          <w:trHeight w:val="278"/>
+        </w:trPr>
+        <w:tc>
+          <w:tcPr>
+            <w:tcW w:w="1890" w:type="dxa"/>
+            <w:vAlign w:val="center"/>
+          </w:tcPr>
+          <w:p>
+            <w:pPr>
+              <w:tabs>
+                <w:tab w:val="center" w:pos="5256"/>
+              </w:tabs>
+              <w:bidi/>
+              <w:spacing w:after="0" w:line="240" w:lineRule="auto"/>
+              <w:rPr>
+                <w:rFonts w:asciiTheme="majorBidi" w:hAnsiTheme="majorBidi" w:cstheme="majorBidi"/>
+                <w:sz w:val="20"/>
+                <w:szCs w:val="20"/>
+                <w:rtl/>
+              </w:rPr>
+            </w:pPr>
+          </w:p>
+        </w:tc>
+        <w:tc>
+          <w:tcPr>
+            <w:tcW w:w="2431" w:type="dxa"/>
+            <w:tcMar>
+              <w:top w:w="72" w:type="dxa"/>
+              <w:left w:w="144" w:type="dxa"/>
+              <w:bottom w:w="72" w:type="dxa"/>
+              <w:right w:w="144" w:type="dxa"/>
+            </w:tcMar>
+            <w:vAlign w:val="center"/>
+          </w:tcPr>
+          <w:p>
+            <w:pPr>
+              <w:tabs>
+                <w:tab w:val="center" w:pos="5256"/>
+              </w:tabs>
+              <w:bidi/>
+              <w:spacing w:after="0" w:line="240" w:lineRule="auto"/>
+              <w:rPr>
+                <w:rFonts w:asciiTheme="majorBidi" w:hAnsiTheme="majorBidi" w:cstheme="majorBidi"/>
+                <w:sz w:val="20"/>
+                <w:szCs w:val="20"/>
+                <w:rtl/>
+                <w:lang w:bidi="ar-JO"/>
+              </w:rPr>
+            </w:pPr>
+          </w:p>
+        </w:tc>
+        <w:tc>
+          <w:tcPr>
+            <w:tcW w:w="1709" w:type="dxa"/>
+            <w:vAlign w:val="center"/>
+          </w:tcPr>
+          <w:p>
+            <w:pPr>
+              <w:tabs>
+                <w:tab w:val="left" w:pos="1692"/>
+                <w:tab w:val="center" w:pos="5256"/>
+              </w:tabs>
+              <w:bidi/>
+              <w:spacing w:after="0" w:line="240" w:lineRule="auto"/>
+              <w:ind w:right="162"/>
+              <w:rPr>
+                <w:rFonts w:asciiTheme="majorBidi" w:hAnsiTheme="majorBidi" w:cstheme="majorBidi"/>
+                <w:sz w:val="20"/>
+                <w:szCs w:val="20"/>
+                <w:rtl/>
+              </w:rPr>
+            </w:pPr>
+          </w:p>
+        </w:tc>
+        <w:tc>
+          <w:tcPr>
+            <w:tcW w:w="3785" w:type="dxa"/>
+            <w:vAlign w:val="center"/>
+          </w:tcPr>
+          <w:p>
+            <w:pPr>
+              <w:tabs>
+                <w:tab w:val="left" w:pos="1692"/>
+                <w:tab w:val="center" w:pos="5256"/>
+              </w:tabs>
+              <w:bidi/>
+              <w:spacing w:after="0" w:line="240" w:lineRule="auto"/>
+              <w:ind w:right="162"/>
+              <w:rPr>
+                <w:rFonts w:asciiTheme="majorBidi" w:hAnsiTheme="majorBidi" w:cstheme="majorBidi"/>
+                <w:sz w:val="20"/>
+                <w:szCs w:val="20"/>
+                <w:rtl/>
+              </w:rPr>
+            </w:pPr>
           </w:p>
         </w:tc>
         <w:tc>
@@ -2615,6 +4332,7 @@
           <w:docPartUnique/>
         </w:docPartObj>
       </w:sdtPr>
+      <w:sdtEndPr/>
       <w:sdtContent>
         <w:sdt>
           <w:sdtPr>
@@ -2631,6 +4349,7 @@
               <w:docPartUnique/>
             </w:docPartObj>
           </w:sdtPr>
+          <w:sdtEndPr/>
           <w:sdtContent>
             <w:r>
               <w:rPr>
@@ -2640,17 +4359,7 @@
                 <w:szCs w:val="20"/>
                 <w:rtl/>
               </w:rPr>
-              <w:t xml:space="preserve">  </w:t>
-            </w:r>
-            <w:r>
-              <w:rPr>
-                <w:rFonts w:asciiTheme="majorBidi" w:hAnsiTheme="majorBidi" w:cstheme="majorBidi"/>
-                <w:color w:val="A79F88"/>
-                <w:sz w:val="20"/>
-                <w:szCs w:val="20"/>
-                <w:rtl/>
-              </w:rPr>
-              <w:t>صفحة</w:t>
+              <w:t xml:space="preserve">  صفحة</w:t>
             </w:r>
             <w:r>
               <w:rPr>

</xml_diff>

<commit_message>
redesign main upload page layout
- mic button moved to left of textarea as a tall square-rounded card
- mic circle replaced with rounded square, styled in brand colors
- template section moved into panel footer with document icon
- page content vertically centered in viewport
- template button slightly enlarged

Co-Authored-By: Claude Sonnet 4.6 <noreply@anthropic.com>
</commit_message>
<xml_diff>
--- a/backend/temp_output.docx
+++ b/backend/temp_output.docx
@@ -114,18 +114,7 @@
                 <w:sz w:val="20"/>
                 <w:szCs w:val="20"/>
               </w:rPr>
-              <w:t xml:space="preserve">Marketing Kickoff – Ramadan Campaign</w:t>
-            </w:r>
-            <w:r>
-              <w:rPr>
-                <w:rFonts w:asciiTheme="majorBidi" w:hAnsiTheme="majorBidi" w:cstheme="majorBidi" w:hint="cs"/>
-                <w:b/>
-                <w:bCs/>
-                <w:sz w:val="20"/>
-                <w:szCs w:val="20"/>
-                <w:rtl/>
-              </w:rPr>
-              <w:t xml:space="preserve"> </w:t>
+              <w:t xml:space="preserve">Marketing Kickoff for the Ramadan Campaign</w:t>
             </w:r>
           </w:p>
         </w:tc>
@@ -341,7 +330,7 @@
                 <w:szCs w:val="20"/>
                 <w:rtl/>
               </w:rPr>
-              <w:t xml:space="preserve">التاريخ</w:t>
+              <w:t>التاريخ</w:t>
             </w:r>
           </w:p>
         </w:tc>
@@ -373,36 +362,14 @@
             </w:pPr>
             <w:r>
               <w:rPr>
-                <w:rFonts w:asciiTheme="majorBidi" w:hAnsiTheme="majorBidi" w:cs="Times New Roman"/>
-                <w:b/>
-                <w:bCs/>
-                <w:sz w:val="20"/>
-                <w:szCs w:val="20"/>
-                <w:rtl/>
-              </w:rPr>
-              <w:t xml:space="preserve">6/1/1448 هـ</w:t>
-            </w:r>
-            <w:r>
-              <w:rPr>
-                <w:rFonts w:asciiTheme="majorBidi" w:hAnsiTheme="majorBidi" w:cstheme="majorBidi" w:hint="cs"/>
-                <w:b/>
-                <w:bCs/>
-                <w:sz w:val="20"/>
-                <w:szCs w:val="20"/>
-                <w:rtl/>
-              </w:rPr>
-              <w:t xml:space="preserve"> </w:t>
-            </w:r>
-            <w:r>
-              <w:rPr>
-                <w:rFonts w:asciiTheme="majorBidi" w:hAnsiTheme="majorBidi" w:cstheme="majorBidi"/>
-                <w:b/>
-                <w:bCs/>
-                <w:sz w:val="20"/>
-                <w:szCs w:val="20"/>
-                <w:rtl/>
-              </w:rPr>
-              <w:t xml:space="preserve">الموافق </w:t>
+                <w:rFonts w:asciiTheme="majorBidi" w:hAnsiTheme="majorBidi" w:cstheme="majorBidi"/>
+                <w:b/>
+                <w:bCs/>
+                <w:sz w:val="20"/>
+                <w:szCs w:val="20"/>
+                <w:rtl/>
+              </w:rPr>
+              <w:t xml:space="preserve">١٣/١١/١٤٤٧هـ الموافق </w:t>
             </w:r>
             <w:r>
               <w:rPr>
@@ -413,17 +380,6 @@
                 <w:szCs w:val="20"/>
               </w:rPr>
               <w:t xml:space="preserve">2026-06-21</w:t>
-            </w:r>
-            <w:r>
-              <w:rPr>
-                <w:rFonts w:asciiTheme="majorBidi" w:hAnsiTheme="majorBidi" w:cstheme="majorBidi"/>
-                <w:b/>
-                <w:bCs/>
-                <w:sz w:val="20"/>
-                <w:szCs w:val="20"/>
-                <w:rtl/>
-              </w:rPr>
-              <w:t>م</w:t>
             </w:r>
           </w:p>
         </w:tc>
@@ -576,7 +532,7 @@
                 <w:szCs w:val="20"/>
                 <w:rtl/>
               </w:rPr>
-              <w:t>1</w:t>
+              <w:t>2</w:t>
             </w:r>
             <w:r>
               <w:rPr>
@@ -620,29 +576,7 @@
                 <w:szCs w:val="20"/>
                 <w:rtl/>
               </w:rPr>
-              <w:t xml:space="preserve"> </w:t>
-            </w:r>
-            <w:r>
-              <w:rPr>
-                <w:rFonts w:asciiTheme="majorBidi" w:hAnsiTheme="majorBidi" w:cstheme="majorBidi" w:hint="cs"/>
-                <w:b/>
-                <w:bCs/>
-                <w:sz w:val="20"/>
-                <w:szCs w:val="20"/>
-                <w:rtl/>
-              </w:rPr>
-              <w:t>2</w:t>
-            </w:r>
-            <w:r>
-              <w:rPr>
-                <w:rFonts w:asciiTheme="majorBidi" w:hAnsiTheme="majorBidi" w:cstheme="majorBidi" w:hint="cs"/>
-                <w:b/>
-                <w:bCs/>
-                <w:sz w:val="20"/>
-                <w:szCs w:val="20"/>
-                <w:rtl/>
-              </w:rPr>
-              <w:t>:00 مساءً</w:t>
+              <w:t xml:space="preserve"> 3:00 مساءً</w:t>
             </w:r>
           </w:p>
         </w:tc>
@@ -793,39 +727,7 @@
                 <w:szCs w:val="20"/>
                 <w:rtl/>
               </w:rPr>
-              <w:t>ساعة</w:t>
-            </w:r>
-            <w:r>
-              <w:rPr>
-                <w:rFonts w:asciiTheme="majorBidi" w:hAnsiTheme="majorBidi" w:cstheme="majorBidi" w:hint="cs"/>
-                <w:b/>
-                <w:bCs/>
-                <w:sz w:val="20"/>
-                <w:szCs w:val="20"/>
-                <w:rtl/>
-              </w:rPr>
-              <w:t xml:space="preserve"> من</w:t>
-            </w:r>
-            <w:r>
-              <w:rPr>
-                <w:rFonts w:asciiTheme="majorBidi" w:hAnsiTheme="majorBidi" w:cstheme="majorBidi" w:hint="cs"/>
-                <w:b/>
-                <w:bCs/>
-                <w:sz w:val="20"/>
-                <w:szCs w:val="20"/>
-                <w:rtl/>
-              </w:rPr>
-              <w:t xml:space="preserve"> </w:t>
-            </w:r>
-            <w:r>
-              <w:rPr>
-                <w:rFonts w:asciiTheme="majorBidi" w:hAnsiTheme="majorBidi" w:cstheme="majorBidi"/>
-                <w:b/>
-                <w:bCs/>
-                <w:sz w:val="20"/>
-                <w:szCs w:val="20"/>
-              </w:rPr>
-              <w:t>14:00 – 13:00</w:t>
+              <w:t xml:space="preserve">ساعة </w:t>
             </w:r>
           </w:p>
         </w:tc>
@@ -973,7 +875,6 @@
                 <w:bCs/>
                 <w:sz w:val="20"/>
                 <w:szCs w:val="20"/>
-                <w:rtl/>
               </w:rPr>
             </w:pPr>
             <w:r>
@@ -1200,7 +1101,6 @@
               <w:bottom w:w="72" w:type="dxa"/>
               <w:right w:w="144" w:type="dxa"/>
             </w:tcMar>
-            <w:vAlign w:val="center"/>
           </w:tcPr>
           <w:p>
             <w:pPr>
@@ -1211,31 +1111,41 @@
               <w:bidi/>
               <w:spacing w:after="0" w:line="240" w:lineRule="auto"/>
               <w:ind w:right="162"/>
-              <w:jc w:val="both"/>
-              <w:rPr>
-                <w:rFonts w:asciiTheme="majorBidi" w:hAnsiTheme="majorBidi" w:cstheme="majorBidi"/>
-                <w:sz w:val="20"/>
-                <w:szCs w:val="20"/>
-              </w:rPr>
-            </w:pPr>
+              <w:rPr>
+                <w:rFonts w:asciiTheme="majorBidi" w:hAnsiTheme="majorBidi" w:cstheme="majorBidi"/>
+                <w:sz w:val="20"/>
+                <w:szCs w:val="20"/>
+                <w:rtl/>
+              </w:rPr>
+            </w:pPr>
+            <w:r>
+              <w:rPr>
+                <w:rFonts w:asciiTheme="majorBidi" w:hAnsiTheme="majorBidi" w:cs="Times New Roman"/>
+                <w:sz w:val="20"/>
+                <w:szCs w:val="20"/>
+                <w:rtl/>
+              </w:rPr>
+              <w:t xml:space="preserve"/>
+            </w:r>
           </w:p>
         </w:tc>
         <w:tc>
           <w:tcPr>
             <w:tcW w:w="4973" w:type="dxa"/>
-            <w:vAlign w:val="center"/>
           </w:tcPr>
           <w:p>
             <w:pPr>
               <w:tabs>
                 <w:tab w:val="left" w:pos="1692"/>
+                <w:tab w:val="center" w:pos="5256"/>
               </w:tabs>
               <w:bidi/>
               <w:spacing w:after="0" w:line="240" w:lineRule="auto"/>
               <w:ind w:right="162"/>
-              <w:jc w:val="both"/>
-              <w:rPr>
-                <w:rFonts w:asciiTheme="majorBidi" w:hAnsiTheme="majorBidi" w:cstheme="majorBidi"/>
+              <w:rPr>
+                <w:rFonts w:asciiTheme="majorBidi" w:hAnsiTheme="majorBidi" w:cstheme="majorBidi"/>
+                <w:b/>
+                <w:bCs/>
                 <w:sz w:val="20"/>
                 <w:szCs w:val="20"/>
                 <w:rtl/>
@@ -1244,11 +1154,13 @@
             <w:r>
               <w:rPr>
                 <w:rFonts w:asciiTheme="majorBidi" w:hAnsiTheme="majorBidi" w:cs="Times New Roman"/>
-                <w:sz w:val="20"/>
-                <w:szCs w:val="20"/>
-                <w:rtl/>
-              </w:rPr>
-              <w:t xml:space="preserve"/>
+                <w:b/>
+                <w:bCs/>
+                <w:sz w:val="20"/>
+                <w:szCs w:val="20"/>
+                <w:rtl/>
+              </w:rPr>
+              <w:t xml:space="preserve">Layla</w:t>
             </w:r>
           </w:p>
         </w:tc>
@@ -1266,7 +1178,6 @@
               <w:bottom w:w="72" w:type="dxa"/>
               <w:right w:w="144" w:type="dxa"/>
             </w:tcMar>
-            <w:vAlign w:val="center"/>
           </w:tcPr>
           <w:p>
             <w:pPr>
@@ -1277,7 +1188,6 @@
               <w:bidi/>
               <w:spacing w:after="0" w:line="240" w:lineRule="auto"/>
               <w:ind w:right="162"/>
-              <w:jc w:val="both"/>
               <w:rPr>
                 <w:rFonts w:asciiTheme="majorBidi" w:hAnsiTheme="majorBidi" w:cstheme="majorBidi"/>
                 <w:sz w:val="20"/>
@@ -1292,14 +1202,13 @@
                 <w:szCs w:val="20"/>
                 <w:rtl/>
               </w:rPr>
-              <w:t xml:space="preserve">Meeting Chair</w:t>
+              <w:t xml:space="preserve"/>
             </w:r>
           </w:p>
         </w:tc>
         <w:tc>
           <w:tcPr>
             <w:tcW w:w="4973" w:type="dxa"/>
-            <w:vAlign w:val="center"/>
           </w:tcPr>
           <w:p>
             <w:pPr>
@@ -1310,9 +1219,10 @@
               <w:bidi/>
               <w:spacing w:after="0" w:line="240" w:lineRule="auto"/>
               <w:ind w:right="162"/>
-              <w:jc w:val="both"/>
-              <w:rPr>
-                <w:rFonts w:asciiTheme="majorBidi" w:hAnsiTheme="majorBidi" w:cstheme="majorBidi"/>
+              <w:rPr>
+                <w:rFonts w:asciiTheme="majorBidi" w:hAnsiTheme="majorBidi" w:cstheme="majorBidi"/>
+                <w:b/>
+                <w:bCs/>
                 <w:sz w:val="20"/>
                 <w:szCs w:val="20"/>
                 <w:rtl/>
@@ -1321,11 +1231,13 @@
             <w:r>
               <w:rPr>
                 <w:rFonts w:asciiTheme="majorBidi" w:hAnsiTheme="majorBidi" w:cs="Times New Roman"/>
-                <w:sz w:val="20"/>
-                <w:szCs w:val="20"/>
-                <w:rtl/>
-              </w:rPr>
-              <w:t xml:space="preserve">Layla</w:t>
+                <w:b/>
+                <w:bCs/>
+                <w:sz w:val="20"/>
+                <w:szCs w:val="20"/>
+                <w:rtl/>
+              </w:rPr>
+              <w:t xml:space="preserve">Hajji Omar</w:t>
             </w:r>
           </w:p>
         </w:tc>
@@ -1343,7 +1255,6 @@
               <w:bottom w:w="72" w:type="dxa"/>
               <w:right w:w="144" w:type="dxa"/>
             </w:tcMar>
-            <w:vAlign w:val="center"/>
           </w:tcPr>
           <w:p>
             <w:pPr>
@@ -1354,20 +1265,27 @@
               <w:bidi/>
               <w:spacing w:after="0" w:line="240" w:lineRule="auto"/>
               <w:ind w:right="162"/>
-              <w:jc w:val="both"/>
-              <w:rPr>
-                <w:rFonts w:asciiTheme="majorBidi" w:hAnsiTheme="majorBidi" w:cstheme="majorBidi"/>
-                <w:sz w:val="20"/>
-                <w:szCs w:val="20"/>
-                <w:rtl/>
-              </w:rPr>
-            </w:pPr>
+              <w:rPr>
+                <w:rFonts w:asciiTheme="majorBidi" w:hAnsiTheme="majorBidi" w:cstheme="majorBidi"/>
+                <w:sz w:val="20"/>
+                <w:szCs w:val="20"/>
+                <w:rtl/>
+              </w:rPr>
+            </w:pPr>
+            <w:r>
+              <w:rPr>
+                <w:rFonts w:asciiTheme="majorBidi" w:hAnsiTheme="majorBidi" w:cs="Times New Roman"/>
+                <w:sz w:val="20"/>
+                <w:szCs w:val="20"/>
+                <w:rtl/>
+              </w:rPr>
+              <w:t xml:space="preserve">Chief Data Management Officer</w:t>
+            </w:r>
           </w:p>
         </w:tc>
         <w:tc>
           <w:tcPr>
             <w:tcW w:w="4973" w:type="dxa"/>
-            <w:vAlign w:val="center"/>
           </w:tcPr>
           <w:p>
             <w:pPr>
@@ -1378,9 +1296,10 @@
               <w:bidi/>
               <w:spacing w:after="0" w:line="240" w:lineRule="auto"/>
               <w:ind w:right="162"/>
-              <w:jc w:val="both"/>
-              <w:rPr>
-                <w:rFonts w:asciiTheme="majorBidi" w:hAnsiTheme="majorBidi" w:cstheme="majorBidi"/>
+              <w:rPr>
+                <w:rFonts w:asciiTheme="majorBidi" w:hAnsiTheme="majorBidi" w:cstheme="majorBidi"/>
+                <w:b/>
+                <w:bCs/>
                 <w:sz w:val="20"/>
                 <w:szCs w:val="20"/>
                 <w:rtl/>
@@ -1389,11 +1308,13 @@
             <w:r>
               <w:rPr>
                 <w:rFonts w:asciiTheme="majorBidi" w:hAnsiTheme="majorBidi" w:cs="Times New Roman"/>
-                <w:sz w:val="20"/>
-                <w:szCs w:val="20"/>
-                <w:rtl/>
-              </w:rPr>
-              <w:t xml:space="preserve"/>
+                <w:b/>
+                <w:bCs/>
+                <w:sz w:val="20"/>
+                <w:szCs w:val="20"/>
+                <w:rtl/>
+              </w:rPr>
+              <w:t xml:space="preserve">Adel AlHarbi</w:t>
             </w:r>
           </w:p>
         </w:tc>
@@ -1411,7 +1332,6 @@
               <w:bottom w:w="72" w:type="dxa"/>
               <w:right w:w="144" w:type="dxa"/>
             </w:tcMar>
-            <w:vAlign w:val="center"/>
           </w:tcPr>
           <w:p>
             <w:pPr>
@@ -1422,7 +1342,6 @@
               <w:bidi/>
               <w:spacing w:after="0" w:line="240" w:lineRule="auto"/>
               <w:ind w:right="162"/>
-              <w:jc w:val="both"/>
               <w:rPr>
                 <w:rFonts w:asciiTheme="majorBidi" w:hAnsiTheme="majorBidi" w:cstheme="majorBidi"/>
                 <w:sz w:val="20"/>
@@ -1444,7 +1363,6 @@
         <w:tc>
           <w:tcPr>
             <w:tcW w:w="4973" w:type="dxa"/>
-            <w:vAlign w:val="center"/>
           </w:tcPr>
           <w:p>
             <w:pPr>
@@ -1455,9 +1373,10 @@
               <w:bidi/>
               <w:spacing w:after="0" w:line="240" w:lineRule="auto"/>
               <w:ind w:right="162"/>
-              <w:jc w:val="both"/>
-              <w:rPr>
-                <w:rFonts w:asciiTheme="majorBidi" w:hAnsiTheme="majorBidi" w:cstheme="majorBidi"/>
+              <w:rPr>
+                <w:rFonts w:asciiTheme="majorBidi" w:hAnsiTheme="majorBidi" w:cstheme="majorBidi"/>
+                <w:b/>
+                <w:bCs/>
                 <w:sz w:val="20"/>
                 <w:szCs w:val="20"/>
                 <w:rtl/>
@@ -1466,11 +1385,13 @@
             <w:r>
               <w:rPr>
                 <w:rFonts w:asciiTheme="majorBidi" w:hAnsiTheme="majorBidi" w:cs="Times New Roman"/>
-                <w:sz w:val="20"/>
-                <w:szCs w:val="20"/>
-                <w:rtl/>
-              </w:rPr>
-              <w:t xml:space="preserve">Hajji Omar</w:t>
+                <w:b/>
+                <w:bCs/>
+                <w:sz w:val="20"/>
+                <w:szCs w:val="20"/>
+                <w:rtl/>
+              </w:rPr>
+              <w:t xml:space="preserve">Mira</w:t>
             </w:r>
           </w:p>
         </w:tc>
@@ -1488,7 +1409,6 @@
               <w:bottom w:w="72" w:type="dxa"/>
               <w:right w:w="144" w:type="dxa"/>
             </w:tcMar>
-            <w:vAlign w:val="center"/>
           </w:tcPr>
           <w:p>
             <w:pPr>
@@ -1499,7 +1419,6 @@
               <w:bidi/>
               <w:spacing w:after="0" w:line="240" w:lineRule="auto"/>
               <w:ind w:right="162"/>
-              <w:jc w:val="both"/>
               <w:rPr>
                 <w:rFonts w:asciiTheme="majorBidi" w:hAnsiTheme="majorBidi" w:cstheme="majorBidi"/>
                 <w:sz w:val="20"/>
@@ -1512,7 +1431,6 @@
         <w:tc>
           <w:tcPr>
             <w:tcW w:w="4973" w:type="dxa"/>
-            <w:vAlign w:val="center"/>
           </w:tcPr>
           <w:p>
             <w:pPr>
@@ -1523,23 +1441,15 @@
               <w:bidi/>
               <w:spacing w:after="0" w:line="240" w:lineRule="auto"/>
               <w:ind w:right="162"/>
-              <w:jc w:val="both"/>
-              <w:rPr>
-                <w:rFonts w:asciiTheme="majorBidi" w:hAnsiTheme="majorBidi" w:cstheme="majorBidi"/>
-                <w:sz w:val="20"/>
-                <w:szCs w:val="20"/>
-                <w:rtl/>
-              </w:rPr>
-            </w:pPr>
-            <w:r>
-              <w:rPr>
-                <w:rFonts w:asciiTheme="majorBidi" w:hAnsiTheme="majorBidi" w:cs="Times New Roman"/>
-                <w:sz w:val="20"/>
-                <w:szCs w:val="20"/>
-                <w:rtl/>
-              </w:rPr>
-              <w:t xml:space="preserve"/>
-            </w:r>
+              <w:rPr>
+                <w:rFonts w:asciiTheme="majorBidi" w:hAnsiTheme="majorBidi" w:cstheme="majorBidi"/>
+                <w:b/>
+                <w:bCs/>
+                <w:sz w:val="20"/>
+                <w:szCs w:val="20"/>
+                <w:rtl/>
+              </w:rPr>
+            </w:pPr>
           </w:p>
         </w:tc>
       </w:tr>
@@ -1556,7 +1466,6 @@
               <w:bottom w:w="72" w:type="dxa"/>
               <w:right w:w="144" w:type="dxa"/>
             </w:tcMar>
-            <w:vAlign w:val="center"/>
           </w:tcPr>
           <w:p>
             <w:pPr>
@@ -1567,29 +1476,18 @@
               <w:bidi/>
               <w:spacing w:after="0" w:line="240" w:lineRule="auto"/>
               <w:ind w:right="162"/>
-              <w:jc w:val="both"/>
-              <w:rPr>
-                <w:rFonts w:asciiTheme="majorBidi" w:hAnsiTheme="majorBidi" w:cstheme="majorBidi"/>
-                <w:sz w:val="20"/>
-                <w:szCs w:val="20"/>
-                <w:rtl/>
-              </w:rPr>
-            </w:pPr>
-            <w:r>
-              <w:rPr>
-                <w:rFonts w:asciiTheme="majorBidi" w:hAnsiTheme="majorBidi" w:cs="Times New Roman"/>
-                <w:sz w:val="20"/>
-                <w:szCs w:val="20"/>
-                <w:rtl/>
-              </w:rPr>
-              <w:t xml:space="preserve">Chief Data Management Officer</w:t>
-            </w:r>
+              <w:rPr>
+                <w:rFonts w:asciiTheme="majorBidi" w:hAnsiTheme="majorBidi" w:cstheme="majorBidi"/>
+                <w:sz w:val="20"/>
+                <w:szCs w:val="20"/>
+                <w:rtl/>
+              </w:rPr>
+            </w:pPr>
           </w:p>
         </w:tc>
         <w:tc>
           <w:tcPr>
             <w:tcW w:w="4973" w:type="dxa"/>
-            <w:vAlign w:val="center"/>
           </w:tcPr>
           <w:p>
             <w:pPr>
@@ -1600,23 +1498,13 @@
               <w:bidi/>
               <w:spacing w:after="0" w:line="240" w:lineRule="auto"/>
               <w:ind w:right="162"/>
-              <w:jc w:val="both"/>
-              <w:rPr>
-                <w:rFonts w:asciiTheme="majorBidi" w:hAnsiTheme="majorBidi" w:cstheme="majorBidi"/>
-                <w:sz w:val="20"/>
-                <w:szCs w:val="20"/>
-                <w:rtl/>
-              </w:rPr>
-            </w:pPr>
-            <w:r>
-              <w:rPr>
-                <w:rFonts w:asciiTheme="majorBidi" w:hAnsiTheme="majorBidi" w:cs="Times New Roman"/>
-                <w:sz w:val="20"/>
-                <w:szCs w:val="20"/>
-                <w:rtl/>
-              </w:rPr>
-              <w:t xml:space="preserve">Adel AlHarbi</w:t>
-            </w:r>
+              <w:rPr>
+                <w:rFonts w:asciiTheme="majorBidi" w:hAnsiTheme="majorBidi" w:cstheme="majorBidi"/>
+                <w:sz w:val="20"/>
+                <w:szCs w:val="20"/>
+                <w:rtl/>
+              </w:rPr>
+            </w:pPr>
           </w:p>
         </w:tc>
       </w:tr>
@@ -1633,7 +1521,6 @@
               <w:bottom w:w="72" w:type="dxa"/>
               <w:right w:w="144" w:type="dxa"/>
             </w:tcMar>
-            <w:vAlign w:val="center"/>
           </w:tcPr>
           <w:p>
             <w:pPr>
@@ -1644,7 +1531,6 @@
               <w:bidi/>
               <w:spacing w:after="0" w:line="240" w:lineRule="auto"/>
               <w:ind w:right="162"/>
-              <w:jc w:val="both"/>
               <w:rPr>
                 <w:rFonts w:asciiTheme="majorBidi" w:hAnsiTheme="majorBidi" w:cstheme="majorBidi"/>
                 <w:sz w:val="20"/>
@@ -1657,348 +1543,15 @@
         <w:tc>
           <w:tcPr>
             <w:tcW w:w="4973" w:type="dxa"/>
-            <w:vAlign w:val="center"/>
           </w:tcPr>
           <w:p>
             <w:pPr>
               <w:tabs>
                 <w:tab w:val="left" w:pos="1692"/>
-                <w:tab w:val="center" w:pos="5256"/>
               </w:tabs>
               <w:bidi/>
               <w:spacing w:after="0" w:line="240" w:lineRule="auto"/>
               <w:ind w:right="162"/>
-              <w:jc w:val="both"/>
-              <w:rPr>
-                <w:rFonts w:asciiTheme="majorBidi" w:hAnsiTheme="majorBidi" w:cstheme="majorBidi"/>
-                <w:sz w:val="20"/>
-                <w:szCs w:val="20"/>
-                <w:rtl/>
-              </w:rPr>
-            </w:pPr>
-            <w:r>
-              <w:rPr>
-                <w:rFonts w:asciiTheme="majorBidi" w:hAnsiTheme="majorBidi" w:cs="Times New Roman"/>
-                <w:sz w:val="20"/>
-                <w:szCs w:val="20"/>
-                <w:rtl/>
-              </w:rPr>
-              <w:t xml:space="preserve"/>
-            </w:r>
-          </w:p>
-        </w:tc>
-      </w:tr>
-      <w:tr>
-        <w:trPr>
-          <w:trHeight w:val="265"/>
-        </w:trPr>
-        <w:tc>
-          <w:tcPr>
-            <w:tcW w:w="5017" w:type="dxa"/>
-            <w:tcMar>
-              <w:top w:w="72" w:type="dxa"/>
-              <w:left w:w="144" w:type="dxa"/>
-              <w:bottom w:w="72" w:type="dxa"/>
-              <w:right w:w="144" w:type="dxa"/>
-            </w:tcMar>
-            <w:vAlign w:val="center"/>
-          </w:tcPr>
-          <w:p>
-            <w:pPr>
-              <w:tabs>
-                <w:tab w:val="left" w:pos="1692"/>
-                <w:tab w:val="center" w:pos="5256"/>
-              </w:tabs>
-              <w:bidi/>
-              <w:spacing w:after="0" w:line="240" w:lineRule="auto"/>
-              <w:ind w:right="162"/>
-              <w:jc w:val="both"/>
-              <w:rPr>
-                <w:rFonts w:asciiTheme="majorBidi" w:hAnsiTheme="majorBidi" w:cstheme="majorBidi"/>
-                <w:sz w:val="20"/>
-                <w:szCs w:val="20"/>
-                <w:rtl/>
-              </w:rPr>
-            </w:pPr>
-            <w:r>
-              <w:rPr>
-                <w:rFonts w:asciiTheme="majorBidi" w:hAnsiTheme="majorBidi" w:cs="Times New Roman"/>
-                <w:sz w:val="20"/>
-                <w:szCs w:val="20"/>
-                <w:rtl/>
-              </w:rPr>
-              <w:t xml:space="preserve"/>
-            </w:r>
-          </w:p>
-        </w:tc>
-        <w:tc>
-          <w:tcPr>
-            <w:tcW w:w="4973" w:type="dxa"/>
-            <w:vAlign w:val="center"/>
-          </w:tcPr>
-          <w:p>
-            <w:pPr>
-              <w:tabs>
-                <w:tab w:val="left" w:pos="1692"/>
-                <w:tab w:val="center" w:pos="5256"/>
-              </w:tabs>
-              <w:bidi/>
-              <w:spacing w:after="0" w:line="240" w:lineRule="auto"/>
-              <w:ind w:right="162"/>
-              <w:jc w:val="both"/>
-              <w:rPr>
-                <w:rFonts w:asciiTheme="majorBidi" w:hAnsiTheme="majorBidi" w:cstheme="majorBidi"/>
-                <w:sz w:val="20"/>
-                <w:szCs w:val="20"/>
-                <w:rtl/>
-              </w:rPr>
-            </w:pPr>
-            <w:r>
-              <w:rPr>
-                <w:rFonts w:asciiTheme="majorBidi" w:hAnsiTheme="majorBidi" w:cs="Times New Roman"/>
-                <w:sz w:val="20"/>
-                <w:szCs w:val="20"/>
-                <w:rtl/>
-              </w:rPr>
-              <w:t xml:space="preserve">Mira</w:t>
-            </w:r>
-          </w:p>
-        </w:tc>
-      </w:tr>
-      <w:tr>
-        <w:trPr>
-          <w:trHeight w:val="265"/>
-        </w:trPr>
-        <w:tc>
-          <w:tcPr>
-            <w:tcW w:w="5017" w:type="dxa"/>
-            <w:tcMar>
-              <w:top w:w="72" w:type="dxa"/>
-              <w:left w:w="144" w:type="dxa"/>
-              <w:bottom w:w="72" w:type="dxa"/>
-              <w:right w:w="144" w:type="dxa"/>
-            </w:tcMar>
-            <w:vAlign w:val="center"/>
-          </w:tcPr>
-          <w:p>
-            <w:pPr>
-              <w:tabs>
-                <w:tab w:val="left" w:pos="1692"/>
-                <w:tab w:val="center" w:pos="5256"/>
-              </w:tabs>
-              <w:bidi/>
-              <w:spacing w:after="0" w:line="240" w:lineRule="auto"/>
-              <w:ind w:right="162"/>
-              <w:jc w:val="both"/>
-              <w:rPr>
-                <w:rFonts w:asciiTheme="majorBidi" w:hAnsiTheme="majorBidi" w:cstheme="majorBidi"/>
-                <w:sz w:val="20"/>
-                <w:szCs w:val="20"/>
-                <w:rtl/>
-              </w:rPr>
-            </w:pPr>
-          </w:p>
-        </w:tc>
-        <w:tc>
-          <w:tcPr>
-            <w:tcW w:w="4973" w:type="dxa"/>
-            <w:vAlign w:val="center"/>
-          </w:tcPr>
-          <w:p>
-            <w:pPr>
-              <w:tabs>
-                <w:tab w:val="left" w:pos="1692"/>
-                <w:tab w:val="center" w:pos="5256"/>
-              </w:tabs>
-              <w:bidi/>
-              <w:spacing w:after="0" w:line="240" w:lineRule="auto"/>
-              <w:ind w:right="162"/>
-              <w:jc w:val="both"/>
-              <w:rPr>
-                <w:rFonts w:asciiTheme="majorBidi" w:hAnsiTheme="majorBidi" w:cstheme="majorBidi"/>
-                <w:sz w:val="20"/>
-                <w:szCs w:val="20"/>
-                <w:rtl/>
-              </w:rPr>
-            </w:pPr>
-            <w:r>
-              <w:rPr>
-                <w:rFonts w:asciiTheme="majorBidi" w:hAnsiTheme="majorBidi" w:cs="Times New Roman"/>
-                <w:sz w:val="20"/>
-                <w:szCs w:val="20"/>
-                <w:rtl/>
-              </w:rPr>
-              <w:t xml:space="preserve"/>
-            </w:r>
-          </w:p>
-        </w:tc>
-      </w:tr>
-      <w:tr>
-        <w:trPr>
-          <w:trHeight w:val="265"/>
-        </w:trPr>
-        <w:tc>
-          <w:tcPr>
-            <w:tcW w:w="5017" w:type="dxa"/>
-            <w:tcMar>
-              <w:top w:w="72" w:type="dxa"/>
-              <w:left w:w="144" w:type="dxa"/>
-              <w:bottom w:w="72" w:type="dxa"/>
-              <w:right w:w="144" w:type="dxa"/>
-            </w:tcMar>
-            <w:vAlign w:val="center"/>
-          </w:tcPr>
-          <w:p>
-            <w:pPr>
-              <w:tabs>
-                <w:tab w:val="left" w:pos="1692"/>
-                <w:tab w:val="center" w:pos="5256"/>
-              </w:tabs>
-              <w:bidi/>
-              <w:spacing w:after="0" w:line="240" w:lineRule="auto"/>
-              <w:ind w:right="162"/>
-              <w:jc w:val="both"/>
-              <w:rPr>
-                <w:rFonts w:asciiTheme="majorBidi" w:hAnsiTheme="majorBidi" w:cstheme="majorBidi"/>
-                <w:sz w:val="20"/>
-                <w:szCs w:val="20"/>
-                <w:rtl/>
-              </w:rPr>
-            </w:pPr>
-          </w:p>
-        </w:tc>
-        <w:tc>
-          <w:tcPr>
-            <w:tcW w:w="4973" w:type="dxa"/>
-            <w:vAlign w:val="center"/>
-          </w:tcPr>
-          <w:p>
-            <w:pPr>
-              <w:tabs>
-                <w:tab w:val="left" w:pos="1692"/>
-                <w:tab w:val="center" w:pos="5256"/>
-              </w:tabs>
-              <w:bidi/>
-              <w:spacing w:after="0" w:line="240" w:lineRule="auto"/>
-              <w:ind w:right="162"/>
-              <w:jc w:val="both"/>
-              <w:rPr>
-                <w:rFonts w:asciiTheme="majorBidi" w:hAnsiTheme="majorBidi" w:cstheme="majorBidi"/>
-                <w:sz w:val="20"/>
-                <w:szCs w:val="20"/>
-                <w:rtl/>
-              </w:rPr>
-            </w:pPr>
-          </w:p>
-        </w:tc>
-      </w:tr>
-      <w:tr>
-        <w:trPr>
-          <w:trHeight w:val="265"/>
-        </w:trPr>
-        <w:tc>
-          <w:tcPr>
-            <w:tcW w:w="5017" w:type="dxa"/>
-            <w:tcMar>
-              <w:top w:w="72" w:type="dxa"/>
-              <w:left w:w="144" w:type="dxa"/>
-              <w:bottom w:w="72" w:type="dxa"/>
-              <w:right w:w="144" w:type="dxa"/>
-            </w:tcMar>
-            <w:vAlign w:val="center"/>
-          </w:tcPr>
-          <w:p>
-            <w:pPr>
-              <w:tabs>
-                <w:tab w:val="left" w:pos="1692"/>
-                <w:tab w:val="center" w:pos="5256"/>
-              </w:tabs>
-              <w:bidi/>
-              <w:spacing w:after="0" w:line="240" w:lineRule="auto"/>
-              <w:ind w:right="162"/>
-              <w:jc w:val="both"/>
-              <w:rPr>
-                <w:rFonts w:asciiTheme="majorBidi" w:hAnsiTheme="majorBidi" w:cstheme="majorBidi"/>
-                <w:sz w:val="20"/>
-                <w:szCs w:val="20"/>
-                <w:rtl/>
-              </w:rPr>
-            </w:pPr>
-          </w:p>
-        </w:tc>
-        <w:tc>
-          <w:tcPr>
-            <w:tcW w:w="4973" w:type="dxa"/>
-            <w:vAlign w:val="center"/>
-          </w:tcPr>
-          <w:p>
-            <w:pPr>
-              <w:tabs>
-                <w:tab w:val="left" w:pos="1692"/>
-                <w:tab w:val="center" w:pos="5256"/>
-              </w:tabs>
-              <w:bidi/>
-              <w:spacing w:after="0" w:line="240" w:lineRule="auto"/>
-              <w:ind w:right="162"/>
-              <w:jc w:val="both"/>
-              <w:rPr>
-                <w:rFonts w:asciiTheme="majorBidi" w:hAnsiTheme="majorBidi" w:cstheme="majorBidi"/>
-                <w:sz w:val="20"/>
-                <w:szCs w:val="20"/>
-              </w:rPr>
-            </w:pPr>
-          </w:p>
-        </w:tc>
-      </w:tr>
-      <w:tr>
-        <w:trPr>
-          <w:trHeight w:val="265"/>
-        </w:trPr>
-        <w:tc>
-          <w:tcPr>
-            <w:tcW w:w="5017" w:type="dxa"/>
-            <w:tcMar>
-              <w:top w:w="72" w:type="dxa"/>
-              <w:left w:w="144" w:type="dxa"/>
-              <w:bottom w:w="72" w:type="dxa"/>
-              <w:right w:w="144" w:type="dxa"/>
-            </w:tcMar>
-            <w:vAlign w:val="center"/>
-          </w:tcPr>
-          <w:p>
-            <w:pPr>
-              <w:tabs>
-                <w:tab w:val="left" w:pos="1692"/>
-                <w:tab w:val="center" w:pos="5256"/>
-              </w:tabs>
-              <w:bidi/>
-              <w:spacing w:after="0" w:line="240" w:lineRule="auto"/>
-              <w:ind w:right="162"/>
-              <w:jc w:val="both"/>
-              <w:rPr>
-                <w:rFonts w:asciiTheme="majorBidi" w:hAnsiTheme="majorBidi" w:cstheme="majorBidi"/>
-                <w:sz w:val="20"/>
-                <w:szCs w:val="20"/>
-                <w:rtl/>
-              </w:rPr>
-            </w:pPr>
-          </w:p>
-        </w:tc>
-        <w:tc>
-          <w:tcPr>
-            <w:tcW w:w="4973" w:type="dxa"/>
-            <w:vAlign w:val="center"/>
-          </w:tcPr>
-          <w:p>
-            <w:pPr>
-              <w:tabs>
-                <w:tab w:val="left" w:pos="1692"/>
-                <w:tab w:val="center" w:pos="5256"/>
-              </w:tabs>
-              <w:bidi/>
-              <w:spacing w:after="0" w:line="240" w:lineRule="auto"/>
-              <w:ind w:right="162"/>
-              <w:jc w:val="both"/>
               <w:rPr>
                 <w:rFonts w:asciiTheme="majorBidi" w:hAnsiTheme="majorBidi" w:cstheme="majorBidi"/>
                 <w:sz w:val="20"/>
@@ -2138,7 +1691,7 @@
                 <w:szCs w:val="28"/>
                 <w:rtl/>
               </w:rPr>
-              <w:t xml:space="preserve">الاجتماع</w:t>
+              <w:t>الاجتماع</w:t>
             </w:r>
           </w:p>
         </w:tc>
@@ -2172,14 +1725,13 @@
             </w:pPr>
             <w:r>
               <w:rPr>
-                <w:rFonts w:asciiTheme="majorBidi" w:hAnsiTheme="majorBidi" w:cs="Times New Roman"/>
-                <w:b/>
-                <w:bCs/>
-                <w:sz w:val="20"/>
-                <w:szCs w:val="20"/>
-                <w:rtl/>
-              </w:rPr>
-              <w:t xml:space="preserve">Kick off the marketing planning for the Ramadan campaign, review creative concepts, and align on budget and influencer strategy</w:t>
+                <w:rFonts w:asciiTheme="majorBidi" w:hAnsiTheme="majorBidi" w:cstheme="majorBidi"/>
+                <w:b/>
+                <w:bCs/>
+                <w:sz w:val="20"/>
+                <w:szCs w:val="20"/>
+              </w:rPr>
+              <w:t xml:space="preserve">Kick off the marketing planning for the Ramadan campaign, review creative concepts, and align on next steps</w:t>
             </w:r>
           </w:p>
         </w:tc>
@@ -2316,60 +1868,22 @@
                 <w:szCs w:val="20"/>
                 <w:rtl/>
               </w:rPr>
-              <w:t xml:space="preserve">
-                <w:r>
-                  <w:t xml:space="preserve">1. Khalid presented three creative concepts for the Ramadan campaign; the team evaluated and discussed the merits of each.
+              <w:t xml:space="preserve">1. Khalid presented three creative concepts for the Ramadan campaign; the team evaluated and discussed the merits of each.
 </w:t>
-                </w:r>
-                <w:r>
-                  <w:br/>
-                </w:r>
-                <w:r>
-                  <w:t xml:space="preserve">2. The second creative concept — the storytelling angle — was selected as the preferred direction.
+              <w:br/>
+              <w:t xml:space="preserve">2. The second creative concept — the storytelling angle — was selected as the preferred direction.
 </w:t>
-                </w:r>
-                <w:r>
-                  <w:br/>
-                </w:r>
-                <w:r>
-                  <w:t xml:space="preserve">3. Layla raised the concern that budget approval from upper management has not yet been obtained, which could impact timelines.
+              <w:br/>
+              <w:t xml:space="preserve">3. Layla raised the issue that budget approval from upper management is still pending, which could impact timelines.
 </w:t>
-                </w:r>
-                <w:r>
-                  <w:br/>
-                </w:r>
-                <w:r>
-                  <w:t xml:space="preserve">4. Hajji Omar committed to escalating the budget request to the board for approval this week.
+              <w:br/>
+              <w:t xml:space="preserve">4. Hajji Omar committed to escalating the budget approval request to the board this week.
 </w:t>
-                </w:r>
-                <w:r>
-                  <w:br/>
-                </w:r>
-                <w:r>
-                  <w:t xml:space="preserve">5. The team discussed the influencer strategy and the need to finalize a shortlist of influencers for the campaign.
+              <w:br/>
+              <w:t xml:space="preserve">5. The influencer list for the campaign was discussed; Mira was tasked with shortlisting candidates.
 </w:t>
-                </w:r>
-                <w:r>
-                  <w:br/>
-                </w:r>
-                <w:r>
-                  <w:t xml:space="preserve">6. Mira was tasked with shortlisting five influencer names to share before the next meeting.
-</w:t>
-                </w:r>
-                <w:r>
-                  <w:br/>
-                </w:r>
-                <w:r>
-                  <w:t xml:space="preserve">7. The tentative campaign launch is planned for the first week of Ramadan, though the timeline is tight and contingent on budget clearance.
-</w:t>
-                </w:r>
-                <w:r>
-                  <w:br/>
-                </w:r>
-                <w:r>
-                  <w:t xml:space="preserve">8. The team acknowledged the need to confirm the launch date once the budget is approved.</w:t>
-                </w:r>
-              </w:t>
+              <w:br/>
+              <w:t xml:space="preserve">6. The tentative launch date is set for the first week of Ramadan, but the timeline is tight and contingent on budget clearance.</w:t>
             </w:r>
           </w:p>
         </w:tc>
@@ -2408,10 +1922,10 @@
         <w:tblLook w:val="0420" w:firstRow="1" w:lastRow="0" w:firstColumn="0" w:lastColumn="0" w:noHBand="0" w:noVBand="1"/>
       </w:tblPr>
       <w:tblGrid>
-        <w:gridCol w:w="1890"/>
-        <w:gridCol w:w="2431"/>
-        <w:gridCol w:w="1709"/>
-        <w:gridCol w:w="3785"/>
+        <w:gridCol w:w="3539"/>
+        <w:gridCol w:w="2977"/>
+        <w:gridCol w:w="1417"/>
+        <w:gridCol w:w="1882"/>
         <w:gridCol w:w="350"/>
       </w:tblGrid>
       <w:tr>
@@ -2420,7 +1934,7 @@
         </w:trPr>
         <w:tc>
           <w:tcPr>
-            <w:tcW w:w="1890" w:type="dxa"/>
+            <w:tcW w:w="3539" w:type="dxa"/>
             <w:shd w:val="clear" w:color="auto" w:fill="A79F88"/>
             <w:vAlign w:val="center"/>
           </w:tcPr>
@@ -2460,7 +1974,7 @@
         </w:tc>
         <w:tc>
           <w:tcPr>
-            <w:tcW w:w="2431" w:type="dxa"/>
+            <w:tcW w:w="2977" w:type="dxa"/>
             <w:shd w:val="clear" w:color="auto" w:fill="A79F88"/>
             <w:tcMar>
               <w:top w:w="72" w:type="dxa"/>
@@ -2506,7 +2020,7 @@
         </w:tc>
         <w:tc>
           <w:tcPr>
-            <w:tcW w:w="1709" w:type="dxa"/>
+            <w:tcW w:w="1417" w:type="dxa"/>
             <w:shd w:val="clear" w:color="auto" w:fill="A79F88"/>
             <w:vAlign w:val="center"/>
           </w:tcPr>
@@ -2545,7 +2059,7 @@
         </w:tc>
         <w:tc>
           <w:tcPr>
-            <w:tcW w:w="3785" w:type="dxa"/>
+            <w:tcW w:w="1882" w:type="dxa"/>
             <w:shd w:val="clear" w:color="auto" w:fill="A79F88"/>
             <w:vAlign w:val="center"/>
           </w:tcPr>
@@ -2630,7 +2144,7 @@
         </w:trPr>
         <w:tc>
           <w:tcPr>
-            <w:tcW w:w="1890" w:type="dxa"/>
+            <w:tcW w:w="3539" w:type="dxa"/>
             <w:vAlign w:val="center"/>
           </w:tcPr>
           <w:p>
@@ -2654,7 +2168,7 @@
         </w:tc>
         <w:tc>
           <w:tcPr>
-            <w:tcW w:w="2431" w:type="dxa"/>
+            <w:tcW w:w="2977" w:type="dxa"/>
             <w:tcMar>
               <w:top w:w="72" w:type="dxa"/>
               <w:left w:w="144" w:type="dxa"/>
@@ -2673,17 +2187,25 @@
               <w:spacing w:after="0" w:line="240" w:lineRule="auto"/>
               <w:ind w:right="162"/>
               <w:rPr>
-                <w:rFonts w:asciiTheme="majorBidi" w:hAnsiTheme="majorBidi" w:cstheme="majorBidi"/>
-                <w:sz w:val="20"/>
-                <w:szCs w:val="20"/>
-                <w:rtl/>
-              </w:rPr>
-            </w:pPr>
-          </w:p>
-        </w:tc>
-        <w:tc>
-          <w:tcPr>
-            <w:tcW w:w="1709" w:type="dxa"/>
+                <w:rFonts w:asciiTheme="majorHAnsi" w:hAnsiTheme="majorHAnsi" w:cstheme="majorHAnsi"/>
+                <w:sz w:val="20"/>
+                <w:szCs w:val="20"/>
+                <w:rtl/>
+              </w:rPr>
+            </w:pPr>
+            <w:r>
+              <w:rPr>
+                <w:rFonts w:asciiTheme="majorBidi" w:hAnsiTheme="majorBidi" w:cstheme="majorBidi"/>
+                <w:sz w:val="20"/>
+                <w:szCs w:val="20"/>
+              </w:rPr>
+              <w:t xml:space="preserve">2026-06-24</w:t>
+            </w:r>
+          </w:p>
+        </w:tc>
+        <w:tc>
+          <w:tcPr>
+            <w:tcW w:w="1417" w:type="dxa"/>
             <w:vAlign w:val="center"/>
           </w:tcPr>
           <w:p>
@@ -2696,17 +2218,25 @@
               <w:spacing w:after="0" w:line="240" w:lineRule="auto"/>
               <w:ind w:right="162"/>
               <w:rPr>
-                <w:rFonts w:asciiTheme="majorBidi" w:hAnsiTheme="majorBidi" w:cstheme="majorBidi"/>
-                <w:sz w:val="20"/>
-                <w:szCs w:val="20"/>
-                <w:rtl/>
-              </w:rPr>
-            </w:pPr>
-          </w:p>
-        </w:tc>
-        <w:tc>
-          <w:tcPr>
-            <w:tcW w:w="3785" w:type="dxa"/>
+                <w:rFonts w:asciiTheme="majorHAnsi" w:hAnsiTheme="majorHAnsi" w:cstheme="majorHAnsi"/>
+                <w:sz w:val="20"/>
+                <w:szCs w:val="20"/>
+                <w:rtl/>
+              </w:rPr>
+            </w:pPr>
+            <w:r>
+              <w:rPr>
+                <w:rFonts w:asciiTheme="majorHAnsi" w:hAnsiTheme="majorHAnsi" w:cstheme="majorHAnsi"/>
+                <w:sz w:val="20"/>
+                <w:szCs w:val="20"/>
+              </w:rPr>
+              <w:t xml:space="preserve">Eng. Khalid Al-Dosari</w:t>
+            </w:r>
+          </w:p>
+        </w:tc>
+        <w:tc>
+          <w:tcPr>
+            <w:tcW w:w="1882" w:type="dxa"/>
             <w:vAlign w:val="center"/>
           </w:tcPr>
           <w:p>
@@ -2719,19 +2249,19 @@
               <w:spacing w:after="0" w:line="240" w:lineRule="auto"/>
               <w:ind w:left="136" w:right="162"/>
               <w:rPr>
-                <w:rFonts w:asciiTheme="majorBidi" w:hAnsiTheme="majorBidi" w:cstheme="majorBidi"/>
-                <w:sz w:val="20"/>
-                <w:szCs w:val="20"/>
-              </w:rPr>
-            </w:pPr>
-            <w:r>
-              <w:rPr>
-                <w:rFonts w:asciiTheme="majorBidi" w:hAnsiTheme="majorBidi" w:cs="Times New Roman"/>
-                <w:sz w:val="20"/>
-                <w:szCs w:val="20"/>
-                <w:rtl/>
-              </w:rPr>
-              <w:t xml:space="preserve"/>
+                <w:rFonts w:asciiTheme="majorHAnsi" w:hAnsiTheme="majorHAnsi" w:cstheme="majorHAnsi"/>
+                <w:sz w:val="20"/>
+                <w:szCs w:val="20"/>
+                <w:rtl/>
+              </w:rPr>
+            </w:pPr>
+            <w:r>
+              <w:rPr>
+                <w:rFonts w:asciiTheme="majorHAnsi" w:hAnsiTheme="majorHAnsi" w:cstheme="majorHAnsi"/>
+                <w:sz w:val="20"/>
+                <w:szCs w:val="20"/>
+              </w:rPr>
+              <w:t xml:space="preserve">Send over the final mockups for the selected storytelling creative concept</w:t>
             </w:r>
           </w:p>
         </w:tc>
@@ -2771,28 +2301,31 @@
         </w:trPr>
         <w:tc>
           <w:tcPr>
-            <w:tcW w:w="1890" w:type="dxa"/>
+            <w:tcW w:w="3539" w:type="dxa"/>
             <w:vAlign w:val="center"/>
           </w:tcPr>
           <w:p>
             <w:pPr>
               <w:tabs>
+                <w:tab w:val="left" w:pos="1692"/>
                 <w:tab w:val="center" w:pos="5256"/>
               </w:tabs>
               <w:bidi/>
               <w:spacing w:after="0" w:line="240" w:lineRule="auto"/>
-              <w:rPr>
-                <w:rFonts w:asciiTheme="majorBidi" w:hAnsiTheme="majorBidi" w:cstheme="majorBidi"/>
-                <w:sz w:val="20"/>
-                <w:szCs w:val="20"/>
-                <w:rtl/>
-              </w:rPr>
-            </w:pPr>
-          </w:p>
-        </w:tc>
-        <w:tc>
-          <w:tcPr>
-            <w:tcW w:w="2431" w:type="dxa"/>
+              <w:ind w:right="162"/>
+              <w:jc w:val="center"/>
+              <w:rPr>
+                <w:rFonts w:asciiTheme="majorBidi" w:hAnsiTheme="majorBidi" w:cstheme="majorBidi"/>
+                <w:sz w:val="20"/>
+                <w:szCs w:val="20"/>
+                <w:rtl/>
+              </w:rPr>
+            </w:pPr>
+          </w:p>
+        </w:tc>
+        <w:tc>
+          <w:tcPr>
+            <w:tcW w:w="2977" w:type="dxa"/>
             <w:tcMar>
               <w:top w:w="72" w:type="dxa"/>
               <w:left w:w="144" w:type="dxa"/>
@@ -2804,33 +2337,32 @@
           <w:p>
             <w:pPr>
               <w:tabs>
+                <w:tab w:val="left" w:pos="1692"/>
                 <w:tab w:val="center" w:pos="5256"/>
               </w:tabs>
               <w:bidi/>
               <w:spacing w:after="0" w:line="240" w:lineRule="auto"/>
-              <w:rPr>
-                <w:rFonts w:asciiTheme="majorBidi" w:hAnsiTheme="majorBidi" w:cstheme="majorBidi"/>
-                <w:sz w:val="20"/>
-                <w:szCs w:val="20"/>
-                <w:rtl/>
-                <w:lang w:bidi="ar-JO"/>
-              </w:rPr>
-            </w:pPr>
-            <w:r>
-              <w:rPr>
-                <w:rFonts w:asciiTheme="majorBidi" w:hAnsiTheme="majorBidi" w:cs="Times New Roman"/>
-                <w:sz w:val="20"/>
-                <w:szCs w:val="20"/>
-                <w:rtl/>
-                <w:lang w:bidi="ar-JO"/>
-              </w:rPr>
-              <w:t xml:space="preserve">2026-06-24</w:t>
-            </w:r>
-          </w:p>
-        </w:tc>
-        <w:tc>
-          <w:tcPr>
-            <w:tcW w:w="1709" w:type="dxa"/>
+              <w:ind w:right="162"/>
+              <w:rPr>
+                <w:rFonts w:asciiTheme="majorHAnsi" w:hAnsiTheme="majorHAnsi" w:cstheme="majorHAnsi"/>
+                <w:sz w:val="20"/>
+                <w:szCs w:val="20"/>
+                <w:rtl/>
+              </w:rPr>
+            </w:pPr>
+            <w:r>
+              <w:rPr>
+                <w:rFonts w:asciiTheme="majorBidi" w:hAnsiTheme="majorBidi" w:cstheme="majorBidi"/>
+                <w:sz w:val="20"/>
+                <w:szCs w:val="20"/>
+              </w:rPr>
+              <w:t xml:space="preserve">2026-06-27</w:t>
+            </w:r>
+          </w:p>
+        </w:tc>
+        <w:tc>
+          <w:tcPr>
+            <w:tcW w:w="1417" w:type="dxa"/>
             <w:vAlign w:val="center"/>
           </w:tcPr>
           <w:p>
@@ -2843,26 +2375,25 @@
               <w:spacing w:after="0" w:line="240" w:lineRule="auto"/>
               <w:ind w:right="162"/>
               <w:rPr>
-                <w:rFonts w:asciiTheme="majorBidi" w:hAnsiTheme="majorBidi" w:cstheme="majorBidi"/>
-                <w:sz w:val="20"/>
-                <w:szCs w:val="20"/>
-                <w:rtl/>
-              </w:rPr>
-            </w:pPr>
-            <w:r>
-              <w:rPr>
-                <w:rFonts w:asciiTheme="majorBidi" w:hAnsiTheme="majorBidi" w:cs="Times New Roman"/>
-                <w:sz w:val="20"/>
-                <w:szCs w:val="20"/>
-                <w:rtl/>
-              </w:rPr>
-              <w:t xml:space="preserve">Eng. Khalid Al-Dosari</w:t>
-            </w:r>
-          </w:p>
-        </w:tc>
-        <w:tc>
-          <w:tcPr>
-            <w:tcW w:w="3785" w:type="dxa"/>
+                <w:rFonts w:asciiTheme="majorHAnsi" w:hAnsiTheme="majorHAnsi" w:cstheme="majorHAnsi"/>
+                <w:sz w:val="20"/>
+                <w:szCs w:val="20"/>
+                <w:rtl/>
+              </w:rPr>
+            </w:pPr>
+            <w:r>
+              <w:rPr>
+                <w:rFonts w:asciiTheme="majorHAnsi" w:hAnsiTheme="majorHAnsi" w:cstheme="majorHAnsi"/>
+                <w:sz w:val="20"/>
+                <w:szCs w:val="20"/>
+              </w:rPr>
+              <w:t xml:space="preserve">Hajji Omar</w:t>
+            </w:r>
+          </w:p>
+        </w:tc>
+        <w:tc>
+          <w:tcPr>
+            <w:tcW w:w="1882" w:type="dxa"/>
             <w:vAlign w:val="center"/>
           </w:tcPr>
           <w:p>
@@ -2873,22 +2404,21 @@
               </w:tabs>
               <w:bidi/>
               <w:spacing w:after="0" w:line="240" w:lineRule="auto"/>
-              <w:ind w:right="162"/>
-              <w:rPr>
-                <w:rFonts w:asciiTheme="majorBidi" w:hAnsiTheme="majorBidi" w:cstheme="majorBidi" w:hint="cs"/>
-                <w:sz w:val="20"/>
-                <w:szCs w:val="20"/>
-                <w:rtl/>
-              </w:rPr>
-            </w:pPr>
-            <w:r>
-              <w:rPr>
-                <w:rFonts w:asciiTheme="majorBidi" w:hAnsiTheme="majorBidi" w:cs="Times New Roman"/>
-                <w:sz w:val="20"/>
-                <w:szCs w:val="20"/>
-                <w:rtl/>
-              </w:rPr>
-              <w:t xml:space="preserve">Send over final mockups for the selected storytelling creative concept</w:t>
+              <w:ind w:left="136" w:right="162"/>
+              <w:rPr>
+                <w:rFonts w:asciiTheme="majorHAnsi" w:hAnsiTheme="majorHAnsi" w:cstheme="majorHAnsi"/>
+                <w:sz w:val="20"/>
+                <w:szCs w:val="20"/>
+                <w:rtl/>
+              </w:rPr>
+            </w:pPr>
+            <w:r>
+              <w:rPr>
+                <w:rFonts w:asciiTheme="majorHAnsi" w:hAnsiTheme="majorHAnsi" w:cstheme="majorHAnsi"/>
+                <w:sz w:val="20"/>
+                <w:szCs w:val="20"/>
+              </w:rPr>
+              <w:t xml:space="preserve">Take the budget approval request to the board and secure a yes or no decision</w:t>
             </w:r>
           </w:p>
         </w:tc>
@@ -2928,28 +2458,31 @@
         </w:trPr>
         <w:tc>
           <w:tcPr>
-            <w:tcW w:w="1890" w:type="dxa"/>
+            <w:tcW w:w="3539" w:type="dxa"/>
             <w:vAlign w:val="center"/>
           </w:tcPr>
           <w:p>
             <w:pPr>
               <w:tabs>
+                <w:tab w:val="left" w:pos="1692"/>
                 <w:tab w:val="center" w:pos="5256"/>
               </w:tabs>
               <w:bidi/>
               <w:spacing w:after="0" w:line="240" w:lineRule="auto"/>
-              <w:rPr>
-                <w:rFonts w:asciiTheme="majorBidi" w:hAnsiTheme="majorBidi" w:cstheme="majorBidi"/>
-                <w:sz w:val="20"/>
-                <w:szCs w:val="20"/>
-                <w:rtl/>
-              </w:rPr>
-            </w:pPr>
-          </w:p>
-        </w:tc>
-        <w:tc>
-          <w:tcPr>
-            <w:tcW w:w="2431" w:type="dxa"/>
+              <w:ind w:right="162"/>
+              <w:jc w:val="center"/>
+              <w:rPr>
+                <w:rFonts w:asciiTheme="majorBidi" w:hAnsiTheme="majorBidi" w:cstheme="majorBidi"/>
+                <w:sz w:val="20"/>
+                <w:szCs w:val="20"/>
+                <w:rtl/>
+              </w:rPr>
+            </w:pPr>
+          </w:p>
+        </w:tc>
+        <w:tc>
+          <w:tcPr>
+            <w:tcW w:w="2977" w:type="dxa"/>
             <w:tcMar>
               <w:top w:w="72" w:type="dxa"/>
               <w:left w:w="144" w:type="dxa"/>
@@ -2961,23 +2494,32 @@
           <w:p>
             <w:pPr>
               <w:tabs>
+                <w:tab w:val="left" w:pos="1692"/>
                 <w:tab w:val="center" w:pos="5256"/>
               </w:tabs>
               <w:bidi/>
               <w:spacing w:after="0" w:line="240" w:lineRule="auto"/>
-              <w:rPr>
-                <w:rFonts w:asciiTheme="majorBidi" w:hAnsiTheme="majorBidi" w:cstheme="majorBidi"/>
-                <w:sz w:val="20"/>
-                <w:szCs w:val="20"/>
-                <w:rtl/>
-                <w:lang w:bidi="ar-JO"/>
-              </w:rPr>
-            </w:pPr>
-          </w:p>
-        </w:tc>
-        <w:tc>
-          <w:tcPr>
-            <w:tcW w:w="1709" w:type="dxa"/>
+              <w:ind w:right="162"/>
+              <w:rPr>
+                <w:rFonts w:asciiTheme="majorHAnsi" w:hAnsiTheme="majorHAnsi" w:cstheme="majorHAnsi"/>
+                <w:sz w:val="20"/>
+                <w:szCs w:val="20"/>
+                <w:rtl/>
+              </w:rPr>
+            </w:pPr>
+            <w:r>
+              <w:rPr>
+                <w:rFonts w:asciiTheme="majorBidi" w:hAnsiTheme="majorBidi" w:cstheme="majorBidi"/>
+                <w:sz w:val="20"/>
+                <w:szCs w:val="20"/>
+              </w:rPr>
+              <w:t xml:space="preserve">2026-06-25</w:t>
+            </w:r>
+          </w:p>
+        </w:tc>
+        <w:tc>
+          <w:tcPr>
+            <w:tcW w:w="1417" w:type="dxa"/>
             <w:vAlign w:val="center"/>
           </w:tcPr>
           <w:p>
@@ -2990,17 +2532,25 @@
               <w:spacing w:after="0" w:line="240" w:lineRule="auto"/>
               <w:ind w:right="162"/>
               <w:rPr>
-                <w:rFonts w:asciiTheme="majorBidi" w:hAnsiTheme="majorBidi" w:cstheme="majorBidi"/>
-                <w:sz w:val="20"/>
-                <w:szCs w:val="20"/>
-                <w:rtl/>
-              </w:rPr>
-            </w:pPr>
-          </w:p>
-        </w:tc>
-        <w:tc>
-          <w:tcPr>
-            <w:tcW w:w="3785" w:type="dxa"/>
+                <w:rFonts w:asciiTheme="majorHAnsi" w:hAnsiTheme="majorHAnsi" w:cstheme="majorHAnsi"/>
+                <w:sz w:val="20"/>
+                <w:szCs w:val="20"/>
+                <w:rtl/>
+              </w:rPr>
+            </w:pPr>
+            <w:r>
+              <w:rPr>
+                <w:rFonts w:asciiTheme="majorHAnsi" w:hAnsiTheme="majorHAnsi" w:cstheme="majorHAnsi"/>
+                <w:sz w:val="20"/>
+                <w:szCs w:val="20"/>
+              </w:rPr>
+              <w:t xml:space="preserve">Mira</w:t>
+            </w:r>
+          </w:p>
+        </w:tc>
+        <w:tc>
+          <w:tcPr>
+            <w:tcW w:w="1882" w:type="dxa"/>
             <w:vAlign w:val="center"/>
           </w:tcPr>
           <w:p>
@@ -3011,22 +2561,21 @@
               </w:tabs>
               <w:bidi/>
               <w:spacing w:after="0" w:line="240" w:lineRule="auto"/>
-              <w:ind w:right="162"/>
-              <w:rPr>
-                <w:rFonts w:asciiTheme="majorBidi" w:hAnsiTheme="majorBidi" w:cstheme="majorBidi"/>
-                <w:sz w:val="20"/>
-                <w:szCs w:val="20"/>
-                <w:rtl/>
-              </w:rPr>
-            </w:pPr>
-            <w:r>
-              <w:rPr>
-                <w:rFonts w:asciiTheme="majorBidi" w:hAnsiTheme="majorBidi" w:cs="Times New Roman"/>
-                <w:sz w:val="20"/>
-                <w:szCs w:val="20"/>
-                <w:rtl/>
-              </w:rPr>
-              <w:t xml:space="preserve"/>
+              <w:ind w:left="136" w:right="162"/>
+              <w:rPr>
+                <w:rFonts w:asciiTheme="majorHAnsi" w:hAnsiTheme="majorHAnsi" w:cstheme="majorHAnsi"/>
+                <w:sz w:val="20"/>
+                <w:szCs w:val="20"/>
+                <w:rtl/>
+              </w:rPr>
+            </w:pPr>
+            <w:r>
+              <w:rPr>
+                <w:rFonts w:asciiTheme="majorHAnsi" w:hAnsiTheme="majorHAnsi" w:cstheme="majorHAnsi"/>
+                <w:sz w:val="20"/>
+                <w:szCs w:val="20"/>
+              </w:rPr>
+              <w:t xml:space="preserve">Shortlist five influencer names and share them before the next meeting</w:t>
             </w:r>
           </w:p>
         </w:tc>
@@ -3066,28 +2615,31 @@
         </w:trPr>
         <w:tc>
           <w:tcPr>
-            <w:tcW w:w="1890" w:type="dxa"/>
+            <w:tcW w:w="3539" w:type="dxa"/>
             <w:vAlign w:val="center"/>
           </w:tcPr>
           <w:p>
             <w:pPr>
               <w:tabs>
+                <w:tab w:val="left" w:pos="1692"/>
                 <w:tab w:val="center" w:pos="5256"/>
               </w:tabs>
               <w:bidi/>
               <w:spacing w:after="0" w:line="240" w:lineRule="auto"/>
-              <w:rPr>
-                <w:rFonts w:asciiTheme="majorBidi" w:hAnsiTheme="majorBidi" w:cstheme="majorBidi"/>
-                <w:sz w:val="20"/>
-                <w:szCs w:val="20"/>
-                <w:rtl/>
-              </w:rPr>
-            </w:pPr>
-          </w:p>
-        </w:tc>
-        <w:tc>
-          <w:tcPr>
-            <w:tcW w:w="2431" w:type="dxa"/>
+              <w:ind w:right="162"/>
+              <w:jc w:val="center"/>
+              <w:rPr>
+                <w:rFonts w:asciiTheme="majorBidi" w:hAnsiTheme="majorBidi" w:cstheme="majorBidi"/>
+                <w:sz w:val="20"/>
+                <w:szCs w:val="20"/>
+                <w:rtl/>
+              </w:rPr>
+            </w:pPr>
+          </w:p>
+        </w:tc>
+        <w:tc>
+          <w:tcPr>
+            <w:tcW w:w="2977" w:type="dxa"/>
             <w:tcMar>
               <w:top w:w="72" w:type="dxa"/>
               <w:left w:w="144" w:type="dxa"/>
@@ -3099,33 +2651,32 @@
           <w:p>
             <w:pPr>
               <w:tabs>
+                <w:tab w:val="left" w:pos="1692"/>
                 <w:tab w:val="center" w:pos="5256"/>
               </w:tabs>
               <w:bidi/>
               <w:spacing w:after="0" w:line="240" w:lineRule="auto"/>
-              <w:rPr>
-                <w:rFonts w:asciiTheme="majorBidi" w:hAnsiTheme="majorBidi" w:cstheme="majorBidi"/>
-                <w:sz w:val="20"/>
-                <w:szCs w:val="20"/>
-                <w:rtl/>
-                <w:lang w:bidi="ar-JO"/>
-              </w:rPr>
-            </w:pPr>
-            <w:r>
-              <w:rPr>
-                <w:rFonts w:asciiTheme="majorBidi" w:hAnsiTheme="majorBidi" w:cs="Times New Roman"/>
-                <w:sz w:val="20"/>
-                <w:szCs w:val="20"/>
-                <w:rtl/>
-                <w:lang w:bidi="ar-JO"/>
-              </w:rPr>
-              <w:t xml:space="preserve">2026-06-27</w:t>
-            </w:r>
-          </w:p>
-        </w:tc>
-        <w:tc>
-          <w:tcPr>
-            <w:tcW w:w="1709" w:type="dxa"/>
+              <w:ind w:right="162"/>
+              <w:rPr>
+                <w:rFonts w:asciiTheme="majorHAnsi" w:hAnsiTheme="majorHAnsi" w:cstheme="majorHAnsi"/>
+                <w:sz w:val="20"/>
+                <w:szCs w:val="20"/>
+                <w:rtl/>
+              </w:rPr>
+            </w:pPr>
+            <w:r>
+              <w:rPr>
+                <w:rFonts w:asciiTheme="majorBidi" w:hAnsiTheme="majorBidi" w:cstheme="majorBidi"/>
+                <w:sz w:val="20"/>
+                <w:szCs w:val="20"/>
+              </w:rPr>
+              <w:t xml:space="preserve"/>
+            </w:r>
+          </w:p>
+        </w:tc>
+        <w:tc>
+          <w:tcPr>
+            <w:tcW w:w="1417" w:type="dxa"/>
             <w:vAlign w:val="center"/>
           </w:tcPr>
           <w:p>
@@ -3138,26 +2689,25 @@
               <w:spacing w:after="0" w:line="240" w:lineRule="auto"/>
               <w:ind w:right="162"/>
               <w:rPr>
-                <w:rFonts w:asciiTheme="majorBidi" w:hAnsiTheme="majorBidi" w:cstheme="majorBidi"/>
-                <w:sz w:val="20"/>
-                <w:szCs w:val="20"/>
-                <w:rtl/>
-              </w:rPr>
-            </w:pPr>
-            <w:r>
-              <w:rPr>
-                <w:rFonts w:asciiTheme="majorBidi" w:hAnsiTheme="majorBidi" w:cs="Times New Roman"/>
-                <w:sz w:val="20"/>
-                <w:szCs w:val="20"/>
-                <w:rtl/>
-              </w:rPr>
-              <w:t xml:space="preserve">Hajji Omar</w:t>
-            </w:r>
-          </w:p>
-        </w:tc>
-        <w:tc>
-          <w:tcPr>
-            <w:tcW w:w="3785" w:type="dxa"/>
+                <w:rFonts w:asciiTheme="majorHAnsi" w:hAnsiTheme="majorHAnsi" w:cstheme="majorHAnsi"/>
+                <w:sz w:val="20"/>
+                <w:szCs w:val="20"/>
+                <w:rtl/>
+              </w:rPr>
+            </w:pPr>
+            <w:r>
+              <w:rPr>
+                <w:rFonts w:asciiTheme="majorHAnsi" w:hAnsiTheme="majorHAnsi" w:cstheme="majorHAnsi"/>
+                <w:sz w:val="20"/>
+                <w:szCs w:val="20"/>
+              </w:rPr>
+              <w:t xml:space="preserve"/>
+            </w:r>
+          </w:p>
+        </w:tc>
+        <w:tc>
+          <w:tcPr>
+            <w:tcW w:w="1882" w:type="dxa"/>
             <w:vAlign w:val="center"/>
           </w:tcPr>
           <w:p>
@@ -3168,1009 +2718,22 @@
               </w:tabs>
               <w:bidi/>
               <w:spacing w:after="0" w:line="240" w:lineRule="auto"/>
-              <w:ind w:right="162"/>
-              <w:rPr>
-                <w:rFonts w:asciiTheme="majorBidi" w:hAnsiTheme="majorBidi" w:cstheme="majorBidi" w:hint="cs"/>
-                <w:sz w:val="20"/>
-                <w:szCs w:val="20"/>
-                <w:rtl/>
-              </w:rPr>
-            </w:pPr>
-            <w:r>
-              <w:rPr>
-                <w:rFonts w:asciiTheme="majorBidi" w:hAnsiTheme="majorBidi" w:cs="Times New Roman"/>
-                <w:sz w:val="20"/>
-                <w:szCs w:val="20"/>
-                <w:rtl/>
-              </w:rPr>
-              <w:t xml:space="preserve">Escalate budget request to the board and obtain approval or rejection</w:t>
-            </w:r>
-          </w:p>
-        </w:tc>
-        <w:tc>
-          <w:tcPr>
-            <w:tcW w:w="350" w:type="dxa"/>
-            <w:vAlign w:val="center"/>
-          </w:tcPr>
-          <w:p>
-            <w:pPr>
-              <w:pStyle w:val="ListParagraph"/>
-              <w:numPr>
-                <w:ilvl w:val="0"/>
-                <w:numId w:val="18"/>
-              </w:numPr>
-              <w:tabs>
-                <w:tab w:val="left" w:pos="1692"/>
-                <w:tab w:val="center" w:pos="5256"/>
-              </w:tabs>
-              <w:bidi/>
-              <w:spacing w:after="0" w:line="240" w:lineRule="auto"/>
-              <w:ind w:right="162"/>
-              <w:jc w:val="center"/>
-              <w:rPr>
-                <w:rFonts w:asciiTheme="majorBidi" w:hAnsiTheme="majorBidi" w:cstheme="majorBidi"/>
-                <w:sz w:val="20"/>
-                <w:szCs w:val="20"/>
-                <w:rtl/>
-              </w:rPr>
-            </w:pPr>
-          </w:p>
-        </w:tc>
-      </w:tr>
-      <w:tr>
-        <w:trPr>
-          <w:trHeight w:val="278"/>
-        </w:trPr>
-        <w:tc>
-          <w:tcPr>
-            <w:tcW w:w="1890" w:type="dxa"/>
-            <w:vAlign w:val="center"/>
-          </w:tcPr>
-          <w:p>
-            <w:pPr>
-              <w:tabs>
-                <w:tab w:val="center" w:pos="5256"/>
-              </w:tabs>
-              <w:bidi/>
-              <w:spacing w:after="0" w:line="240" w:lineRule="auto"/>
-              <w:rPr>
-                <w:rFonts w:asciiTheme="majorBidi" w:hAnsiTheme="majorBidi" w:cstheme="majorBidi"/>
-                <w:sz w:val="20"/>
-                <w:szCs w:val="20"/>
-                <w:rtl/>
-              </w:rPr>
-            </w:pPr>
-          </w:p>
-        </w:tc>
-        <w:tc>
-          <w:tcPr>
-            <w:tcW w:w="2431" w:type="dxa"/>
-            <w:tcMar>
-              <w:top w:w="72" w:type="dxa"/>
-              <w:left w:w="144" w:type="dxa"/>
-              <w:bottom w:w="72" w:type="dxa"/>
-              <w:right w:w="144" w:type="dxa"/>
-            </w:tcMar>
-            <w:vAlign w:val="center"/>
-          </w:tcPr>
-          <w:p>
-            <w:pPr>
-              <w:tabs>
-                <w:tab w:val="center" w:pos="5256"/>
-              </w:tabs>
-              <w:bidi/>
-              <w:spacing w:after="0" w:line="240" w:lineRule="auto"/>
-              <w:rPr>
-                <w:rFonts w:asciiTheme="majorBidi" w:hAnsiTheme="majorBidi" w:cstheme="majorBidi"/>
-                <w:sz w:val="20"/>
-                <w:szCs w:val="20"/>
-                <w:rtl/>
-                <w:lang w:bidi="ar-JO"/>
-              </w:rPr>
-            </w:pPr>
-          </w:p>
-        </w:tc>
-        <w:tc>
-          <w:tcPr>
-            <w:tcW w:w="1709" w:type="dxa"/>
-            <w:vAlign w:val="center"/>
-          </w:tcPr>
-          <w:p>
-            <w:pPr>
-              <w:tabs>
-                <w:tab w:val="left" w:pos="1692"/>
-                <w:tab w:val="center" w:pos="5256"/>
-              </w:tabs>
-              <w:bidi/>
-              <w:spacing w:after="0" w:line="240" w:lineRule="auto"/>
-              <w:ind w:right="162"/>
-              <w:rPr>
-                <w:rFonts w:asciiTheme="majorBidi" w:hAnsiTheme="majorBidi" w:cstheme="majorBidi"/>
-                <w:sz w:val="20"/>
-                <w:szCs w:val="20"/>
-                <w:rtl/>
-              </w:rPr>
-            </w:pPr>
-          </w:p>
-        </w:tc>
-        <w:tc>
-          <w:tcPr>
-            <w:tcW w:w="3785" w:type="dxa"/>
-            <w:vAlign w:val="center"/>
-          </w:tcPr>
-          <w:p>
-            <w:pPr>
-              <w:tabs>
-                <w:tab w:val="left" w:pos="1692"/>
-                <w:tab w:val="center" w:pos="5256"/>
-              </w:tabs>
-              <w:bidi/>
-              <w:spacing w:after="0" w:line="240" w:lineRule="auto"/>
-              <w:ind w:right="162"/>
-              <w:rPr>
-                <w:rFonts w:asciiTheme="majorBidi" w:hAnsiTheme="majorBidi" w:cstheme="majorBidi"/>
-                <w:sz w:val="20"/>
-                <w:szCs w:val="20"/>
-                <w:rtl/>
-              </w:rPr>
-            </w:pPr>
-            <w:r>
-              <w:rPr>
-                <w:rFonts w:asciiTheme="majorBidi" w:hAnsiTheme="majorBidi" w:cs="Times New Roman"/>
-                <w:sz w:val="20"/>
-                <w:szCs w:val="20"/>
-                <w:rtl/>
-              </w:rPr>
-              <w:t xml:space="preserve"/>
-            </w:r>
-          </w:p>
-        </w:tc>
-        <w:tc>
-          <w:tcPr>
-            <w:tcW w:w="350" w:type="dxa"/>
-            <w:vAlign w:val="center"/>
-          </w:tcPr>
-          <w:p>
-            <w:pPr>
-              <w:pStyle w:val="ListParagraph"/>
-              <w:numPr>
-                <w:ilvl w:val="0"/>
-                <w:numId w:val="18"/>
-              </w:numPr>
-              <w:tabs>
-                <w:tab w:val="left" w:pos="1692"/>
-                <w:tab w:val="center" w:pos="5256"/>
-              </w:tabs>
-              <w:bidi/>
-              <w:spacing w:after="0" w:line="240" w:lineRule="auto"/>
-              <w:ind w:right="162"/>
-              <w:jc w:val="center"/>
-              <w:rPr>
-                <w:rFonts w:asciiTheme="majorBidi" w:hAnsiTheme="majorBidi" w:cstheme="majorBidi"/>
-                <w:sz w:val="20"/>
-                <w:szCs w:val="20"/>
-                <w:rtl/>
-              </w:rPr>
-            </w:pPr>
-          </w:p>
-        </w:tc>
-      </w:tr>
-      <w:tr>
-        <w:trPr>
-          <w:trHeight w:val="278"/>
-        </w:trPr>
-        <w:tc>
-          <w:tcPr>
-            <w:tcW w:w="1890" w:type="dxa"/>
-            <w:vAlign w:val="center"/>
-          </w:tcPr>
-          <w:p>
-            <w:pPr>
-              <w:tabs>
-                <w:tab w:val="center" w:pos="5256"/>
-              </w:tabs>
-              <w:bidi/>
-              <w:spacing w:after="0" w:line="240" w:lineRule="auto"/>
-              <w:rPr>
-                <w:rFonts w:asciiTheme="majorBidi" w:hAnsiTheme="majorBidi" w:cstheme="majorBidi"/>
-                <w:sz w:val="20"/>
-                <w:szCs w:val="20"/>
-                <w:rtl/>
-              </w:rPr>
-            </w:pPr>
-          </w:p>
-        </w:tc>
-        <w:tc>
-          <w:tcPr>
-            <w:tcW w:w="2431" w:type="dxa"/>
-            <w:tcMar>
-              <w:top w:w="72" w:type="dxa"/>
-              <w:left w:w="144" w:type="dxa"/>
-              <w:bottom w:w="72" w:type="dxa"/>
-              <w:right w:w="144" w:type="dxa"/>
-            </w:tcMar>
-            <w:vAlign w:val="center"/>
-          </w:tcPr>
-          <w:p>
-            <w:pPr>
-              <w:tabs>
-                <w:tab w:val="center" w:pos="5256"/>
-              </w:tabs>
-              <w:bidi/>
-              <w:spacing w:after="0" w:line="240" w:lineRule="auto"/>
-              <w:rPr>
-                <w:rFonts w:asciiTheme="majorBidi" w:hAnsiTheme="majorBidi" w:cstheme="majorBidi"/>
-                <w:sz w:val="20"/>
-                <w:szCs w:val="20"/>
-                <w:rtl/>
-                <w:lang w:bidi="ar-JO"/>
-              </w:rPr>
-            </w:pPr>
-            <w:r>
-              <w:rPr>
-                <w:rFonts w:asciiTheme="majorBidi" w:hAnsiTheme="majorBidi" w:cs="Times New Roman"/>
-                <w:sz w:val="20"/>
-                <w:szCs w:val="20"/>
-                <w:rtl/>
-                <w:lang w:bidi="ar-JO"/>
-              </w:rPr>
-              <w:t xml:space="preserve">2026-06-25</w:t>
-            </w:r>
-          </w:p>
-        </w:tc>
-        <w:tc>
-          <w:tcPr>
-            <w:tcW w:w="1709" w:type="dxa"/>
-            <w:vAlign w:val="center"/>
-          </w:tcPr>
-          <w:p>
-            <w:pPr>
-              <w:tabs>
-                <w:tab w:val="left" w:pos="1692"/>
-                <w:tab w:val="center" w:pos="5256"/>
-              </w:tabs>
-              <w:bidi/>
-              <w:spacing w:after="0" w:line="240" w:lineRule="auto"/>
-              <w:ind w:right="162"/>
-              <w:rPr>
-                <w:rFonts w:asciiTheme="majorBidi" w:hAnsiTheme="majorBidi" w:cstheme="majorBidi"/>
-                <w:sz w:val="20"/>
-                <w:szCs w:val="20"/>
-                <w:rtl/>
-              </w:rPr>
-            </w:pPr>
-            <w:r>
-              <w:rPr>
-                <w:rFonts w:asciiTheme="majorBidi" w:hAnsiTheme="majorBidi" w:cs="Times New Roman"/>
-                <w:sz w:val="20"/>
-                <w:szCs w:val="20"/>
-                <w:rtl/>
-              </w:rPr>
-              <w:t xml:space="preserve">Mira</w:t>
-            </w:r>
-          </w:p>
-        </w:tc>
-        <w:tc>
-          <w:tcPr>
-            <w:tcW w:w="3785" w:type="dxa"/>
-            <w:vAlign w:val="center"/>
-          </w:tcPr>
-          <w:p>
-            <w:pPr>
-              <w:tabs>
-                <w:tab w:val="left" w:pos="1692"/>
-                <w:tab w:val="center" w:pos="5256"/>
-              </w:tabs>
-              <w:bidi/>
-              <w:spacing w:after="0" w:line="240" w:lineRule="auto"/>
-              <w:ind w:right="162"/>
-              <w:rPr>
-                <w:rFonts w:asciiTheme="majorBidi" w:hAnsiTheme="majorBidi" w:cstheme="majorBidi" w:hint="cs"/>
-                <w:sz w:val="20"/>
-                <w:szCs w:val="20"/>
-                <w:rtl/>
-              </w:rPr>
-            </w:pPr>
-            <w:r>
-              <w:rPr>
-                <w:rFonts w:asciiTheme="majorBidi" w:hAnsiTheme="majorBidi" w:cs="Times New Roman"/>
-                <w:sz w:val="20"/>
-                <w:szCs w:val="20"/>
-                <w:rtl/>
-              </w:rPr>
-              <w:t xml:space="preserve">Shortlist five influencer names and share with the team before the next meeting</w:t>
-            </w:r>
-          </w:p>
-        </w:tc>
-        <w:tc>
-          <w:tcPr>
-            <w:tcW w:w="350" w:type="dxa"/>
-            <w:vAlign w:val="center"/>
-          </w:tcPr>
-          <w:p>
-            <w:pPr>
-              <w:pStyle w:val="ListParagraph"/>
-              <w:numPr>
-                <w:ilvl w:val="0"/>
-                <w:numId w:val="18"/>
-              </w:numPr>
-              <w:tabs>
-                <w:tab w:val="left" w:pos="1692"/>
-                <w:tab w:val="center" w:pos="5256"/>
-              </w:tabs>
-              <w:bidi/>
-              <w:spacing w:after="0" w:line="240" w:lineRule="auto"/>
-              <w:ind w:right="162"/>
-              <w:jc w:val="center"/>
-              <w:rPr>
-                <w:rFonts w:asciiTheme="majorBidi" w:hAnsiTheme="majorBidi" w:cstheme="majorBidi"/>
-                <w:sz w:val="20"/>
-                <w:szCs w:val="20"/>
-                <w:rtl/>
-              </w:rPr>
-            </w:pPr>
-          </w:p>
-        </w:tc>
-      </w:tr>
-      <w:tr>
-        <w:trPr>
-          <w:trHeight w:val="278"/>
-        </w:trPr>
-        <w:tc>
-          <w:tcPr>
-            <w:tcW w:w="1890" w:type="dxa"/>
-            <w:vAlign w:val="center"/>
-          </w:tcPr>
-          <w:p>
-            <w:pPr>
-              <w:tabs>
-                <w:tab w:val="center" w:pos="5256"/>
-              </w:tabs>
-              <w:bidi/>
-              <w:spacing w:after="0" w:line="240" w:lineRule="auto"/>
-              <w:rPr>
-                <w:rFonts w:asciiTheme="majorBidi" w:hAnsiTheme="majorBidi" w:cstheme="majorBidi"/>
-                <w:sz w:val="20"/>
-                <w:szCs w:val="20"/>
-                <w:rtl/>
-              </w:rPr>
-            </w:pPr>
-          </w:p>
-        </w:tc>
-        <w:tc>
-          <w:tcPr>
-            <w:tcW w:w="2431" w:type="dxa"/>
-            <w:tcMar>
-              <w:top w:w="72" w:type="dxa"/>
-              <w:left w:w="144" w:type="dxa"/>
-              <w:bottom w:w="72" w:type="dxa"/>
-              <w:right w:w="144" w:type="dxa"/>
-            </w:tcMar>
-            <w:vAlign w:val="center"/>
-          </w:tcPr>
-          <w:p>
-            <w:pPr>
-              <w:tabs>
-                <w:tab w:val="center" w:pos="5256"/>
-              </w:tabs>
-              <w:bidi/>
-              <w:spacing w:after="0" w:line="240" w:lineRule="auto"/>
-              <w:rPr>
-                <w:rFonts w:asciiTheme="majorBidi" w:hAnsiTheme="majorBidi" w:cstheme="majorBidi"/>
-                <w:sz w:val="20"/>
-                <w:szCs w:val="20"/>
-                <w:rtl/>
-                <w:lang w:bidi="ar-JO"/>
-              </w:rPr>
-            </w:pPr>
-          </w:p>
-        </w:tc>
-        <w:tc>
-          <w:tcPr>
-            <w:tcW w:w="1709" w:type="dxa"/>
-            <w:vAlign w:val="center"/>
-          </w:tcPr>
-          <w:p>
-            <w:pPr>
-              <w:tabs>
-                <w:tab w:val="left" w:pos="1692"/>
-                <w:tab w:val="center" w:pos="5256"/>
-              </w:tabs>
-              <w:bidi/>
-              <w:spacing w:after="0" w:line="240" w:lineRule="auto"/>
-              <w:ind w:right="162"/>
-              <w:rPr>
-                <w:rFonts w:asciiTheme="majorBidi" w:hAnsiTheme="majorBidi" w:cstheme="majorBidi"/>
-                <w:sz w:val="20"/>
-                <w:szCs w:val="20"/>
-                <w:rtl/>
-              </w:rPr>
-            </w:pPr>
-          </w:p>
-        </w:tc>
-        <w:tc>
-          <w:tcPr>
-            <w:tcW w:w="3785" w:type="dxa"/>
-            <w:vAlign w:val="center"/>
-          </w:tcPr>
-          <w:p>
-            <w:pPr>
-              <w:tabs>
-                <w:tab w:val="left" w:pos="1692"/>
-                <w:tab w:val="center" w:pos="5256"/>
-              </w:tabs>
-              <w:bidi/>
-              <w:spacing w:after="0" w:line="240" w:lineRule="auto"/>
-              <w:ind w:right="162"/>
-              <w:rPr>
-                <w:rFonts w:asciiTheme="majorBidi" w:hAnsiTheme="majorBidi" w:cstheme="majorBidi"/>
-                <w:sz w:val="20"/>
-                <w:szCs w:val="20"/>
-                <w:rtl/>
-              </w:rPr>
-            </w:pPr>
-            <w:r>
-              <w:rPr>
-                <w:rFonts w:asciiTheme="majorBidi" w:hAnsiTheme="majorBidi" w:cs="Times New Roman"/>
-                <w:sz w:val="20"/>
-                <w:szCs w:val="20"/>
-                <w:rtl/>
-              </w:rPr>
-              <w:t xml:space="preserve"/>
-            </w:r>
-          </w:p>
-        </w:tc>
-        <w:tc>
-          <w:tcPr>
-            <w:tcW w:w="350" w:type="dxa"/>
-            <w:vAlign w:val="center"/>
-          </w:tcPr>
-          <w:p>
-            <w:pPr>
-              <w:pStyle w:val="ListParagraph"/>
-              <w:numPr>
-                <w:ilvl w:val="0"/>
-                <w:numId w:val="18"/>
-              </w:numPr>
-              <w:tabs>
-                <w:tab w:val="left" w:pos="1692"/>
-                <w:tab w:val="center" w:pos="5256"/>
-              </w:tabs>
-              <w:bidi/>
-              <w:spacing w:after="0" w:line="240" w:lineRule="auto"/>
-              <w:ind w:right="162"/>
-              <w:jc w:val="center"/>
-              <w:rPr>
-                <w:rFonts w:asciiTheme="majorBidi" w:hAnsiTheme="majorBidi" w:cstheme="majorBidi"/>
-                <w:sz w:val="20"/>
-                <w:szCs w:val="20"/>
-                <w:rtl/>
-              </w:rPr>
-            </w:pPr>
-          </w:p>
-        </w:tc>
-      </w:tr>
-      <w:tr>
-        <w:trPr>
-          <w:trHeight w:val="278"/>
-        </w:trPr>
-        <w:tc>
-          <w:tcPr>
-            <w:tcW w:w="1890" w:type="dxa"/>
-            <w:vAlign w:val="center"/>
-          </w:tcPr>
-          <w:p>
-            <w:pPr>
-              <w:tabs>
-                <w:tab w:val="center" w:pos="5256"/>
-              </w:tabs>
-              <w:bidi/>
-              <w:spacing w:after="0" w:line="240" w:lineRule="auto"/>
-              <w:rPr>
-                <w:rFonts w:asciiTheme="majorBidi" w:hAnsiTheme="majorBidi" w:cstheme="majorBidi"/>
-                <w:sz w:val="20"/>
-                <w:szCs w:val="20"/>
-                <w:rtl/>
-              </w:rPr>
-            </w:pPr>
-          </w:p>
-        </w:tc>
-        <w:tc>
-          <w:tcPr>
-            <w:tcW w:w="2431" w:type="dxa"/>
-            <w:tcMar>
-              <w:top w:w="72" w:type="dxa"/>
-              <w:left w:w="144" w:type="dxa"/>
-              <w:bottom w:w="72" w:type="dxa"/>
-              <w:right w:w="144" w:type="dxa"/>
-            </w:tcMar>
-            <w:vAlign w:val="center"/>
-          </w:tcPr>
-          <w:p>
-            <w:pPr>
-              <w:tabs>
-                <w:tab w:val="center" w:pos="5256"/>
-              </w:tabs>
-              <w:bidi/>
-              <w:spacing w:after="0" w:line="240" w:lineRule="auto"/>
-              <w:rPr>
-                <w:rFonts w:asciiTheme="majorBidi" w:hAnsiTheme="majorBidi" w:cstheme="majorBidi"/>
-                <w:sz w:val="20"/>
-                <w:szCs w:val="20"/>
-                <w:rtl/>
-                <w:lang w:bidi="ar-JO"/>
-              </w:rPr>
-            </w:pPr>
-            <w:r>
-              <w:rPr>
-                <w:rFonts w:asciiTheme="majorBidi" w:hAnsiTheme="majorBidi" w:cs="Times New Roman"/>
-                <w:sz w:val="20"/>
-                <w:szCs w:val="20"/>
-                <w:rtl/>
-                <w:lang w:bidi="ar-JO"/>
-              </w:rPr>
-              <w:t xml:space="preserve"/>
-            </w:r>
-          </w:p>
-        </w:tc>
-        <w:tc>
-          <w:tcPr>
-            <w:tcW w:w="1709" w:type="dxa"/>
-            <w:vAlign w:val="center"/>
-          </w:tcPr>
-          <w:p>
-            <w:pPr>
-              <w:tabs>
-                <w:tab w:val="left" w:pos="1692"/>
-                <w:tab w:val="center" w:pos="5256"/>
-              </w:tabs>
-              <w:bidi/>
-              <w:spacing w:after="0" w:line="240" w:lineRule="auto"/>
-              <w:ind w:right="162"/>
-              <w:rPr>
-                <w:rFonts w:asciiTheme="majorBidi" w:hAnsiTheme="majorBidi" w:cstheme="majorBidi"/>
-                <w:sz w:val="20"/>
-                <w:szCs w:val="20"/>
-                <w:rtl/>
-              </w:rPr>
-            </w:pPr>
-            <w:r>
-              <w:rPr>
-                <w:rFonts w:asciiTheme="majorBidi" w:hAnsiTheme="majorBidi" w:cs="Times New Roman"/>
-                <w:sz w:val="20"/>
-                <w:szCs w:val="20"/>
-                <w:rtl/>
-              </w:rPr>
-              <w:t xml:space="preserve"/>
-            </w:r>
-          </w:p>
-        </w:tc>
-        <w:tc>
-          <w:tcPr>
-            <w:tcW w:w="3785" w:type="dxa"/>
-            <w:vAlign w:val="center"/>
-          </w:tcPr>
-          <w:p>
-            <w:pPr>
-              <w:tabs>
-                <w:tab w:val="left" w:pos="1692"/>
-                <w:tab w:val="center" w:pos="5256"/>
-              </w:tabs>
-              <w:bidi/>
-              <w:spacing w:after="0" w:line="240" w:lineRule="auto"/>
-              <w:ind w:right="162"/>
-              <w:rPr>
-                <w:rFonts w:asciiTheme="majorBidi" w:hAnsiTheme="majorBidi" w:cstheme="majorBidi" w:hint="cs"/>
-                <w:sz w:val="20"/>
-                <w:szCs w:val="20"/>
-                <w:rtl/>
-              </w:rPr>
-            </w:pPr>
-            <w:r>
-              <w:rPr>
-                <w:rFonts w:asciiTheme="majorBidi" w:hAnsiTheme="majorBidi" w:cs="Times New Roman"/>
-                <w:sz w:val="20"/>
-                <w:szCs w:val="20"/>
-                <w:rtl/>
-              </w:rPr>
-              <w:t xml:space="preserve">Confirm campaign launch date once budget is cleared</w:t>
-            </w:r>
-          </w:p>
-        </w:tc>
-        <w:tc>
-          <w:tcPr>
-            <w:tcW w:w="350" w:type="dxa"/>
-            <w:vAlign w:val="center"/>
-          </w:tcPr>
-          <w:p>
-            <w:pPr>
-              <w:pStyle w:val="ListParagraph"/>
-              <w:numPr>
-                <w:ilvl w:val="0"/>
-                <w:numId w:val="18"/>
-              </w:numPr>
-              <w:tabs>
-                <w:tab w:val="left" w:pos="1692"/>
-                <w:tab w:val="center" w:pos="5256"/>
-              </w:tabs>
-              <w:bidi/>
-              <w:spacing w:after="0" w:line="240" w:lineRule="auto"/>
-              <w:ind w:right="162"/>
-              <w:jc w:val="center"/>
-              <w:rPr>
-                <w:rFonts w:asciiTheme="majorBidi" w:hAnsiTheme="majorBidi" w:cstheme="majorBidi"/>
-                <w:sz w:val="20"/>
-                <w:szCs w:val="20"/>
-                <w:rtl/>
-              </w:rPr>
-            </w:pPr>
-          </w:p>
-        </w:tc>
-      </w:tr>
-      <w:tr>
-        <w:trPr>
-          <w:trHeight w:val="278"/>
-        </w:trPr>
-        <w:tc>
-          <w:tcPr>
-            <w:tcW w:w="1890" w:type="dxa"/>
-            <w:vAlign w:val="center"/>
-          </w:tcPr>
-          <w:p>
-            <w:pPr>
-              <w:tabs>
-                <w:tab w:val="center" w:pos="5256"/>
-              </w:tabs>
-              <w:bidi/>
-              <w:spacing w:after="0" w:line="240" w:lineRule="auto"/>
-              <w:rPr>
-                <w:rFonts w:asciiTheme="majorBidi" w:hAnsiTheme="majorBidi" w:cstheme="majorBidi"/>
-                <w:sz w:val="20"/>
-                <w:szCs w:val="20"/>
-                <w:rtl/>
-              </w:rPr>
-            </w:pPr>
-          </w:p>
-        </w:tc>
-        <w:tc>
-          <w:tcPr>
-            <w:tcW w:w="2431" w:type="dxa"/>
-            <w:tcMar>
-              <w:top w:w="72" w:type="dxa"/>
-              <w:left w:w="144" w:type="dxa"/>
-              <w:bottom w:w="72" w:type="dxa"/>
-              <w:right w:w="144" w:type="dxa"/>
-            </w:tcMar>
-            <w:vAlign w:val="center"/>
-          </w:tcPr>
-          <w:p>
-            <w:pPr>
-              <w:tabs>
-                <w:tab w:val="center" w:pos="5256"/>
-              </w:tabs>
-              <w:bidi/>
-              <w:spacing w:after="0" w:line="240" w:lineRule="auto"/>
-              <w:rPr>
-                <w:rFonts w:asciiTheme="majorBidi" w:hAnsiTheme="majorBidi" w:cstheme="majorBidi"/>
-                <w:sz w:val="20"/>
-                <w:szCs w:val="20"/>
-                <w:rtl/>
-                <w:lang w:bidi="ar-JO"/>
-              </w:rPr>
-            </w:pPr>
-          </w:p>
-        </w:tc>
-        <w:tc>
-          <w:tcPr>
-            <w:tcW w:w="1709" w:type="dxa"/>
-            <w:vAlign w:val="center"/>
-          </w:tcPr>
-          <w:p>
-            <w:pPr>
-              <w:tabs>
-                <w:tab w:val="left" w:pos="1692"/>
-                <w:tab w:val="center" w:pos="5256"/>
-              </w:tabs>
-              <w:bidi/>
-              <w:spacing w:after="0" w:line="240" w:lineRule="auto"/>
-              <w:ind w:right="162"/>
-              <w:rPr>
-                <w:rFonts w:asciiTheme="majorBidi" w:hAnsiTheme="majorBidi" w:cstheme="majorBidi"/>
-                <w:sz w:val="20"/>
-                <w:szCs w:val="20"/>
-                <w:rtl/>
-              </w:rPr>
-            </w:pPr>
-          </w:p>
-        </w:tc>
-        <w:tc>
-          <w:tcPr>
-            <w:tcW w:w="3785" w:type="dxa"/>
-            <w:vAlign w:val="center"/>
-          </w:tcPr>
-          <w:p>
-            <w:pPr>
-              <w:tabs>
-                <w:tab w:val="left" w:pos="1692"/>
-                <w:tab w:val="center" w:pos="5256"/>
-              </w:tabs>
-              <w:bidi/>
-              <w:spacing w:after="0" w:line="240" w:lineRule="auto"/>
-              <w:ind w:right="162"/>
-              <w:rPr>
-                <w:rFonts w:asciiTheme="majorBidi" w:hAnsiTheme="majorBidi" w:cstheme="majorBidi"/>
-                <w:sz w:val="20"/>
-                <w:szCs w:val="20"/>
-                <w:rtl/>
-              </w:rPr>
-            </w:pPr>
-            <w:r>
-              <w:rPr>
-                <w:rFonts w:asciiTheme="majorBidi" w:hAnsiTheme="majorBidi" w:cs="Times New Roman"/>
-                <w:sz w:val="20"/>
-                <w:szCs w:val="20"/>
-                <w:rtl/>
-              </w:rPr>
-              <w:t xml:space="preserve"/>
-            </w:r>
-          </w:p>
-        </w:tc>
-        <w:tc>
-          <w:tcPr>
-            <w:tcW w:w="350" w:type="dxa"/>
-            <w:vAlign w:val="center"/>
-          </w:tcPr>
-          <w:p>
-            <w:pPr>
-              <w:pStyle w:val="ListParagraph"/>
-              <w:numPr>
-                <w:ilvl w:val="0"/>
-                <w:numId w:val="18"/>
-              </w:numPr>
-              <w:tabs>
-                <w:tab w:val="left" w:pos="1692"/>
-                <w:tab w:val="center" w:pos="5256"/>
-              </w:tabs>
-              <w:bidi/>
-              <w:spacing w:after="0" w:line="240" w:lineRule="auto"/>
-              <w:ind w:right="162"/>
-              <w:jc w:val="center"/>
-              <w:rPr>
-                <w:rFonts w:asciiTheme="majorBidi" w:hAnsiTheme="majorBidi" w:cstheme="majorBidi"/>
-                <w:sz w:val="20"/>
-                <w:szCs w:val="20"/>
-                <w:rtl/>
-              </w:rPr>
-            </w:pPr>
-          </w:p>
-        </w:tc>
-      </w:tr>
-      <w:tr>
-        <w:trPr>
-          <w:trHeight w:val="278"/>
-        </w:trPr>
-        <w:tc>
-          <w:tcPr>
-            <w:tcW w:w="1890" w:type="dxa"/>
-            <w:vAlign w:val="center"/>
-          </w:tcPr>
-          <w:p>
-            <w:pPr>
-              <w:tabs>
-                <w:tab w:val="center" w:pos="5256"/>
-              </w:tabs>
-              <w:bidi/>
-              <w:spacing w:after="0" w:line="240" w:lineRule="auto"/>
-              <w:rPr>
-                <w:rFonts w:asciiTheme="majorBidi" w:hAnsiTheme="majorBidi" w:cstheme="majorBidi"/>
-                <w:sz w:val="20"/>
-                <w:szCs w:val="20"/>
-                <w:rtl/>
-              </w:rPr>
-            </w:pPr>
-          </w:p>
-        </w:tc>
-        <w:tc>
-          <w:tcPr>
-            <w:tcW w:w="2431" w:type="dxa"/>
-            <w:tcMar>
-              <w:top w:w="72" w:type="dxa"/>
-              <w:left w:w="144" w:type="dxa"/>
-              <w:bottom w:w="72" w:type="dxa"/>
-              <w:right w:w="144" w:type="dxa"/>
-            </w:tcMar>
-            <w:vAlign w:val="center"/>
-          </w:tcPr>
-          <w:p>
-            <w:pPr>
-              <w:tabs>
-                <w:tab w:val="center" w:pos="5256"/>
-              </w:tabs>
-              <w:bidi/>
-              <w:spacing w:after="0" w:line="240" w:lineRule="auto"/>
-              <w:rPr>
-                <w:rFonts w:asciiTheme="majorBidi" w:hAnsiTheme="majorBidi" w:cstheme="majorBidi"/>
-                <w:sz w:val="20"/>
-                <w:szCs w:val="20"/>
-                <w:rtl/>
-                <w:lang w:bidi="ar-JO"/>
-              </w:rPr>
-            </w:pPr>
-          </w:p>
-        </w:tc>
-        <w:tc>
-          <w:tcPr>
-            <w:tcW w:w="1709" w:type="dxa"/>
-            <w:vAlign w:val="center"/>
-          </w:tcPr>
-          <w:p>
-            <w:pPr>
-              <w:tabs>
-                <w:tab w:val="left" w:pos="1692"/>
-                <w:tab w:val="center" w:pos="5256"/>
-              </w:tabs>
-              <w:bidi/>
-              <w:spacing w:after="0" w:line="240" w:lineRule="auto"/>
-              <w:ind w:right="162"/>
-              <w:rPr>
-                <w:rFonts w:asciiTheme="majorBidi" w:hAnsiTheme="majorBidi" w:cstheme="majorBidi"/>
-                <w:sz w:val="20"/>
-                <w:szCs w:val="20"/>
-                <w:rtl/>
-              </w:rPr>
-            </w:pPr>
-          </w:p>
-        </w:tc>
-        <w:tc>
-          <w:tcPr>
-            <w:tcW w:w="3785" w:type="dxa"/>
-            <w:vAlign w:val="center"/>
-          </w:tcPr>
-          <w:p>
-            <w:pPr>
-              <w:tabs>
-                <w:tab w:val="left" w:pos="1692"/>
-                <w:tab w:val="center" w:pos="5256"/>
-              </w:tabs>
-              <w:bidi/>
-              <w:spacing w:after="0" w:line="240" w:lineRule="auto"/>
-              <w:ind w:right="162"/>
-              <w:rPr>
-                <w:rFonts w:asciiTheme="majorBidi" w:hAnsiTheme="majorBidi" w:cstheme="majorBidi"/>
-                <w:sz w:val="20"/>
-                <w:szCs w:val="20"/>
-                <w:rtl/>
-              </w:rPr>
-            </w:pPr>
-          </w:p>
-        </w:tc>
-        <w:tc>
-          <w:tcPr>
-            <w:tcW w:w="350" w:type="dxa"/>
-            <w:vAlign w:val="center"/>
-          </w:tcPr>
-          <w:p>
-            <w:pPr>
-              <w:pStyle w:val="ListParagraph"/>
-              <w:numPr>
-                <w:ilvl w:val="0"/>
-                <w:numId w:val="18"/>
-              </w:numPr>
-              <w:tabs>
-                <w:tab w:val="left" w:pos="1692"/>
-                <w:tab w:val="center" w:pos="5256"/>
-              </w:tabs>
-              <w:bidi/>
-              <w:spacing w:after="0" w:line="240" w:lineRule="auto"/>
-              <w:ind w:right="162"/>
-              <w:jc w:val="center"/>
-              <w:rPr>
-                <w:rFonts w:asciiTheme="majorBidi" w:hAnsiTheme="majorBidi" w:cstheme="majorBidi"/>
-                <w:sz w:val="20"/>
-                <w:szCs w:val="20"/>
-                <w:rtl/>
-              </w:rPr>
-            </w:pPr>
-          </w:p>
-        </w:tc>
-      </w:tr>
-      <w:tr>
-        <w:trPr>
-          <w:trHeight w:val="278"/>
-        </w:trPr>
-        <w:tc>
-          <w:tcPr>
-            <w:tcW w:w="1890" w:type="dxa"/>
-            <w:vAlign w:val="center"/>
-          </w:tcPr>
-          <w:p>
-            <w:pPr>
-              <w:tabs>
-                <w:tab w:val="center" w:pos="5256"/>
-              </w:tabs>
-              <w:bidi/>
-              <w:spacing w:after="0" w:line="240" w:lineRule="auto"/>
-              <w:rPr>
-                <w:rFonts w:asciiTheme="majorBidi" w:hAnsiTheme="majorBidi" w:cstheme="majorBidi"/>
-                <w:sz w:val="20"/>
-                <w:szCs w:val="20"/>
-                <w:rtl/>
-              </w:rPr>
-            </w:pPr>
-          </w:p>
-        </w:tc>
-        <w:tc>
-          <w:tcPr>
-            <w:tcW w:w="2431" w:type="dxa"/>
-            <w:tcMar>
-              <w:top w:w="72" w:type="dxa"/>
-              <w:left w:w="144" w:type="dxa"/>
-              <w:bottom w:w="72" w:type="dxa"/>
-              <w:right w:w="144" w:type="dxa"/>
-            </w:tcMar>
-            <w:vAlign w:val="center"/>
-          </w:tcPr>
-          <w:p>
-            <w:pPr>
-              <w:tabs>
-                <w:tab w:val="center" w:pos="5256"/>
-              </w:tabs>
-              <w:bidi/>
-              <w:spacing w:after="0" w:line="240" w:lineRule="auto"/>
-              <w:rPr>
-                <w:rFonts w:asciiTheme="majorBidi" w:hAnsiTheme="majorBidi" w:cstheme="majorBidi"/>
-                <w:sz w:val="20"/>
-                <w:szCs w:val="20"/>
-                <w:rtl/>
-                <w:lang w:bidi="ar-JO"/>
-              </w:rPr>
-            </w:pPr>
-          </w:p>
-        </w:tc>
-        <w:tc>
-          <w:tcPr>
-            <w:tcW w:w="1709" w:type="dxa"/>
-            <w:vAlign w:val="center"/>
-          </w:tcPr>
-          <w:p>
-            <w:pPr>
-              <w:tabs>
-                <w:tab w:val="left" w:pos="1692"/>
-                <w:tab w:val="center" w:pos="5256"/>
-              </w:tabs>
-              <w:bidi/>
-              <w:spacing w:after="0" w:line="240" w:lineRule="auto"/>
-              <w:ind w:right="162"/>
-              <w:rPr>
-                <w:rFonts w:asciiTheme="majorBidi" w:hAnsiTheme="majorBidi" w:cstheme="majorBidi"/>
-                <w:sz w:val="20"/>
-                <w:szCs w:val="20"/>
-                <w:rtl/>
-              </w:rPr>
-            </w:pPr>
-          </w:p>
-        </w:tc>
-        <w:tc>
-          <w:tcPr>
-            <w:tcW w:w="3785" w:type="dxa"/>
-            <w:vAlign w:val="center"/>
-          </w:tcPr>
-          <w:p>
-            <w:pPr>
-              <w:tabs>
-                <w:tab w:val="left" w:pos="1692"/>
-                <w:tab w:val="center" w:pos="5256"/>
-              </w:tabs>
-              <w:bidi/>
-              <w:spacing w:after="0" w:line="240" w:lineRule="auto"/>
-              <w:ind w:right="162"/>
-              <w:rPr>
-                <w:rFonts w:asciiTheme="majorBidi" w:hAnsiTheme="majorBidi" w:cstheme="majorBidi"/>
-                <w:sz w:val="20"/>
-                <w:szCs w:val="20"/>
-                <w:rtl/>
-              </w:rPr>
-            </w:pPr>
+              <w:ind w:left="136" w:right="162"/>
+              <w:rPr>
+                <w:rFonts w:asciiTheme="majorHAnsi" w:hAnsiTheme="majorHAnsi" w:cstheme="majorHAnsi"/>
+                <w:sz w:val="20"/>
+                <w:szCs w:val="20"/>
+                <w:rtl/>
+              </w:rPr>
+            </w:pPr>
+            <w:r>
+              <w:rPr>
+                <w:rFonts w:asciiTheme="majorHAnsi" w:hAnsiTheme="majorHAnsi" w:cstheme="majorHAnsi"/>
+                <w:sz w:val="20"/>
+                <w:szCs w:val="20"/>
+              </w:rPr>
+              <w:t xml:space="preserve">Confirm the campaign launch date once the budget is cleared</w:t>
+            </w:r>
           </w:p>
         </w:tc>
         <w:tc>
@@ -4332,7 +2895,6 @@
           <w:docPartUnique/>
         </w:docPartObj>
       </w:sdtPr>
-      <w:sdtEndPr/>
       <w:sdtContent>
         <w:sdt>
           <w:sdtPr>
@@ -4349,7 +2911,6 @@
               <w:docPartUnique/>
             </w:docPartObj>
           </w:sdtPr>
-          <w:sdtEndPr/>
           <w:sdtContent>
             <w:r>
               <w:rPr>
@@ -4359,7 +2920,17 @@
                 <w:szCs w:val="20"/>
                 <w:rtl/>
               </w:rPr>
-              <w:t xml:space="preserve">  صفحة</w:t>
+              <w:t xml:space="preserve">  </w:t>
+            </w:r>
+            <w:r>
+              <w:rPr>
+                <w:rFonts w:asciiTheme="majorBidi" w:hAnsiTheme="majorBidi" w:cstheme="majorBidi"/>
+                <w:color w:val="A79F88"/>
+                <w:sz w:val="20"/>
+                <w:szCs w:val="20"/>
+                <w:rtl/>
+              </w:rPr>
+              <w:t>صفحة</w:t>
             </w:r>
             <w:r>
               <w:rPr>

</xml_diff>